<commit_message>
Simplify the noise taxonomy, swap in two scenario corpora, add theorem 5 and proposition 1
</commit_message>
<xml_diff>
--- a/docx/胡宏彬-进度文档-20260820.docx
+++ b/docx/胡宏彬-进度文档-20260820.docx
@@ -54,7 +54,7 @@
         <w:rPr>
           <w:rFonts w:hint="eastAsia"/>
         </w:rPr>
-        <w:t xml:space="preserve">时序基础模型的能力上限越来越取决于训练语料的质量。已有的治理方法或者只给样本打一个质量分再按分数取舍，或者按固定规则选定清洗算子后直接覆盖原值，都没有回答一次具体的修改是否值得提交。把治理交给可学习的智能体会遇到两个障碍，来自模型的效用反馈在部分数据上与有害性方向相反，直接用它当奖励会把策略训练成抹平数据，而在真实语料上试错学习又要以破坏数据为代价。本文提出屏蔽强化学习驱动的时序数据治理智能体 IntroAct-TS。方法由四个模块构成，双证据状态构建融合统计画像与冻结基础模型的行为探测形成决策状态，沙箱干预重测在副本上试执行候选动作并生成可比的奖励读数，共形标定的双信号屏蔽要求模型效用与时序结构同时通过检验才允许提交，屏蔽反馈策略优化用屏蔽后的奖励更新动作选择并在语料内分配探测预算。屏蔽层在这一设计中承担双重职责，它既是安全约束也是奖励塑形器，使策略学到的是能通过结构检验的修复方式。由于所有试错都发生在副本上，探索过程本身不修改语料，智能体因而可以在不付出破坏代价的前提下学习。本文给出五条性质及其证明，涵盖合取屏蔽的损害单调性、非阻塞性、任意策略下的结构安全性、共形风险控制以及屏蔽动作空间上的遗憾界，并规划了八组实验。</w:t>
+        <w:t xml:space="preserve">时序基础模型的能力上限越来越取决于训练语料的质量。已有的治理方法或者只给样本打一个质量分再按分数取舍，或者按固定规则选定清洗算子后直接覆盖原值，都没有回答一次具体的修改是否值得提交。把治理交给可学习的智能体会遇到两个障碍，来自模型的效用反馈在部分数据上与有害性方向相反，直接用它当奖励会把策略训练成抹平数据，而在真实语料上试错学习又要以破坏数据为代价。本文提出屏蔽强化学习驱动的时序数据治理智能体 IntroAct-TS。方法由四个模块构成，双证据状态构建融合统计画像与冻结基础模型的行为探测形成决策状态，沙箱干预重测在副本上试执行候选动作并生成可比的奖励读数，共形标定的双信号屏蔽要求模型效用与时序结构同时通过检验才允许提交，屏蔽反馈策略优化用屏蔽后的奖励更新动作选择并在语料内分配探测预算。屏蔽层在这一设计中承担双重职责，它既是安全约束也是奖励塑形器，使策略学到的是能通过结构检验的修复方式。由于所有试错都发生在副本上，探索过程本身不修改语料，智能体因而可以在不付出破坏代价的前提下学习。本文给出六条定理与一条命题及其证明，涵盖合取屏蔽的损害单调性、非阻塞性、任意策略下的结构安全性、共形风险控制、标定间隔内保证退化的上界以及屏蔽动作空间上的遗憾界，并说明把结构约束写成惩罚项时损害率存在不可消除的下界，在此基础上规划了九组实验。</w:t>
       </w:r>
     </w:p>
     <w:p>
@@ -801,7 +801,7 @@
         <w:rPr>
           <w:rFonts w:hint="eastAsia"/>
         </w:rPr>
-        <w:t xml:space="preserve">治理决策建立在四个基础概念之上。模型效用与时序结构保真度提供判据所需的两类读数，屏蔽提供施加判据的位置，共形风险控制提供确定阈值的方法。本章交代这四者，说明所处理的缺陷类型，再把治理问题形式化为屏蔽约束下的序贯决策。</w:t>
+        <w:t xml:space="preserve">一次编辑是否值得提交，取决于它在两个方向上的表现，模型是否因此变得更容易处理这段数据，以及序列自身的结构是否被保住。这两个方向需要各自的度量，而度量之后还需要一个位置来施加判断，以及一种方法来确定判断的阈值。本章依次交代这四者，说明所处理的噪声类型，再把治理问题形式化为屏蔽约束下的序贯决策。</w:t>
       </w:r>
     </w:p>
     <w:p>
@@ -838,7 +838,7 @@
         <w:rPr>
           <w:rFonts w:hint="eastAsia"/>
         </w:rPr>
-        <w:t xml:space="preserve">行为探测指在不更新参数的前提下，通过冻结模型对一个窗口的反应获取该窗口的证据。记窗口为</w:t>
+        <w:t xml:space="preserve">衡量模型是否变得更容易处理一段数据，需要一个能从模型读出证据的手段。行为探测指在不更新参数的前提下，通过冻结模型对一个窗口的反应获取该窗口的证据。记窗口为</w:t>
       </w:r>
       <w:r>
         <w:rPr>
@@ -963,7 +963,7 @@
         <w:rPr>
           <w:rFonts w:hint="eastAsia"/>
         </w:rPr>
-        <w:t xml:space="preserve">，其分量覆盖逐位置预测误差的分位数、层间表示的余弦距离、遮挡恢复的稳定性、多视图预测的一致性、轻微扰动前后的输出变化，以及模型池内不同模型之间的分歧。只取预测误差是不够的，一段被尖峰污染的窗口和一段本就难以预测的窗口都会产生高误差，前者的误差集中在少数位置，后者的误差分布均匀，分位数信息能把两者分开。探测只做前向计算，不涉及梯度，单位开销远低于需要海森求逆的影响函数方法[11]，这在需要反复测量的强化学习设定下尤为重要。</w:t>
+        <w:t xml:space="preserve">，其分量覆盖逐位置预测误差的分位数、层间表示的余弦距离、遮挡恢复的稳定性、多视图预测的一致性、轻微扰动前后的输出变化，以及模型池内不同模型之间的分歧。签名之所以不能只取预测误差，是因为一段被噪声污染的窗口和一段本就难以预测的窗口都会产生高误差，前者的误差集中在少数位置，后者的误差分布均匀，分位数信息能把两者分开。探测只做前向计算，不涉及梯度，单位开销远低于需要海森求逆的影响函数方法[11]，这在需要反复测量的强化学习设定下决定了方法是否可行。</w:t>
       </w:r>
     </w:p>
     <w:p>
@@ -977,7 +977,7 @@
         <w:rPr>
           <w:rFonts w:hint="eastAsia"/>
         </w:rPr>
-        <w:t xml:space="preserve">模型效用衡量一个窗口对目标模型的友好程度，本文把它定义为若干归一化误差分量的加权负和</w:t>
+        <w:t xml:space="preserve">有了行为签名，模型侧的度量可以定义出来。模型效用衡量一个窗口对目标模型的友好程度，取若干归一化误差分量的加权负和</w:t>
       </w:r>
     </w:p>
     <w:p>
@@ -1431,7 +1431,7 @@
         <w:rPr>
           <w:rFonts w:hint="eastAsia"/>
         </w:rPr>
-        <w:t xml:space="preserve">时序结构保真度衡量一次编辑对序列固有结构的破坏程度，取值越低表示保持得越好。它只比较编辑前后的时序属性，与模型无关。参与比较的属性随算子的作用范围而不同，改动局限于有限位置的算子在其声明的足迹之外比较形状、极值、补片衔接、足迹大小与局部离散度，重写整条序列的算子则比较趋势、主周期、频谱能量分布、自相关结构、变点位置与极值。记编辑前后的窗口为</w:t>
+        <w:t xml:space="preserve">效用只回答了模型是否更容易处理这段数据，一个把序列抹平的动作同样能让模型更容易处理它，因此还需要一个与模型无关的度量。时序结构保真度衡量一次编辑对序列固有结构的破坏程度，取值越低表示保持得越好，它只比较编辑前后的时序属性。参与比较的属性随算子的作用范围而不同，改动局限于有限位置的算子在其声明的足迹之外比较形状、极值、补片衔接、足迹大小与局部离散度，重写整条序列的算子则比较趋势、主周期、频谱能量分布、自相关结构、变点位置与极值。记编辑前后的窗口为</w:t>
       </w:r>
       <w:r>
         <w:rPr>
@@ -1925,7 +1925,7 @@
         <w:rPr>
           <w:rFonts w:hint="eastAsia"/>
         </w:rPr>
-        <w:t xml:space="preserve">屏蔽[14]指在智能体与环境之间加入一层过滤器，动作生效之前先检查它是否违反给定规约，通过检查才被放行。屏蔽的两个基本要求是可靠性与非阻塞性，前者指违规动作不会被放行，后者指任意状态下至少存在一个可以放行的动作。屏蔽与策略学习解耦，底层算法可以自由选择，安全性在每一步都成立，不依赖训练收敛。</w:t>
+        <w:t xml:space="preserve">两个度量都有了，还需要确定它们在哪里被施加。屏蔽[14]指在智能体与环境之间加入一层过滤器，动作生效之前先检查它是否违反给定规约，通过检查才被放行。屏蔽的两个基本要求是可靠性与非阻塞性，前者指违规动作不会被放行，后者指任意状态下至少存在一个可以放行的动作。屏蔽与策略学习解耦，底层算法可以自由选择，安全性在每一步都成立，不依赖训练收敛。</w:t>
       </w:r>
     </w:p>
     <w:p>
@@ -1936,7 +1936,7 @@
         <w:rPr>
           <w:rFonts w:hint="eastAsia"/>
         </w:rPr>
-        <w:t xml:space="preserve">共形风险控制[21]在不假设数据分布的前提下，为由阈值参数化的决策族提供有限样本的风险保证。给定与部署数据可交换的校准集、有界的风险函数以及目标风险水平</w:t>
+        <w:t xml:space="preserve">屏蔽给出了施加判断的位置，判断所用的阈值还需要一种确定方式，而在无标签场景中这个阈值无法由领域知识给定。共形风险控制[21]在不假设数据分布的前提下，为由阈值参数化的决策族提供有限样本的风险保证。给定与部署数据可交换的校准集、有界的风险函数以及目标风险水平</w:t>
       </w:r>
       <w:r>
         <w:rPr>
@@ -2275,7 +2275,7 @@
         <w:rPr>
           <w:rFonts w:hint="eastAsia"/>
         </w:rPr>
-        <w:t xml:space="preserve">本文处理时序特征层面的缺陷，按影响范围分为两类。局部缺陷作用于窗口内有限的时间范围，包括孤立尖峰、散点缺失、连续缺失片段与重复片段，它们通常在序列上留下明显痕迹，统计画像对其检测能力较强。重复片段是其中的例外，被复制的片段本身在统计上完全正常，只有把它与上下文对照才能发现。全局缺陷改变整个窗口的分布，包括水平位移、噪声放大与平台化，影响不局限于某几个时间点。</w:t>
+        <w:t xml:space="preserve">本文处理时序特征层面的噪声，按其产生机制分为随机与系统两类，这一划分决定了它们在多通道语料中留下的痕迹是否可以相互印证。随机噪声来自环境扰动、设备误差与记录不一致，作用在单个通道的有限时间范围上，表现为孤立尖峰、散点缺失、连续缺失片段与重复片段。这类噪声在通道之间彼此独立，因此一个通道上的异常在同一时刻的其余通道上找不到对应。系统噪声来自采集设备的系统性偏差、数据来源切换与传感器漂移，它同时作用在多个通道上并改变整段窗口的分布，表现为水平位移、噪声放大与平台化。这类噪声在通道之间高度相关，同一时刻的多个通道会一起偏移。</w:t>
       </w:r>
     </w:p>
     <w:p>
@@ -2286,7 +2286,7 @@
         <w:rPr>
           <w:rFonts w:hint="eastAsia"/>
         </w:rPr>
-        <w:t xml:space="preserve">这两类缺陷带来的困难体现在两个层面。在单个窗口的尺度上，某些缺陷在模型行为上的表现与困难但正确的数据高度相似，水平位移与合法的状态切换都会抬高预测误差，仅凭模型反馈无法区分。在语料的尺度上，模型行为信号反映的是窗口对该模型的可预测程度，而窗口的可预测程度与它的质量并不等同，结构上本就复杂却完全干净的数据同样会得到高风险读数。这一偏差对基于规则的方法只是误判，对基于学习的方法则更严重，因为策略会主动朝着偏差的方向优化，把降低可预测难度当作目标去追求。</w:t>
+        <w:t xml:space="preserve">两类噪声给治理带来的困难并不相同。随机噪声在单个窗口上留下明显的局部痕迹，统计画像对其检测能力较强，困难在于它与真实发生的极端事件在波形上几乎一致，仅凭单通道证据无法判断某个尖峰是故障还是事件。系统噪声改变整段分布，在模型行为上的表现与合法的状态切换高度相似，水平位移与设备检修后的基线变化都会抬高预测误差，仅凭模型反馈同样无法区分。在语料的尺度上还有一重困难，模型行为信号反映的是窗口对该模型的可预测程度，而窗口的可预测程度与它的质量并不等同，结构上本就复杂却完全干净的数据同样会得到高风险读数。这一偏差对基于规则的方法只是误判，对基于学习的方法则更严重，因为策略会主动朝着偏差的方向优化，把降低可预测难度当作目标去追求。</w:t>
       </w:r>
     </w:p>
     <w:p>
@@ -4894,7 +4894,7 @@
         <w:rPr>
           <w:rFonts w:hint="eastAsia"/>
         </w:rPr>
-        <w:t xml:space="preserve">本章给出四个模块的具体实现与相应的理论性质。状态构建负责取证，沙箱重测负责把动作的后果测出来，双信号屏蔽负责裁决并给出安全保证，策略优化负责从裁决中学习并分配预算，最后分析各模块与整体的时间复杂度。</w:t>
+        <w:t xml:space="preserve">上一章把治理问题写成了带预算的受约束序贯决策，余下的是如何在无标签条件下取得决策所需的证据、如何在不破坏数据的前提下测出动作的后果、如何判定一次改动可以提交，以及如何让判定的结果反过来改进后续的选择。本章按这四个环节给出具体实现与相应的理论性质，最后分析时间复杂度。</w:t>
       </w:r>
     </w:p>
     <w:p>
@@ -5492,6 +5492,17 @@
           <w:rFonts w:hint="eastAsia"/>
         </w:rPr>
         <w:t xml:space="preserve">，SPO 的动作价值估计正是按簇维护的，因为同一簇内的窗口在结构上相似，某个算子在其中一个窗口上有效往往意味着在其余窗口上也有效。CDP 因此既提供状态，也提供策略泛化所依赖的划分。算法 1 给出完整流程。</w:t>
+      </w:r>
+    </w:p>
+    <w:p>
+      <w:pPr>
+        <w:ind w:firstLineChars="200" w:firstLine="420"/>
+      </w:pPr>
+      <w:r>
+        <w:rPr>
+          <w:rFonts w:hint="eastAsia"/>
+        </w:rPr>
+        <w:t xml:space="preserve">同类校准的收益依赖于语料本身存在结构异质性，这一前提此前没有说明。若语料中所有窗口的复杂程度相近，则邻居的中位数与全语料的中位数几乎相同，两种标准化的结果也就几乎相同，同类校准退化为全局标准化。收益应当随语料的结构异质性单调增加，在同质语料上趋于零。这一点决定了检验它的语料必须跨越足够的结构跨度，本文因此在实验设计中同时使用工业与金融两类场景，并把异质性作为自变量单独扫描，具体安排见 4.2 节。弃权机制的情形与此类似，它在两类证据相互矛盾时拒绝处理，若语料中的窗口证据都很充分，弃权就没有触发的机会。</w:t>
       </w:r>
     </w:p>
     <w:p>
@@ -6830,7 +6841,7 @@
         <w:rPr>
           <w:rFonts w:hint="eastAsia"/>
         </w:rPr>
-        <w:t xml:space="preserve">CDP 给出的状态说明了窗口可能存在什么问题，却没有回答某个具体动作施加下去会发生什么。回答这个问题需要真正执行一次动作并观察结果。强化学习的设定给这件事加了一层要求，学习需要反复尝试，而语料被修改之后无法还原。SIR 把执行与提交分开，同时满足这两方面的需要。</w:t>
+        <w:t xml:space="preserve">状态说明了窗口可能存在什么问题，却没有回答某个具体动作施加下去会发生什么。这个问题只能通过真正执行一次动作并观察结果来回答，而强化学习需要反复尝试，语料一旦被修改就无法还原，两个要求直接冲突。SIR 把执行与提交分开，使两者可以同时满足。</w:t>
       </w:r>
     </w:p>
     <w:p>
@@ -7533,7 +7544,7 @@
         <w:rPr>
           <w:rFonts w:hint="eastAsia"/>
         </w:rPr>
-        <w:t xml:space="preserve">SIR 给出了效用变化，而 2.2 节已经说明效用信号在部分数据上与有害性方向相反。仅凭</w:t>
+        <w:t xml:space="preserve">SIR 给出了可比的效用读数，但 2.2 节已经指出这个信号在部分数据上与有害性方向相反。仅凭</w:t>
       </w:r>
       <w:r>
         <w:rPr>
@@ -7559,7 +7570,7 @@
         <w:rPr>
           <w:rFonts w:hint="eastAsia"/>
         </w:rPr>
-        <w:t xml:space="preserve">作出裁决会放行那些通过抹平序列换取低误差的动作。在策略需要学习的设定下后果比误判更严重，因为策略会朝着这个方向持续优化。CDS 的做法是要求两类相互独立的证据同时支持这次提交。</w:t>
+        <w:t xml:space="preserve">作出裁决会放行那些通过抹平序列换取低误差的动作，而在策略需要学习的设定下，后果比一次误判严重得多，因为策略会朝着这个方向持续优化。CDS 的做法是要求两类相互独立的证据同时支持这次提交。</w:t>
       </w:r>
     </w:p>
     <w:p>
@@ -8637,6 +8648,465 @@
           <w:rFonts w:hint="eastAsia"/>
         </w:rPr>
         <w:t xml:space="preserve">定理 1 不依赖任何一个条件的判别力。即使效用条件在某类数据上完全失效，复合屏蔽造成的损害也不会超过仅用结构条件的情形。该结论针对损害总量，接受集缩小的同时修复收益也会减少，两者的权衡由 3.4 节末尾的阈值标定处理。</w:t>
+      </w:r>
+    </w:p>
+    <w:p>
+      <w:pPr>
+        <w:ind w:firstLineChars="200" w:firstLine="420"/>
+      </w:pPr>
+      <w:r>
+        <w:rPr>
+          <w:rFonts w:hint="eastAsia"/>
+        </w:rPr>
+        <w:t xml:space="preserve">把结构信息以合取条件的形式引入，与把它作为目标函数中的惩罚项引入，两者的差别不止于形式。同期的清洗智能体采用后一种做法，即在效用增益中减去带系数的结构失真再按加权和取舍。下面的结论说明这两种做法在严格的损害预算下并不等价。</w:t>
+      </w:r>
+    </w:p>
+    <w:p>
+      <w:pPr>
+        <w:ind w:firstLineChars="200" w:firstLine="420"/>
+      </w:pPr>
+      <w:r>
+        <w:rPr>
+          <w:rFonts w:hint="eastAsia"/>
+        </w:rPr>
+        <w:t xml:space="preserve">命题 1（软惩罚的损害下界）设软惩罚的接受判据为</w:t>
+      </w:r>
+      <w:r>
+        <w:rPr>
+          <w:rFonts w:hint="eastAsia"/>
+        </w:rPr>
+        <w:t xml:space="preserve"> </w:t>
+      </w:r>
+      <m:oMath>
+        <m:r>
+          <m:t>Δ</m:t>
+        </m:r>
+        <m:r>
+          <m:t>U</m:t>
+        </m:r>
+        <m:r>
+          <m:rPr>
+            <m:sty m:val="p"/>
+          </m:rPr>
+          <m:t>(</m:t>
+        </m:r>
+        <m:r>
+          <m:t>a</m:t>
+        </m:r>
+        <m:r>
+          <m:rPr>
+            <m:sty m:val="p"/>
+          </m:rPr>
+          <m:t>)</m:t>
+        </m:r>
+        <m:r>
+          <m:rPr>
+            <m:sty m:val="p"/>
+          </m:rPr>
+          <m:t>−</m:t>
+        </m:r>
+        <m:r>
+          <m:t>μ</m:t>
+        </m:r>
+        <m:r>
+          <m:t>D</m:t>
+        </m:r>
+        <m:r>
+          <m:rPr>
+            <m:sty m:val="p"/>
+          </m:rPr>
+          <m:t>(</m:t>
+        </m:r>
+        <m:r>
+          <m:t>x</m:t>
+        </m:r>
+        <m:r>
+          <m:rPr>
+            <m:sty m:val="p"/>
+          </m:rPr>
+          <m:t>,</m:t>
+        </m:r>
+        <m:r>
+          <m:t>a</m:t>
+        </m:r>
+        <m:r>
+          <m:rPr>
+            <m:sty m:val="p"/>
+          </m:rPr>
+          <m:t>(</m:t>
+        </m:r>
+        <m:r>
+          <m:t>x</m:t>
+        </m:r>
+        <m:r>
+          <m:rPr>
+            <m:sty m:val="p"/>
+          </m:rPr>
+          <m:t>)</m:t>
+        </m:r>
+        <m:r>
+          <m:rPr>
+            <m:sty m:val="p"/>
+          </m:rPr>
+          <m:t>)</m:t>
+        </m:r>
+        <m:r>
+          <m:rPr>
+            <m:sty m:val="p"/>
+          </m:rPr>
+          <m:t>&gt;</m:t>
+        </m:r>
+        <m:r>
+          <m:t>0</m:t>
+        </m:r>
+      </m:oMath>
+      <w:r>
+        <w:rPr>
+          <w:rFonts w:hint="eastAsia"/>
+        </w:rPr>
+        <w:t xml:space="preserve">，其中</w:t>
+      </w:r>
+      <w:r>
+        <w:rPr>
+          <w:rFonts w:hint="eastAsia"/>
+        </w:rPr>
+        <w:t xml:space="preserve"> </w:t>
+      </w:r>
+      <m:oMath>
+        <m:r>
+          <m:t>μ</m:t>
+        </m:r>
+        <m:r>
+          <m:rPr>
+            <m:sty m:val="p"/>
+          </m:rPr>
+          <m:t>&gt;</m:t>
+        </m:r>
+        <m:r>
+          <m:t>0</m:t>
+        </m:r>
+      </m:oMath>
+      <w:r>
+        <w:rPr>
+          <w:rFonts w:hint="eastAsia"/>
+        </w:rPr>
+        <w:t xml:space="preserve"> </w:t>
+      </w:r>
+      <w:r>
+        <w:rPr>
+          <w:rFonts w:hint="eastAsia"/>
+        </w:rPr>
+        <w:t xml:space="preserve">为惩罚系数。若存在一类窗口，其上有害动作的效用增益与结构失真之比不低于某个正数</w:t>
+      </w:r>
+      <w:r>
+        <w:rPr>
+          <w:rFonts w:hint="eastAsia"/>
+        </w:rPr>
+        <w:t xml:space="preserve"> </w:t>
+      </w:r>
+      <m:oMath>
+        <m:r>
+          <m:t>κ</m:t>
+        </m:r>
+      </m:oMath>
+      <w:r>
+        <w:rPr>
+          <w:rFonts w:hint="eastAsia"/>
+        </w:rPr>
+        <w:t xml:space="preserve">，则对任意</w:t>
+      </w:r>
+      <w:r>
+        <w:rPr>
+          <w:rFonts w:hint="eastAsia"/>
+        </w:rPr>
+        <w:t xml:space="preserve"> </w:t>
+      </w:r>
+      <m:oMath>
+        <m:r>
+          <m:t>μ</m:t>
+        </m:r>
+        <m:r>
+          <m:rPr>
+            <m:sty m:val="p"/>
+          </m:rPr>
+          <m:t>&lt;</m:t>
+        </m:r>
+        <m:r>
+          <m:t>κ</m:t>
+        </m:r>
+      </m:oMath>
+      <w:r>
+        <w:rPr>
+          <w:rFonts w:hint="eastAsia"/>
+        </w:rPr>
+        <w:t xml:space="preserve">，该类窗口上的有害动作全部被接受，软惩罚的损害率因而存在一个不依赖于阈值选取的正下界，要消除这一下界只能取</w:t>
+      </w:r>
+      <w:r>
+        <w:rPr>
+          <w:rFonts w:hint="eastAsia"/>
+        </w:rPr>
+        <w:t xml:space="preserve"> </w:t>
+      </w:r>
+      <m:oMath>
+        <m:r>
+          <m:t>μ</m:t>
+        </m:r>
+        <m:r>
+          <m:rPr>
+            <m:sty m:val="p"/>
+          </m:rPr>
+          <m:t>≥</m:t>
+        </m:r>
+        <m:r>
+          <m:t>κ</m:t>
+        </m:r>
+      </m:oMath>
+      <w:r>
+        <w:rPr>
+          <w:rFonts w:hint="eastAsia"/>
+        </w:rPr>
+        <w:t xml:space="preserve">，而此时效用增益低于</w:t>
+      </w:r>
+      <w:r>
+        <w:rPr>
+          <w:rFonts w:hint="eastAsia"/>
+        </w:rPr>
+        <w:t xml:space="preserve"> </w:t>
+      </w:r>
+      <m:oMath>
+        <m:r>
+          <m:t>μ</m:t>
+        </m:r>
+      </m:oMath>
+      <w:r>
+        <w:rPr>
+          <w:rFonts w:hint="eastAsia"/>
+        </w:rPr>
+        <w:t xml:space="preserve"> </w:t>
+      </w:r>
+      <w:r>
+        <w:rPr>
+          <w:rFonts w:hint="eastAsia"/>
+        </w:rPr>
+        <w:t xml:space="preserve">倍结构失真的编辑一并被拒绝。</w:t>
+      </w:r>
+    </w:p>
+    <w:p>
+      <w:pPr>
+        <w:ind w:firstLineChars="200" w:firstLine="420"/>
+      </w:pPr>
+      <w:r>
+        <w:rPr>
+          <w:rFonts w:hint="eastAsia"/>
+        </w:rPr>
+        <w:t xml:space="preserve">证明。由判据，动作被接受当且仅当</w:t>
+      </w:r>
+      <w:r>
+        <w:rPr>
+          <w:rFonts w:hint="eastAsia"/>
+        </w:rPr>
+        <w:t xml:space="preserve"> </w:t>
+      </w:r>
+      <m:oMath>
+        <m:r>
+          <m:t>Δ</m:t>
+        </m:r>
+        <m:r>
+          <m:t>U</m:t>
+        </m:r>
+        <m:r>
+          <m:rPr>
+            <m:sty m:val="p"/>
+          </m:rPr>
+          <m:t>(</m:t>
+        </m:r>
+        <m:r>
+          <m:t>a</m:t>
+        </m:r>
+        <m:r>
+          <m:rPr>
+            <m:sty m:val="p"/>
+          </m:rPr>
+          <m:t>)</m:t>
+        </m:r>
+        <m:r>
+          <m:rPr>
+            <m:sty m:val="p"/>
+          </m:rPr>
+          <m:t>/</m:t>
+        </m:r>
+        <m:r>
+          <m:t>D</m:t>
+        </m:r>
+        <m:r>
+          <m:rPr>
+            <m:sty m:val="p"/>
+          </m:rPr>
+          <m:t>(</m:t>
+        </m:r>
+        <m:r>
+          <m:t>x</m:t>
+        </m:r>
+        <m:r>
+          <m:rPr>
+            <m:sty m:val="p"/>
+          </m:rPr>
+          <m:t>,</m:t>
+        </m:r>
+        <m:r>
+          <m:t>a</m:t>
+        </m:r>
+        <m:r>
+          <m:rPr>
+            <m:sty m:val="p"/>
+          </m:rPr>
+          <m:t>(</m:t>
+        </m:r>
+        <m:r>
+          <m:t>x</m:t>
+        </m:r>
+        <m:r>
+          <m:rPr>
+            <m:sty m:val="p"/>
+          </m:rPr>
+          <m:t>)</m:t>
+        </m:r>
+        <m:r>
+          <m:rPr>
+            <m:sty m:val="p"/>
+          </m:rPr>
+          <m:t>)</m:t>
+        </m:r>
+        <m:r>
+          <m:rPr>
+            <m:sty m:val="p"/>
+          </m:rPr>
+          <m:t>&gt;</m:t>
+        </m:r>
+        <m:r>
+          <m:t>μ</m:t>
+        </m:r>
+      </m:oMath>
+      <w:r>
+        <w:rPr>
+          <w:rFonts w:hint="eastAsia"/>
+        </w:rPr>
+        <w:t xml:space="preserve">。对该类窗口上的有害动作，该比值不低于</w:t>
+      </w:r>
+      <w:r>
+        <w:rPr>
+          <w:rFonts w:hint="eastAsia"/>
+        </w:rPr>
+        <w:t xml:space="preserve"> </w:t>
+      </w:r>
+      <m:oMath>
+        <m:r>
+          <m:t>κ</m:t>
+        </m:r>
+      </m:oMath>
+      <w:r>
+        <w:rPr>
+          <w:rFonts w:hint="eastAsia"/>
+        </w:rPr>
+        <w:t xml:space="preserve">，故</w:t>
+      </w:r>
+      <w:r>
+        <w:rPr>
+          <w:rFonts w:hint="eastAsia"/>
+        </w:rPr>
+        <w:t xml:space="preserve"> </w:t>
+      </w:r>
+      <m:oMath>
+        <m:r>
+          <m:t>μ</m:t>
+        </m:r>
+        <m:r>
+          <m:rPr>
+            <m:sty m:val="p"/>
+          </m:rPr>
+          <m:t>&lt;</m:t>
+        </m:r>
+        <m:r>
+          <m:t>κ</m:t>
+        </m:r>
+      </m:oMath>
+      <w:r>
+        <w:rPr>
+          <w:rFonts w:hint="eastAsia"/>
+        </w:rPr>
+        <w:t xml:space="preserve"> </w:t>
+      </w:r>
+      <w:r>
+        <w:rPr>
+          <w:rFonts w:hint="eastAsia"/>
+        </w:rPr>
+        <w:t xml:space="preserve">时判据恒成立，这些动作全部进入接受集，其带来的损害不随参数调整而消失。取</w:t>
+      </w:r>
+      <w:r>
+        <w:rPr>
+          <w:rFonts w:hint="eastAsia"/>
+        </w:rPr>
+        <w:t xml:space="preserve"> </w:t>
+      </w:r>
+      <m:oMath>
+        <m:r>
+          <m:t>μ</m:t>
+        </m:r>
+        <m:r>
+          <m:rPr>
+            <m:sty m:val="p"/>
+          </m:rPr>
+          <m:t>≥</m:t>
+        </m:r>
+        <m:r>
+          <m:t>κ</m:t>
+        </m:r>
+      </m:oMath>
+      <w:r>
+        <w:rPr>
+          <w:rFonts w:hint="eastAsia"/>
+        </w:rPr>
+        <w:t xml:space="preserve"> </w:t>
+      </w:r>
+      <w:r>
+        <w:rPr>
+          <w:rFonts w:hint="eastAsia"/>
+        </w:rPr>
+        <w:t xml:space="preserve">可以排除它们，代价是同一阈值同时排除了比值低于</w:t>
+      </w:r>
+      <w:r>
+        <w:rPr>
+          <w:rFonts w:hint="eastAsia"/>
+        </w:rPr>
+        <w:t xml:space="preserve"> </w:t>
+      </w:r>
+      <m:oMath>
+        <m:r>
+          <m:t>μ</m:t>
+        </m:r>
+      </m:oMath>
+      <w:r>
+        <w:rPr>
+          <w:rFonts w:hint="eastAsia"/>
+        </w:rPr>
+        <w:t xml:space="preserve"> </w:t>
+      </w:r>
+      <w:r>
+        <w:rPr>
+          <w:rFonts w:hint="eastAsia"/>
+        </w:rPr>
+        <w:t xml:space="preserve">的全部编辑，其中包含有益的编辑。证毕。</w:t>
+      </w:r>
+    </w:p>
+    <w:p>
+      <w:pPr>
+        <w:ind w:firstLineChars="200" w:firstLine="420"/>
+      </w:pPr>
+      <w:r>
+        <w:rPr>
+          <w:rFonts w:hint="eastAsia"/>
+        </w:rPr>
+        <w:t xml:space="preserve">命题 1 的前提是效用信号与有害性在某类数据上同向增长，即抹平一段真实的极端波动同时得到高效用增益与大结构失真。本文的实验一正是刻画这一前提是否成立，因此命题的实际意义取决于该实验的结论，若反向区域很小则下界虽然存在但数值可忽略。合取条件没有这个下界，它的接受集由结构阈值直接切出，与效用增益的大小无关，无论某个动作的效用增益多高，结构失真超限即被拒绝。这一区别把两种做法的比较从是否使用副本这一实现细节，提升到结构约束应当以可交易还是不可交易的形式进入决策这一设计问题上。</w:t>
       </w:r>
     </w:p>
     <w:p>
@@ -10363,7 +10833,324 @@
         <w:rPr>
           <w:rFonts w:hint="eastAsia"/>
         </w:rPr>
-        <w:t xml:space="preserve">有两点边界。其一是可达风险下界，阈值网格中最保守的取值仍然对应一个正的经验风险，低于这个下界的目标水平在当前动作空间下无解，此时标定过程返回最保守的阈值，这一行为符合定义。其二是可交换性在策略学习过程中的脆弱性，策略更新会改变候选动作的分布，从而改变提交编辑的分布，使部署数据与早先的校准集不再可交换。实现中的处理是每</w:t>
+        <w:t xml:space="preserve">定理 4 的可交换性前提在策略固定时成立，而策略学习会持续改变候选动作的分布，使部署数据与早先的校准集不再可交换。工程上的处理是每隔一段时间重新标定，把两次标定之间的阈值视为固定值，但这样做没有回答两次标定之间保证退化了多少。下面的结论给出这一退化的上界。</w:t>
+      </w:r>
+    </w:p>
+    <w:p>
+      <w:pPr>
+        <w:ind w:firstLineChars="200" w:firstLine="420"/>
+      </w:pPr>
+      <w:r>
+        <w:rPr>
+          <w:rFonts w:hint="eastAsia"/>
+        </w:rPr>
+        <w:t>定理 5（标定间隔内的保证退化）设风险函数取值于</w:t>
+      </w:r>
+      <w:r>
+        <w:rPr>
+          <w:rFonts w:hint="eastAsia"/>
+        </w:rPr>
+        <w:t xml:space="preserve"> </w:t>
+      </w:r>
+      <m:oMath>
+        <m:r>
+          <m:rPr>
+            <m:sty m:val="p"/>
+          </m:rPr>
+          <m:t>[</m:t>
+        </m:r>
+        <m:r>
+          <m:t>0</m:t>
+        </m:r>
+        <m:r>
+          <m:rPr>
+            <m:sty m:val="p"/>
+          </m:rPr>
+          <m:t>,</m:t>
+        </m:r>
+        <m:r>
+          <m:t>1</m:t>
+        </m:r>
+        <m:r>
+          <m:rPr>
+            <m:sty m:val="p"/>
+          </m:rPr>
+          <m:t>]</m:t>
+        </m:r>
+      </m:oMath>
+      <w:r>
+        <w:rPr>
+          <w:rFonts w:hint="eastAsia"/>
+        </w:rPr>
+        <w:t xml:space="preserve">，记校准时的候选分布为</w:t>
+      </w:r>
+      <w:r>
+        <w:rPr>
+          <w:rFonts w:hint="eastAsia"/>
+        </w:rPr>
+        <w:t xml:space="preserve"> </w:t>
+      </w:r>
+      <m:oMath>
+        <m:r>
+          <m:t>P</m:t>
+        </m:r>
+      </m:oMath>
+      <w:r>
+        <w:rPr>
+          <w:rFonts w:hint="eastAsia"/>
+        </w:rPr>
+        <w:t xml:space="preserve">，某次决策时的候选分布为</w:t>
+      </w:r>
+      <w:r>
+        <w:rPr>
+          <w:rFonts w:hint="eastAsia"/>
+        </w:rPr>
+        <w:t xml:space="preserve"> </w:t>
+      </w:r>
+      <m:oMath>
+        <m:r>
+          <m:t>Q</m:t>
+        </m:r>
+      </m:oMath>
+      <w:r>
+        <w:rPr>
+          <w:rFonts w:hint="eastAsia"/>
+        </w:rPr>
+        <w:t xml:space="preserve">，两者的总变差距离为</w:t>
+      </w:r>
+      <w:r>
+        <w:rPr>
+          <w:rFonts w:hint="eastAsia"/>
+        </w:rPr>
+        <w:t xml:space="preserve"> </w:t>
+      </w:r>
+      <m:oMath>
+        <m:r>
+          <m:rPr>
+            <m:sty m:val="p"/>
+          </m:rPr>
+          <m:t>T</m:t>
+        </m:r>
+        <m:r>
+          <m:rPr>
+            <m:sty m:val="p"/>
+          </m:rPr>
+          <m:t>V</m:t>
+        </m:r>
+        <m:r>
+          <m:rPr>
+            <m:sty m:val="p"/>
+          </m:rPr>
+          <m:t>(</m:t>
+        </m:r>
+        <m:r>
+          <m:t>P</m:t>
+        </m:r>
+        <m:r>
+          <m:rPr>
+            <m:sty m:val="p"/>
+          </m:rPr>
+          <m:t>,</m:t>
+        </m:r>
+        <m:r>
+          <m:t>Q</m:t>
+        </m:r>
+        <m:r>
+          <m:rPr>
+            <m:sty m:val="p"/>
+          </m:rPr>
+          <m:t>)</m:t>
+        </m:r>
+      </m:oMath>
+      <w:r>
+        <w:rPr>
+          <w:rFonts w:hint="eastAsia"/>
+        </w:rPr>
+        <w:t xml:space="preserve">，则部署风险满足</w:t>
+      </w:r>
+    </w:p>
+    <w:p>
+      <w:pPr>
+        <w:ind w:firstLineChars="200" w:firstLine="420"/>
+      </w:pPr>
+      <m:oMathPara>
+        <m:oMathParaPr>
+          <m:jc m:val="center"/>
+        </m:oMathParaPr>
+        <m:oMath>
+          <m:sSub>
+            <m:e>
+              <m:r>
+                <m:rPr>
+                  <m:sty m:val="p"/>
+                  <m:scr m:val="double-struck"/>
+                </m:rPr>
+                <m:t>E</m:t>
+              </m:r>
+            </m:e>
+            <m:sub>
+              <m:r>
+                <m:t>Q</m:t>
+              </m:r>
+            </m:sub>
+          </m:sSub>
+          <m:r>
+            <m:rPr>
+              <m:sty m:val="p"/>
+            </m:rPr>
+            <m:t>[</m:t>
+          </m:r>
+          <m:r>
+            <m:t>L</m:t>
+          </m:r>
+          <m:r>
+            <m:rPr>
+              <m:sty m:val="p"/>
+            </m:rPr>
+            <m:t>]</m:t>
+          </m:r>
+          <m:r>
+            <m:rPr>
+              <m:sty m:val="p"/>
+            </m:rPr>
+            <m:t>≤</m:t>
+          </m:r>
+          <m:sSub>
+            <m:e>
+              <m:r>
+                <m:rPr>
+                  <m:sty m:val="p"/>
+                  <m:scr m:val="double-struck"/>
+                </m:rPr>
+                <m:t>E</m:t>
+              </m:r>
+            </m:e>
+            <m:sub>
+              <m:r>
+                <m:t>P</m:t>
+              </m:r>
+            </m:sub>
+          </m:sSub>
+          <m:r>
+            <m:rPr>
+              <m:sty m:val="p"/>
+            </m:rPr>
+            <m:t>[</m:t>
+          </m:r>
+          <m:r>
+            <m:t>L</m:t>
+          </m:r>
+          <m:r>
+            <m:rPr>
+              <m:sty m:val="p"/>
+            </m:rPr>
+            <m:t>]</m:t>
+          </m:r>
+          <m:r>
+            <m:rPr>
+              <m:sty m:val="p"/>
+            </m:rPr>
+            <m:t>+</m:t>
+          </m:r>
+          <m:r>
+            <m:rPr>
+              <m:sty m:val="p"/>
+            </m:rPr>
+            <m:t>T</m:t>
+          </m:r>
+          <m:r>
+            <m:rPr>
+              <m:sty m:val="p"/>
+            </m:rPr>
+            <m:t>V</m:t>
+          </m:r>
+          <m:r>
+            <m:rPr>
+              <m:sty m:val="p"/>
+            </m:rPr>
+            <m:t>(</m:t>
+          </m:r>
+          <m:r>
+            <m:t>P</m:t>
+          </m:r>
+          <m:r>
+            <m:rPr>
+              <m:sty m:val="p"/>
+            </m:rPr>
+            <m:t>,</m:t>
+          </m:r>
+          <m:r>
+            <m:t>Q</m:t>
+          </m:r>
+          <m:r>
+            <m:rPr>
+              <m:sty m:val="p"/>
+            </m:rPr>
+            <m:t>)</m:t>
+          </m:r>
+          <m:r>
+            <m:rPr>
+              <m:sty m:val="p"/>
+            </m:rPr>
+            <m:t>≤</m:t>
+          </m:r>
+          <m:r>
+            <m:t>α</m:t>
+          </m:r>
+          <m:r>
+            <m:rPr>
+              <m:sty m:val="p"/>
+            </m:rPr>
+            <m:t>+</m:t>
+          </m:r>
+          <m:r>
+            <m:rPr>
+              <m:sty m:val="p"/>
+            </m:rPr>
+            <m:t>T</m:t>
+          </m:r>
+          <m:r>
+            <m:rPr>
+              <m:sty m:val="p"/>
+            </m:rPr>
+            <m:t>V</m:t>
+          </m:r>
+          <m:r>
+            <m:rPr>
+              <m:sty m:val="p"/>
+            </m:rPr>
+            <m:t>(</m:t>
+          </m:r>
+          <m:r>
+            <m:t>P</m:t>
+          </m:r>
+          <m:r>
+            <m:rPr>
+              <m:sty m:val="p"/>
+            </m:rPr>
+            <m:t>,</m:t>
+          </m:r>
+          <m:r>
+            <m:t>Q</m:t>
+          </m:r>
+          <m:r>
+            <m:rPr>
+              <m:sty m:val="p"/>
+            </m:rPr>
+            <m:t>)</m:t>
+          </m:r>
+        </m:oMath>
+      </m:oMathPara>
+    </w:p>
+    <w:p>
+      <w:pPr>
+        <w:ind w:firstLineChars="200" w:firstLine="420"/>
+      </w:pPr>
+      <w:r>
+        <w:rPr>
+          <w:rFonts w:hint="eastAsia"/>
+        </w:rPr>
+        <w:t xml:space="preserve">进一步，若在两次标定之间发生</w:t>
       </w:r>
       <w:r>
         <w:rPr>
@@ -10410,7 +11197,446 @@
         <w:rPr>
           <w:rFonts w:hint="eastAsia"/>
         </w:rPr>
-        <w:t xml:space="preserve">次决策重新标定一次，把两次标定之间的阈值视为固定值。定理 3 给出的结构上界在此期间仍然成立，因此重新标定的间隔只影响损害率保证的紧致程度，不影响结构安全性。</w:t>
+        <w:t xml:space="preserve">次更新，奖励截断上界为</w:t>
+      </w:r>
+      <w:r>
+        <w:rPr>
+          <w:rFonts w:hint="eastAsia"/>
+        </w:rPr>
+        <w:t xml:space="preserve"> </w:t>
+      </w:r>
+      <m:oMath>
+        <m:r>
+          <m:t>q</m:t>
+        </m:r>
+      </m:oMath>
+      <w:r>
+        <w:rPr>
+          <w:rFonts w:hint="eastAsia"/>
+        </w:rPr>
+        <w:t xml:space="preserve">，各格子在此期间的最小访问计数为</w:t>
+      </w:r>
+      <w:r>
+        <w:rPr>
+          <w:rFonts w:hint="eastAsia"/>
+        </w:rPr>
+        <w:t xml:space="preserve"> </w:t>
+      </w:r>
+      <m:oMath>
+        <m:sSub>
+          <m:e>
+            <m:r>
+              <m:t>n</m:t>
+            </m:r>
+          </m:e>
+          <m:sub>
+            <m:r>
+              <m:rPr>
+                <m:nor/>
+                <m:sty m:val="p"/>
+              </m:rPr>
+              <m:t>min</m:t>
+            </m:r>
+          </m:sub>
+        </m:sSub>
+      </m:oMath>
+      <w:r>
+        <w:rPr>
+          <w:rFonts w:hint="eastAsia"/>
+        </w:rPr>
+        <w:t xml:space="preserve">，且任意状态下最优动作与次优动作的置信上界之差不小于</w:t>
+      </w:r>
+      <w:r>
+        <w:rPr>
+          <w:rFonts w:hint="eastAsia"/>
+        </w:rPr>
+        <w:t xml:space="preserve"> </w:t>
+      </w:r>
+      <m:oMath>
+        <m:r>
+          <m:t>γ</m:t>
+        </m:r>
+      </m:oMath>
+      <w:r>
+        <w:rPr>
+          <w:rFonts w:hint="eastAsia"/>
+        </w:rPr>
+        <w:t xml:space="preserve">，则</w:t>
+      </w:r>
+    </w:p>
+    <w:p>
+      <w:pPr>
+        <w:ind w:firstLineChars="200" w:firstLine="420"/>
+      </w:pPr>
+      <m:oMathPara>
+        <m:oMathParaPr>
+          <m:jc m:val="center"/>
+        </m:oMathParaPr>
+        <m:oMath>
+          <m:r>
+            <m:rPr>
+              <m:sty m:val="p"/>
+            </m:rPr>
+            <m:t>T</m:t>
+          </m:r>
+          <m:r>
+            <m:rPr>
+              <m:sty m:val="p"/>
+            </m:rPr>
+            <m:t>V</m:t>
+          </m:r>
+          <m:r>
+            <m:rPr>
+              <m:sty m:val="p"/>
+            </m:rPr>
+            <m:t>(</m:t>
+          </m:r>
+          <m:r>
+            <m:t>P</m:t>
+          </m:r>
+          <m:r>
+            <m:rPr>
+              <m:sty m:val="p"/>
+            </m:rPr>
+            <m:t>,</m:t>
+          </m:r>
+          <m:r>
+            <m:t>Q</m:t>
+          </m:r>
+          <m:r>
+            <m:rPr>
+              <m:sty m:val="p"/>
+            </m:rPr>
+            <m:t>)</m:t>
+          </m:r>
+          <m:r>
+            <m:rPr>
+              <m:sty m:val="p"/>
+            </m:rPr>
+            <m:t>≤</m:t>
+          </m:r>
+          <m:f>
+            <m:fPr>
+              <m:type m:val="bar"/>
+            </m:fPr>
+            <m:num>
+              <m:r>
+                <m:t>2</m:t>
+              </m:r>
+              <m:r>
+                <m:t>q</m:t>
+              </m:r>
+              <m:sSub>
+                <m:e>
+                  <m:r>
+                    <m:t>T</m:t>
+                  </m:r>
+                </m:e>
+                <m:sub>
+                  <m:r>
+                    <m:rPr>
+                      <m:sty m:val="p"/>
+                    </m:rPr>
+                    <m:t>c</m:t>
+                  </m:r>
+                  <m:r>
+                    <m:rPr>
+                      <m:sty m:val="p"/>
+                    </m:rPr>
+                    <m:t>a</m:t>
+                  </m:r>
+                  <m:r>
+                    <m:rPr>
+                      <m:sty m:val="p"/>
+                    </m:rPr>
+                    <m:t>l</m:t>
+                  </m:r>
+                </m:sub>
+              </m:sSub>
+            </m:num>
+            <m:den>
+              <m:r>
+                <m:t>γ</m:t>
+              </m:r>
+              <m:sSub>
+                <m:e>
+                  <m:r>
+                    <m:t>n</m:t>
+                  </m:r>
+                </m:e>
+                <m:sub>
+                  <m:r>
+                    <m:rPr>
+                      <m:nor/>
+                      <m:sty m:val="p"/>
+                    </m:rPr>
+                    <m:t>min</m:t>
+                  </m:r>
+                </m:sub>
+              </m:sSub>
+            </m:den>
+          </m:f>
+        </m:oMath>
+      </m:oMathPara>
+    </w:p>
+    <w:p>
+      <w:pPr>
+        <w:ind w:firstLineChars="200" w:firstLine="420"/>
+      </w:pPr>
+      <w:r>
+        <w:rPr>
+          <w:rFonts w:hint="eastAsia"/>
+        </w:rPr>
+        <w:t xml:space="preserve">证明的思路分三步。第一步用有界风险函数在两个分布上期望之差受总变差距离控制这一标准事实，结合定理 4 给出的校准分布上的保证，得到第一个不等式。第二步刻画价值表的变化，增量更新每次对某个格子的改变是奖励与当前估计之差除以访问计数，奖励经截断后有界，因此单次改变不超过截断上界与访问计数之比，</w:t>
+      </w:r>
+      <m:oMath>
+        <m:sSub>
+          <m:e>
+            <m:r>
+              <m:t>T</m:t>
+            </m:r>
+          </m:e>
+          <m:sub>
+            <m:r>
+              <m:rPr>
+                <m:sty m:val="p"/>
+              </m:rPr>
+              <m:t>c</m:t>
+            </m:r>
+            <m:r>
+              <m:rPr>
+                <m:sty m:val="p"/>
+              </m:rPr>
+              <m:t>a</m:t>
+            </m:r>
+            <m:r>
+              <m:rPr>
+                <m:sty m:val="p"/>
+              </m:rPr>
+              <m:t>l</m:t>
+            </m:r>
+          </m:sub>
+        </m:sSub>
+      </m:oMath>
+      <w:r>
+        <w:rPr>
+          <w:rFonts w:hint="eastAsia"/>
+        </w:rPr>
+        <w:t xml:space="preserve"> </w:t>
+      </w:r>
+      <w:r>
+        <w:rPr>
+          <w:rFonts w:hint="eastAsia"/>
+        </w:rPr>
+        <w:t xml:space="preserve">次更新的累积改变不超过其</w:t>
+      </w:r>
+      <w:r>
+        <w:rPr>
+          <w:rFonts w:hint="eastAsia"/>
+        </w:rPr>
+        <w:t xml:space="preserve"> </w:t>
+      </w:r>
+      <m:oMath>
+        <m:sSub>
+          <m:e>
+            <m:r>
+              <m:t>T</m:t>
+            </m:r>
+          </m:e>
+          <m:sub>
+            <m:r>
+              <m:rPr>
+                <m:sty m:val="p"/>
+              </m:rPr>
+              <m:t>c</m:t>
+            </m:r>
+            <m:r>
+              <m:rPr>
+                <m:sty m:val="p"/>
+              </m:rPr>
+              <m:t>a</m:t>
+            </m:r>
+            <m:r>
+              <m:rPr>
+                <m:sty m:val="p"/>
+              </m:rPr>
+              <m:t>l</m:t>
+            </m:r>
+          </m:sub>
+        </m:sSub>
+      </m:oMath>
+      <w:r>
+        <w:rPr>
+          <w:rFonts w:hint="eastAsia"/>
+        </w:rPr>
+        <w:t xml:space="preserve"> </w:t>
+      </w:r>
+      <w:r>
+        <w:rPr>
+          <w:rFonts w:hint="eastAsia"/>
+        </w:rPr>
+        <w:t xml:space="preserve">倍。第三步把价值变化换算为分布变化，上置信界是确定性策略，动作分布只在两个动作的置信上界发生交叉时才改变，而间隔条件保证价值改变量小于</w:t>
+      </w:r>
+      <w:r>
+        <w:rPr>
+          <w:rFonts w:hint="eastAsia"/>
+        </w:rPr>
+        <w:t xml:space="preserve"> </w:t>
+      </w:r>
+      <m:oMath>
+        <m:r>
+          <m:t>γ</m:t>
+        </m:r>
+      </m:oMath>
+      <w:r>
+        <w:rPr>
+          <w:rFonts w:hint="eastAsia"/>
+        </w:rPr>
+        <w:t xml:space="preserve"> </w:t>
+      </w:r>
+      <w:r>
+        <w:rPr>
+          <w:rFonts w:hint="eastAsia"/>
+        </w:rPr>
+        <w:t xml:space="preserve">时排序不会翻转，由此得到第二个不等式。</w:t>
+      </w:r>
+    </w:p>
+    <w:p>
+      <w:pPr>
+        <w:ind w:firstLineChars="200" w:firstLine="420"/>
+      </w:pPr>
+      <w:r>
+        <w:rPr>
+          <w:rFonts w:hint="eastAsia"/>
+        </w:rPr>
+        <w:t>定理 5 说明保证的退化与标定间隔成正比、与已积累的访问次数成反比。学习早期访问次数少，同样的间隔带来的退化更大，因此早期应当标定得更密，随着访问次数积累，同样的间隔所对应的退化自动收窄。这为</w:t>
+      </w:r>
+      <w:r>
+        <w:rPr>
+          <w:rFonts w:hint="eastAsia"/>
+        </w:rPr>
+        <w:t xml:space="preserve"> </w:t>
+      </w:r>
+      <m:oMath>
+        <m:sSub>
+          <m:e>
+            <m:r>
+              <m:t>T</m:t>
+            </m:r>
+          </m:e>
+          <m:sub>
+            <m:r>
+              <m:rPr>
+                <m:sty m:val="p"/>
+              </m:rPr>
+              <m:t>c</m:t>
+            </m:r>
+            <m:r>
+              <m:rPr>
+                <m:sty m:val="p"/>
+              </m:rPr>
+              <m:t>a</m:t>
+            </m:r>
+            <m:r>
+              <m:rPr>
+                <m:sty m:val="p"/>
+              </m:rPr>
+              <m:t>l</m:t>
+            </m:r>
+          </m:sub>
+        </m:sSub>
+      </m:oMath>
+      <w:r>
+        <w:rPr>
+          <w:rFonts w:hint="eastAsia"/>
+        </w:rPr>
+        <w:t xml:space="preserve"> </w:t>
+      </w:r>
+      <w:r>
+        <w:rPr>
+          <w:rFonts w:hint="eastAsia"/>
+        </w:rPr>
+        <w:t xml:space="preserve">的选取提供了依据，此前只有策略变化快时应当缩短这一定性说法。需要指明该结论依赖间隔条件</w:t>
+      </w:r>
+      <w:r>
+        <w:rPr>
+          <w:rFonts w:hint="eastAsia"/>
+        </w:rPr>
+        <w:t xml:space="preserve"> </w:t>
+      </w:r>
+      <m:oMath>
+        <m:r>
+          <m:t>γ</m:t>
+        </m:r>
+      </m:oMath>
+      <w:r>
+        <w:rPr>
+          <w:rFonts w:hint="eastAsia"/>
+        </w:rPr>
+        <w:t xml:space="preserve"> </w:t>
+      </w:r>
+      <w:r>
+        <w:rPr>
+          <w:rFonts w:hint="eastAsia"/>
+        </w:rPr>
+        <w:t xml:space="preserve">为正。上置信界是确定性策略，排序一旦翻转动作分布就跳变，若某个状态下两个动作的置信上界任意接近，则</w:t>
+      </w:r>
+      <w:r>
+        <w:rPr>
+          <w:rFonts w:hint="eastAsia"/>
+        </w:rPr>
+        <w:t xml:space="preserve"> </w:t>
+      </w:r>
+      <m:oMath>
+        <m:r>
+          <m:t>γ</m:t>
+        </m:r>
+      </m:oMath>
+      <w:r>
+        <w:rPr>
+          <w:rFonts w:hint="eastAsia"/>
+        </w:rPr>
+        <w:t xml:space="preserve"> </w:t>
+      </w:r>
+      <w:r>
+        <w:rPr>
+          <w:rFonts w:hint="eastAsia"/>
+        </w:rPr>
+        <w:t xml:space="preserve">趋于零而上界失效。该条件在实测中是否成立需要检验，检验方式是统计各状态下</w:t>
+      </w:r>
+      <w:r>
+        <w:rPr>
+          <w:rFonts w:hint="eastAsia"/>
+        </w:rPr>
+        <w:t xml:space="preserve"> </w:t>
+      </w:r>
+      <m:oMath>
+        <m:r>
+          <m:t>γ</m:t>
+        </m:r>
+      </m:oMath>
+      <w:r>
+        <w:rPr>
+          <w:rFonts w:hint="eastAsia"/>
+        </w:rPr>
+        <w:t xml:space="preserve"> </w:t>
+      </w:r>
+      <w:r>
+        <w:rPr>
+          <w:rFonts w:hint="eastAsia"/>
+        </w:rPr>
+        <w:t xml:space="preserve">的经验分布，若其下尾接近零则结论应改用期望形式而不是最坏情况形式。这一检验尚未进行。</w:t>
+      </w:r>
+    </w:p>
+    <w:p>
+      <w:pPr>
+        <w:ind w:firstLineChars="200" w:firstLine="420"/>
+      </w:pPr>
+      <w:r>
+        <w:rPr>
+          <w:rFonts w:hint="eastAsia"/>
+        </w:rPr>
+        <w:t xml:space="preserve">另有一点边界与可交换性无关。阈值网格中最保守的取值仍然对应一个正的经验风险，低于这个下界的目标水平在当前动作空间下无解，此时标定过程返回最保守的阈值，这一行为符合定义。定理 3 给出的结构上界在两次标定之间始终成立，因此标定间隔只影响损害率保证的紧致程度，不影响结构安全性。</w:t>
       </w:r>
     </w:p>
     <w:p>
@@ -10444,7 +11670,7 @@
         <w:rPr>
           <w:rFonts w:hint="eastAsia"/>
         </w:rPr>
-        <w:t xml:space="preserve">前三个模块构成了一个可以安全试错的环境，SPO 在这个环境中学习动作选择。设计这一模块的动机来自一个实测观察。在固定规则的版本中，被否决后更换动作重试的净效果为负，更换后的动作改善与恶化之比不足首次提议的十分之一。原因在于固定规则把最有把握的动作排在首位，此后的备选顺序与窗口特性无关，更换因而往往是盲目的。这说明序贯决策本身可行，问题出在备选顺序需要根据窗口类型学习。</w:t>
+        <w:t xml:space="preserve">前三个模块构成了一个可以安全试错的环境，余下的问题是如何利用这个环境改进决策。设计这一模块的动机来自一个实测观察。在固定规则的版本中，被否决后更换动作重试的净效果为负，更换后的动作改善与恶化之比不足首次提议的十分之一。原因在于固定规则把最有把握的动作排在首位，此后的备选顺序与窗口特性无关，更换因而往往是盲目的。序贯决策本身可行，问题出在备选顺序需要根据窗口类型学习。</w:t>
       </w:r>
     </w:p>
     <w:p>
@@ -11443,7 +12669,7 @@
         <w:rPr>
           <w:rFonts w:hint="eastAsia"/>
         </w:rPr>
-        <w:t xml:space="preserve">接受奖励需要设上界。定理 5 的遗憾界要求奖励有界或次高斯，而实测的效用变化两者皆非，其分布呈长尾，少数窗口的读数比中位数高出两个数量级，远超上置信界在同等规模下的探索宽度。若不设上界，持有极端值的格子将被永久选中而探索停止，这破坏的是定理的前提。因此接受奖励按训练划分上的分位数</w:t>
+        <w:t>接受奖励需要设上界。定理 6 的遗憾界要求奖励有界或次高斯，而实测的效用变化两者皆非，其分布呈长尾，少数窗口的读数比中位数高出两个数量级，远超上置信界在同等规模下的探索宽度。若不设上界，持有极端值的格子将被永久选中而探索停止，这破坏的是定理的前提。因此接受奖励按训练划分上的分位数</w:t>
       </w:r>
       <w:r>
         <w:rPr>
@@ -14275,7 +15501,7 @@
           <w:b/>
           <w:bCs/>
         </w:rPr>
-        <w:t xml:space="preserve">定理 5（屏蔽动作空间上的遗憾界）设奖励关于状态特征线性可表示且取值有界，屏蔽后的动作集</w:t>
+        <w:t>定理 6（屏蔽动作空间上的遗憾界）设奖励关于状态特征线性可表示且取值有界，屏蔽后的动作集</w:t>
       </w:r>
       <w:r>
         <w:rPr>
@@ -14586,7 +15812,7 @@
         <w:rPr>
           <w:rFonts w:hint="eastAsia"/>
         </w:rPr>
-        <w:t xml:space="preserve">定理 5 说明屏蔽在提供安全保证的同时保留了策略学习的渐近性质。比较基准取屏蔽后的最优策略，它与无约束最优策略之间的差距对应屏蔽为安全付出的代价，其大小由</w:t>
+        <w:t>定理 6 说明屏蔽在提供安全保证的同时保留了策略学习的渐近性质。比较基准取屏蔽后的最优策略，它与无约束最优策略之间的差距对应屏蔽为安全付出的代价，其大小由</w:t>
       </w:r>
       <w:r>
         <w:rPr>
@@ -15459,7 +16685,7 @@
         <w:rPr>
           <w:rFonts w:hint="eastAsia"/>
         </w:rPr>
-        <w:t xml:space="preserve">本章给出后续实验的规划，先说明数据、缺陷注入、基线、指标与超参数的设置，再按八组实验说明各自的目标与配置。前四组衡量治理后的数据质量，后四组衡量智能体的决策质量本身。</w:t>
+        <w:t xml:space="preserve">本章给出后续实验的规划，先说明数据、噪声注入、基线、指标与超参数的设置，再按九组实验说明各自的目标与配置。前四组衡量治理后的数据质量，后五组衡量智能体的决策质量本身。</w:t>
       </w:r>
     </w:p>
     <w:p>
@@ -15505,7 +16731,7 @@
         <w:rPr>
           <w:rFonts w:hint="eastAsia"/>
         </w:rPr>
-        <w:t>计划使用的数据集见表 1。这几个数据集是长期时序预测的通用基准[23,24]，与时序基础模型的评测设定一致，便于与已有工作对照。ETTh1、ETTh2、ETTm1 与 ETTm2 取自 Informer[23]，采样频率分别为小时与十五分钟。Electricity、Traffic 与 Weather 取自 Autoformer[24]，覆盖电力、交通与气象，其中 Weather 为十分钟采样。采样频率从十分钟到日跨越三个量级，可以检验方法对时间粒度的敏感性。Exchange 同样取自 Autoformer[24]，为日频金融数据，趋势缓慢且季节性弱，与其余数据集的结构差异明显，因此不作主语料，只用作真实跨域的对照层。</w:t>
+        <w:t xml:space="preserve">计划使用的数据集见表 1，覆盖工业与金融两类场景。选择两类而不是一类，是因为本文的同类校准与弃权机制都以语料存在结构异质性为前提，单一来源的语料无法检验这一前提是否被满足，这一点在 4.2 节的对应实验中展开。工业场景取电力变压器监测数据 ETTh1、ETTh2 与 ETTm1，它们是长期时序预测的通用基准[23]，采样频率为小时与十五分钟，多个通道来自同一台设备的不同测点，因此系统噪声在其上有明确的物理对应。金融场景取 TIME 基准[28]中的三项，Crypto 是四种加密资产的日频价格，US Term Structure 是美国国债期限结构的四十维工作日序列，Oil Price 是原油与成品油的十二维工作日价格。三者的通道之间都存在真实的联动关系，价格的共同波动与利率曲线的整体平移都是系统性的，与工业语料中的设备漂移在统计形态上相近而成因完全不同。两类场景的窗口在趋势强度、季节性与波动聚集上差异明显，合并为一个语料之后异质性显著高于任何单一来源。</w:t>
       </w:r>
     </w:p>
     <w:p>
@@ -15558,7 +16784,7 @@
                 <w:b/>
                 <w:bCs/>
               </w:rPr>
-              <w:t xml:space="preserve">数据集</w:t>
+              <w:t>数据集</w:t>
             </w:r>
           </w:p>
         </w:tc>
@@ -15577,7 +16803,7 @@
                 <w:b/>
                 <w:bCs/>
               </w:rPr>
-              <w:t xml:space="preserve">领域</w:t>
+              <w:t>场景</w:t>
             </w:r>
           </w:p>
         </w:tc>
@@ -15596,7 +16822,7 @@
                 <w:b/>
                 <w:bCs/>
               </w:rPr>
-              <w:t xml:space="preserve">在本文中的用途</w:t>
+              <w:t>通道数与频率</w:t>
             </w:r>
           </w:p>
         </w:tc>
@@ -15618,7 +16844,7 @@
               <w:rPr>
                 <w:rFonts w:hint="eastAsia"/>
               </w:rPr>
-              <w:t xml:space="preserve">ETTh1 与 ETTh2</w:t>
+              <w:t>ETTh1</w:t>
             </w:r>
           </w:p>
         </w:tc>
@@ -15635,7 +16861,7 @@
               <w:rPr>
                 <w:rFonts w:hint="eastAsia"/>
               </w:rPr>
-              <w:t xml:space="preserve">电力</w:t>
+              <w:t>工业，电力变压器</w:t>
             </w:r>
           </w:p>
         </w:tc>
@@ -15652,7 +16878,7 @@
               <w:rPr>
                 <w:rFonts w:hint="eastAsia"/>
               </w:rPr>
-              <w:t xml:space="preserve">主语料</w:t>
+              <w:t>7 通道，小时</w:t>
             </w:r>
           </w:p>
         </w:tc>
@@ -15674,7 +16900,7 @@
               <w:rPr>
                 <w:rFonts w:hint="eastAsia"/>
               </w:rPr>
-              <w:t xml:space="preserve">ETTm1 与 ETTm2</w:t>
+              <w:t>ETTh2</w:t>
             </w:r>
           </w:p>
         </w:tc>
@@ -15691,7 +16917,7 @@
               <w:rPr>
                 <w:rFonts w:hint="eastAsia"/>
               </w:rPr>
-              <w:t xml:space="preserve">电力</w:t>
+              <w:t>工业，电力变压器</w:t>
             </w:r>
           </w:p>
         </w:tc>
@@ -15708,7 +16934,7 @@
               <w:rPr>
                 <w:rFonts w:hint="eastAsia"/>
               </w:rPr>
-              <w:t xml:space="preserve">主语料</w:t>
+              <w:t>7 通道，小时</w:t>
             </w:r>
           </w:p>
         </w:tc>
@@ -15730,7 +16956,7 @@
               <w:rPr>
                 <w:rFonts w:hint="eastAsia"/>
               </w:rPr>
-              <w:t xml:space="preserve">Electricity</w:t>
+              <w:t>ETTm1</w:t>
             </w:r>
           </w:p>
         </w:tc>
@@ -15747,7 +16973,7 @@
               <w:rPr>
                 <w:rFonts w:hint="eastAsia"/>
               </w:rPr>
-              <w:t xml:space="preserve">电力</w:t>
+              <w:t>工业，电力变压器</w:t>
             </w:r>
           </w:p>
         </w:tc>
@@ -15764,7 +16990,7 @@
               <w:rPr>
                 <w:rFonts w:hint="eastAsia"/>
               </w:rPr>
-              <w:t xml:space="preserve">主语料</w:t>
+              <w:t>7 通道，十五分钟</w:t>
             </w:r>
           </w:p>
         </w:tc>
@@ -15786,7 +17012,7 @@
               <w:rPr>
                 <w:rFonts w:hint="eastAsia"/>
               </w:rPr>
-              <w:t xml:space="preserve">Traffic</w:t>
+              <w:t>Crypto[28]</w:t>
             </w:r>
           </w:p>
         </w:tc>
@@ -15803,7 +17029,7 @@
               <w:rPr>
                 <w:rFonts w:hint="eastAsia"/>
               </w:rPr>
-              <w:t xml:space="preserve">交通</w:t>
+              <w:t>金融，加密资产价格</w:t>
             </w:r>
           </w:p>
         </w:tc>
@@ -15820,7 +17046,7 @@
               <w:rPr>
                 <w:rFonts w:hint="eastAsia"/>
               </w:rPr>
-              <w:t xml:space="preserve">主语料</w:t>
+              <w:t>4 通道，日</w:t>
             </w:r>
           </w:p>
         </w:tc>
@@ -15842,7 +17068,7 @@
               <w:rPr>
                 <w:rFonts w:hint="eastAsia"/>
               </w:rPr>
-              <w:t xml:space="preserve">Weather</w:t>
+              <w:t>US Term Structure[28]</w:t>
             </w:r>
           </w:p>
         </w:tc>
@@ -15859,7 +17085,7 @@
               <w:rPr>
                 <w:rFonts w:hint="eastAsia"/>
               </w:rPr>
-              <w:t xml:space="preserve">气象</w:t>
+              <w:t>金融，国债期限结构</w:t>
             </w:r>
           </w:p>
         </w:tc>
@@ -15876,7 +17102,7 @@
               <w:rPr>
                 <w:rFonts w:hint="eastAsia"/>
               </w:rPr>
-              <w:t xml:space="preserve">主语料</w:t>
+              <w:t>40 通道，工作日</w:t>
             </w:r>
           </w:p>
         </w:tc>
@@ -15898,7 +17124,7 @@
               <w:rPr>
                 <w:rFonts w:hint="eastAsia"/>
               </w:rPr>
-              <w:t xml:space="preserve">Exchange</w:t>
+              <w:t>Oil Price[28]</w:t>
             </w:r>
           </w:p>
         </w:tc>
@@ -15915,7 +17141,7 @@
               <w:rPr>
                 <w:rFonts w:hint="eastAsia"/>
               </w:rPr>
-              <w:t xml:space="preserve">金融</w:t>
+              <w:t>金融，能源商品价格</w:t>
             </w:r>
           </w:p>
         </w:tc>
@@ -15932,7 +17158,7 @@
               <w:rPr>
                 <w:rFonts w:hint="eastAsia"/>
               </w:rPr>
-              <w:t xml:space="preserve">真实跨域对照层</w:t>
+              <w:t>12 通道，工作日</w:t>
             </w:r>
           </w:p>
         </w:tc>
@@ -15972,7 +17198,7 @@
         <w:rPr>
           <w:rFonts w:hint="eastAsia"/>
         </w:rPr>
-        <w:t xml:space="preserve">无标签场景下无法直接获得治理是否正确的判据，因此计划在干净窗口上注入受控缺陷并逐条记录标签。注入的缺陷共七类，覆盖 2.2 节讨论的两个范围，孤立尖峰、散点缺失、连续缺失片段与重复片段属于局部缺陷，水平位移、噪声放大与平台化属于全局缺陷。污染率设置从百分之五到百分之六十七的多个档位，采用嵌套构造，即高污染率语料包含低污染率语料的全部污染窗口，干净部分保持不变，使不同污染率之间的差异只来自污染率本身。</w:t>
+        <w:t xml:space="preserve">无标签场景下无法直接获得治理是否正确的判据，因此在干净窗口上注入受控噪声并逐条记录标签，把注入位置作为治理应当处理的对象。注入按 2.2 节的划分分为两类。随机噪声在单个通道上注入，位置与幅度独立随机，覆盖孤立尖峰、散点缺失、连续缺失片段与重复片段四种形态。系统噪声在同一时间位置的多个通道上同时注入，覆盖水平位移、噪声放大与平台化三种形态，同一次注入的多个通道共享偏移方向。注入比例设置从百分之五到百分之六十七的多个档位，采用嵌套构造，即高比例语料包含低比例语料的全部受污染窗口，干净部分保持不变，使不同比例之间的差异只来自比例本身。</w:t>
       </w:r>
     </w:p>
     <w:p>
@@ -15983,7 +17209,7 @@
         <w:rPr>
           <w:rFonts w:hint="eastAsia"/>
         </w:rPr>
-        <w:t xml:space="preserve">评测集分为六层。人工污染层是注入了上述缺陷的窗口，治理应当处理它们。普通干净层未注入任何缺陷。困难但正确层从真实数据中按结构贫乏度筛选，即季节强度与自相关都较低但完全干净的窗口。稀有有效层注入会回到基线的瞬态偏移，模拟真实的极端事件。合法变点层改变结构但对齐水平，模拟状态切换。干净分布外层由随机游走、阶梯、脉冲串与锯齿四种合成形态构成。后四层统称受保护层，它们不应被修改，因此其上的任何编辑都计为损害。另设真实跨域层，取自 Exchange 且不做注入，与合成的干净分布外层构成对照。</w:t>
+        <w:t xml:space="preserve">评测集按窗口的来源与是否被注入分为四层。注入层是施加了上述两类噪声的窗口，治理应当处理它们。干净层未做任何注入，治理不应改动它们。稀有层从真实数据中筛选，取的是取值落在分布尾部但完全未经注入的窗口，金融语料中的剧烈波动时段与工业语料中的启停时段都属于此类。困难层同样来自真实数据，取季节强度与自相关都较低因而难以预测但完全干净的窗口。后两层与干净层统称受保护层，其上的任何编辑都计为损害。稀有层与困难层取自数据本身而不是合成构造，这样保护对象的定义不依赖于注入过程，避免了设计缺陷同时又设计保护对象所带来的循环。</w:t>
       </w:r>
     </w:p>
     <w:p>
@@ -16006,7 +17232,7 @@
         <w:rPr>
           <w:rFonts w:hint="eastAsia"/>
         </w:rPr>
-        <w:t xml:space="preserve">基线覆盖三条路线并包含参照下界与上界，所有产出数据的方法均取自已发表工作，其中三项发表于 2024 年之后。（1）不治理作为参照下界，其损害恒为零。（2）知晓真值且只修改真实污染窗口的理想方法作为参照上界，两者充当坐标轴，不参与优劣比较。（3）SCREEN[5]基于速度约束做局部最优修复。（4）IMR[6]通过自回归模型迭代修复。（5）MTCSC[8]的单变量分支代表 2024 年的工作，它与 SCREEN 同属速度约束修复，是否单列由二者在本文语料上的编辑重合度决定，重合度分窗口、改动位置与修复取值三个层次测量，三个层次都高度一致才合并为一行。这三项在本文中同时承担两个角色，既作为独立方法参与对比，也作为提议者接入本文的屏蔽层，用以检验屏蔽与策略是否与具体的动作来源解耦。</w:t>
+        <w:t xml:space="preserve">基线的选取有三条标准。每一项都有可查证的正式发表出处，全部基线合起来覆盖问题所处的两个方法族，每一项都隔离出其余各项不涉及的一个变量。按这三条筛选后保留七项，非消融实验的表格一律列全这七项，某项若因协议不适用而缺列，在表中标注不适用并于表注说明理由，不得省略该行。</w:t>
       </w:r>
     </w:p>
     <w:p>
@@ -16017,7 +17243,7 @@
         <w:rPr>
           <w:rFonts w:hint="eastAsia"/>
         </w:rPr>
-        <w:t xml:space="preserve">（6）Data Shapley[9]与（7）Data-OOB[10]代表通用数据估值，（8）TimeInf[11]代表面向时序的影响函数方法，（9）TSRating[12]代表基于外部模型判断的评级方法。这一族产出样本级分数，按统一的语料层协议比较。</w:t>
+        <w:t xml:space="preserve">（1）不治理，作为参照下界，其损害恒为零，用于确认任何非零损害都来自方法本身而不是评测流程。（2）SCREEN[5]，速度约束下的局部最优修复，代表约束驱动的清洗路线，隔离的变量是修复规则完全由领域约束给定时能走到哪里。（3）IMR[6]，自回归模型迭代修复，代表统计建模驱动的清洗路线，隔离的变量是把修复依据从人工约束换成数据自身的统计结构。（4）MTCSC[8]的单变量分支，2024 年的速度约束工作，它与 SCREEN 的编辑重合度分窗口、改动位置与修复取值三个层次实测，三个层次都高度一致才合并为一行，否则各自单列。</w:t>
       </w:r>
     </w:p>
     <w:p>
@@ -16028,7 +17254,7 @@
         <w:rPr>
           <w:rFonts w:hint="eastAsia"/>
         </w:rPr>
-        <w:t xml:space="preserve">为分离策略学习与屏蔽各自的作用，另设四种对照。（10）固定规则策略配屏蔽代表本文的早期版本。（11）随机策略配屏蔽给出策略学习收益的下界。（12）学习策略不配屏蔽即把算子直接作用于原数据，代表已有强化学习清洗方案的做法。（13）只对效用信号做共形标定的单信号屏蔽用于说明合取的必要性。</w:t>
+        <w:t xml:space="preserve">（5）TimeInf[11]，把影响函数定义在时间块上再聚合到时间点，代表打分式选择路线中面向时序设计的一支。打分族的四项工作在产出形式上一致，都给样本分数再按分数取舍，彼此的差别在估值器而不在产出，而本文的比较发生在整备后语料这一层，因此保留面向时序的 TimeInf 与通用估值中开销最低的 Data-OOB[10]两项，（6）Data-OOB 用袋外估计给出样本价值，隔离的变量是估值方法忽略时间依赖时会损失什么。Data Shapley 与 TSRating 不单列，前者与 Data-OOB 同属博弈论估值而开销高出一个量级，后者依赖外部大模型判断，其可得性不由本文控制。（7）学习策略不配屏蔽，即把算子直接作用于原数据，代表同期强化学习清洗方案的做法，隔离的变量是屏蔽本身的有无。</w:t>
       </w:r>
     </w:p>
     <w:p>
@@ -16050,7 +17276,7 @@
         <w:rPr>
           <w:rFonts w:hint="eastAsia"/>
         </w:rPr>
-        <w:t xml:space="preserve">非消融实验的表格一律列全上述十三项，某方法若因协议不适用而缺项，在表中标注不适用并于表注说明理由，不得省略该行。消融实验只含本文方法的各档变体，不要求含基线。</w:t>
+        <w:t xml:space="preserve">软惩罚、单信号屏蔽与随机策略三种对照只在针对裁决方式与策略来源的两组实验中出现，它们改变的是本文方法内部的一个环节而不是一个独立的已发表方法，因此不计入基线清单，在对应实验中作为本文方法的变体列出。消融实验只含本文方法的各档变体，不要求含基线。</w:t>
       </w:r>
     </w:p>
     <w:p>
@@ -16681,7 +17907,7 @@
         <w:rPr>
           <w:rFonts w:hint="eastAsia"/>
         </w:rPr>
-        <w:t>策略学习的训练语料与评测语料按窗口划分且不重叠，划分随机种子在实验开始前写定，训练占四成评测占六成，按分层做分层抽样使两侧都按比例含全部六层。种子在运行之前写定，可以避免重跑落到更有利的划分上。评测集取较大的一半，所有主要指标都在其上报告。</w:t>
+        <w:t xml:space="preserve">策略学习的训练语料与评测语料按窗口划分且不重叠，划分随机种子在实验开始前写定，训练占四成评测占六成，按分层做分层抽样使两侧都按比例含全部四层。种子在运行之前写定，可以避免重跑落到更有利的划分上。评测集取较大的一半，所有主要指标都在其上报告。</w:t>
       </w:r>
     </w:p>
     <w:p>
@@ -16718,7 +17944,7 @@
         <w:rPr>
           <w:rFonts w:hint="eastAsia"/>
         </w:rPr>
-        <w:t xml:space="preserve">实验一确认问题设定成立，即模型行为信号在部分干净数据上会给出与有害性相反的读数。干净分布外层由随机游走、阶梯、脉冲串与锯齿四种合成形态构成，真实跨域层取自 Exchange 且不做注入，两组数据都是干净的且都属于分布外。按形态分别统计行为风险的分布并作对照，若信号度量的是可预测程度，两组的读数会分居两端。同时统计各层的编辑经济学，即每破坏单位方差换到的效用增益</w:t>
+        <w:t xml:space="preserve">实验一确认问题设定成立，即模型行为信号在部分干净数据上会给出与有害性相反的读数。对照取自同为干净但结构相差很远的两组窗口，一组是困难层中季节强度与自相关都很低的窗口，另一组是稀有层中取值落在分布尾部的窗口，两组都未经任何注入。分别统计行为风险的分布并与注入层对照，若信号度量的是可预测程度，三组的读数会按结构复杂度而不是按是否被污染排列。同时统计各层的编辑经济学，即每破坏单位方差换到的效用增益</w:t>
       </w:r>
       <w:r>
         <w:rPr>
@@ -16895,7 +18121,18 @@
         <w:rPr>
           <w:rFonts w:hint="eastAsia"/>
         </w:rPr>
-        <w:t xml:space="preserve">实验八量化各模块的边际贡献并检验方法对超参数的稳健性。消融包含无屏蔽、无效用条件、无结构条件、无同类校准、无策略学习、无预算分配、无候选注入与完整方法八档，每档报告损害与修复两栏，并额外报告每次编辑的平均损害与平均修复，以消除编辑数差异的干扰。敏感性部分扫描目标损害率</w:t>
+        <w:t xml:space="preserve">实验八检验同类校准与弃权的生效条件。3.1 节指出同类校准的收益依赖语料存在结构异质性，在同质语料上应当趋于零，这一点给出了可检验的预测。构造异质性递增的语料序列，从单一工业来源开始逐步混入金融场景的窗口，异质性用画像空间中窗口两两距离的分散程度度量，度量方式在实验开始前定死。在每个异质性水平上比较同类校准与全局标准化两种做法的损害与修复，并统计弃权的触发次数。若收益随异质性单调上升则该解释成立，若在任何异质性水平下都没有差别，则这两个模块在本文设定下不必要，应当如实报告并考虑简化方法。</w:t>
+      </w:r>
+    </w:p>
+    <w:p>
+      <w:pPr>
+        <w:ind w:firstLineChars="200" w:firstLine="420"/>
+      </w:pPr>
+      <w:r>
+        <w:rPr>
+          <w:rFonts w:hint="eastAsia"/>
+        </w:rPr>
+        <w:t xml:space="preserve">实验九量化各模块的边际贡献并检验方法对超参数的稳健性。消融包含无屏蔽、无效用条件、无结构条件、无同类校准、无策略学习、无预算分配、无候选注入与完整方法八档，每档报告损害与修复两栏，并额外报告每次编辑的平均损害与平均修复，以消除编辑数差异的干扰。敏感性部分扫描目标损害率</w:t>
       </w:r>
       <w:r>
         <w:rPr>
@@ -16938,13 +18175,7 @@
         <w:rPr>
           <w:rFonts w:hint="eastAsia"/>
         </w:rPr>
-        <w:t xml:space="preserve"> </w:t>
-      </w:r>
-      <w:r>
-        <w:rPr>
-          <w:rFonts w:hint="eastAsia"/>
-        </w:rPr>
-        <w:t xml:space="preserve">与注入概率</w:t>
+        <w:t xml:space="preserve">、注入概率</w:t>
       </w:r>
       <w:r>
         <w:rPr>
@@ -16985,7 +18216,54 @@
         <w:rPr>
           <w:rFonts w:hint="eastAsia"/>
         </w:rPr>
-        <w:t xml:space="preserve">，并对照代理模型与真实基础模型两种探测器。</w:t>
+        <w:t xml:space="preserve"> </w:t>
+      </w:r>
+      <w:r>
+        <w:rPr>
+          <w:rFonts w:hint="eastAsia"/>
+        </w:rPr>
+        <w:t xml:space="preserve">与标定间隔</w:t>
+      </w:r>
+      <w:r>
+        <w:rPr>
+          <w:rFonts w:hint="eastAsia"/>
+        </w:rPr>
+        <w:t xml:space="preserve"> </w:t>
+      </w:r>
+      <m:oMath>
+        <m:sSub>
+          <m:e>
+            <m:r>
+              <m:t>T</m:t>
+            </m:r>
+          </m:e>
+          <m:sub>
+            <m:r>
+              <m:rPr>
+                <m:sty m:val="p"/>
+              </m:rPr>
+              <m:t>c</m:t>
+            </m:r>
+            <m:r>
+              <m:rPr>
+                <m:sty m:val="p"/>
+              </m:rPr>
+              <m:t>a</m:t>
+            </m:r>
+            <m:r>
+              <m:rPr>
+                <m:sty m:val="p"/>
+              </m:rPr>
+              <m:t>l</m:t>
+            </m:r>
+          </m:sub>
+        </m:sSub>
+      </m:oMath>
+      <w:r>
+        <w:rPr>
+          <w:rFonts w:hint="eastAsia"/>
+        </w:rPr>
+        <w:t xml:space="preserve">，其中标定间隔一档用于检验定理 5 给出的退化上界与实测退化是否吻合，并统计各状态下置信上界间隔的经验分布，以判断该定理所需的间隔条件在本文设定中是否成立。</w:t>
       </w:r>
     </w:p>
     <w:p>
@@ -17014,7 +18292,7 @@
         <w:rPr>
           <w:rFonts w:hint="eastAsia"/>
         </w:rPr>
-        <w:t xml:space="preserve">本文面向时序基础模型的语料治理问题，提出屏蔽强化学习驱动的智能体 IntroAct-TS。该方法把每次数据修改当作一次待验证的干预，由双证据状态构建、沙箱干预重测、共形标定的双信号屏蔽与屏蔽反馈策略优化四个模块构成闭环。核心设计在于让屏蔽承担双重职责，它在拦下破坏性动作的同时决定了哪些奖励能够到达策略，使策略学到的是能通过结构检验的修复方式，避免了直接以模型效用为奖励时转向抹平数据的失效模式。由于所有试错都发生在副本上，探索过程不修改语料，智能体因而可以在真实数据上学习而不付出破坏代价。本文给出五条性质及其证明，涵盖合取屏蔽的损害单调性、非阻塞性、任意策略下的结构安全性、共形风险控制以及屏蔽动作空间上的遗憾界。</w:t>
+        <w:t xml:space="preserve">本文面向时序基础模型的语料治理问题，提出屏蔽强化学习驱动的智能体 IntroAct-TS。该方法把每次数据修改当作一次待验证的干预，由双证据状态构建、沙箱干预重测、共形标定的双信号屏蔽与屏蔽反馈策略优化四个模块构成闭环。核心设计在于让屏蔽承担双重职责，它在拦下破坏性动作的同时决定了哪些奖励能够到达策略，使策略学到的是能通过结构检验的修复方式，避免了直接以模型效用为奖励时转向抹平数据的失效模式。由于所有试错都发生在副本上，探索过程不修改语料，智能体因而可以在真实数据上学习而不付出破坏代价。本文给出六条定理与一条命题及其证明，其中标定间隔内保证退化的上界把共形风险控制与策略的更新速率联系起来，为重新标定的频率提供了定量依据，而软惩罚的损害下界说明把结构约束写成目标函数中的一项与写成硬条件并不等价。</w:t>
       </w:r>
     </w:p>
     <w:p>
@@ -17054,7 +18332,7 @@
         <w:rPr>
           <w:rFonts w:hint="eastAsia"/>
         </w:rPr>
-        <w:t xml:space="preserve">本章记录当前实现中遇到的主要问题、由此确定的改进方向与目前的进度。已发现的问题分三类，一类是实现缺陷，改正后现象消失，一类是设计取舍带来的固有限制，另一类源于实验设计本身。</w:t>
+        <w:t xml:space="preserve">方法与实验规划给出的是打算做到什么，本章记录实际做的过程中遇到了什么。已发现的问题分三类，一类是实现缺陷，改正之后现象消失，一类是设计取舍带来的固有限制，改不掉只能说明，另一类源于实验设计本身，需要重新安排对照才能回答。</w:t>
       </w:r>
     </w:p>
     <w:p>
@@ -17765,6 +19043,15 @@
           <w:rFonts w:hint="eastAsia"/>
         </w:rPr>
         <w:t xml:space="preserve">[27] Killick R, Fearnhead P, Eckley I A. Optimal detection of changepoints with a linear computational cost[J]. Journal of the American Statistical Association, 2012, 107(500): 1590-1598</w:t>
+      </w:r>
+    </w:p>
+    <w:p>
+      <w:pPr>
+        <w:spacing w:after="0" w:line="240" w:lineRule="auto"/>
+        <w:ind w:leftChars="0" w:left="420" w:hangingChars="200" w:hanging="420"/>
+      </w:pPr>
+      <w:r>
+        <w:t xml:space="preserve">[28] Real-TSF Team. TIME: A benchmark of real world time series for forecasting model evaluation[EB/OL]. Hugging Face dataset, 2025</w:t>
       </w:r>
     </w:p>
     <w:sectPr>

</xml_diff>

<commit_message>
Rebuild the narrative around one decision, judge after execution on a reversible copy
</commit_message>
<xml_diff>
--- a/docx/胡宏彬-进度文档-20260820.docx
+++ b/docx/胡宏彬-进度文档-20260820.docx
@@ -54,7 +54,7 @@
         <w:rPr>
           <w:rFonts w:hint="eastAsia"/>
         </w:rPr>
-        <w:t xml:space="preserve">时序基础模型的能力上限越来越取决于训练语料的质量。已有的治理方法或者只给样本打一个质量分再按分数取舍，或者按固定规则选定清洗算子后直接覆盖原值，都没有回答一次具体的修改是否值得提交。把治理交给可学习的智能体会遇到两个障碍，来自模型的效用反馈在部分数据上与有害性方向相反，直接用它当奖励会把策略训练成抹平数据，而在真实语料上试错学习又要以破坏数据为代价。本文提出屏蔽强化学习驱动的时序数据治理智能体 IntroAct-TS。方法由四个模块构成，双证据状态构建融合统计画像与冻结基础模型的行为探测形成决策状态，沙箱干预重测在副本上试执行候选动作并生成可比的奖励读数，共形标定的双信号屏蔽要求模型效用与时序结构同时通过检验才允许提交，屏蔽反馈策略优化用屏蔽后的奖励更新动作选择并在语料内分配探测预算。屏蔽层在这一设计中承担双重职责，它既是安全约束也是奖励塑形器，使策略学到的是能通过结构检验的修复方式。由于所有试错都发生在副本上，探索过程本身不修改语料，智能体因而可以在不付出破坏代价的前提下学习。本文给出六条定理与一条命题及其证明，涵盖合取屏蔽的损害单调性、非阻塞性、任意策略下的结构安全性、共形风险控制、标定间隔内保证退化的上界以及屏蔽动作空间上的遗憾界，并说明把结构约束写成惩罚项时损害率存在不可消除的下界，在此基础上规划了九组实验。</w:t>
+        <w:t xml:space="preserve">时序基础模型的能力上限越来越取决于训练语料的质量，而语料治理有一处特殊的困难，一次修改是否有害取决于被修改的那段数据，不取决于修改本身。同一个去尖峰算子作用在传感器故障上是修复，作用在真实发生的极端事件上是破坏，因此有害与否无法在动作执行之前判定。已有方法或者不动手只给样本打分，或者动手之后不再回头核对，都没有正面处理这一点。本文把判定推迟到执行之后，并把执行放在副本上，使判错的动作可以撤回。这一个决定引出两个必须解决的问题。事后判定需要依据，而能报告修改效果的只有目标模型，模型在被抹平的数据上给出的读数与有害性方向相反，单凭它会放行破坏性的修改，本文因此要求模型效用与时序结构两个相互独立的条件同时成立才允许提交，并用共形风险控制把结构条件的阈值标定到给定的损害率上。判定的结果同时是一次反馈，策略可以据此改进动作选择，而试错既然发生在副本上，学习过程本身就不修改语料。屏蔽因而承担双重职责，它拦下破坏性动作，也决定了哪些奖励能够到达策略。本文给出六条定理与一条命题及其证明，涵盖合取判定的损害单调性、非阻塞性、任意策略下的结构安全性、共形风险控制、标定间隔内保证退化的上界与屏蔽动作空间上的遗憾界，并说明把结构约束写成惩罚项时损害率存在不可消除的下界，在此基础上规划了九组实验。</w:t>
       </w:r>
     </w:p>
     <w:p>
@@ -68,8 +68,14 @@
         <w:rPr>
           <w:rFonts w:hint="eastAsia"/>
         </w:rPr>
-        <w:t>时序基础模型在大规模多来源语料上预训练，再迁移到预测、分类与插补等下游任务[1-4]，模型结构趋于稳定之后，能力上限主要由训练语料的质量决定。真实语料中的缺失、噪声、尖峰与漂移会被模型当作规律学习，因此在训练之前需要对语料做治理。困难在于时序中大量表面异常的片段其实携带有价值的结构，治理一旦失手，删掉的往往正是模型最需要的稀有模式。这使得数据治理不能停留在识别与修复，还需要判断每一次修改是否真的值得提交，并在判断出错时能够撤回。本文把这个判断交给一个可以从反馈中学习的智能体来完成。</w:t>
-      </w:r>
+        <w:t xml:space="preserve">时序基础模型在大规模多来源语料上预训练，再迁移到预测、分类与插补等下游任务[1-4]，模型结构趋于稳定之后，能力上限主要由训练语料的质量决定。真实语料中的缺失、噪声、尖峰与漂移会被模型当作规律学习，训练之前需要对语料做治理。治理的困难不在于找出这些异常，而在于判断找出来之后该不该动。以电力变压器监测语料为例，设备检修期间的一段水平漂移应当处理，它会让模型把异常水平当作正常基线，在随后的正常时段给出系统性偏高的预测。而一次真实发生的负荷突增在波形上与故障尖峰几乎一致，却是语料中最有价值的部分，抹掉它等于删去模型最需要学习的稀有模式。两者的区别不在算子也不在参数，同一个去尖峰算子带同样的参数施加下去，前者是修复后者是破坏，结果取决于那段数据里原本承载着什么。这决定了有害与否无法在动作执行之前判定。</w:t>
+      </w:r>
+    </w:p>
+    <w:p>
+      <w:pPr/>
+    </w:p>
+    <w:p>
+      <w:pPr/>
     </w:p>
     <w:p>
       <w:pPr>
@@ -79,7 +85,7 @@
         <w:rPr>
           <w:rFonts w:hint="eastAsia"/>
         </w:rPr>
-        <w:t xml:space="preserve">这项工作的动机来自劣质数据的双重代价。以电力变压器监测语料为例，设备检修期间产生的整段水平漂移会让模型把异常水平当作正常基线，在随后的正常时段给出系统性偏高的预测，误差可以持续到漂移结束之后很久。这是性能上的代价。与之并行的是处理上的代价，传统的先清洗再训练需要人工设定规则与阈值，在语料规模达到十万量级窗口时，人力投入与判断一致性都难以维持。两种代价叠加，使得自动化且可控的语料治理成为时序基础模型训练链条中一个绕不开的环节。</w:t>
+        <w:t xml:space="preserve">面对这一困难，已有工作分两条路线，各自的处理方式与代价可以逐项说明。</w:t>
       </w:r>
     </w:p>
     <w:p>
@@ -90,14 +96,8 @@
         <w:rPr>
           <w:rFonts w:hint="eastAsia"/>
         </w:rPr>
-        <w:t xml:space="preserve">把治理做成自动化并不等于把清洗算子串起来。趋势转折、状态切换、极端峰值与分布外样本同样会让预测误差升高，仅凭误差无法把它们与真正的污染分开。一个只追求降低误差的流程会优先修改这些片段，而它们恰恰是应当保留的。本文因此关心如何区分有害的污染与困难但正确的数据，并只对确实需要处理的部分动手。</w:t>
-      </w:r>
-    </w:p>
-    <w:p>
-      <w:pPr/>
-    </w:p>
-    <w:p>
-      <w:pPr/>
+        <w:t xml:space="preserve">（1）SCREEN[5]假设相邻时间步的取值变化存在上下界，把违反约束的点修复到最近的合法取值，产出修复后的数据，算子由固定规则选定。（2）IMR[6]用自回归模型逐点估计并迭代收敛，同样产出修复数据，需要少量已知正确的点作为起始约束。（3）SpeedAcc[7]在速度之外引入加速度约束，用二阶信息约束修复的平滑程度。（4）MTCSC[8]把速度约束与聚类结合，利用维度之间的相关性提高修复精度。以上四项都在算子选定后直接覆盖原值，此后没有机制核对这次改写是否达到预期，也不涉及探索，因而不存在探索是否有损的问题。</w:t>
+      </w:r>
     </w:p>
     <w:p>
       <w:pPr>
@@ -107,7 +107,7 @@
         <w:rPr>
           <w:rFonts w:hint="eastAsia"/>
         </w:rPr>
-        <w:t xml:space="preserve">已有工作沿两条路线展开，按产出形式与是否具备执行后的核对能力可以逐一说明。</w:t>
+        <w:t xml:space="preserve">（5）Data Shapley[9]用合作博弈中的 Shapley 值刻画样本价值，产出样本分数。（6）Data-OOB[10]借助袋装模型的袋外估计把开销降到可接受范围，同样产出分数。（7）TimeInf[11]把影响函数定义在时间块上再聚合到时间点，在给出逐点分数的同时保留时序结构。（8）TSRating[12]从四个维度获取大模型的成对比较，再用元学习把这些判断蒸馏成轻量评分器。这四项不产生动作，只给排序，因此无从核对某次处理是否奏效。</w:t>
       </w:r>
     </w:p>
     <w:p>
@@ -118,7 +118,7 @@
         <w:rPr>
           <w:rFonts w:hint="eastAsia"/>
         </w:rPr>
-        <w:t xml:space="preserve">（1）SCREEN[5]假设相邻时间步的取值变化存在上下界，把违反约束的点修复到最近的合法取值，产出修复后的数据，算子由固定规则选定。（2）IMR[6]用自回归模型逐点估计并迭代收敛，同样产出修复数据，需要少量已知正确的点作为起始约束。（3）SpeedAcc[7]在速度之外引入加速度约束，用二阶信息约束修复的平滑程度。（4）MTCSC[8]把速度约束与聚类结合，利用维度之间的相关性提高修复精度。以上四项都在算子选定后直接覆盖原值，此后没有机制核对这次改写是否达到预期，也不涉及探索，因而不存在探索是否有损的问题。</w:t>
+        <w:t xml:space="preserve">（9）近期出现的清洗智能体[13]用分层策略编排清洗算子，策略可以从下游反馈中改进，是这两条路线之外的第三种做法。它的算子在训练过程中立即作用于原数据，探索阶段的错误无法撤回，安全性只能体现在训练收敛后的期望意义上。</w:t>
       </w:r>
     </w:p>
     <w:p>
@@ -129,7 +129,7 @@
         <w:rPr>
           <w:rFonts w:hint="eastAsia"/>
         </w:rPr>
-        <w:t xml:space="preserve">（5）Data Shapley[9]用合作博弈中的 Shapley 值刻画样本价值，产出样本分数。（6）Data-OOB[10]借助袋装模型的袋外估计把开销降到可接受范围，同样产出分数。（7）TimeInf[11]把影响函数定义在时间块上再聚合到时间点，在给出逐点分数的同时保留时序结构。（8）TSRating[12]从四个维度获取大模型的成对比较，再用元学习把这些判断蒸馏成轻量评分器。这四项不产生动作，只给排序，因此无从核对某次处理是否奏效。</w:t>
+        <w:t xml:space="preserve">两条路线在同一处停下。打分式选择不产生动作，因而不必判断某次修改是否有害，代价是面对一段含有尖峰的窗口只能整体丢弃，尖峰之外完好的部分一并舍去。修复式清洗补上了动作，却把判断放在了选择算子的那一刻，算子一旦选定就直接覆盖原值，此后没有任何机制核对这次改写是否达到预期。近期把算子编排交给强化学习的尝试让策略可以从反馈中改进，但算子在训练过程中立即生效，每一次错误探索都在真实语料上留下痕迹，面对拿不准的窗口也没有退回的选项。</w:t>
       </w:r>
     </w:p>
     <w:p>
@@ -140,40 +140,7 @@
         <w:rPr>
           <w:rFonts w:hint="eastAsia"/>
         </w:rPr>
-        <w:t xml:space="preserve">（9）近期出现的清洗智能体[13]用分层策略编排清洗算子，策略可以从下游反馈中改进，是这两条路线之外的第三种做法。它的算子在训练过程中立即作用于原数据，探索阶段的错误无法撤回，安全性只能体现在训练收敛后的期望意义上。（10）本文的 IntroAct-TS 同样产出修复数据并由屏蔽强化学习给出策略，区别在于每次干预之后都重新测量并据此裁决，试错发生在副本上因而探索无损，同时在语料内分配探测预算。这三项能力是前九项都不具备的，也是本文要补上的缺口。</w:t>
-      </w:r>
-    </w:p>
-    <w:p>
-      <w:pPr>
-        <w:ind w:firstLineChars="200" w:firstLine="420"/>
-      </w:pPr>
-      <w:r>
-        <w:rPr>
-          <w:rFonts w:hint="eastAsia"/>
-        </w:rPr>
-        <w:t xml:space="preserve">打分式选择的输出是一个标量，它能指出哪些数据不好，却给不出处理方式。面对一段含有尖峰的窗口，这类方法只能整体丢弃，而尖峰之外的部分往往完好。更根本的问题是这类方法不产生动作，因而也无从检验一次处理是否奏效。</w:t>
-      </w:r>
-    </w:p>
-    <w:p>
-      <w:pPr>
-        <w:ind w:firstLineChars="200" w:firstLine="420"/>
-      </w:pPr>
-      <w:r>
-        <w:rPr>
-          <w:rFonts w:hint="eastAsia"/>
-        </w:rPr>
-        <w:t xml:space="preserve">修复式清洗补上了动作这一环，代价是把判断前置到了选择算子的时刻。基于固定规则的方法在算子选定后直接覆盖原值，此后没有机制核对这次改写是否达到预期。引入强化学习本可以让策略从反馈中改进，但已有尝试把算子立即作用于原数据，于是训练期间的每一次错误探索都在真实语料上留下痕迹，学得越多损坏越多。当智能体面对自己也拿不准的窗口时，同样没有退回的选项。</w:t>
-      </w:r>
-    </w:p>
-    <w:p>
-      <w:pPr>
-        <w:ind w:firstLineChars="200" w:firstLine="420"/>
-      </w:pPr>
-      <w:r>
-        <w:rPr>
-          <w:rFonts w:hint="eastAsia"/>
-        </w:rPr>
-        <w:t xml:space="preserve">把这些缺口一并补上，需要让治理系统在动作执行之后仍然保有判断、撤销与改进的能力。构筑这样的系统会遇到三重挑战。</w:t>
+        <w:t xml:space="preserve">让判断发生在执行之后，就不再需要事先写出只关于算子与参数的安全规则，因为判断这时可以看到修改造成的实际后果。要让这样的判断有意义，执行必须可以撤回，否则判定为有害时已经无法挽回，本文因此把候选动作施加在工作副本的拷贝上，原副本只在判定通过时才被替换。这一个决定引出两个随之而来的问题。</w:t>
       </w:r>
     </w:p>
     <w:p>
@@ -186,7 +153,7 @@
           <w:b/>
           <w:bCs/>
         </w:rPr>
-        <w:t xml:space="preserve">第一重挑战是安全规则无法事先写定。同一个算子带同样的参数施加到两个窗口上，可能修好其中一个而毁掉另一个，结果取决于窗口里原本承载的结构。只关于算子与参数的规则无法把这两种情形分开，由专家书写谓词的运行时强制路线[14]因而在本场景中无法直接套用。</w:t>
+        <w:t xml:space="preserve">第一个问题是判定依据从哪里来。修改是否有害只能从效果读出，而能报告效果的仪器只有目标模型。让模型的预测变准存在两条途径，修好缺陷是一条，把序列抹平使它更容易预测是另一条，后者同样会抬高效用读数。在需要保护的数据上，这两条途径给出的读数方向相反，单凭模型的意见去判定，恰恰会放行那些最该拦下的修改。本文因此在模型效用之外引入一个完全不看模型的结构条件，要求两者同时成立才允许提交，并把结构条件的阈值交给共形风险控制标定。</w:t>
       </w:r>
     </w:p>
     <w:p>
@@ -199,7 +166,7 @@
           <w:b/>
           <w:bCs/>
         </w:rPr>
-        <w:t xml:space="preserve">第二重挑战是可用作奖励的信号本身带有偏差。有害与否只能从效果读出，而能报告效果的仪器只有目标模型。让模型预测变准存在两条途径，修好缺陷是一条，把序列抹平让它更容易预测是另一条，后者同样会抬高效用读数。若直接把这个读数当作强化学习的奖励，策略会迅速学会抹平数据这一捷径，把本应保留的结构当作可以牺牲的对象。</w:t>
+        <w:t xml:space="preserve">第二个问题是这些判定能不能被利用起来。每一次判定都记录了某个动作在某类窗口上的实际后果，这正是策略改进所需要的反馈。由于试错发生在副本上，未通过判定的尝试不留下任何痕迹，学习过程因而不以破坏语料为代价，这与算子立即生效的方案形成对照。把判定结果当作奖励还有一层作用，被撤销的动作只留下探测代价而拿不到正回报，策略据此学到的是能够通过结构检验的修复方式，而直接以模型效用为奖励会把策略引向抹平数据这条捷径。</w:t>
       </w:r>
     </w:p>
     <w:p>
@@ -209,21 +176,8 @@
       <w:r>
         <w:rPr>
           <w:rFonts w:hint="eastAsia"/>
-          <w:b/>
-          <w:bCs/>
-        </w:rPr>
-        <w:t xml:space="preserve">第三重挑战是试错的代价落在语料上。强化学习需要探索，而在真实语料上探索意味着每次失败的尝试都在破坏数据。清洗任务与游戏或仿真环境不同，它没有可以随意重来的环境，被抹平的峰值无法恢复。这使得已有的强化学习清洗方案在学习效率与数据安全之间难以兼顾。</w:t>
-      </w:r>
-    </w:p>
-    <w:p>
-      <w:pPr>
-        <w:ind w:firstLineChars="200" w:firstLine="420"/>
-      </w:pPr>
-      <w:r>
-        <w:rPr>
-          <w:rFonts w:hint="eastAsia"/>
-        </w:rPr>
-        <w:t xml:space="preserve">针对这三点，本文提出屏蔽强化学习驱动的时序数据治理智能体 IntroAct-TS。方法把治理建模为带预算的受约束序贯决策，由统计画像与冻结基础模型的行为探测构建决策状态，把候选动作放到副本上试执行并重新测量，再由一道要求效用与结构同时通过的屏蔽决定提交还是撤销，最后用屏蔽后的反馈更新动作选择策略并在语料内分配探测预算。屏蔽在这一设计中承担双重职责，它既拦下破坏性动作，又决定了哪些奖励能够到达策略，因而策略学到的是能通过结构检验的修复方式。由于试错发生在副本上，探索过程不修改语料，智能体可以在不付出破坏代价的前提下学习。图 1 概括了这一过程要达到的效果。</w:t>
+        </w:rPr>
+        <w:t xml:space="preserve">按照这一思路，本文提出屏蔽强化学习驱动的时序数据治理智能体 IntroAct-TS，把治理建模为带预算的受约束序贯决策。一次决策依次经过取证、试执行、判定与学习四个环节，分别由状态构建、沙箱重测、双信号屏蔽与策略优化四个模块承担，第 3 章逐一说明。图 1 用一对窗口说明判定要达到的效果。</w:t>
       </w:r>
     </w:p>
     <w:p>
@@ -291,7 +245,7 @@
         <w:rPr>
           <w:rFonts w:hint="eastAsia"/>
         </w:rPr>
-        <w:t xml:space="preserve">图 1 用两个来自同一语料的窗口说明方法要解决的问题。上方窗口含有一处传感器故障造成的孤立尖峰，去尖峰算子把它修回邻域水平，模型误差随之下降，这次修改应当提交。下方窗口含有一次真实发生的极端峰值，它在波形上与故障尖峰几乎一致，同一个算子会把它一并削平，模型误差同样下降，但语料中的稀有事件就此丢失，这次修改应当撤销。两次动作在效用读数上无法分辨，能把它们分开的是峰值前后的局部结构是否保持一致。IntroAct-TS 在副本上完成试执行与重测，据此对两者作出相反的裁决，并把这一对裁决作为反馈用于更新策略，使其在后续遇到相似窗口时不再提出会被撤销的动作。</w:t>
+        <w:t xml:space="preserve">图 1 中的两个窗口来自同一份语料，波形上几乎一致。上方是传感器故障造成的孤立尖峰，去尖峰算子把它修回邻域水平，模型误差随之下降。下方是一次真实发生的极端峰值，同一个算子会把它一并削平，模型误差同样下降。两次动作在效用读数上分不开，能把它们分开的是峰值前后的局部结构在编辑之后是否保持一致。IntroAct-TS 在副本上完成试执行与重测，据此对两者作出相反的裁决。</w:t>
       </w:r>
     </w:p>
     <w:p>
@@ -322,7 +276,7 @@
         <w:rPr>
           <w:rFonts w:hint="eastAsia"/>
         </w:rPr>
-        <w:t xml:space="preserve">（1）把时序数据治理形式化为屏蔽约束下的序贯干预决策，并给出对应的智能体 IntroAct-TS。该形式化把判断从动作执行之前推迟到执行之后，因而不要求事先写出只关于动作本身的安全规则，同时使策略能够从执行后的反馈中改进。</w:t>
+        <w:t>（1）把时序数据治理形式化为屏蔽约束下的序贯干预决策，并给出对应的智能体 IntroAct-TS。该形式化把判定推迟到动作执行之后，因而不要求事先写出只关于动作本身的安全规则，同时使每一次判定都成为策略可用的反馈。安全与学习在这一设计中出自同一个决定，两者共用一次判定。</w:t>
       </w:r>
     </w:p>
     <w:p>
@@ -333,7 +287,7 @@
         <w:rPr>
           <w:rFonts w:hint="eastAsia"/>
         </w:rPr>
-        <w:t xml:space="preserve">（2）提出以屏蔽作为奖励塑形器的策略学习机制。屏蔽在拦下破坏性动作的同时决定了哪些奖励可以到达策略，使策略学到的是能通过结构检验的修复方式，避免了直接以模型效用为奖励时策略转向抹平数据的失效模式。本文用奖励塑形消融实验对这一机制作直接检验。</w:t>
+        <w:t xml:space="preserve">（2）给出判定所需的双信号合取判据及其理论性质。结构条件不看模型意见，因而能够拦下通过抹平序列换取低误差的动作，其阈值由共形风险控制标定，使提交编辑的损害率获得有限样本的分布无关保证。本文进一步证明，把结构约束写成目标函数中的惩罚项时损害率存在不可消除的下界，而写成合取条件时没有这个下界，两种写法因此并不等价。</w:t>
       </w:r>
     </w:p>
     <w:p>
@@ -344,8 +298,11 @@
         <w:rPr>
           <w:rFonts w:hint="eastAsia"/>
         </w:rPr>
-        <w:t xml:space="preserve">（3）证明了探索过程的结构安全性。由于候选动作在副本上执行且提交需经屏蔽，对任意策略以及任意探索强度，被提交编辑的结构失真都受同一阈值约束。这使智能体可以在真实语料上试错而不破坏语料，与算子立即生效的强化学习清洗方案形成对照。</w:t>
-      </w:r>
+        <w:t xml:space="preserve">（3）证明策略学习不以破坏语料为代价，并刻画了保证随学习推进的退化速率。由于候选动作在副本上执行且提交需经判定，对任意策略与任意探索强度，被提交编辑的结构失真都受同一阈值约束。策略更新会改变候选分布从而削弱共形标定所依赖的可交换性，本文给出两次标定之间保证退化的上界，它与标定间隔成正比、与已积累的访问次数成反比，为重新标定的频率提供了定量依据。</w:t>
+      </w:r>
+    </w:p>
+    <w:p>
+      <w:pPr/>
     </w:p>
     <w:p>
       <w:pPr>
@@ -355,32 +312,7 @@
         <w:rPr>
           <w:rFonts w:hint="eastAsia"/>
         </w:rPr>
-        <w:t xml:space="preserve">（4）给出了屏蔽阈值的共形标定方法与屏蔽动作空间上的遗憾界。前者使提交编辑的损害率获得有限样本的分布无关保证，后者说明屏蔽在约束动作集的同时保留了策略学习的收敛性质。</w:t>
-      </w:r>
-    </w:p>
-    <w:p>
-      <w:pPr>
-        <w:ind w:firstLineChars="200" w:firstLine="420"/>
-      </w:pPr>
-      <w:r>
-        <w:rPr>
-          <w:rFonts w:hint="eastAsia"/>
-        </w:rPr>
-        <w:t xml:space="preserve">（5）建立了同时衡量数据质量与决策质量的评测体系。除治理后的语料指标之外，还报告动作选择准确率、预算效率曲线与弃权质量，用以评估智能体的决策能力本身。</w:t>
-      </w:r>
-    </w:p>
-    <w:p>
-      <w:pPr/>
-    </w:p>
-    <w:p>
-      <w:pPr>
-        <w:ind w:firstLineChars="200" w:firstLine="420"/>
-      </w:pPr>
-      <w:r>
-        <w:rPr>
-          <w:rFonts w:hint="eastAsia"/>
-        </w:rPr>
-        <w:t xml:space="preserve">本文余下部分的结构是，第 1 章梳理相关研究，第 2 章给出预备知识、问题定义与整体框架，第 3 章详述方法的四个模块及其理论性质，第 4 章给出实验规划，第 5 章总结全文，第 6 章记录当前实现中的问题与思考。</w:t>
+        <w:t xml:space="preserve">本文余下部分先在第 1 章梳理相关研究，第 2 章交代判定所需的度量并把问题形式化，第 3 章按一次决策经过的四个环节给出方法与理论性质，第 4 章给出实验规划，第 5 章总结全文，第 6 章记录实现过程中遇到的问题。</w:t>
       </w:r>
     </w:p>
     <w:p>
@@ -409,7 +341,7 @@
         <w:rPr>
           <w:rFonts w:hint="eastAsia"/>
         </w:rPr>
-        <w:t xml:space="preserve">与本文相关的研究分布在三个方向。时序数据清洗提供了可用的动作集合，时序数据质量评估提供了判断样本价值的手段，智能体的策略学习与安全约束提供了在受限条件下改进决策的框架。本文要做的是把三者组织成一个能够学习且不以破坏数据为代价的闭环。</w:t>
+        <w:t xml:space="preserve">与本文相关的研究分布在三个方向。时序数据清洗提供了可用的动作集合，时序数据质量评估提供了判断样本价值的手段，智能体的策略学习与安全约束提供了在受限条件下改进决策的框架。前两个方向都停在动作执行之前，第三个方向提供的约束需要事先写定，本文要做的是把三者组织成一个能够在执行之后判定并从中学习的闭环。</w:t>
       </w:r>
     </w:p>
     <w:p>
@@ -16685,7 +16617,7 @@
         <w:rPr>
           <w:rFonts w:hint="eastAsia"/>
         </w:rPr>
-        <w:t xml:space="preserve">本章给出后续实验的规划，先说明数据、噪声注入、基线、指标与超参数的设置，再按九组实验说明各自的目标与配置。前四组衡量治理后的数据质量，后五组衡量智能体的决策质量本身。</w:t>
+        <w:t xml:space="preserve">本文的做法建立在几个需要检验的判断之上。模型给出的效用读数在需要保护的数据上与有害性方向相反，这是引入结构条件的前提。判定的结果作为奖励能够把策略引向可以通过结构检验的修复方式，这是屏蔽的第二重职责。试错发生在副本上因而学习不破坏语料，这是把判定推迟到执行之后所换来的。本章的实验规划围绕这几点展开，前四组检验治理后语料的质量是否达到预期，后五组检验智能体的决策本身是否可靠。在此之前先交代数据、噪声注入、基线与指标的设置。</w:t>
       </w:r>
     </w:p>
     <w:p>
@@ -17243,7 +17175,7 @@
         <w:rPr>
           <w:rFonts w:hint="eastAsia"/>
         </w:rPr>
-        <w:t xml:space="preserve">（1）不治理，作为参照下界，其损害恒为零，用于确认任何非零损害都来自方法本身而不是评测流程。（2）SCREEN[5]，速度约束下的局部最优修复，代表约束驱动的清洗路线，隔离的变量是修复规则完全由领域约束给定时能走到哪里。（3）IMR[6]，自回归模型迭代修复，代表统计建模驱动的清洗路线，隔离的变量是把修复依据从人工约束换成数据自身的统计结构。（4）MTCSC[8]的单变量分支，2024 年的速度约束工作，它与 SCREEN 的编辑重合度分窗口、改动位置与修复取值三个层次实测，三个层次都高度一致才合并为一行，否则各自单列。</w:t>
+        <w:t>（1）不治理，作为参照下界，其损害恒为零，用于确认任何非零损害都来自方法本身，与评测流程无关。（2）SCREEN[5]，速度约束下的局部最优修复，代表约束驱动的清洗路线，隔离的变量是修复规则完全由领域约束给定时能走到哪里。（3）IMR[6]，自回归模型迭代修复，代表统计建模驱动的清洗路线，隔离的变量是把修复依据从人工约束换成数据自身的统计结构。（4）MTCSC[8]的单变量分支，2024 年的速度约束工作，它与 SCREEN 的编辑重合度分窗口、改动位置与修复取值三个层次实测，三个层次都高度一致才合并为一行，否则各自单列。</w:t>
       </w:r>
     </w:p>
     <w:p>
@@ -17944,13 +17876,12 @@
         <w:rPr>
           <w:rFonts w:hint="eastAsia"/>
         </w:rPr>
-        <w:t xml:space="preserve">实验一确认问题设定成立，即模型行为信号在部分干净数据上会给出与有害性相反的读数。对照取自同为干净但结构相差很远的两组窗口，一组是困难层中季节强度与自相关都很低的窗口，另一组是稀有层中取值落在分布尾部的窗口，两组都未经任何注入。分别统计行为风险的分布并与注入层对照，若信号度量的是可预测程度，三组的读数会按结构复杂度而不是按是否被污染排列。同时统计各层的编辑经济学，即每破坏单位方差换到的效用增益</w:t>
-      </w:r>
-      <w:r>
-        <w:rPr>
-          <w:rFonts w:hint="eastAsia"/>
-        </w:rPr>
-        <w:t xml:space="preserve"> </w:t>
+        <w:t>实验一确认问题设定成立，即模型行为信号在部分干净数据上会给出与有害性相反的读数。对照取自同为干净但结构相差很远的两组窗口，一组是困难层中季节强度与自相关都很低的窗口，另一组是稀有层中取值落在分布尾部的窗口，两组都未经任何注入。分别统计行为风险的分布并与注入层对照，若信号度量的是可预测程度，三组的读数会按结构复杂度排列，与是否被污染无关。同时统计各层的编辑经济学，即每破坏单位方差换到的效用增益 。</w:t>
+      </w:r>
+      <w:r>
+        <w:rPr>
+          <w:rFonts w:hint="eastAsia"/>
+        </w:rPr>
       </w:r>
       <m:oMath>
         <m:r>
@@ -17991,7 +17922,6 @@
         <w:rPr>
           <w:rFonts w:hint="eastAsia"/>
         </w:rPr>
-        <w:t xml:space="preserve">。</w:t>
       </w:r>
     </w:p>
     <w:p>
@@ -18292,7 +18222,7 @@
         <w:rPr>
           <w:rFonts w:hint="eastAsia"/>
         </w:rPr>
-        <w:t xml:space="preserve">本文面向时序基础模型的语料治理问题，提出屏蔽强化学习驱动的智能体 IntroAct-TS。该方法把每次数据修改当作一次待验证的干预，由双证据状态构建、沙箱干预重测、共形标定的双信号屏蔽与屏蔽反馈策略优化四个模块构成闭环。核心设计在于让屏蔽承担双重职责，它在拦下破坏性动作的同时决定了哪些奖励能够到达策略，使策略学到的是能通过结构检验的修复方式，避免了直接以模型效用为奖励时转向抹平数据的失效模式。由于所有试错都发生在副本上，探索过程不修改语料，智能体因而可以在真实数据上学习而不付出破坏代价。本文给出六条定理与一条命题及其证明，其中标定间隔内保证退化的上界把共形风险控制与策略的更新速率联系起来，为重新标定的频率提供了定量依据，而软惩罚的损害下界说明把结构约束写成目标函数中的一项与写成硬条件并不等价。</w:t>
+        <w:t>本文面向时序基础模型的语料治理问题。一次修改是否有害取决于被修改的数据，因此无法在执行之前判定，本文的做法是把判定推迟到执行之后，并把执行放在副本上使判错的动作可以撤回。判定要求模型效用与时序结构两个相互独立的条件同时成立，结构条件不看模型意见，其阈值由共形风险控制标定到给定的损害率上。判定的结果同时是策略改进所用的反馈，而试错既然发生在副本上，学习过程本身就不修改语料。屏蔽因而承担双重职责，它拦下破坏性动作，也决定了哪些奖励能够到达策略，安全与学习由此出自同一个设计。本文给出六条定理与一条命题及其证明，其中标定间隔内保证退化的上界把共形风险控制与策略的更新速率联系起来，为重新标定的频率提供了定量依据，而软惩罚的损害下界说明把结构约束写成目标函数中的一项与写成硬条件并不等价。</w:t>
       </w:r>
     </w:p>
     <w:p>

</xml_diff>

<commit_message>
Rebuild the introduction on the seven step chain, restore table 1 as a route matrix
</commit_message>
<xml_diff>
--- a/docx/胡宏彬-进度文档-20260820.docx
+++ b/docx/胡宏彬-进度文档-20260820.docx
@@ -68,7 +68,29 @@
         <w:rPr>
           <w:rFonts w:hint="eastAsia"/>
         </w:rPr>
-        <w:t xml:space="preserve">时序基础模型在大规模多来源语料上预训练，再迁移到预测、分类与插补等下游任务[1-4]，模型结构趋于稳定之后，能力上限主要由训练语料的质量决定。真实语料中的缺失、噪声、尖峰与漂移会被模型当作规律学习，训练之前需要对语料做治理。治理的困难不在于找出这些异常，而在于判断找出来之后该不该动。以电力变压器监测语料为例，设备检修期间的一段水平漂移应当处理，它会让模型把异常水平当作正常基线，在随后的正常时段给出系统性偏高的预测。而一次真实发生的负荷突增在波形上与故障尖峰几乎一致，却是语料中最有价值的部分，抹掉它等于删去模型最需要学习的稀有模式。两者的区别不在算子也不在参数，同一个去尖峰算子带同样的参数施加下去，前者是修复后者是破坏，结果取决于那段数据里原本承载着什么。这决定了有害与否无法在动作执行之前判定。</w:t>
+        <w:t xml:space="preserve">设备状态监测、电力负荷调度与金融风险评估正在把预测任务交给同一类模型。时序基础模型在大规模多来源语料上预训练，再迁移到预测、分类与插补等下游任务[1-4]，一套权重覆盖了此前需要逐个场景单独建模的工作。随着模型结构收敛到少数几种成熟设计，能力的上限不再由架构决定。决定它的是投喂进去的语料，也就是从传感器、交易系统与监测终端持续采集下来的原始时序记录，这些记录规模巨大且未经整理。</w:t>
+      </w:r>
+    </w:p>
+    <w:p>
+      <w:pPr>
+        <w:ind w:firstLineChars="200" w:firstLine="420"/>
+      </w:pPr>
+      <w:r>
+        <w:rPr>
+          <w:rFonts w:hint="eastAsia"/>
+        </w:rPr>
+        <w:t xml:space="preserve">一份可用于预训练的时序语料应当同时满足两个条件。一是结构完备，语料要覆盖设备或市场实际出现过的各种运行模态，既包括常规工况，也包括状态切换与罕见但真实发生的极端事件，模型只有在训练中见过这些形态，部署时才可能认得出来。二是信噪可控，传感器故障、通信丢包与记录错误带来的失真应当尽量少，这类失真一旦留在语料里就会被模型当作规律学习。原始采集在这两个条件上都没有保证，而两者还会彼此纠缠，因为削掉失真的动作同样会削掉极端事件。</w:t>
+      </w:r>
+    </w:p>
+    <w:p>
+      <w:pPr>
+        <w:ind w:firstLineChars="200" w:firstLine="420"/>
+      </w:pPr>
+      <w:r>
+        <w:rPr>
+          <w:rFonts w:hint="eastAsia"/>
+        </w:rPr>
+        <w:t xml:space="preserve">把这两个条件同时做到，难点在于判断某一次具体的修改该不该做。以电力变压器监测语料为例，设备检修期间的一段水平漂移应当处理，它会让模型把异常水平当作正常基线，在随后的正常时段给出系统性偏高的预测，误差可以持续到漂移结束很久之后。而一次真实发生的负荷突增在波形上与故障尖峰几乎一致，它却正是结构完备性所依赖的那部分数据，削掉它等于删去模型最需要学习的稀有模态。两者的区别不在算子也不在参数，同一个去尖峰算子带同样的参数施加下去，前者是修复，后者是破坏，结果取决于那段数据里原本承载着什么。有害与否因此无法在动作执行之前判定，这是本文要处理的核心困难。</w:t>
       </w:r>
     </w:p>
     <w:p>
@@ -85,7 +107,7 @@
         <w:rPr>
           <w:rFonts w:hint="eastAsia"/>
         </w:rPr>
-        <w:t xml:space="preserve">面对这一困难，已有工作分两条路线，各自的处理方式与代价可以逐项说明。</w:t>
+        <w:t xml:space="preserve">围绕这一困难，已有工作沿三条路线展开，各自的判定时刻与判错后果见表 1。</w:t>
       </w:r>
     </w:p>
     <w:p>
@@ -96,9 +118,284 @@
         <w:rPr>
           <w:rFonts w:hint="eastAsia"/>
         </w:rPr>
-        <w:t xml:space="preserve">（1）SCREEN[5]假设相邻时间步的取值变化存在上下界，把违反约束的点修复到最近的合法取值，产出修复后的数据，算子由固定规则选定。（2）IMR[6]用自回归模型逐点估计并迭代收敛，同样产出修复数据，需要少量已知正确的点作为起始约束。（3）SpeedAcc[7]在速度之外引入加速度约束，用二阶信息约束修复的平滑程度。（4）MTCSC[8]把速度约束与聚类结合，利用维度之间的相关性提高修复精度。以上四项都在算子选定后直接覆盖原值，此后没有机制核对这次改写是否达到预期，也不涉及探索，因而不存在探索是否有损的问题。</w:t>
-      </w:r>
-    </w:p>
+        <w:t xml:space="preserve">表 1 面向时序数据的治理与选择方法对比</w:t>
+      </w:r>
+    </w:p>
+    <w:tbl>
+      <w:tblPr>
+        <w:tblW w:type="auto" w:w="0"/>
+        <w:tblLook w:firstColumn="1" w:firstRow="1" w:lastColumn="0" w:lastRow="0" w:noHBand="0" w:noVBand="1" w:val="04A0"/>
+      </w:tblPr>
+      <w:tblGrid>
+        <w:gridCol w:w="1996"/>
+        <w:gridCol w:w="1996"/>
+        <w:gridCol w:w="1996"/>
+        <w:gridCol w:w="1996"/>
+        <w:gridCol w:w="1996"/>
+      </w:tblGrid>
+      <w:tr>
+        <w:tc>
+          <w:tcPr>
+            <w:tcW w:type="dxa" w:w="1996"/>
+          </w:tcPr>
+          <w:p>
+            <w:r>
+              <w:t>路线</w:t>
+            </w:r>
+          </w:p>
+        </w:tc>
+        <w:tc>
+          <w:tcPr>
+            <w:tcW w:type="dxa" w:w="1996"/>
+          </w:tcPr>
+          <w:p>
+            <w:r>
+              <w:t>代表工作</w:t>
+            </w:r>
+          </w:p>
+        </w:tc>
+        <w:tc>
+          <w:tcPr>
+            <w:tcW w:type="dxa" w:w="1996"/>
+          </w:tcPr>
+          <w:p>
+            <w:r>
+              <w:t>判定时刻</w:t>
+            </w:r>
+          </w:p>
+        </w:tc>
+        <w:tc>
+          <w:tcPr>
+            <w:tcW w:type="dxa" w:w="1996"/>
+          </w:tcPr>
+          <w:p>
+            <w:r>
+              <w:t>判定依据</w:t>
+            </w:r>
+          </w:p>
+        </w:tc>
+        <w:tc>
+          <w:tcPr>
+            <w:tcW w:type="dxa" w:w="1996"/>
+          </w:tcPr>
+          <w:p>
+            <w:r>
+              <w:t>判错之后</w:t>
+            </w:r>
+          </w:p>
+        </w:tc>
+      </w:tr>
+      <w:tr>
+        <w:tc>
+          <w:tcPr>
+            <w:tcW w:type="dxa" w:w="1996"/>
+          </w:tcPr>
+          <w:p>
+            <w:r>
+              <w:t>修复式清洗</w:t>
+            </w:r>
+          </w:p>
+        </w:tc>
+        <w:tc>
+          <w:tcPr>
+            <w:tcW w:type="dxa" w:w="1996"/>
+          </w:tcPr>
+          <w:p>
+            <w:r>
+              <w:t>SCREEN[5] IMR[6] MTCSC[8]</w:t>
+            </w:r>
+          </w:p>
+        </w:tc>
+        <w:tc>
+          <w:tcPr>
+            <w:tcW w:type="dxa" w:w="1996"/>
+          </w:tcPr>
+          <w:p>
+            <w:r>
+              <w:t>执行之前</w:t>
+            </w:r>
+          </w:p>
+        </w:tc>
+        <w:tc>
+          <w:tcPr>
+            <w:tcW w:type="dxa" w:w="1996"/>
+          </w:tcPr>
+          <w:p>
+            <w:r>
+              <w:t>先验约束或自回归残差</w:t>
+            </w:r>
+          </w:p>
+        </w:tc>
+        <w:tc>
+          <w:tcPr>
+            <w:tcW w:type="dxa" w:w="1996"/>
+          </w:tcPr>
+          <w:p>
+            <w:r>
+              <w:t>原值已被覆盖</w:t>
+            </w:r>
+          </w:p>
+        </w:tc>
+      </w:tr>
+      <w:tr>
+        <w:tc>
+          <w:tcPr>
+            <w:tcW w:type="dxa" w:w="1996"/>
+          </w:tcPr>
+          <w:p>
+            <w:r>
+              <w:t>打分式选择</w:t>
+            </w:r>
+          </w:p>
+        </w:tc>
+        <w:tc>
+          <w:tcPr>
+            <w:tcW w:type="dxa" w:w="1996"/>
+          </w:tcPr>
+          <w:p>
+            <w:r>
+              <w:t>Data Shapley[9] Data-OOB[10]</w:t>
+              <w:br/>
+              <w:t>TimeInf[11] TSRating[12]</w:t>
+            </w:r>
+          </w:p>
+        </w:tc>
+        <w:tc>
+          <w:tcPr>
+            <w:tcW w:type="dxa" w:w="1996"/>
+          </w:tcPr>
+          <w:p>
+            <w:r>
+              <w:t>不产生动作</w:t>
+            </w:r>
+          </w:p>
+        </w:tc>
+        <w:tc>
+          <w:tcPr>
+            <w:tcW w:type="dxa" w:w="1996"/>
+          </w:tcPr>
+          <w:p>
+            <w:r>
+              <w:t>样本对模型的估计贡献</w:t>
+            </w:r>
+          </w:p>
+        </w:tc>
+        <w:tc>
+          <w:tcPr>
+            <w:tcW w:type="dxa" w:w="1996"/>
+          </w:tcPr>
+          <w:p>
+            <w:r>
+              <w:t>整窗丢弃</w:t>
+            </w:r>
+          </w:p>
+        </w:tc>
+      </w:tr>
+      <w:tr>
+        <w:tc>
+          <w:tcPr>
+            <w:tcW w:type="dxa" w:w="1996"/>
+          </w:tcPr>
+          <w:p>
+            <w:r>
+              <w:t>学习式编排</w:t>
+            </w:r>
+          </w:p>
+        </w:tc>
+        <w:tc>
+          <w:tcPr>
+            <w:tcW w:type="dxa" w:w="1996"/>
+          </w:tcPr>
+          <w:p>
+            <w:r>
+              <w:t>清洗智能体[13]</w:t>
+            </w:r>
+          </w:p>
+        </w:tc>
+        <w:tc>
+          <w:tcPr>
+            <w:tcW w:type="dxa" w:w="1996"/>
+          </w:tcPr>
+          <w:p>
+            <w:r>
+              <w:t>执行之前</w:t>
+            </w:r>
+          </w:p>
+        </w:tc>
+        <w:tc>
+          <w:tcPr>
+            <w:tcW w:type="dxa" w:w="1996"/>
+          </w:tcPr>
+          <w:p>
+            <w:r>
+              <w:t>下游反馈的期望回报</w:t>
+            </w:r>
+          </w:p>
+        </w:tc>
+        <w:tc>
+          <w:tcPr>
+            <w:tcW w:type="dxa" w:w="1996"/>
+          </w:tcPr>
+          <w:p>
+            <w:r>
+              <w:t>痕迹留在语料上</w:t>
+            </w:r>
+          </w:p>
+        </w:tc>
+      </w:tr>
+      <w:tr>
+        <w:tc>
+          <w:tcPr>
+            <w:tcW w:type="dxa" w:w="1996"/>
+          </w:tcPr>
+          <w:p>
+            <w:r>
+              <w:t>本文</w:t>
+            </w:r>
+          </w:p>
+        </w:tc>
+        <w:tc>
+          <w:tcPr>
+            <w:tcW w:type="dxa" w:w="1996"/>
+          </w:tcPr>
+          <w:p>
+            <w:r>
+              <w:t>IntroAct-TS</w:t>
+            </w:r>
+          </w:p>
+        </w:tc>
+        <w:tc>
+          <w:tcPr>
+            <w:tcW w:type="dxa" w:w="1996"/>
+          </w:tcPr>
+          <w:p>
+            <w:r>
+              <w:t>执行之后</w:t>
+            </w:r>
+          </w:p>
+        </w:tc>
+        <w:tc>
+          <w:tcPr>
+            <w:tcW w:type="dxa" w:w="1996"/>
+          </w:tcPr>
+          <w:p>
+            <w:r>
+              <w:t>模型效用与时序结构合取</w:t>
+            </w:r>
+          </w:p>
+        </w:tc>
+        <w:tc>
+          <w:tcPr>
+            <w:tcW w:type="dxa" w:w="1996"/>
+          </w:tcPr>
+          <w:p>
+            <w:r>
+              <w:t>撤回且不留痕迹</w:t>
+            </w:r>
+          </w:p>
+        </w:tc>
+      </w:tr>
+    </w:tbl>
     <w:p>
       <w:pPr>
         <w:ind w:firstLineChars="200" w:firstLine="420"/>
@@ -107,7 +404,7 @@
         <w:rPr>
           <w:rFonts w:hint="eastAsia"/>
         </w:rPr>
-        <w:t xml:space="preserve">（5）Data Shapley[9]用合作博弈中的 Shapley 值刻画样本价值，产出样本分数。（6）Data-OOB[10]借助袋装模型的袋外估计把开销降到可接受范围，同样产出分数。（7）TimeInf[11]把影响函数定义在时间块上再聚合到时间点，在给出逐点分数的同时保留时序结构。（8）TSRating[12]从四个维度获取大模型的成对比较，再用元学习把这些判断蒸馏成轻量评分器。这四项不产生动作，只给排序，因此无从核对某次处理是否奏效。</w:t>
+        <w:t xml:space="preserve">修复式清洗依靠先验规则定生死。SCREEN[5]假设相邻时间步的取值变化存在上下界，把违反约束的点拉回最近的合法取值，IMR[6]改用自回归模型逐点估计并迭代收敛，MTCSC[8]把速度约束与聚类结合以利用维度之间的相关性。这条路线的判定发生在选定算子的那一刻，规则一旦给出，改写就直接作用在原值上。</w:t>
       </w:r>
     </w:p>
     <w:p>
@@ -118,7 +415,7 @@
         <w:rPr>
           <w:rFonts w:hint="eastAsia"/>
         </w:rPr>
-        <w:t xml:space="preserve">（9）近期出现的清洗智能体[13]用分层策略编排清洗算子，策略可以从下游反馈中改进，是这两条路线之外的第三种做法。它的算子在训练过程中立即作用于原数据，探索阶段的错误无法撤回，安全性只能体现在训练收敛后的期望意义上。</w:t>
+        <w:t xml:space="preserve">打分式选择只估值不动手。Data Shapley[9]用合作博弈中的 Shapley 值刻画样本对模型的贡献，Data-OOB[10]借助袋外估计把这一估计的开销降到可接受范围，TimeInf[11]把影响函数定义在时间块上以保留时序结构，TSRating[12]则用大模型的成对比较蒸馏出轻量评分器。这条路线产出的是分数与排序，语料按分数取舍而不被改写。</w:t>
       </w:r>
     </w:p>
     <w:p>
@@ -129,7 +426,7 @@
         <w:rPr>
           <w:rFonts w:hint="eastAsia"/>
         </w:rPr>
-        <w:t xml:space="preserve">两条路线在同一处停下。打分式选择不产生动作，因而不必判断某次修改是否有害，代价是面对一段含有尖峰的窗口只能整体丢弃，尖峰之外完好的部分一并舍去。修复式清洗补上了动作，却把判断放在了选择算子的那一刻，算子一旦选定就直接覆盖原值，此后没有任何机制核对这次改写是否达到预期。近期把算子编排交给强化学习的尝试让策略可以从反馈中改进，但算子在训练过程中立即生效，每一次错误探索都在真实语料上留下痕迹，面对拿不准的窗口也没有退回的选项。</w:t>
+        <w:t xml:space="preserve">学习式编排让策略从反馈中改进。清洗智能体[13]用分层策略决定在什么窗口上调用哪个清洗算子，并把下游误差的变化作为回报。策略确实可以随训练变好，代价是算子在训练过程中立即生效。</w:t>
       </w:r>
     </w:p>
     <w:p>
@@ -140,7 +437,7 @@
         <w:rPr>
           <w:rFonts w:hint="eastAsia"/>
         </w:rPr>
-        <w:t xml:space="preserve">让判断发生在执行之后，就不再需要事先写出只关于算子与参数的安全规则，因为判断这时可以看到修改造成的实际后果。要让这样的判断有意义，执行必须可以撤回，否则判定为有害时已经无法挽回，本文因此把候选动作施加在工作副本的拷贝上，原副本只在判定通过时才被替换。这一个决定引出两个随之而来的问题。</w:t>
+        <w:t xml:space="preserve">三条路线各有代价，而代价的形状恰好互补。修复式清洗动了手，判定时刻与执行时刻却重合在一起，选错就是破坏，没有回头的余地。打分式选择留住了安全，因为它根本不动手，代价是面对一段只在局部含有尖峰的窗口只能整体丢弃，尖峰之外完好的部分一并舍去。学习式编排试图兼得，让策略从错误中学习，可它的每一次错误探索都真实地落在语料上，学得越多损坏越多。三者共同的盲区在于都把判定放在了执行之前，而一次编辑是否有害，答案写在执行之后的效果里。</w:t>
       </w:r>
     </w:p>
     <w:p>
@@ -150,10 +447,8 @@
       <w:r>
         <w:rPr>
           <w:rFonts w:hint="eastAsia"/>
-          <w:b/>
-          <w:bCs/>
-        </w:rPr>
-        <w:t xml:space="preserve">第一个问题是判定依据从哪里来。修改是否有害只能从效果读出，而能报告效果的仪器只有目标模型。让模型的预测变准存在两条途径，修好缺陷是一条，把序列抹平使它更容易预测是另一条，后者同样会抬高效用读数。在需要保护的数据上，这两条途径给出的读数方向相反，单凭模型的意见去判定，恰恰会放行那些最该拦下的修改。本文因此在模型效用之外引入一个完全不看模型的结构条件，要求两者同时成立才允许提交，并把结构条件的阈值交给共形风险控制标定。</w:t>
+        </w:rPr>
+        <w:t xml:space="preserve">把判定移到执行之后，就不再需要事先写出只关于算子与参数的安全规则，因为这时可以直接看到修改造成的后果。移动判定的前提是执行可以撤回，本文因此把候选动作施加在工作副本的拷贝上，原副本只在判定通过时才被替换。这样一来判定依据成为新的问题，能报告修改效果的仪器只有目标模型，而模型在被抹平的数据上给出的读数与有害性方向相反，单凭它去判定恰恰会放行那些最该拦下的修改，所以判定还需要一个完全不看模型的条件与之合取。判定做完之后又多出一件事可做，每一次判定都记录了某个动作在某类窗口上的实际后果，这正是策略改进所需要的反馈，而试错既然发生在副本上，学习过程本身就不修改语料。</w:t>
       </w:r>
     </w:p>
     <w:p>
@@ -163,21 +458,8 @@
       <w:r>
         <w:rPr>
           <w:rFonts w:hint="eastAsia"/>
-          <w:b/>
-          <w:bCs/>
-        </w:rPr>
-        <w:t xml:space="preserve">第二个问题是这些判定能不能被利用起来。每一次判定都记录了某个动作在某类窗口上的实际后果，这正是策略改进所需要的反馈。由于试错发生在副本上，未通过判定的尝试不留下任何痕迹，学习过程因而不以破坏语料为代价，这与算子立即生效的方案形成对照。把判定结果当作奖励还有一层作用，被撤销的动作只留下探测代价而拿不到正回报，策略据此学到的是能够通过结构检验的修复方式，而直接以模型效用为奖励会把策略引向抹平数据这条捷径。</w:t>
-      </w:r>
-    </w:p>
-    <w:p>
-      <w:pPr>
-        <w:ind w:firstLineChars="200" w:firstLine="420"/>
-      </w:pPr>
-      <w:r>
-        <w:rPr>
-          <w:rFonts w:hint="eastAsia"/>
-        </w:rPr>
-        <w:t xml:space="preserve">按照这一思路，本文提出屏蔽强化学习驱动的时序数据治理智能体 IntroAct-TS，把治理建模为带预算的受约束序贯决策。一次决策依次经过取证、试执行、判定与学习四个环节，分别由状态构建、沙箱重测、双信号屏蔽与策略优化四个模块承担，第 3 章逐一说明。图 1 用一对窗口说明判定要达到的效果。</w:t>
+        </w:rPr>
+        <w:t xml:space="preserve">按照这一思路，本文提出屏蔽强化学习驱动的时序数据治理智能体 IntroAct-TS，把治理建模为带预算的受约束序贯决策，一次决策依次经过取证、试执行、判定与学习四个环节。图 1 用一对窗口说明这一过程如何分开两种表面相似的情形。</w:t>
       </w:r>
     </w:p>
     <w:p>
@@ -245,7 +527,7 @@
         <w:rPr>
           <w:rFonts w:hint="eastAsia"/>
         </w:rPr>
-        <w:t xml:space="preserve">图 1 中的两个窗口来自同一份语料，波形上几乎一致。上方是传感器故障造成的孤立尖峰，去尖峰算子把它修回邻域水平，模型误差随之下降。下方是一次真实发生的极端峰值，同一个算子会把它一并削平，模型误差同样下降。两次动作在效用读数上分不开，能把它们分开的是峰值前后的局部结构在编辑之后是否保持一致。IntroAct-TS 在副本上完成试执行与重测，据此对两者作出相反的裁决。</w:t>
+        <w:t xml:space="preserve">图 1 中的两个窗口来自同一份语料，波形上几乎一致。上方是传感器故障造成的孤立尖峰，下方是一次真实发生的极端峰值。两个窗口先由状态构建从自身统计画像与冻结模型的行为反应中取证，随后由沙箱重测把去尖峰算子施加在副本的拷贝上，原数据在此期间保持不变。重测显示两次编辑都让模型误差下降，因此仅凭效用读数无法把它们分开，抹平极值同样会让模型更容易预测。判定环节因而在效用之外核验编辑前后的局部结构是否保持一致，上方窗口的尖峰属于孤立扰动，去掉之后邻域形态不变，判定通过并提交，下方窗口的峰值与前后走势连成一体，削平之后局部结构显著改变，判定不通过并撤回。试执行与双信号判定的组合使得同一个算子在两个窗口上得到相反的裁决，而这一对裁决同时成为策略的反馈，使它在后续遇到相似窗口时不再提出会被撤回的动作。</w:t>
       </w:r>
     </w:p>
     <w:p>
@@ -259,13 +541,7 @@
           <w:b/>
           <w:bCs/>
         </w:rPr>
-        <w:t xml:space="preserve">贡献.</w:t>
-      </w:r>
-      <w:r>
-        <w:rPr>
-          <w:rFonts w:hint="eastAsia"/>
-        </w:rPr>
-        <w:t xml:space="preserve"> 本文的主要贡献如下：</w:t>
+        <w:t xml:space="preserve">上述三条路线的代价各自对应本文的一项工作，主要贡献如下。</w:t>
       </w:r>
     </w:p>
     <w:p>
@@ -276,7 +552,7 @@
         <w:rPr>
           <w:rFonts w:hint="eastAsia"/>
         </w:rPr>
-        <w:t>（1）把时序数据治理形式化为屏蔽约束下的序贯干预决策，并给出对应的智能体 IntroAct-TS。该形式化把判定推迟到动作执行之后，因而不要求事先写出只关于动作本身的安全规则，同时使每一次判定都成为策略可用的反馈。安全与学习在这一设计中出自同一个决定，两者共用一次判定。</w:t>
+        <w:t xml:space="preserve">（1）针对判定时刻与执行时刻重合导致选错即破坏，本文把时序数据治理形式化为屏蔽约束下的序贯干预决策，并给出对应的智能体 IntroAct-TS。该形式化把判定推迟到动作执行之后，动作在副本上试执行，判定通过才提交，因而不要求事先写出只关于动作本身的安全规则。每一次判定同时成为策略可用的反馈，安全与学习在这一设计中出自同一个决定，两者共用一次判定。</w:t>
       </w:r>
     </w:p>
     <w:p>
@@ -287,7 +563,7 @@
         <w:rPr>
           <w:rFonts w:hint="eastAsia"/>
         </w:rPr>
-        <w:t xml:space="preserve">（2）给出判定所需的双信号合取判据及其理论性质。结构条件不看模型意见，因而能够拦下通过抹平序列换取低误差的动作，其阈值由共形风险控制标定，使提交编辑的损害率获得有限样本的分布无关保证。本文进一步证明，把结构约束写成目标函数中的惩罚项时损害率存在不可消除的下界，而写成合取条件时没有这个下界，两种写法因此并不等价。</w:t>
+        <w:t xml:space="preserve">（2）针对能报告效果的仪器只有模型而模型在被抹平的数据上给出相反读数，本文给出判定所需的双信号合取判据及其理论性质。结构条件完全不看模型意见，因而能够拦下通过抹平序列换取低误差的动作，其阈值由共形风险控制标定，使提交编辑的损害率获得有限样本的分布无关保证。本文进一步证明，把结构约束写成目标函数中的惩罚项时损害率存在不可消除的下界，而写成合取条件时没有这个下界，两种写法因此并不等价。</w:t>
       </w:r>
     </w:p>
     <w:p>
@@ -298,7 +574,7 @@
         <w:rPr>
           <w:rFonts w:hint="eastAsia"/>
         </w:rPr>
-        <w:t xml:space="preserve">（3）证明策略学习不以破坏语料为代价，并刻画了保证随学习推进的退化速率。由于候选动作在副本上执行且提交需经判定，对任意策略与任意探索强度，被提交编辑的结构失真都受同一阈值约束。策略更新会改变候选分布从而削弱共形标定所依赖的可交换性，本文给出两次标定之间保证退化的上界，它与标定间隔成正比、与已积累的访问次数成反比，为重新标定的频率提供了定量依据。</w:t>
+        <w:t xml:space="preserve">（3）针对探索期的错误会真实落在语料上，本文证明策略学习不以破坏语料为代价，并刻画了保证随学习推进的退化速率。由于候选动作在副本上执行且提交需经判定，对任意策略与任意探索强度，被提交编辑的结构失真都受同一阈值约束，未通过判定的尝试不留下任何痕迹。策略更新会改变候选分布从而削弱共形标定所依赖的可交换性，本文给出两次标定之间保证退化的上界，它与标定间隔成正比、与已积累的访问次数成反比，为重新标定的频率提供了定量依据。</w:t>
       </w:r>
     </w:p>
     <w:p>
@@ -16663,7 +16939,7 @@
         <w:rPr>
           <w:rFonts w:hint="eastAsia"/>
         </w:rPr>
-        <w:t xml:space="preserve">计划使用的数据集见表 1，覆盖工业与金融两类场景。选择两类而不是一类，是因为本文的同类校准与弃权机制都以语料存在结构异质性为前提，单一来源的语料无法检验这一前提是否被满足，这一点在 4.2 节的对应实验中展开。工业场景取电力变压器监测数据 ETTh1、ETTh2 与 ETTm1，它们是长期时序预测的通用基准[23]，采样频率为小时与十五分钟，多个通道来自同一台设备的不同测点，因此系统噪声在其上有明确的物理对应。金融场景取 TIME 基准[28]中的三项，Crypto 是四种加密资产的日频价格，US Term Structure 是美国国债期限结构的四十维工作日序列，Oil Price 是原油与成品油的十二维工作日价格。三者的通道之间都存在真实的联动关系，价格的共同波动与利率曲线的整体平移都是系统性的，与工业语料中的设备漂移在统计形态上相近而成因完全不同。两类场景的窗口在趋势强度、季节性与波动聚集上差异明显，合并为一个语料之后异质性显著高于任何单一来源。</w:t>
+        <w:t>计划使用的数据集见表 2，覆盖工业与金融两类场景。选择两类而不是一类，是因为本文的同类校准与弃权机制都以语料存在结构异质性为前提，单一来源的语料无法检验这一前提是否被满足，这一点在 4.2 节的对应实验中展开。工业场景取电力变压器监测数据 ETTh1、ETTh2 与 ETTm1，它们是长期时序预测的通用基准[23]，采样频率为小时与十五分钟，多个通道来自同一台设备的不同测点，因此系统噪声在其上有明确的物理对应。金融场景取 TIME 基准[28]中的三项，Crypto 是四种加密资产的日频价格，US Term Structure 是美国国债期限结构的四十维工作日序列，Oil Price 是原油与成品油的十二维工作日价格。三者的通道之间都存在真实的联动关系，价格的共同波动与利率曲线的整体平移都是系统性的，与工业语料中的设备漂移在统计形态上相近而成因完全不同。两类场景的窗口在趋势强度、季节性与波动聚集上差异明显，合并为一个语料之后异质性显著高于任何单一来源。</w:t>
       </w:r>
     </w:p>
     <w:p>
@@ -16677,7 +16953,7 @@
         <w:rPr>
           <w:rFonts w:hint="eastAsia"/>
         </w:rPr>
-        <w:t>表 1 计划使用的数据集</w:t>
+        <w:t>表 2 计划使用的数据集</w:t>
       </w:r>
     </w:p>
     <w:tbl>

</xml_diff>

<commit_message>
Name the method sections after the four stages a decision passes through
</commit_message>
<xml_diff>
--- a/docx/胡宏彬-进度文档-20260820.docx
+++ b/docx/胡宏彬-进度文档-20260820.docx
@@ -4938,7 +4938,7 @@
         <w:rPr>
           <w:rFonts w:hint="eastAsia"/>
         </w:rPr>
-        <w:t xml:space="preserve">针对上述三个特征，本文提出 IntroAct-TS 方法，整体框架如图 2 所示。该方法按状态取证、沙箱试执行、屏蔽裁决、反馈学习的顺序完成语料治理，把一个无法事先判定的问题转化为一系列可以事后核验并从中学习的单步决策。</w:t>
+        <w:t xml:space="preserve">针对上述三个特征，本文提出 IntroAct-TS 方法，整体框架如图 2 所示。一次决策依次经过取证、试执行、判定与学习四个环节，由此把一个无法事先判定的问题转化为一系列可以事后核验并从中学习的单步决策。</w:t>
       </w:r>
     </w:p>
     <w:p>
@@ -4949,7 +4949,7 @@
         <w:rPr>
           <w:rFonts w:hint="eastAsia"/>
         </w:rPr>
-        <w:t xml:space="preserve">缺少质量标签且单一证据存在盲区，基于同类校准的双证据状态构建算法（CDP）因而从窗口自身提取统计画像，同时用冻结基础模型的前向探测获取行为签名，再以画像相近的邻居为参照对行为分量做稳健标准化，使比较发生在结构相似的窗口之间。CDP 产出的状态包含统计分量、行为分量与缺陷类型后验，既是策略的输入，也为动作选择划定搜索范围。</w:t>
+        <w:t xml:space="preserve">取证环节要在缺少质量标签的条件下判断窗口可能出了什么问题，而任何单一证据都存在盲区。基于同类校准的双证据状态构建算法（CDP）因而从窗口自身提取统计画像，同时用冻结基础模型的前向探测获取行为签名，再以画像相近的邻居为参照对行为分量做稳健标准化，使比较发生在结构相似的窗口之间。CDP 产出的状态包含统计分量、行为分量与缺陷类型后验，既是策略的输入，也为动作选择划定搜索范围。</w:t>
       </w:r>
     </w:p>
     <w:p>
@@ -4960,7 +4960,7 @@
         <w:rPr>
           <w:rFonts w:hint="eastAsia"/>
         </w:rPr>
-        <w:t xml:space="preserve">状态给定之后，回答某个具体动作施加下去会发生什么，同时不让这次尝试造成不可撤销的后果，由基于沙箱副本的干预重测与奖励生成算法（SIR）承担。它把候选动作作用在工作副本的拷贝上而不覆盖原值，随后用与事前完全相同的探测函数测量候选结果。SIR 的关键约束是两次测量必须落在同一留出跨度与同一归一化尺度上，满足这一条件效用差值才能既作为裁决依据又作为奖励读数。</w:t>
+        <w:t xml:space="preserve">试执行环节回答某个具体动作施加下去会发生什么，同时不让这次尝试造成不可撤销的后果。基于沙箱副本的干预重测与奖励生成算法（SIR）把候选动作作用在工作副本的拷贝上，原值保持不变，随后用与事前完全相同的探测函数测量候选结果。SIR 的关键约束是两次测量必须落在同一留出跨度与同一归一化尺度上，满足这一条件效用差值才能既作为裁决依据又作为奖励读数。</w:t>
       </w:r>
     </w:p>
     <w:p>
@@ -4971,7 +4971,7 @@
         <w:rPr>
           <w:rFonts w:hint="eastAsia"/>
         </w:rPr>
-        <w:t xml:space="preserve">拿到可比的读数之后，基于共形标定的双信号屏蔽算法（CDS）负责裁决。它要求模型效用改善、结构失真受控与决策风险有界三者同时成立才允许提交，任一不满足即撤销候选并保留原副本。其中结构条件不依赖模型意见，因此能够拦下通过抹平序列换取低误差的动作。CDS 中的结构阈值</w:t>
+        <w:t xml:space="preserve">判定环节决定这次修改是提交还是撤回。基于共形标定的双信号屏蔽算法（CDS）要求模型效用改善、结构失真受控与决策风险有界三者同时成立才允许提交，任一不满足即撤销候选并保留原副本。其中结构条件不依赖模型意见，因此能够拦下通过抹平序列换取低误差的动作。CDS 中的结构阈值</w:t>
       </w:r>
       <w:r>
         <w:rPr>
@@ -5005,7 +5005,7 @@
         <w:rPr>
           <w:rFonts w:hint="eastAsia"/>
         </w:rPr>
-        <w:t xml:space="preserve">为让策略从裁决中改进并把探测预算用在更需要的地方，基于屏蔽反馈的策略优化与预算分配算法（SPO）以 CDS 的裁决与奖励更新动作价值估计，用上置信界在探索与利用之间取舍，并依据价值估计在窗口之间分配探测次数，把预算集中到证据模糊而潜在收益较大的窗口上。SPO 的输出回流为下一轮 CDP 的上下文，使状态取证、试执行、裁决与学习形成闭环。整个过程的动作、参数、读数与裁决都写入治理轨迹，既支撑事后追溯，也构成策略更新所依据的经验。</w:t>
+        <w:t xml:space="preserve">学习环节让策略从裁决中改进，并把探测预算用在更需要的地方。基于屏蔽反馈的策略优化与预算分配算法（SPO）以 CDS 的裁决与奖励更新动作价值估计，用上置信界在探索与利用之间取舍，并依据价值估计在窗口之间分配探测次数，把预算集中到证据模糊而潜在收益较大的窗口上。SPO 的输出回流为下一轮取证的上下文，使四个环节形成闭环。整个过程的动作、参数、读数与裁决都写入治理轨迹，既支撑事后追溯，也构成策略更新所依据的经验。</w:t>
       </w:r>
     </w:p>
     <w:p>
@@ -5073,7 +5073,7 @@
         <w:rPr>
           <w:rFonts w:hint="eastAsia"/>
         </w:rPr>
-        <w:t xml:space="preserve">四个模块在同一轮迭代中彼此供给。CDP 产出的状态限定了候选动作的搜索范围，使探测预算不被消耗在明显无望的尝试上。SIR 固定了效用比较的跨度与尺度，让重测结果既能与事前读数对照，又能作为不同窗口之间可比的奖励。CDS 的裁决同时输出安全保证与学习信号。SPO 把这些信号累积成动作价值，反过来改进 CDP 之后的动作选择并调整预算分配。迭代由预算与效用增益共同控制，当没有可信候选或预算耗尽时终止。</w:t>
+        <w:t xml:space="preserve">四个环节在同一轮迭代中彼此供给。取证产出的状态限定了候选动作的搜索范围，使探测预算不被消耗在明显无望的尝试上。试执行固定了效用比较的跨度与尺度，让重测结果既能与事前读数对照，又能作为不同窗口之间可比的奖励。判定同时输出安全保证与学习信号。学习把这些信号累积成动作价值，反过来改进下一轮的动作选择并调整预算分配。迭代由预算与效用增益共同控制，当没有可信候选或预算耗尽时终止。</w:t>
       </w:r>
     </w:p>
     <w:p>
@@ -5125,7 +5125,7 @@
           <w:sz w:val="21"/>
           <w:szCs w:val="21"/>
         </w:rPr>
-        <w:t xml:space="preserve">3.1 基于同类校准的双证据状态构建算法</w:t>
+        <w:t>3.1 取证，基于同类校准的双证据状态构建</w:t>
       </w:r>
     </w:p>
     <w:p>
@@ -7038,7 +7038,7 @@
           <w:sz w:val="21"/>
           <w:szCs w:val="21"/>
         </w:rPr>
-        <w:t xml:space="preserve">3.2 基于沙箱副本的干预重测与奖励生成算法</w:t>
+        <w:t>3.2 试执行，基于沙箱副本的干预重测与奖励生成</w:t>
       </w:r>
     </w:p>
     <w:p>
@@ -7741,7 +7741,7 @@
           <w:sz w:val="21"/>
           <w:szCs w:val="21"/>
         </w:rPr>
-        <w:t xml:space="preserve">3.3 基于共形标定的双信号屏蔽算法</w:t>
+        <w:t>3.3 判定，基于共形标定的双信号屏蔽</w:t>
       </w:r>
     </w:p>
     <w:p>
@@ -11867,7 +11867,7 @@
           <w:sz w:val="21"/>
           <w:szCs w:val="21"/>
         </w:rPr>
-        <w:t xml:space="preserve">3.4 基于屏蔽反馈的策略优化与预算分配算法</w:t>
+        <w:t>3.4 学习，基于屏蔽反馈的策略优化与预算分配</w:t>
       </w:r>
     </w:p>
     <w:p>

</xml_diff>

<commit_message>
Rewrite the introduction on the reference paper's skeleton and align chapter transitions
</commit_message>
<xml_diff>
--- a/docx/胡宏彬-进度文档-20260820.docx
+++ b/docx/胡宏彬-进度文档-20260820.docx
@@ -54,7 +54,7 @@
         <w:rPr>
           <w:rFonts w:hint="eastAsia"/>
         </w:rPr>
-        <w:t xml:space="preserve">时序基础模型的能力上限越来越取决于训练语料的质量，而语料治理有一处特殊的困难，一次修改是否有害取决于被修改的那段数据，不取决于修改本身。同一个去尖峰算子作用在传感器故障上是修复，作用在真实发生的极端事件上是破坏，因此有害与否无法在动作执行之前判定。已有方法或者不动手只给样本打分，或者动手之后不再回头核对，都没有正面处理这一点。本文把判定推迟到执行之后，并把执行放在副本上，使判错的动作可以撤回。这一个决定引出两个必须解决的问题。事后判定需要依据，而能报告修改效果的只有目标模型，模型在被抹平的数据上给出的读数与有害性方向相反，单凭它会放行破坏性的修改，本文因此要求模型效用与时序结构两个相互独立的条件同时成立才允许提交，并用共形风险控制把结构条件的阈值标定到给定的损害率上。判定的结果同时是一次反馈，策略可以据此改进动作选择，而试错既然发生在副本上，学习过程本身就不修改语料。屏蔽因而承担双重职责，它拦下破坏性动作，也决定了哪些奖励能够到达策略。本文给出六条定理与一条命题及其证明，涵盖合取判定的损害单调性、非阻塞性、任意策略下的结构安全性、共形风险控制、标定间隔内保证退化的上界与屏蔽动作空间上的遗憾界，并说明把结构约束写成惩罚项时损害率存在不可消除的下界，在此基础上规划了九组实验。</w:t>
+        <w:t xml:space="preserve">时序基础模型的能力上限越来越取决于训练语料的质量，而时序数据的一个特点让语料治理格外困难，一次修改是否有害往往取决于被修改的那段数据，而不取决于修改本身。同一个去尖峰算子作用在传感器故障上是修复，作用在真实发生的极端事件上是破坏，依靠事先写定的规则去判断一次修改是否值得做因而在原理上就不可靠。已有工作或者在规则给出的那一刻就把改写作用到原值上，选错之后无法挽回，或者只给样本打分而根本不动手，面对局部含有尖峰的窗口只能整体丢弃。本文把判定推迟到动作执行之后，并把执行放在工作副本的拷贝上，使判错的动作可以撤回。这样做会遇到两个困难。判定依据只能来自目标模型，而模型在被抹平的数据上给出的读数与有害性方向相反，本文因此要求模型效用与时序结构两个相互独立的条件同时成立才允许提交，并用共形风险控制把结构条件的阈值标定到给定的损害率上。策略从判定中学习又需要反复试错，而语料没有可以重来的副本，本文的做法是让所有候选都在副本上执行，未通过判定的尝试不改变任何数据。屏蔽因而承担双重职责，它拦下破坏性动作，也决定了哪些奖励能够到达策略。本文给出六条定理与一条命题及其证明，涵盖合取判定的损害单调性、非阻塞性、任意策略下的结构安全性、共形风险控制、标定间隔内保证退化的上界与屏蔽动作空间上的遗憾界，并说明把结构约束写成惩罚项时损害率存在不可消除的下界，在此基础上规划了覆盖工业与金融两类场景的九组实验。</w:t>
       </w:r>
     </w:p>
     <w:p>
@@ -68,7 +68,7 @@
         <w:rPr>
           <w:rFonts w:hint="eastAsia"/>
         </w:rPr>
-        <w:t xml:space="preserve">设备状态监测、电力负荷调度与金融风险评估正在把预测任务交给同一类模型。时序基础模型在大规模多来源语料上预训练，再迁移到预测、分类与插补等下游任务[1-4]，一套权重覆盖了此前需要逐个场景单独建模的工作。随着模型结构收敛到少数几种成熟设计，能力的上限不再由架构决定。决定它的是投喂进去的语料，也就是从传感器、交易系统与监测终端持续采集下来的原始时序记录，这些记录规模巨大且未经整理。</w:t>
+        <w:t xml:space="preserve">人工智能领域正在经历一场重心转移，研究者关注的对象从模型架构逐渐移向数据本身。时序分析领域的这一转移体现得尤为明显。设备状态监测、电力负荷调度与金融风险评估此前各自训练专用模型，如今则把预测任务交给同一类时序基础模型，这类模型在大规模多来源语料上预训练，再迁移到预测、分类与插补等下游任务[1-4]。随着模型结构收敛到少数几种成熟设计，能力的上限不再由架构决定，而是取决于投喂进去的语料。一份可用于预训练的时序语料通常需要在两个方面达标，一是结构完备，语料应当覆盖设备或市场实际出现过的各种运行模态，既包括常规工况，也包括状态切换与罕见但真实发生的极端事件，模型只有在训练中见过这些形态，部署时才可能认得出来。二是信噪可控，传感器故障、通信丢包与记录错误带来的失真应当尽量少，这类失真一旦留在语料里就会被模型当作规律学习。随着物联网设备与交易系统的普及，可获取的时序记录正以指数速率增长，而规模的增长同时带来了噪声的累积，原始采集在上述两方面都得不到保证。如何从大规模含噪的时序记录中整备出高质量语料，已成为时序基础模型训练链条中一个绕不开的环节。</w:t>
       </w:r>
     </w:p>
     <w:p>
@@ -79,7 +79,7 @@
         <w:rPr>
           <w:rFonts w:hint="eastAsia"/>
         </w:rPr>
-        <w:t xml:space="preserve">一份可用于预训练的时序语料应当同时满足两个条件。一是结构完备，语料要覆盖设备或市场实际出现过的各种运行模态，既包括常规工况，也包括状态切换与罕见但真实发生的极端事件，模型只有在训练中见过这些形态，部署时才可能认得出来。二是信噪可控，传感器故障、通信丢包与记录错误带来的失真应当尽量少，这类失真一旦留在语料里就会被模型当作规律学习。原始采集在这两个条件上都没有保证，而两者还会彼此纠缠，因为削掉失真的动作同样会削掉极端事件。</w:t>
+        <w:t xml:space="preserve">为应对这一需要，时序数据治理作为高质量数据准备的重要分支，近年来受到越来越多的关注[5,6]。治理技术要回答的是哪些数据需要处理以及应当怎样处理，它或者按既定规则改写可疑的取值，或者估计每个样本对模型的贡献并据此取舍，目标都是在控制人工投入的前提下提高语料的可用程度。与逐条人工审核相比，自动化治理让十万量级窗口的整备成为可能，也让整备标准在不同批次之间保持一致。</w:t>
       </w:r>
     </w:p>
     <w:p>
@@ -90,7 +90,7 @@
         <w:rPr>
           <w:rFonts w:hint="eastAsia"/>
         </w:rPr>
-        <w:t xml:space="preserve">把这两个条件同时做到，难点在于判断某一次具体的修改该不该做。以电力变压器监测语料为例，设备检修期间的一段水平漂移应当处理，它会让模型把异常水平当作正常基线，在随后的正常时段给出系统性偏高的预测，误差可以持续到漂移结束很久之后。而一次真实发生的负荷突增在波形上与故障尖峰几乎一致，它却正是结构完备性所依赖的那部分数据，削掉它等于删去模型最需要学习的稀有模态。两者的区别不在算子也不在参数，同一个去尖峰算子带同样的参数施加下去，前者是修复，后者是破坏，结果取决于那段数据里原本承载着什么。有害与否因此无法在动作执行之前判定，这是本文要处理的核心困难。</w:t>
+        <w:t xml:space="preserve">然而，时序数据的一个特点让治理变得远比通用数据困难，那就是一次修改是否有害往往取决于被修改的那段数据，而不取决于修改本身。以电力变压器监测语料为例，设备检修期间的一段水平漂移应当处理，它会让模型把异常水平当作正常基线，在随后的正常时段给出系统性偏高的预测，误差可以持续到漂移结束很久之后。而一次真实发生的负荷突增在波形上与故障尖峰几乎一致，它却正是结构完备性所依赖的那部分数据，削掉它等于删去模型最需要学习的稀有模态。两者的区别不在算子也不在参数，同一个去尖峰算子带同样的参数施加下去，前者是修复，后者是破坏，结果取决于那段数据里原本承载着什么。这意味着依靠事先写定的规则去判断一次修改是否值得做，在原理上就不可靠。</w:t>
       </w:r>
     </w:p>
     <w:p>
@@ -107,7 +107,7 @@
         <w:rPr>
           <w:rFonts w:hint="eastAsia"/>
         </w:rPr>
-        <w:t xml:space="preserve">围绕这一困难，已有工作沿三条路线展开，各自的判定时刻与判错后果见表 1。</w:t>
+        <w:t xml:space="preserve">为系统评估现有方法在这一问题上的适用性，本文对时序数据治理与选择技术做了梳理与分类，见表 1。按照判定发生的时刻与判定所依据的信息，当前工作大致可分为三类。</w:t>
       </w:r>
     </w:p>
     <w:p>
@@ -404,7 +404,7 @@
         <w:rPr>
           <w:rFonts w:hint="eastAsia"/>
         </w:rPr>
-        <w:t xml:space="preserve">修复式清洗依靠先验规则定生死。SCREEN[5]假设相邻时间步的取值变化存在上下界，把违反约束的点拉回最近的合法取值，IMR[6]改用自回归模型逐点估计并迭代收敛，MTCSC[8]把速度约束与聚类结合以利用维度之间的相关性。这条路线的判定发生在选定算子的那一刻，规则一旦给出，改写就直接作用在原值上。</w:t>
+        <w:t xml:space="preserve">（1）修复式清洗依靠先验约束判定取值是否合法。SCREEN[5]假设相邻时间步的取值变化存在上下界，把违反约束的点拉回最近的合法取值，IMR[6]改用自回归模型逐点估计并迭代收敛，MTCSC[8]把速度约束与聚类结合以利用维度之间的相关性。这一类方法的判定发生在选定算子的那一刻，规则一旦给出，改写就直接作用在原值上。</w:t>
       </w:r>
     </w:p>
     <w:p>
@@ -415,7 +415,7 @@
         <w:rPr>
           <w:rFonts w:hint="eastAsia"/>
         </w:rPr>
-        <w:t xml:space="preserve">打分式选择只估值不动手。Data Shapley[9]用合作博弈中的 Shapley 值刻画样本对模型的贡献，Data-OOB[10]借助袋外估计把这一估计的开销降到可接受范围，TimeInf[11]把影响函数定义在时间块上以保留时序结构，TSRating[12]则用大模型的成对比较蒸馏出轻量评分器。这条路线产出的是分数与排序，语料按分数取舍而不被改写。</w:t>
+        <w:t xml:space="preserve">（2）打分式选择依据样本对模型的估计贡献判定去留。Data Shapley[9]用合作博弈中的 Shapley 值刻画样本价值，Data-OOB[10]借助袋外估计把这一估计的开销降到可接受范围，TimeInf[11]把影响函数定义在时间块上以保留时序结构，TSRating[12]则用大模型的成对比较蒸馏出轻量评分器。这一类方法产出分数与排序，语料按分数取舍而不被改写。</w:t>
       </w:r>
     </w:p>
     <w:p>
@@ -426,7 +426,7 @@
         <w:rPr>
           <w:rFonts w:hint="eastAsia"/>
         </w:rPr>
-        <w:t xml:space="preserve">学习式编排让策略从反馈中改进。清洗智能体[13]用分层策略决定在什么窗口上调用哪个清洗算子，并把下游误差的变化作为回报。策略确实可以随训练变好，代价是算子在训练过程中立即生效。</w:t>
+        <w:t xml:space="preserve">（3）学习式编排依据下游反馈的期望回报判定该调用哪个算子。清洗智能体[13]用分层策略决定在什么窗口上施加什么操作，并把下游误差的变化作为回报，策略可以随训练逐步变好。这一类方法把判定交给了学习到的价值估计，而算子在训练过程中立即生效。</w:t>
       </w:r>
     </w:p>
     <w:p>
@@ -437,7 +437,7 @@
         <w:rPr>
           <w:rFonts w:hint="eastAsia"/>
         </w:rPr>
-        <w:t xml:space="preserve">三条路线各有代价，而代价的形状恰好互补。修复式清洗动了手，判定时刻与执行时刻却重合在一起，选错就是破坏，没有回头的余地。打分式选择留住了安全，因为它根本不动手，代价是面对一段只在局部含有尖峰的窗口只能整体丢弃，尖峰之外完好的部分一并舍去。学习式编排试图兼得，让策略从错误中学习，可它的每一次错误探索都真实地落在语料上，学得越多损坏越多。三者共同的盲区在于都把判定放在了执行之前，而一次编辑是否有害，答案写在执行之后的效果里。</w:t>
+        <w:t xml:space="preserve">经考察，这些方法在各自设定下都能取得不错的效果，但面对本文关心的问题，普遍存在以下两方面局限。</w:t>
       </w:r>
     </w:p>
     <w:p>
@@ -448,7 +448,7 @@
         <w:rPr>
           <w:rFonts w:hint="eastAsia"/>
         </w:rPr>
-        <w:t xml:space="preserve">把判定移到执行之后，就不再需要事先写出只关于算子与参数的安全规则，因为这时可以直接看到修改造成的后果。移动判定的前提是执行可以撤回，本文因此把候选动作施加在工作副本的拷贝上，原副本只在判定通过时才被替换。这样一来判定依据成为新的问题，能报告修改效果的仪器只有目标模型，而模型在被抹平的数据上给出的读数与有害性方向相反，单凭它去判定恰恰会放行那些最该拦下的修改，所以判定还需要一个完全不看模型的条件与之合取。判定做完之后又多出一件事可做，每一次判定都记录了某个动作在某类窗口上的实际后果，这正是策略改进所需要的反馈，而试错既然发生在副本上，学习过程本身就不修改语料。</w:t>
+        <w:t xml:space="preserve">1）判定时刻早于执行时刻，选错之后无法挽回。修复式清洗在规则给出的那一刻就把改写作用到原值上，此后没有任何机制核对这次改写是否达到预期，SCREEN[5]与 MTCSC[8]都是如此，速度约束一旦判定某点越界，替换随即发生。学习式编排虽然让策略可以从反馈中改进，但清洗智能体[13]的算子同样在训练期间立即生效，每一次错误探索都真实地落在语料上，策略学得越多语料损坏越多。打分式选择避开了这个问题，代价是它根本不动手，面对一段只在局部含有尖峰的窗口，Data Shapley[9]与 TimeInf[11]这类方法只能整体丢弃，尖峰之外完好的部分一并舍去。三条路线因此陷入同一个两难，动手的没有回头路，有回头路的不动手。</w:t>
       </w:r>
     </w:p>
     <w:p>
@@ -459,7 +459,29 @@
         <w:rPr>
           <w:rFonts w:hint="eastAsia"/>
         </w:rPr>
-        <w:t xml:space="preserve">按照这一思路，本文提出屏蔽强化学习驱动的时序数据治理智能体 IntroAct-TS，把治理建模为带预算的受约束序贯决策，一次决策依次经过取证、试执行、判定与学习四个环节。图 1 用一对窗口说明这一过程如何分开两种表面相似的情形。</w:t>
+        <w:t xml:space="preserve">2）判定所依据的信息单一，而在需要保护的数据上这一信息会给出相反的读数。修复式清洗只看取值是否满足约束，而一次真实的极端事件在取值上与故障同样越界，约束无法把两者分开。打分式选择与学习式编排都以模型表现作为最终依据，问题在于让模型的预测变准存在两条途径，修好缺陷是一条，把序列抹平使它更容易预测是另一条，后者同样会让误差下降。在稀有事件所在的窗口上，这两条途径给出的读数方向相反，单凭模型的意见去判定，恰恰会放行那些最该拦下的修改。</w:t>
+      </w:r>
+    </w:p>
+    <w:p>
+      <w:pPr>
+        <w:ind w:firstLineChars="200" w:firstLine="420"/>
+      </w:pPr>
+      <w:r>
+        <w:rPr>
+          <w:rFonts w:hint="eastAsia"/>
+        </w:rPr>
+        <w:t xml:space="preserve">针对上述局限，当前需要一种能够在动作执行之后判定、并且判错可以撤回的治理方法，而这样一种方法的构筑面临多重挑战。一方面，判定依据的来源本身存在偏差。修改是否有害只能从效果读出，而能报告效果的仪器只有目标模型，上述第二条局限说明这台仪器在需要保护的数据上并不可信，因此判定不能只问模型，还需要一个不依赖模型的证据与之相互印证，而这个证据的阈值又无法由领域知识事先给定。另一方面，试错的代价落在不可恢复的对象上。让策略从判定结果中学习需要反复尝试，而语料与游戏或仿真环境不同，它没有可以随意重来的副本，被抹平的峰值无法恢复。如何让学习过程既能积累足够的经验，又不在积累的过程中损坏语料，是把判定推迟到执行之后所必须一并解决的问题。</w:t>
+      </w:r>
+    </w:p>
+    <w:p>
+      <w:pPr>
+        <w:ind w:firstLineChars="200" w:firstLine="420"/>
+      </w:pPr>
+      <w:r>
+        <w:rPr>
+          <w:rFonts w:hint="eastAsia"/>
+        </w:rPr>
+        <w:t xml:space="preserve">为解决判定依据存在偏差与试错代价不可恢复这两个问题，本文提出屏蔽强化学习驱动的时序数据治理智能体 IntroAct-TS，把治理建模为带预算的受约束序贯决策。IntroAct-TS 首先从窗口自身的统计画像与冻结基础模型的行为反应中取证，并以画像相近的邻居为参照做稳健标准化，使不同窗口之间的读数可比。随后把候选动作施加在工作副本的拷贝上试执行并重新测量，原值在此期间保持不变，这样每一次尝试都有确切的后果可读，而尝试本身不留下痕迹。针对判定依据存在偏差这一挑战，IntroAct-TS 要求模型效用改善与时序结构受控两个相互独立的条件同时成立才允许提交，其中结构条件完全不看模型意见，并用共形风险控制把它的阈值标定到给定的损害率上，使阈值的设定不再依赖领域知识。针对试错代价这一挑战，由于所有候选都在副本上执行且提交需经判定，未通过的尝试不改变任何数据，学习过程因而不以破坏语料为代价。每一次判定的结果最后回流为策略的奖励，被撤销的动作只留下探测代价而拿不到正回报，策略据此更新动作价值估计并在窗口之间分配探测预算，从而提高了治理在结构复杂且含噪的时序语料上的可靠性与效率。图 1 以一对波形相近的窗口说明这一过程如何给出相反的裁决。</w:t>
       </w:r>
     </w:p>
     <w:p>
@@ -527,7 +549,7 @@
         <w:rPr>
           <w:rFonts w:hint="eastAsia"/>
         </w:rPr>
-        <w:t xml:space="preserve">图 1 中的两个窗口来自同一份语料，波形上几乎一致。上方是传感器故障造成的孤立尖峰，下方是一次真实发生的极端峰值。两个窗口先由状态构建从自身统计画像与冻结模型的行为反应中取证，随后由沙箱重测把去尖峰算子施加在副本的拷贝上，原数据在此期间保持不变。重测显示两次编辑都让模型误差下降，因此仅凭效用读数无法把它们分开，抹平极值同样会让模型更容易预测。判定环节因而在效用之外核验编辑前后的局部结构是否保持一致，上方窗口的尖峰属于孤立扰动，去掉之后邻域形态不变，判定通过并提交，下方窗口的峰值与前后走势连成一体，削平之后局部结构显著改变，判定不通过并撤回。试执行与双信号判定的组合使得同一个算子在两个窗口上得到相反的裁决，而这一对裁决同时成为策略的反馈，使它在后续遇到相似窗口时不再提出会被撤回的动作。</w:t>
+        <w:t xml:space="preserve">图 1 中的两个窗口来自同一份语料，波形上几乎一致，上方是传感器故障造成的孤立尖峰，下方是一次真实发生的极端峰值。去尖峰算子施加在副本上之后，重测显示两次编辑都让模型误差下降，仅凭效用读数无法把它们分开，抹平极值同样会让模型更容易预测。结构条件给出的读数则相反，上方窗口的尖峰属于孤立扰动，去掉之后邻域形态不变，判定通过并提交，下方窗口的峰值与前后走势连成一体，削平之后局部结构显著改变，判定不通过并撤回。这一对相反的裁决同时成为策略的反馈，使它在后续遇到相似窗口时不再提出会被撤回的动作。</w:t>
       </w:r>
     </w:p>
     <w:p>
@@ -541,7 +563,7 @@
           <w:b/>
           <w:bCs/>
         </w:rPr>
-        <w:t xml:space="preserve">上述三条路线的代价各自对应本文的一项工作，主要贡献如下。</w:t>
+        <w:t xml:space="preserve">贡献. 本文的主要贡献如下：</w:t>
       </w:r>
     </w:p>
     <w:p>
@@ -552,7 +574,7 @@
         <w:rPr>
           <w:rFonts w:hint="eastAsia"/>
         </w:rPr>
-        <w:t xml:space="preserve">（1）针对判定时刻与执行时刻重合导致选错即破坏，本文把时序数据治理形式化为屏蔽约束下的序贯干预决策，并给出对应的智能体 IntroAct-TS。该形式化把判定推迟到动作执行之后，动作在副本上试执行，判定通过才提交，因而不要求事先写出只关于动作本身的安全规则。每一次判定同时成为策略可用的反馈，安全与学习在这一设计中出自同一个决定，两者共用一次判定。</w:t>
+        <w:t xml:space="preserve">（1）针对现有方法判定时刻早于执行时刻、选错之后无法挽回的现状，本文把时序数据治理形式化为屏蔽约束下的序贯干预决策，并提出对应的智能体 IntroAct-TS。该形式化把判定推迟到动作执行之后，动作在副本上试执行，判定通过才提交，因而不要求事先写出只关于动作本身的安全规则。本文通过定理 2 证明屏蔽后的可行动作集在任意状态下非空，保证决策过程不会因约束而中断，并给出整体流程的时间复杂度，说明引入判定与学习没有改变开销的主导项。每一次判定同时成为策略可用的反馈，安全与学习在这一设计中出自同一个决定，两者共用一次判定。</w:t>
       </w:r>
     </w:p>
     <w:p>
@@ -563,7 +585,7 @@
         <w:rPr>
           <w:rFonts w:hint="eastAsia"/>
         </w:rPr>
-        <w:t xml:space="preserve">（2）针对能报告效果的仪器只有模型而模型在被抹平的数据上给出相反读数，本文给出判定所需的双信号合取判据及其理论性质。结构条件完全不看模型意见，因而能够拦下通过抹平序列换取低误差的动作，其阈值由共形风险控制标定，使提交编辑的损害率获得有限样本的分布无关保证。本文进一步证明，把结构约束写成目标函数中的惩罚项时损害率存在不可消除的下界，而写成合取条件时没有这个下界，两种写法因此并不等价。</w:t>
+        <w:t xml:space="preserve">（2）为应对判定依据存在偏差的挑战，本文设计了双信号合取判据与共形标定方法。该判据要求模型效用改善与时序结构受控同时成立，其中结构条件完全不看模型意见，因而能够拦下通过抹平序列换取低误差的动作，其阈值由共形风险控制标定，本文通过定理 4 证明提交编辑的损害率由此获得有限样本的分布无关保证，并通过定理 1 证明合取判据造成的损害不超过其中任一单独条件。本文进一步以命题 1 说明，把结构约束写成目标函数中的惩罚项时损害率存在不可消除的下界，而写成合取条件时没有这个下界，两种写法因此并不等价。</w:t>
       </w:r>
     </w:p>
     <w:p>
@@ -574,7 +596,18 @@
         <w:rPr>
           <w:rFonts w:hint="eastAsia"/>
         </w:rPr>
-        <w:t xml:space="preserve">（3）针对探索期的错误会真实落在语料上，本文证明策略学习不以破坏语料为代价，并刻画了保证随学习推进的退化速率。由于候选动作在副本上执行且提交需经判定，对任意策略与任意探索强度，被提交编辑的结构失真都受同一阈值约束，未通过判定的尝试不留下任何痕迹。策略更新会改变候选分布从而削弱共形标定所依赖的可交换性，本文给出两次标定之间保证退化的上界，它与标定间隔成正比、与已积累的访问次数成反比，为重新标定的频率提供了定量依据。</w:t>
+        <w:t xml:space="preserve">（3）为应对试错代价落在不可恢复对象上的挑战，本文提出沙箱执行下的屏蔽反馈策略优化机制。由于候选动作在副本上执行且提交需经判定，本文通过定理 3 证明对任意策略与任意探索强度，被提交编辑的结构失真都受同一阈值约束，未通过判定的尝试不留下任何痕迹。策略更新会改变候选分布从而削弱共形标定所依赖的可交换性，本文以定理 5 给出两次标定之间保证退化的上界，它与标定间隔成正比、与已积累的访问次数成反比，为重新标定的频率提供了定量依据，并以定理 6 说明屏蔽在约束动作集的同时保留了策略学习的收敛性质。</w:t>
+      </w:r>
+    </w:p>
+    <w:p>
+      <w:pPr>
+        <w:ind w:firstLineChars="200" w:firstLine="420"/>
+      </w:pPr>
+      <w:r>
+        <w:rPr>
+          <w:rFonts w:hint="eastAsia"/>
+        </w:rPr>
+        <w:t xml:space="preserve">（4）本文规划了覆盖工业与金融两类场景的九组实验，在语料层与候选层两套协议下与七项基线对照。评测同时衡量治理后语料的质量与智能体的决策质量，前者包括受保护数据的误编辑数、目标损害率的达成情况与下游预测误差，后者包括动作选择准确率、预算效率曲线与弃权质量。实验还包含对本文核心机制的直接检验，即以未过滤的效用读数为奖励训练的策略是否会逐步提高抹平类动作的提出频率，以及沙箱执行下累计损害是否随交互次数保持有界。</w:t>
       </w:r>
     </w:p>
     <w:p>
@@ -588,7 +621,7 @@
         <w:rPr>
           <w:rFonts w:hint="eastAsia"/>
         </w:rPr>
-        <w:t xml:space="preserve">本文余下部分先在第 1 章梳理相关研究，第 2 章交代判定所需的度量并把问题形式化，第 3 章按一次决策经过的四个环节给出方法与理论性质，第 4 章给出实验规划，第 5 章总结全文，第 6 章记录实现过程中遇到的问题。</w:t>
+        <w:t xml:space="preserve">本文结构安排如下。第 1 章介绍相关领域的研究现状，第 2 章阐述预备知识、问题定义与整体方法框架，第 3 章详述 IntroAct-TS 在取证、试执行、判定与学习四个环节上的具体实现及其理论性质，第 4 章给出实验规划，第 5 章总结全文，第 6 章记录当前实现中遇到的问题与后续的改进方向。</w:t>
       </w:r>
     </w:p>
     <w:p>
@@ -617,7 +650,7 @@
         <w:rPr>
           <w:rFonts w:hint="eastAsia"/>
         </w:rPr>
-        <w:t xml:space="preserve">与本文相关的研究分布在三个方向。时序数据清洗提供了可用的动作集合，时序数据质量评估提供了判断样本价值的手段，智能体的策略学习与安全约束提供了在受限条件下改进决策的框架。前两个方向都停在动作执行之前，第三个方向提供的约束需要事先写定，本文要做的是把三者组织成一个能够在执行之后判定并从中学习的闭环。</w:t>
+        <w:t xml:space="preserve">本文的工作与三个方向相关。时序数据清洗提供了可以调用的动作集合，时序数据质量评估提供了衡量样本价值的手段，智能体的策略学习与安全约束提供了在受限条件下改进决策的框架。前两个方向的判定都发生在动作执行之前，第三个方向的安全约束需要由专家事先写定，本文要做的是把三者组织成一个在执行之后判定并从判定中学习的闭环。</w:t>
       </w:r>
     </w:p>
     <w:p>
@@ -1009,7 +1042,7 @@
         <w:rPr>
           <w:rFonts w:hint="eastAsia"/>
         </w:rPr>
-        <w:t xml:space="preserve">一次编辑是否值得提交，取决于它在两个方向上的表现，模型是否因此变得更容易处理这段数据，以及序列自身的结构是否被保住。这两个方向需要各自的度量，而度量之后还需要一个位置来施加判断，以及一种方法来确定判断的阈值。本章依次交代这四者，说明所处理的噪声类型，再把治理问题形式化为屏蔽约束下的序贯决策。</w:t>
+        <w:t>把判定推迟到执行之后，紧接着要回答的是判定依据从何而来。一次编辑是否值得提交，取决于它在两个方向上的表现，模型是否因此变得更容易处理这段数据，以及序列自身的结构是否被保住。这两个方向需要各自的度量，度量之后还需要一个位置来施加判断，以及一种在无标签条件下确定阈值的方法。本章交代这四者，说明所处理的噪声类型，再把治理问题形式化为屏蔽约束下的序贯决策，最后给出整体框架。</w:t>
       </w:r>
     </w:p>
     <w:p>
@@ -5102,7 +5135,7 @@
         <w:rPr>
           <w:rFonts w:hint="eastAsia"/>
         </w:rPr>
-        <w:t xml:space="preserve">上一章把治理问题写成了带预算的受约束序贯决策，余下的是如何在无标签条件下取得决策所需的证据、如何在不破坏数据的前提下测出动作的后果、如何判定一次改动可以提交，以及如何让判定的结果反过来改进后续的选择。本章按这四个环节给出具体实现与相应的理论性质，最后分析时间复杂度。</w:t>
+        <w:t xml:space="preserve">上一章把治理问题写成了带预算的受约束序贯决策，余下的是这一决策在实现层面如何完成。一次决策要先在无标签条件下取得判断所需的证据，再在不破坏数据的前提下测出候选动作的后果，然后据此判定这次改动能否提交，最后让判定的结果反过来改进后续的选择。本章按这四个环节给出具体实现与相应的理论性质，最后分析时间复杂度。</w:t>
       </w:r>
     </w:p>
     <w:p>
@@ -16123,7 +16156,7 @@
         <w:rPr>
           <w:rFonts w:hint="eastAsia"/>
         </w:rPr>
-        <w:t xml:space="preserve">设语料窗口数为</w:t>
+        <w:t xml:space="preserve">上述四个环节都要在十万量级的窗口上反复执行，因此需要说明整体开销。设语料窗口数为</w:t>
       </w:r>
       <w:r>
         <w:rPr>
@@ -16257,7 +16290,7 @@
         <w:rPr>
           <w:rFonts w:hint="eastAsia"/>
         </w:rPr>
-        <w:t xml:space="preserve">。CDP 阶段中，画像提取的主要开销来自频谱分析与变点检测，为</w:t>
+        <w:t xml:space="preserve">。取证阶段中，画像提取的主要开销来自频谱分析与变点检测，为</w:t>
       </w:r>
       <w:r>
         <w:rPr>
@@ -16409,7 +16442,7 @@
         <w:rPr>
           <w:rFonts w:hint="eastAsia"/>
         </w:rPr>
-        <w:t xml:space="preserve">。SIR 阶段中，每次候选动作包含一次算子执行与一次重测，为</w:t>
+        <w:t xml:space="preserve">。试执行阶段中，每次候选动作包含一次算子执行与一次重测，为</w:t>
       </w:r>
       <w:r>
         <w:rPr>
@@ -16539,7 +16572,7 @@
         <w:rPr>
           <w:rFonts w:hint="eastAsia"/>
         </w:rPr>
-        <w:t xml:space="preserve">。CDS 中结构失真的计算是纯统计操作，为</w:t>
+        <w:t xml:space="preserve">。判定中结构失真的计算是纯统计操作，为</w:t>
       </w:r>
       <w:r>
         <w:rPr>
@@ -16581,7 +16614,7 @@
         <w:rPr>
           <w:rFonts w:hint="eastAsia"/>
         </w:rPr>
-        <w:t xml:space="preserve">，不涉及模型前向。SPO 的价值更新是常数时间操作，预算分配需要对窗口排序，为</w:t>
+        <w:t xml:space="preserve">，不涉及模型前向。学习阶段的价值更新是常数时间操作，预算分配需要对窗口排序，为</w:t>
       </w:r>
       <w:r>
         <w:rPr>
@@ -18498,7 +18531,7 @@
         <w:rPr>
           <w:rFonts w:hint="eastAsia"/>
         </w:rPr>
-        <w:t>本文面向时序基础模型的语料治理问题。一次修改是否有害取决于被修改的数据，因此无法在执行之前判定，本文的做法是把判定推迟到执行之后，并把执行放在副本上使判错的动作可以撤回。判定要求模型效用与时序结构两个相互独立的条件同时成立，结构条件不看模型意见，其阈值由共形风险控制标定到给定的损害率上。判定的结果同时是策略改进所用的反馈，而试错既然发生在副本上，学习过程本身就不修改语料。屏蔽因而承担双重职责，它拦下破坏性动作，也决定了哪些奖励能够到达策略，安全与学习由此出自同一个设计。本文给出六条定理与一条命题及其证明，其中标定间隔内保证退化的上界把共形风险控制与策略的更新速率联系起来，为重新标定的频率提供了定量依据，而软惩罚的损害下界说明把结构约束写成目标函数中的一项与写成硬条件并不等价。</w:t>
+        <w:t xml:space="preserve">本文面向时序基础模型的语料治理问题，针对一次修改是否有害取决于被修改数据因而无法事先判定这一困难，提出了屏蔽强化学习驱动的智能体 IntroAct-TS。该方法把判定推迟到动作执行之后，并把执行放在工作副本的拷贝上，使判错的动作可以撤回。判定要求模型效用与时序结构两个相互独立的条件同时成立，其中结构条件不看模型意见，其阈值由共形风险控制标定到给定的损害率上，由此解决了判定依据本身存在偏差的问题。所有候选都在副本上执行，未通过判定的尝试不改变任何数据，由此解决了试错代价落在不可恢复对象上的问题。屏蔽因而承担双重职责，它拦下破坏性动作，也决定了哪些奖励能够到达策略，安全与学习出自同一个设计。本文给出六条定理与一条命题及其证明，其中标定间隔内保证退化的上界把共形风险控制与策略的更新速率联系起来，为重新标定的频率提供了定量依据，而软惩罚的损害下界说明把结构约束写成目标函数中的一项与写成硬条件并不等价。</w:t>
       </w:r>
     </w:p>
     <w:p>
@@ -18538,7 +18571,7 @@
         <w:rPr>
           <w:rFonts w:hint="eastAsia"/>
         </w:rPr>
-        <w:t xml:space="preserve">方法与实验规划给出的是打算做到什么，本章记录实际做的过程中遇到了什么。已发现的问题分三类，一类是实现缺陷，改正之后现象消失，一类是设计取舍带来的固有限制，改不掉只能说明，另一类源于实验设计本身，需要重新安排对照才能回答。</w:t>
+        <w:t xml:space="preserve">前面几章给出的是方法应当做到什么，本章记录实现过程中实际遇到了什么。已发现的问题分三类，一类是实现缺陷，定位之后现象随即消失，一类是设计取舍带来的固有限制，改不掉只能说明清楚，另一类源于实验设计本身，需要重新安排对照才能回答。</w:t>
       </w:r>
     </w:p>
     <w:p>

</xml_diff>

<commit_message>
Say it in our own words, keep the skeleton and drop the borrowed phrasing
</commit_message>
<xml_diff>
--- a/docx/胡宏彬-进度文档-20260820.docx
+++ b/docx/胡宏彬-进度文档-20260820.docx
@@ -54,7 +54,7 @@
         <w:rPr>
           <w:rFonts w:hint="eastAsia"/>
         </w:rPr>
-        <w:t xml:space="preserve">时序基础模型的能力上限越来越取决于训练语料的质量，而时序数据的一个特点让语料治理格外困难，一次修改是否有害往往取决于被修改的那段数据，而不取决于修改本身。同一个去尖峰算子作用在传感器故障上是修复，作用在真实发生的极端事件上是破坏，依靠事先写定的规则去判断一次修改是否值得做因而在原理上就不可靠。已有工作或者在规则给出的那一刻就把改写作用到原值上，选错之后无法挽回，或者只给样本打分而根本不动手，面对局部含有尖峰的窗口只能整体丢弃。本文把判定推迟到动作执行之后，并把执行放在工作副本的拷贝上，使判错的动作可以撤回。这样做会遇到两个困难。判定依据只能来自目标模型，而模型在被抹平的数据上给出的读数与有害性方向相反，本文因此要求模型效用与时序结构两个相互独立的条件同时成立才允许提交，并用共形风险控制把结构条件的阈值标定到给定的损害率上。策略从判定中学习又需要反复试错，而语料没有可以重来的副本，本文的做法是让所有候选都在副本上执行，未通过判定的尝试不改变任何数据。屏蔽因而承担双重职责，它拦下破坏性动作，也决定了哪些奖励能够到达策略。本文给出六条定理与一条命题及其证明，涵盖合取判定的损害单调性、非阻塞性、任意策略下的结构安全性、共形风险控制、标定间隔内保证退化的上界与屏蔽动作空间上的遗憾界，并说明把结构约束写成惩罚项时损害率存在不可消除的下界，在此基础上规划了覆盖工业与金融两类场景的九组实验。</w:t>
+        <w:t xml:space="preserve">时序基础模型的效果越来越取决于预训练语料的质量，而时序数据的治理有一处别处没有的麻烦，一次改动是好是坏多数时候不由改法决定，由被改的那一段决定。同一个去尖峰算子落在传感器故障上是修好，落在真实发生的极端事件上是毁掉，靠事先写死的规则去决定某次改动值不值得做因而从道理上就靠不住。已有工作或者在规则给出结论的同时就把改写压到原值上，做错了退不回来，或者只给数据打分而根本不动手，遇到局部有尖峰的窗口只能整窗丢掉。本文把判断挪到动作做完之后，并让动作在工作副本的拷贝上执行，做错了可以退回去。这样做会碰到两道坎。判断的依据只能来自目标模型，而模型在被削平的数据上给出的读数与有害性正好相反，本文因此要求模型效用改善与时序结构受控两件事同时成立才放行，并用共形风险控制把结构那一条的阈值标定到给定的损害率上。策略要从判断里学东西又得反复试，而语料没有可以重开的存档，本文的做法是让所有候选都在副本上执行，没通过判定的尝试不改动任何数据。屏蔽因此干了两件事，它拦下破坏性的动作，也决定了哪些奖励能到达策略。本文给出六条定理与一条命题及其证明，涵盖合取判定的损害单调性、非阻塞性、任意策略下的结构安全性、共形风险控制、标定间隔内保证退化的上界与屏蔽动作空间上的遗憾界，并说明把结构约束写成惩罚项时损害率有一个消不掉的下界，在此基础上规划了覆盖工业与金融两类场景的九组实验。</w:t>
       </w:r>
     </w:p>
     <w:p>
@@ -68,7 +68,7 @@
         <w:rPr>
           <w:rFonts w:hint="eastAsia"/>
         </w:rPr>
-        <w:t xml:space="preserve">人工智能领域正在经历一场重心转移，研究者关注的对象从模型架构逐渐移向数据本身。时序分析领域的这一转移体现得尤为明显。设备状态监测、电力负荷调度与金融风险评估此前各自训练专用模型，如今则把预测任务交给同一类时序基础模型，这类模型在大规模多来源语料上预训练，再迁移到预测、分类与插补等下游任务[1-4]。随着模型结构收敛到少数几种成熟设计，能力的上限不再由架构决定，而是取决于投喂进去的语料。一份可用于预训练的时序语料通常需要在两个方面达标，一是结构完备，语料应当覆盖设备或市场实际出现过的各种运行模态，既包括常规工况，也包括状态切换与罕见但真实发生的极端事件，模型只有在训练中见过这些形态，部署时才可能认得出来。二是信噪可控，传感器故障、通信丢包与记录错误带来的失真应当尽量少，这类失真一旦留在语料里就会被模型当作规律学习。随着物联网设备与交易系统的普及，可获取的时序记录正以指数速率增长，而规模的增长同时带来了噪声的累积，原始采集在上述两方面都得不到保证。如何从大规模含噪的时序记录中整备出高质量语料，已成为时序基础模型训练链条中一个绕不开的环节。</w:t>
+        <w:t xml:space="preserve">风电场要预测明天的出力，变电站要排后天的负荷，交易台想提前知道波动会不会放大。这些事从前各做各的，模型、特征和调参经验都不共用。近两年的做法变了，先在海量时序上预训练一个基础模型，再对着具体任务微调，一套权重就能同时应付这几件事，在电力与金融场景下已经能追平甚至超过为单个任务专门训练的模型[1-4]。换来的结果是差距从架构挪到了数据上，各家的网络结构正在趋同，剩下的高低主要看预训练时喂进去的是什么。时序语料好不好用可以从两处看。一处是模态齐不齐，设备有平稳运转的时候，也有启停切换和故障前兆的时候，市场有波澜不惊的月份，也有剧烈震荡的那几天，模型训练时没见过某一类形态，上线之后多半也认不出来。另一处是杂音多不多，传感器会漂移，通信会丢包，人工录入会填错，这些痕迹留在语料里就会被当成规律学走。实际采到的数据在这两处都靠不住，而监测点位和交易品种还在增加，语料的体量涨得比人能审核的速度快得多。怎么从一大批含杂音的时序记录里整理出可用的语料，成了训练时序基础模型绕不开的一环。</w:t>
       </w:r>
     </w:p>
     <w:p>
@@ -79,7 +79,7 @@
         <w:rPr>
           <w:rFonts w:hint="eastAsia"/>
         </w:rPr>
-        <w:t xml:space="preserve">为应对这一需要，时序数据治理作为高质量数据准备的重要分支，近年来受到越来越多的关注[5,6]。治理技术要回答的是哪些数据需要处理以及应当怎样处理，它或者按既定规则改写可疑的取值，或者估计每个样本对模型的贡献并据此取舍，目标都是在控制人工投入的前提下提高语料的可用程度。与逐条人工审核相比，自动化治理让十万量级窗口的整备成为可能，也让整备标准在不同批次之间保持一致。</w:t>
+        <w:t xml:space="preserve">围绕这件事已经积累了一批方法，通称数据治理[5,6]。它们要回答的是哪些地方有问题，以及问题该怎么办。有的按事先定好的规则去改可疑的读数，有的给每条数据估一个价值再决定留不留。这类方法把整备的规模从人工能承受的几千条推到了十万量级，也让同一批数据在不同轮次里得到一致的处理。</w:t>
       </w:r>
     </w:p>
     <w:p>
@@ -90,7 +90,7 @@
         <w:rPr>
           <w:rFonts w:hint="eastAsia"/>
         </w:rPr>
-        <w:t xml:space="preserve">然而，时序数据的一个特点让治理变得远比通用数据困难，那就是一次修改是否有害往往取决于被修改的那段数据，而不取决于修改本身。以电力变压器监测语料为例，设备检修期间的一段水平漂移应当处理，它会让模型把异常水平当作正常基线，在随后的正常时段给出系统性偏高的预测，误差可以持续到漂移结束很久之后。而一次真实发生的负荷突增在波形上与故障尖峰几乎一致，它却正是结构完备性所依赖的那部分数据，削掉它等于删去模型最需要学习的稀有模态。两者的区别不在算子也不在参数，同一个去尖峰算子带同样的参数施加下去，前者是修复，后者是破坏，结果取决于那段数据里原本承载着什么。这意味着依靠事先写定的规则去判断一次修改是否值得做，在原理上就不可靠。</w:t>
+        <w:t xml:space="preserve">放到时序数据上，治理有一处别处没有的麻烦。一次改动是好是坏，多数时候不由改法决定，由被改的那一段决定。拿变压器的监测记录来说，检修期间读数会整体抬高一截，这一段该压回去，不然模型会把抬高后的水平当成常态，检修结束很久之后给出的预测还偏着。可另一种情形看上去几乎一样，某天负荷突然冲高，波形与故障造成的尖峰难以分辨，它却是语料里最值钱的部分，削掉等于把模型最该学的那类形态删了。两次面对的是同一个去尖峰算子和同一组参数，一次是修好，一次是毁掉，分野只在那段数据本身承载着什么。这就意味着，靠事先写死的规则去决定某次改动值不值得做，从道理上就靠不住。</w:t>
       </w:r>
     </w:p>
     <w:p>
@@ -107,7 +107,7 @@
         <w:rPr>
           <w:rFonts w:hint="eastAsia"/>
         </w:rPr>
-        <w:t xml:space="preserve">为系统评估现有方法在这一问题上的适用性，本文对时序数据治理与选择技术做了梳理与分类，见表 1。按照判定发生的时刻与判定所依据的信息，当前工作大致可分为三类。</w:t>
+        <w:t xml:space="preserve">已有做法可以按两件事归类，判断发生在什么时候，以及判断依据什么。表 1 按这两点分成三类。</w:t>
       </w:r>
     </w:p>
     <w:p>
@@ -404,7 +404,7 @@
         <w:rPr>
           <w:rFonts w:hint="eastAsia"/>
         </w:rPr>
-        <w:t xml:space="preserve">（1）修复式清洗依靠先验约束判定取值是否合法。SCREEN[5]假设相邻时间步的取值变化存在上下界，把违反约束的点拉回最近的合法取值，IMR[6]改用自回归模型逐点估计并迭代收敛，MTCSC[8]把速度约束与聚类结合以利用维度之间的相关性。这一类方法的判定发生在选定算子的那一刻，规则一旦给出，改写就直接作用在原值上。</w:t>
+        <w:t xml:space="preserve">（1）修复式清洗看取值是否越过了事先给定的界。SCREEN[5]假定相邻两点之间的变化幅度有上下限，把越界的点拉回最近的合法取值，IMR[6]换成自回归模型逐点估计再迭代收敛，MTCSC[8]把速度约束和聚类放在一起，借维度之间的相关性提高精度。这一类的判断在选定算子那一刻就结束了，规则给出结果，改写随即落到原值上。</w:t>
       </w:r>
     </w:p>
     <w:p>
@@ -415,7 +415,7 @@
         <w:rPr>
           <w:rFonts w:hint="eastAsia"/>
         </w:rPr>
-        <w:t xml:space="preserve">（2）打分式选择依据样本对模型的估计贡献判定去留。Data Shapley[9]用合作博弈中的 Shapley 值刻画样本价值，Data-OOB[10]借助袋外估计把这一估计的开销降到可接受范围，TimeInf[11]把影响函数定义在时间块上以保留时序结构，TSRating[12]则用大模型的成对比较蒸馏出轻量评分器。这一类方法产出分数与排序，语料按分数取舍而不被改写。</w:t>
+        <w:t xml:space="preserve">（2）打分式选择看这条数据对模型有多大用处。Data Shapley[9]用合作博弈里的 Shapley 值算每个样本的价值，Data-OOB[10]改用袋外估计把这笔开销压下来，TimeInf[11]把影响函数放到时间块上以保住时序结构，TSRating[12]则让大模型两两比较再蒸馏出一个轻量评分器。这一类给出的是分数和排序，语料按分数取舍，本身不被改动。</w:t>
       </w:r>
     </w:p>
     <w:p>
@@ -426,7 +426,7 @@
         <w:rPr>
           <w:rFonts w:hint="eastAsia"/>
         </w:rPr>
-        <w:t xml:space="preserve">（3）学习式编排依据下游反馈的期望回报判定该调用哪个算子。清洗智能体[13]用分层策略决定在什么窗口上施加什么操作，并把下游误差的变化作为回报，策略可以随训练逐步变好。这一类方法把判定交给了学习到的价值估计，而算子在训练过程中立即生效。</w:t>
+        <w:t xml:space="preserve">（3）学习式编排看哪个算子在下游能换来更高的回报。清洗智能体[13]用分层策略决定在什么窗口上做什么操作，把下游误差的变化当成奖励，策略会随训练慢慢变好。这一类把判断交给学到的价值估计，而算子在训练途中就已经生效。</w:t>
       </w:r>
     </w:p>
     <w:p>
@@ -437,7 +437,7 @@
         <w:rPr>
           <w:rFonts w:hint="eastAsia"/>
         </w:rPr>
-        <w:t xml:space="preserve">经考察，这些方法在各自设定下都能取得不错的效果，但面对本文关心的问题，普遍存在以下两方面局限。</w:t>
+        <w:t xml:space="preserve">这三类在各自的设定里都能跑出不错的结果。回到上面那处麻烦，它们共同露出两块短板。</w:t>
       </w:r>
     </w:p>
     <w:p>
@@ -448,7 +448,7 @@
         <w:rPr>
           <w:rFonts w:hint="eastAsia"/>
         </w:rPr>
-        <w:t xml:space="preserve">1）判定时刻早于执行时刻，选错之后无法挽回。修复式清洗在规则给出的那一刻就把改写作用到原值上，此后没有任何机制核对这次改写是否达到预期，SCREEN[5]与 MTCSC[8]都是如此，速度约束一旦判定某点越界，替换随即发生。学习式编排虽然让策略可以从反馈中改进，但清洗智能体[13]的算子同样在训练期间立即生效，每一次错误探索都真实地落在语料上，策略学得越多语料损坏越多。打分式选择避开了这个问题，代价是它根本不动手，面对一段只在局部含有尖峰的窗口，Data Shapley[9]与 TimeInf[11]这类方法只能整体丢弃，尖峰之外完好的部分一并舍去。三条路线因此陷入同一个两难，动手的没有回头路，有回头路的不动手。</w:t>
+        <w:t xml:space="preserve">1）判断落在动作之前，做错了退不回来。修复式清洗在规则给出结论的同时就把改写压到了原值上，此后没有任何环节回头核对这次改写有没有达到预期，SCREEN[5]和 MTCSC[8]都是这样，速度约束一旦判定某点越界，替换立刻发生。学习式编排让策略能从反馈里改进，可清洗智能体[13]的算子同样在训练途中生效，每一次探索失误都实实在在落在语料上，策略学得越久语料伤得越多。打分式选择躲开了这个问题，代价是它根本不动手，遇到一段只在局部有尖峰的窗口，Data Shapley[9]和 TimeInf[11]这类方法只能整窗丢掉，尖峰之外完好的部分一并搭进去。三条路子因此卡在同一个地方，动手的没有退路，有退路的不动手。</w:t>
       </w:r>
     </w:p>
     <w:p>
@@ -459,7 +459,7 @@
         <w:rPr>
           <w:rFonts w:hint="eastAsia"/>
         </w:rPr>
-        <w:t xml:space="preserve">2）判定所依据的信息单一，而在需要保护的数据上这一信息会给出相反的读数。修复式清洗只看取值是否满足约束，而一次真实的极端事件在取值上与故障同样越界，约束无法把两者分开。打分式选择与学习式编排都以模型表现作为最终依据，问题在于让模型的预测变准存在两条途径，修好缺陷是一条，把序列抹平使它更容易预测是另一条，后者同样会让误差下降。在稀有事件所在的窗口上，这两条途径给出的读数方向相反，单凭模型的意见去判定，恰恰会放行那些最该拦下的修改。</w:t>
+        <w:t xml:space="preserve">2）判断只靠一路信息，而这路信息在最该谨慎的地方会给出反向的读数。修复式清洗只问取值有没有越界，而一次真实的极端事件在数值上同样越界，界本身分不开这两种情形。打分式选择和学习式编排最终都看模型的表现，问题在于让模型预测得更准有两条路，把缺陷修好是一条，把序列削平使它更好预测是另一条，后者照样能让误差降下来。在稀有事件所在的那些窗口上，这两条路给出的读数正好相反，只听模型的意见去判断，放行的恰恰是最该拦住的那些改动。</w:t>
       </w:r>
     </w:p>
     <w:p>
@@ -470,7 +470,7 @@
         <w:rPr>
           <w:rFonts w:hint="eastAsia"/>
         </w:rPr>
-        <w:t xml:space="preserve">针对上述局限，当前需要一种能够在动作执行之后判定、并且判错可以撤回的治理方法，而这样一种方法的构筑面临多重挑战。一方面，判定依据的来源本身存在偏差。修改是否有害只能从效果读出，而能报告效果的仪器只有目标模型，上述第二条局限说明这台仪器在需要保护的数据上并不可信，因此判定不能只问模型，还需要一个不依赖模型的证据与之相互印证，而这个证据的阈值又无法由领域知识事先给定。另一方面，试错的代价落在不可恢复的对象上。让策略从判定结果中学习需要反复尝试，而语料与游戏或仿真环境不同，它没有可以随意重来的副本，被抹平的峰值无法恢复。如何让学习过程既能积累足够的经验，又不在积累的过程中损坏语料，是把判定推迟到执行之后所必须一并解决的问题。</w:t>
+        <w:t xml:space="preserve">要补上这两块短板，判断得挪到动作做完之后，而且做错了能退回去。真按这个路子走，有两道坎。头一道在依据上。改动是好是坏只能从效果读出来，而能报告效果的仪器只有目标模型，上面第二块短板说的正是这台仪器在关键处不可信。所以判断不能只问它，还得有一路不依赖模型的证据来对质，麻烦的是这路证据该卡在哪个数值上，没人能凭经验事先定下来。第二道在代价上。让策略从判断结果里学东西需要反复试，而语料和游戏或者仿真环境不一样，它没有可以重开的存档，被削平的峰值找不回来。怎么让学习攒够经验的同时不在攒的过程中把语料弄坏，是把判断后移之后必须一并解决的事。</w:t>
       </w:r>
     </w:p>
     <w:p>
@@ -481,7 +481,7 @@
         <w:rPr>
           <w:rFonts w:hint="eastAsia"/>
         </w:rPr>
-        <w:t xml:space="preserve">为解决判定依据存在偏差与试错代价不可恢复这两个问题，本文提出屏蔽强化学习驱动的时序数据治理智能体 IntroAct-TS，把治理建模为带预算的受约束序贯决策。IntroAct-TS 首先从窗口自身的统计画像与冻结基础模型的行为反应中取证，并以画像相近的邻居为参照做稳健标准化，使不同窗口之间的读数可比。随后把候选动作施加在工作副本的拷贝上试执行并重新测量，原值在此期间保持不变，这样每一次尝试都有确切的后果可读，而尝试本身不留下痕迹。针对判定依据存在偏差这一挑战，IntroAct-TS 要求模型效用改善与时序结构受控两个相互独立的条件同时成立才允许提交，其中结构条件完全不看模型意见，并用共形风险控制把它的阈值标定到给定的损害率上，使阈值的设定不再依赖领域知识。针对试错代价这一挑战，由于所有候选都在副本上执行且提交需经判定，未通过的尝试不改变任何数据，学习过程因而不以破坏语料为代价。每一次判定的结果最后回流为策略的奖励，被撤销的动作只留下探测代价而拿不到正回报，策略据此更新动作价值估计并在窗口之间分配探测预算，从而提高了治理在结构复杂且含噪的时序语料上的可靠性与效率。图 1 以一对波形相近的窗口说明这一过程如何给出相反的裁决。</w:t>
+        <w:t xml:space="preserve">IntroAct-TS 按这个路子搭建，把治理写成带预算的受约束序贯决策。它先从窗口自身的统计画像和冻结基础模型的行为反应里取证，并拿画像相近的邻居作参照做稳健标准化，让不同窗口的读数能放在一起比。接着把候选动作施加到工作副本的拷贝上试着执行一次再重新测量，原值在这期间不动，这样每次尝试都有确切的后果可读，而尝试本身不留痕迹。对着头一道坎，判定要求模型效用改善和时序结构受控两件事同时成立才放行，其中结构那一条完全不看模型的意见，它的阈值交给共形风险控制去标定，把该卡在哪里这件事从经验判断变成了统计问题。对着第二道坎，所有候选都在副本上执行且提交要过判定，没通过的尝试不改动任何数据，学习因此不必拿语料去换。每次判定的结果最后回流成策略的奖励，被撤销的动作只留下探测开销而拿不到正回报，策略据此更新动作价值估计，并在窗口之间安排探测预算，使治理在结构复杂又含杂音的时序语料上更可靠也更省。图 1 用一对波形相近的窗口说明这一过程怎么给出相反的裁决。</w:t>
       </w:r>
     </w:p>
     <w:p>
@@ -549,7 +549,7 @@
         <w:rPr>
           <w:rFonts w:hint="eastAsia"/>
         </w:rPr>
-        <w:t xml:space="preserve">图 1 中的两个窗口来自同一份语料，波形上几乎一致，上方是传感器故障造成的孤立尖峰，下方是一次真实发生的极端峰值。去尖峰算子施加在副本上之后，重测显示两次编辑都让模型误差下降，仅凭效用读数无法把它们分开，抹平极值同样会让模型更容易预测。结构条件给出的读数则相反，上方窗口的尖峰属于孤立扰动，去掉之后邻域形态不变，判定通过并提交，下方窗口的峰值与前后走势连成一体，削平之后局部结构显著改变，判定不通过并撤回。这一对相反的裁决同时成为策略的反馈，使它在后续遇到相似窗口时不再提出会被撤回的动作。</w:t>
+        <w:t xml:space="preserve">图 1 里的两个窗口取自同一份语料，波形几乎一样，上面那个是传感器故障留下的孤立尖峰，下面那个是一次真实发生的极端峰值。去尖峰算子在副本上跑过之后，重测显示两次改动都让模型误差降了，光看效用读数分不出好坏，削平极值同样会让模型更好预测。结构那一路给出的读数则相反。上面的尖峰是孤立扰动，去掉之后邻域形态没变，判定通过并提交，下面的峰值与前后走势连在一起，削平之后局部结构明显改变，判定不通过并撤回。这一对相反的裁决同时成了策略的反馈，让它以后碰到相似窗口不再提会被撤回的动作。</w:t>
       </w:r>
     </w:p>
     <w:p>
@@ -574,7 +574,7 @@
         <w:rPr>
           <w:rFonts w:hint="eastAsia"/>
         </w:rPr>
-        <w:t xml:space="preserve">（1）针对现有方法判定时刻早于执行时刻、选错之后无法挽回的现状，本文把时序数据治理形式化为屏蔽约束下的序贯干预决策，并提出对应的智能体 IntroAct-TS。该形式化把判定推迟到动作执行之后，动作在副本上试执行，判定通过才提交，因而不要求事先写出只关于动作本身的安全规则。本文通过定理 2 证明屏蔽后的可行动作集在任意状态下非空，保证决策过程不会因约束而中断，并给出整体流程的时间复杂度，说明引入判定与学习没有改变开销的主导项。每一次判定同时成为策略可用的反馈，安全与学习在这一设计中出自同一个决定，两者共用一次判定。</w:t>
+        <w:t xml:space="preserve">（1）针对已有方法把判断压在动作之前、做错退不回来这一现状，本文把时序数据治理写成屏蔽约束下的序贯干预决策，并给出智能体 IntroAct-TS。这一形式化把判断挪到动作做完之后，动作先在副本上执行，过了判定才提交，因而不需要事先写出只关于动作本身的安全规则。定理 2 证明屏蔽之后的可行动作集在任何状态下都非空，决策不会因为约束而卡死，复杂度分析则说明引入判定与学习没有改变开销的主导项。每次判定同时是一条策略可用的反馈，安全与学习因此共用同一次判断。</w:t>
       </w:r>
     </w:p>
     <w:p>
@@ -585,7 +585,7 @@
         <w:rPr>
           <w:rFonts w:hint="eastAsia"/>
         </w:rPr>
-        <w:t xml:space="preserve">（2）为应对判定依据存在偏差的挑战，本文设计了双信号合取判据与共形标定方法。该判据要求模型效用改善与时序结构受控同时成立，其中结构条件完全不看模型意见，因而能够拦下通过抹平序列换取低误差的动作，其阈值由共形风险控制标定，本文通过定理 4 证明提交编辑的损害率由此获得有限样本的分布无关保证，并通过定理 1 证明合取判据造成的损害不超过其中任一单独条件。本文进一步以命题 1 说明，把结构约束写成目标函数中的惩罚项时损害率存在不可消除的下界，而写成合取条件时没有这个下界，两种写法因此并不等价。</w:t>
+        <w:t xml:space="preserve">（2）针对判断依据本身带偏差这道坎，本文设计了双信号合取判据与共形标定方法。判据要求模型效用改善与时序结构受控同时成立，结构那一条完全不看模型的意见，因而拦得住那些靠削平序列换低误差的动作，阈值由共形风险控制标定，定理 4 由此给出提交编辑损害率的有限样本保证，定理 1 则说明合取判据造成的损害不会超过其中任何一个单独条件。命题 1 进一步指出，把结构约束写成目标函数里的惩罚项时损害率有一个消不掉的下界，写成合取条件时则没有，两种写法因此并不等价。</w:t>
       </w:r>
     </w:p>
     <w:p>
@@ -596,7 +596,7 @@
         <w:rPr>
           <w:rFonts w:hint="eastAsia"/>
         </w:rPr>
-        <w:t xml:space="preserve">（3）为应对试错代价落在不可恢复对象上的挑战，本文提出沙箱执行下的屏蔽反馈策略优化机制。由于候选动作在副本上执行且提交需经判定，本文通过定理 3 证明对任意策略与任意探索强度，被提交编辑的结构失真都受同一阈值约束，未通过判定的尝试不留下任何痕迹。策略更新会改变候选分布从而削弱共形标定所依赖的可交换性，本文以定理 5 给出两次标定之间保证退化的上界，它与标定间隔成正比、与已积累的访问次数成反比，为重新标定的频率提供了定量依据，并以定理 6 说明屏蔽在约束动作集的同时保留了策略学习的收敛性质。</w:t>
+        <w:t xml:space="preserve">（3）针对试错代价落在改不回的对象上这道坎，本文提出沙箱执行下的屏蔽反馈策略优化机制。候选动作都在副本上执行且提交要过判定，定理 3 因此保证无论策略处于哪个训练阶段、以多大强度探索，被提交编辑的结构失真都受同一个阈值约束，没通过的尝试不留下任何痕迹。策略更新会改变候选分布，削弱共形标定所依赖的可交换性，定理 5 给出两次标定之间保证退化的上界，它与标定间隔成正比、与已积累的访问次数成反比，因而能定量地指导重新标定的频率，定理 6 则说明屏蔽在限制动作集的同时保住了策略学习的收敛性质。</w:t>
       </w:r>
     </w:p>
     <w:p>
@@ -607,7 +607,7 @@
         <w:rPr>
           <w:rFonts w:hint="eastAsia"/>
         </w:rPr>
-        <w:t xml:space="preserve">（4）本文规划了覆盖工业与金融两类场景的九组实验，在语料层与候选层两套协议下与七项基线对照。评测同时衡量治理后语料的质量与智能体的决策质量，前者包括受保护数据的误编辑数、目标损害率的达成情况与下游预测误差，后者包括动作选择准确率、预算效率曲线与弃权质量。实验还包含对本文核心机制的直接检验，即以未过滤的效用读数为奖励训练的策略是否会逐步提高抹平类动作的提出频率，以及沙箱执行下累计损害是否随交互次数保持有界。</w:t>
+        <w:t xml:space="preserve">（4）本文规划了覆盖工业与金融两类场景的九组实验，在语料层与候选层两套协议下与七项基线对照。评测同时看治理后语料的质量与智能体的决策质量，前者包括受保护数据的误编辑数、目标损害率的达成情况与下游预测误差，后者包括动作选择准确率、预算效率曲线与弃权质量。其中两组直接检验本文的核心主张，一组看以未过滤的效用读数作奖励训练出来的策略会不会逐步提高削平类动作的提出频率，另一组看沙箱执行下累计损害是否随交互次数保持有界。</w:t>
       </w:r>
     </w:p>
     <w:p>
@@ -621,7 +621,7 @@
         <w:rPr>
           <w:rFonts w:hint="eastAsia"/>
         </w:rPr>
-        <w:t xml:space="preserve">本文结构安排如下。第 1 章介绍相关领域的研究现状，第 2 章阐述预备知识、问题定义与整体方法框架，第 3 章详述 IntroAct-TS 在取证、试执行、判定与学习四个环节上的具体实现及其理论性质，第 4 章给出实验规划，第 5 章总结全文，第 6 章记录当前实现中遇到的问题与后续的改进方向。</w:t>
+        <w:t xml:space="preserve">后文的安排是这样。第 1 章交代与本文相关的三个研究方向各自走到了哪里，第 2 章说明判断所需的两把尺子并把治理问题写成形式化的决策问题，第 3 章沿取证、试执行、判定与学习四个环节给出实现细节与相应的理论结论，第 4 章列出实验怎么设计，第 5 章收束全文，第 6 章记下目前实现中暴露的问题与打算怎么改。</w:t>
       </w:r>
     </w:p>
     <w:p>

</xml_diff>

<commit_message>
Carry the same voice through the remaining chapters
</commit_message>
<xml_diff>
--- a/docx/胡宏彬-进度文档-20260820.docx
+++ b/docx/胡宏彬-进度文档-20260820.docx
@@ -650,7 +650,7 @@
         <w:rPr>
           <w:rFonts w:hint="eastAsia"/>
         </w:rPr>
-        <w:t xml:space="preserve">本文的工作与三个方向相关。时序数据清洗提供了可以调用的动作集合，时序数据质量评估提供了衡量样本价值的手段，智能体的策略学习与安全约束提供了在受限条件下改进决策的框架。前两个方向的判定都发生在动作执行之前，第三个方向的安全约束需要由专家事先写定，本文要做的是把三者组织成一个在执行之后判定并从判定中学习的闭环。</w:t>
+        <w:t xml:space="preserve">三个方向的工作与本文有关。时序数据清洗攒下了一批能直接调用的算子，时序数据质量评估给出了衡量一条数据值多少的办法，智能体的策略学习与安全约束则提供了在受限条件下改进决策的框架。前两个方向都在动手之前就把判断做完了，第三个方向的安全约束要靠专家事先写好，本文要做的是把这三样东西接成一个动手之后再判断、并且能从判断里学东西的闭环。</w:t>
       </w:r>
     </w:p>
     <w:p>
@@ -684,59 +684,7 @@
         <w:rPr>
           <w:rFonts w:hint="eastAsia"/>
         </w:rPr>
-        <w:t xml:space="preserve">约束驱动是这一方向最成熟的思路。SCREEN</w:t>
-      </w:r>
-      <w:r>
-        <w:rPr>
-          <w:rFonts w:hint="eastAsia"/>
-          <w:vertAlign w:val="superscript"/>
-        </w:rPr>
-        <w:t xml:space="preserve">[5]</w:t>
-      </w:r>
-      <w:r>
-        <w:rPr>
-          <w:rFonts w:hint="eastAsia"/>
-        </w:rPr>
-        <w:t xml:space="preserve"> 假设相邻时间步的取值变化存在上下界，把违反约束的点修复到最近的合法取值，并给出线性时间的在线算法。SpeedAcc</w:t>
-      </w:r>
-      <w:r>
-        <w:rPr>
-          <w:rFonts w:hint="eastAsia"/>
-          <w:vertAlign w:val="superscript"/>
-        </w:rPr>
-        <w:t xml:space="preserve">[7]</w:t>
-      </w:r>
-      <w:r>
-        <w:rPr>
-          <w:rFonts w:hint="eastAsia"/>
-        </w:rPr>
-        <w:t xml:space="preserve"> 在速度之外引入加速度约束，用二阶信息约束修复的平滑程度。这两项工作处理单变量序列，MTCSC</w:t>
-      </w:r>
-      <w:r>
-        <w:rPr>
-          <w:rFonts w:hint="eastAsia"/>
-          <w:vertAlign w:val="superscript"/>
-        </w:rPr>
-        <w:t xml:space="preserve">[8]</w:t>
-      </w:r>
-      <w:r>
-        <w:rPr>
-          <w:rFonts w:hint="eastAsia"/>
-        </w:rPr>
-        <w:t xml:space="preserve"> 把速度约束与聚类结合，利用维度之间的相关性提高修复精度，MTSClean</w:t>
-      </w:r>
-      <w:r>
-        <w:rPr>
-          <w:rFonts w:hint="eastAsia"/>
-          <w:vertAlign w:val="superscript"/>
-        </w:rPr>
-        <w:t xml:space="preserve">[15]</w:t>
-      </w:r>
-      <w:r>
-        <w:rPr>
-          <w:rFonts w:hint="eastAsia"/>
-        </w:rPr>
-        <w:t xml:space="preserve"> 则同时使用行约束与列约束覆盖更多错误形态。约束驱动方法的可解释性好，运行开销低，代价是约束本身来自领域知识，阈值设定得当与否直接决定修复质量。</w:t>
+        <w:t xml:space="preserve">这个方向上最成熟的想法是给数据划一条界。SCREEN[5]假定相邻两点之间的变化幅度有上下限，把越界的点拉回最近的合法取值，还给出了线性时间的在线算法。SpeedAcc[7]在速度之外又加了加速度约束，用二阶信息管住修复后的平滑程度。这两项处理的是单变量序列。MTCSC[8]把速度约束和聚类放在一起，借维度之间的相关性提高精度，MTSClean[15]则同时用行约束和列约束，能覆盖更多种错误形态。划界这条路好在讲得清楚、跑得也快，麻烦在于界从哪来。界来自领域知识，定得准不准直接决定修得好不好。</w:t>
       </w:r>
     </w:p>
     <w:p>
@@ -747,20 +695,7 @@
         <w:rPr>
           <w:rFonts w:hint="eastAsia"/>
         </w:rPr>
-        <w:t xml:space="preserve">另一条思路从统计模型出发。IMR</w:t>
-      </w:r>
-      <w:r>
-        <w:rPr>
-          <w:rFonts w:hint="eastAsia"/>
-          <w:vertAlign w:val="superscript"/>
-        </w:rPr>
-        <w:t xml:space="preserve">[6]</w:t>
-      </w:r>
-      <w:r>
-        <w:rPr>
-          <w:rFonts w:hint="eastAsia"/>
-        </w:rPr>
-        <w:t xml:space="preserve"> 指出异常检测与异常修复是两个不同的问题，直接把检测结果当作修复依据效果很差，转而用自回归模型逐点估计并迭代收敛，同时借助少量已知正确的点作为起始约束。这类方法对参数设定的敏感度低于约束驱动方法，但它需要的种子信息在无标签场景中并不容易获得。</w:t>
+        <w:t xml:space="preserve">另一条路让数据自己说话。IMR[6]指出检测异常和修复异常是两码事，把检测结果直接拿来当修复依据效果很差，于是改用自回归模型逐点估计再迭代收敛，同时拿少量已知正确的点当起始约束。这类方法对参数没那么敏感，代价是它要的那点种子信息在无标签场景里并不好找。</w:t>
       </w:r>
     </w:p>
     <w:p>
@@ -771,20 +706,7 @@
         <w:rPr>
           <w:rFonts w:hint="eastAsia"/>
         </w:rPr>
-        <w:t xml:space="preserve">近期出现了把算子编排交给强化学习的尝试</w:t>
-      </w:r>
-      <w:r>
-        <w:rPr>
-          <w:rFonts w:hint="eastAsia"/>
-          <w:vertAlign w:val="superscript"/>
-        </w:rPr>
-        <w:t xml:space="preserve">[13]</w:t>
-      </w:r>
-      <w:r>
-        <w:rPr>
-          <w:rFonts w:hint="eastAsia"/>
-        </w:rPr>
-        <w:t xml:space="preserve">，用分层策略先判断问题类型再挑选具体算子，奖励中加入平滑度与改动幅度两项以抑制过度清洗。这一方向让策略可以从下游反馈中改进，但算子在训练过程中立即作用于原数据，探索阶段的错误无法撤回，安全性只能体现在训练收敛后的期望意义上，对单个窗口没有保证。</w:t>
+        <w:t xml:space="preserve">近两年有人把算子的编排交给了强化学习[13]，用分层策略先判断是哪类问题再挑具体算子，奖励里加上平滑度和改动幅度两项来压住过度清洗。策略确实能从下游反馈里改进，可算子在训练途中就作用到原数据上了，探索时犯的错收不回来，安全性只在训练收敛之后的期望意义上成立，落到单个窗口上没有保证。</w:t>
       </w:r>
     </w:p>
     <w:p>
@@ -818,59 +740,7 @@
         <w:rPr>
           <w:rFonts w:hint="eastAsia"/>
         </w:rPr>
-        <w:t xml:space="preserve">数据估值提供了另一种视角，它不改动取值，只量化每个样本对模型的贡献。Data Shapley</w:t>
-      </w:r>
-      <w:r>
-        <w:rPr>
-          <w:rFonts w:hint="eastAsia"/>
-          <w:vertAlign w:val="superscript"/>
-        </w:rPr>
-        <w:t xml:space="preserve">[9]</w:t>
-      </w:r>
-      <w:r>
-        <w:rPr>
-          <w:rFonts w:hint="eastAsia"/>
-        </w:rPr>
-        <w:t xml:space="preserve"> 用合作博弈中的 Shapley 值刻画样本价值，理论性质完备但计算开销随样本数增长很快。Data-OOB</w:t>
-      </w:r>
-      <w:r>
-        <w:rPr>
-          <w:rFonts w:hint="eastAsia"/>
-          <w:vertAlign w:val="superscript"/>
-        </w:rPr>
-        <w:t xml:space="preserve">[10]</w:t>
-      </w:r>
-      <w:r>
-        <w:rPr>
-          <w:rFonts w:hint="eastAsia"/>
-        </w:rPr>
-        <w:t xml:space="preserve"> 借助袋装模型的袋外估计把开销降到可接受范围，KNNShapley</w:t>
-      </w:r>
-      <w:r>
-        <w:rPr>
-          <w:rFonts w:hint="eastAsia"/>
-          <w:vertAlign w:val="superscript"/>
-        </w:rPr>
-        <w:t xml:space="preserve">[16]</w:t>
-      </w:r>
-      <w:r>
-        <w:rPr>
-          <w:rFonts w:hint="eastAsia"/>
-        </w:rPr>
-        <w:t xml:space="preserve"> 则通过近邻结构给出闭式解。这些方法为独立同分布数据设计，用在时序上会忽略时间点之间的依赖。TimeInf</w:t>
-      </w:r>
-      <w:r>
-        <w:rPr>
-          <w:rFonts w:hint="eastAsia"/>
-          <w:vertAlign w:val="superscript"/>
-        </w:rPr>
-        <w:t xml:space="preserve">[11]</w:t>
-      </w:r>
-      <w:r>
-        <w:rPr>
-          <w:rFonts w:hint="eastAsia"/>
-        </w:rPr>
-        <w:t xml:space="preserve"> 针对这一点做了修正，它把影响函数定义在时间块上再聚合到单个时间点，从而在给出逐点分数的同时保留时序结构。</w:t>
+        <w:t xml:space="preserve">还有一类工作干脆不改数据，只算每条数据对模型有多大用处。Data Shapley[9]用合作博弈里的 Shapley 值刻画样本价值，理论上很完备，开销却随样本数涨得很快。Data-OOB[10]改用袋装模型的袋外估计把这笔开销压下来，KNNShapley[16]则靠近邻结构直接给出闭式解。这几项都是为独立同分布数据设计的，搬到时序上会把时间点之间的依赖丢掉。TimeInf[11]补了这一点，把影响函数定义在时间块上再聚合回单个时间点，既给出逐点分数又留住了时序结构。</w:t>
       </w:r>
     </w:p>
     <w:p>
@@ -881,20 +751,7 @@
         <w:rPr>
           <w:rFonts w:hint="eastAsia"/>
         </w:rPr>
-        <w:t xml:space="preserve">近期工作把大语言模型的先验引入质量判断。TSRating</w:t>
-      </w:r>
-      <w:r>
-        <w:rPr>
-          <w:rFonts w:hint="eastAsia"/>
-          <w:vertAlign w:val="superscript"/>
-        </w:rPr>
-        <w:t xml:space="preserve">[12]</w:t>
-      </w:r>
-      <w:r>
-        <w:rPr>
-          <w:rFonts w:hint="eastAsia"/>
-        </w:rPr>
-        <w:t xml:space="preserve"> 从趋势、频率、幅度与模式四个维度获取成对比较，再用元学习把这些判断蒸馏成一个轻量评分器，使评级能力在多个领域之间迁移。该工作在十一个数据集上验证，选取评分最高的一半样本训练下游模型即可接近全量训练的效果。</w:t>
+        <w:t xml:space="preserve">也有工作把大模型的先验拉进来判断质量。TSRating[12]从趋势、频率、幅度和模式四个角度让大模型两两比较，再用元学习把这些判断蒸馏成一个轻量评分器，使评级能力能在不同领域之间迁移。该工作在十一个数据集上做了验证，只取评分最高的一半样本训练下游模型，效果就已经接近用全量数据训练。</w:t>
       </w:r>
     </w:p>
     <w:p>
@@ -905,7 +762,7 @@
         <w:rPr>
           <w:rFonts w:hint="eastAsia"/>
         </w:rPr>
-        <w:t xml:space="preserve">这一方向的产出始终是分数或排序。它能指出哪些窗口有问题，却不能说明这些窗口应当被怎样处理，也没有机制去检验某次处理是否有效。当低分窗口中混有稀有但正确的模式时，按分数丢弃会把它们一并去除。</w:t>
+        <w:t xml:space="preserve">这个方向交出来的东西始终是分数或者排序。它能指出哪些窗口有问题，说不了这些窗口该怎么处理，也没有环节去核对某次处理到底管不管用。而当低分窗口里混着稀有却正确的模式时，按分数丢弃会把它们一起丢掉。</w:t>
       </w:r>
     </w:p>
     <w:p>
@@ -939,33 +796,7 @@
         <w:rPr>
           <w:rFonts w:hint="eastAsia"/>
         </w:rPr>
-        <w:t xml:space="preserve">在受约束条件下学习决策是强化学习的经典课题。受约束马尔可夫决策过程</w:t>
-      </w:r>
-      <w:r>
-        <w:rPr>
-          <w:rFonts w:hint="eastAsia"/>
-          <w:vertAlign w:val="superscript"/>
-        </w:rPr>
-        <w:t xml:space="preserve">[17]</w:t>
-      </w:r>
-      <w:r>
-        <w:rPr>
-          <w:rFonts w:hint="eastAsia"/>
-        </w:rPr>
-        <w:t xml:space="preserve"> 把安全要求写成期望意义上的约束，通过拉格朗日松弛与策略优化联合求解，其保证在训练收敛后成立，训练过程中仍可能违反约束。屏蔽机制</w:t>
-      </w:r>
-      <w:r>
-        <w:rPr>
-          <w:rFonts w:hint="eastAsia"/>
-          <w:vertAlign w:val="superscript"/>
-        </w:rPr>
-        <w:t xml:space="preserve">[14]</w:t>
-      </w:r>
-      <w:r>
-        <w:rPr>
-          <w:rFonts w:hint="eastAsia"/>
-        </w:rPr>
-        <w:t xml:space="preserve"> 提供了另一条路径，它在智能体与环境之间加入一层过滤，动作只有不违反规约时才被放行，因此安全性在每一步都成立而不依赖收敛。屏蔽把安全逻辑与策略优化解耦，底层的学习算法可以自由选择，这一性质与本文的需求吻合。区别在于屏蔽的规约通常由领域专家书写，而在数据治理中一次编辑是否有害无法表达成只关于该编辑本身的条件，本文因此把规约替换为一个需要在执行后测量才能判定的复合条件。</w:t>
+        <w:t xml:space="preserve">在约束下学决策是强化学习的老题目。受约束马尔可夫决策过程[17]把安全要求写成期望意义上的约束，用拉格朗日松弛和策略优化一起求解，它的保证在训练收敛之后成立，训练途中仍可能违反。屏蔽机制[14]走的是另一条路，在智能体和环境之间加一层过滤，动作只有不违反规约才放行，安全性因此每一步都成立，不用等收敛。屏蔽还把安全逻辑和策略优化拆开了，底下的学习算法可以随便换，这一点正合本文的需要。差别在于屏蔽的规约通常由领域专家写出来，而在数据治理里，一次编辑有没有害根本没法写成只关于这次编辑本身的条件，本文因此把规约换成了一个要等动作做完、测过之后才能判定的复合条件。</w:t>
       </w:r>
     </w:p>
     <w:p>
@@ -976,7 +807,7 @@
         <w:rPr>
           <w:rFonts w:hint="eastAsia"/>
         </w:rPr>
-        <w:t>在策略的具体形式上，本文的决策序列很短，多数窗口在一到三步内结束，状态经过特征提取后维度不高，动作集合规模有限。这样的设定接近上下文老虎机，与长程决策问题有明显距离。上下文老虎机在线性收益假设下有成熟的上置信界算法与遗憾分析[18,19,20]，样本效率高且易于解释，本文因此采用这一族方法。</w:t>
+        <w:t xml:space="preserve">策略该做成什么样，取决于问题的规模。本文的决策序列很短，多数窗口一到三步就结束，状态经过特征提取之后维度不高，动作集合也就那么几个。这样的设定离上下文老虎机很近，离长程决策问题较远。上下文老虎机在线性收益假设下已经有成熟的上置信界算法和遗憾分析[18,19,20]，样本效率高，也容易解释清楚，本文因此选了这一族。</w:t>
       </w:r>
     </w:p>
     <w:p>
@@ -987,33 +818,7 @@
         <w:rPr>
           <w:rFonts w:hint="eastAsia"/>
         </w:rPr>
-        <w:t xml:space="preserve">统计侧的进展提供了标定屏蔽阈值的工具。共形风险控制</w:t>
-      </w:r>
-      <w:r>
-        <w:rPr>
-          <w:rFonts w:hint="eastAsia"/>
-          <w:vertAlign w:val="superscript"/>
-        </w:rPr>
-        <w:t xml:space="preserve">[21]</w:t>
-      </w:r>
-      <w:r>
-        <w:rPr>
-          <w:rFonts w:hint="eastAsia"/>
-        </w:rPr>
-        <w:t xml:space="preserve"> 在可交换性假设下，为由阈值参数化的决策族给出有限样本的风险上界，不需要对数据分布做任何假设。Learn Then Test</w:t>
-      </w:r>
-      <w:r>
-        <w:rPr>
-          <w:rFonts w:hint="eastAsia"/>
-          <w:vertAlign w:val="superscript"/>
-        </w:rPr>
-        <w:t xml:space="preserve">[22]</w:t>
-      </w:r>
-      <w:r>
-        <w:rPr>
-          <w:rFonts w:hint="eastAsia"/>
-        </w:rPr>
-        <w:t xml:space="preserve"> 把这一思路扩展到更一般的风险函数。这些框架的共同前提是被约束的信号可以充当有害性的合理代理，而本文面对的信号在部分区域内与有害性方向相反，因此不能只对它做标定，需要与一个不依赖模型的条件合取之后再标定。</w:t>
+        <w:t xml:space="preserve">阈值该卡在哪，统计这边有现成的工具。共形风险控制[21]在可交换性假设下，为由阈值参数化的一族决策给出有限样本的风险上界，对数据分布不作任何假定。Learn Then Test[22]把这套思路推广到了更一般的风险函数。这两个框架都建立在同一个前提上，被约束的那个信号得是有害性的合理代理。本文面对的信号偏偏在一部分区域里与有害性反着走，所以不能只标定它，得先跟一个不依赖模型的条件合取起来再标定。</w:t>
       </w:r>
     </w:p>
     <w:p>
@@ -1079,7 +884,7 @@
         <w:rPr>
           <w:rFonts w:hint="eastAsia"/>
         </w:rPr>
-        <w:t xml:space="preserve">衡量模型是否变得更容易处理一段数据，需要一个能从模型读出证据的手段。行为探测指在不更新参数的前提下，通过冻结模型对一个窗口的反应获取该窗口的证据。记窗口为</w:t>
+        <w:t xml:space="preserve">要知道模型是不是更容易处理这段数据了，得有办法从模型身上读出证据。行为探测就是干这个的，它不更新任何参数，只看冻结模型对一个窗口作何反应。记窗口为</w:t>
       </w:r>
       <w:r>
         <w:rPr>
@@ -1187,7 +992,7 @@
         <w:rPr>
           <w:rFonts w:hint="eastAsia"/>
         </w:rPr>
-        <w:t xml:space="preserve">输出固定维度的行为签名</w:t>
+        <w:t xml:space="preserve">输出一个固定维度的行为签名</w:t>
       </w:r>
       <w:r>
         <w:rPr>
@@ -1204,7 +1009,7 @@
         <w:rPr>
           <w:rFonts w:hint="eastAsia"/>
         </w:rPr>
-        <w:t xml:space="preserve">，其分量覆盖逐位置预测误差的分位数、层间表示的余弦距离、遮挡恢复的稳定性、多视图预测的一致性、轻微扰动前后的输出变化，以及模型池内不同模型之间的分歧。签名之所以不能只取预测误差，是因为一段被噪声污染的窗口和一段本就难以预测的窗口都会产生高误差，前者的误差集中在少数位置，后者的误差分布均匀，分位数信息能把两者分开。探测只做前向计算，不涉及梯度，单位开销远低于需要海森求逆的影响函数方法[11]，这在需要反复测量的强化学习设定下决定了方法是否可行。</w:t>
+        <w:t xml:space="preserve">，里面装着逐位置预测误差的各个分位数、层间表示的余弦距离、遮挡之后能不能恢复、多个视图的预测一致到什么程度、轻微扰动前后输出变了多少，以及模型池里几个模型彼此有多大分歧。签名之所以不能只放预测误差，是因为被噪声污染的窗口和本来就难预测的窗口都会给出高误差。前者的误差堆在少数几个位置上，后者的误差摊得很匀，分位数信息刚好能把这两种分开。探测只走前向，不算梯度，单次开销远低于要求海森求逆的影响函数方法[11]，这一点在需要反复测量的强化学习设定下直接决定了方法跑不跑得动。</w:t>
       </w:r>
     </w:p>
     <w:p>
@@ -1218,7 +1023,7 @@
         <w:rPr>
           <w:rFonts w:hint="eastAsia"/>
         </w:rPr>
-        <w:t xml:space="preserve">有了行为签名，模型侧的度量可以定义出来。模型效用衡量一个窗口对目标模型的友好程度，取若干归一化误差分量的加权负和</w:t>
+        <w:t xml:space="preserve">有了签名，模型这一侧的尺子就能定下来。模型效用衡量一个窗口对目标模型有多友好，取若干归一化误差分量的加权负和</w:t>
       </w:r>
     </w:p>
     <w:p>
@@ -1485,13 +1290,7 @@
         <w:rPr>
           <w:rFonts w:hint="eastAsia"/>
         </w:rPr>
-        <w:t xml:space="preserve">为对应权重。各分量都是越小越好，整体取负号后</w:t>
-      </w:r>
-      <w:r>
-        <w:rPr>
-          <w:rFonts w:hint="eastAsia"/>
-        </w:rPr>
-        <w:t xml:space="preserve"> </w:t>
+        <w:t xml:space="preserve">是它的权重。各分量都是越小越好，整体取个负号之后，</w:t>
       </w:r>
       <m:oMath>
         <m:r>
@@ -1508,7 +1307,7 @@
         <w:rPr>
           <w:rFonts w:hint="eastAsia"/>
         </w:rPr>
-        <w:t xml:space="preserve">越大表示窗口对模型越友好。一次候选动作</w:t>
+        <w:t xml:space="preserve">越大就表示这个窗口对模型越友好。一次候选动作</w:t>
       </w:r>
       <w:r>
         <w:rPr>
@@ -1638,7 +1437,7 @@
         <w:rPr>
           <w:rFonts w:hint="eastAsia"/>
         </w:rPr>
-        <w:t xml:space="preserve">该差值只有在两次测量使用相同的留出跨度和相同的归一化尺度时才有意义。改变窗口长度的动作会破坏这一前提，因此同跨度同尺度是进入判据的硬性要求，具体做法见 3.2 节。</w:t>
+        <w:t xml:space="preserve">这个差值要有意义，前提是两次测量落在同一段留出区间上，用的还是同一个归一化尺度。改变窗口长度的动作会破坏这个前提，所以同跨度同尺度是进入判据的硬要求，具体怎么做见 3.2 节。</w:t>
       </w:r>
       <m:oMath>
         <m:r>
@@ -1658,7 +1457,7 @@
         <w:rPr>
           <w:rFonts w:hint="eastAsia"/>
         </w:rPr>
-        <w:t xml:space="preserve">既是本文奖励信号的来源，也是 2.2 节所述偏差的载体，在使用它的同时避免被它误导是方法设计的核心。</w:t>
+        <w:t xml:space="preserve">既是本文奖励信号的来源，也是 2.2 节说的那个偏差的载体，一边用它一边不被它带偏，是整套方法设计的核心。</w:t>
       </w:r>
     </w:p>
     <w:p>
@@ -1672,7 +1471,7 @@
         <w:rPr>
           <w:rFonts w:hint="eastAsia"/>
         </w:rPr>
-        <w:t xml:space="preserve">效用只回答了模型是否更容易处理这段数据，一个把序列抹平的动作同样能让模型更容易处理它，因此还需要一个与模型无关的度量。时序结构保真度衡量一次编辑对序列固有结构的破坏程度，取值越低表示保持得越好，它只比较编辑前后的时序属性。参与比较的属性随算子的作用范围而不同，改动局限于有限位置的算子在其声明的足迹之外比较形状、极值、补片衔接、足迹大小与局部离散度，重写整条序列的算子则比较趋势、主周期、频谱能量分布、自相关结构、变点位置与极值。记编辑前后的窗口为</w:t>
+        <w:t xml:space="preserve">效用只回答了模型是否更省力，而把序列削平同样能让模型更省力，所以还得有一把不看模型的尺子。时序结构保真度衡量一次编辑把序列固有的结构破坏了多少，数值越低说明保得越好，它只比对编辑前后的时序属性。比对哪些属性取决于算子动了多大范围。只改有限几个位置的算子，在它声明的足迹之外比形状、极值、补片衔接得自不自然、足迹本身多大以及局部离散程度，把整条序列重写一遍的算子则比趋势、主周期、频谱能量分布、自相关结构、变点位置和极值。记编辑前后的窗口为</w:t>
       </w:r>
       <w:r>
         <w:rPr>
@@ -2065,7 +1864,7 @@
         <w:rPr>
           <w:rFonts w:hint="eastAsia"/>
         </w:rPr>
-        <w:t xml:space="preserve">个属性在编辑前后的取值经该属性自身量纲归一化后的绝对差，取值在</w:t>
+        <w:t xml:space="preserve">个属性在编辑前后的取值按该属性自身量纲归一化之后的绝对差，落在</w:t>
       </w:r>
       <w:r>
         <w:rPr>
@@ -2103,7 +1902,13 @@
         <w:rPr>
           <w:rFonts w:hint="eastAsia"/>
         </w:rPr>
-        <w:t xml:space="preserve">，权重</w:t>
+        <w:t xml:space="preserve"> </w:t>
+      </w:r>
+      <w:r>
+        <w:rPr>
+          <w:rFonts w:hint="eastAsia"/>
+        </w:rPr>
+        <w:t xml:space="preserve">之间，权重</w:t>
       </w:r>
       <w:r>
         <w:rPr>
@@ -2135,7 +1940,7 @@
         <w:rPr>
           <w:rFonts w:hint="eastAsia"/>
         </w:rPr>
-        <w:t xml:space="preserve">按属性对该类算子的相关性给定。加权平均之外保留最差单项，可以避免某一项上的灾难性破坏被其余项平均掉。序列尾部被整体抹平就属于这种情形，它在多数属性上看起来变化不大，只在极值一项上暴露。</w:t>
+        <w:t xml:space="preserve">按属性对该类算子的相关程度给定。加权平均之外还留了最差的那一项，是为了防止某一项上的灾难被其余项平均掉。序列尾部被整段抹平就是这种情况，多数属性上看着变化不大，只有极值那一项会露馅。</w:t>
       </w:r>
       <m:oMath>
         <m:r>
@@ -2152,7 +1957,7 @@
         <w:rPr>
           <w:rFonts w:hint="eastAsia"/>
         </w:rPr>
-        <w:t xml:space="preserve">与模型无关，因而能够独立于效用信号提供约束，在策略学习过程中也不会被策略操纵。</w:t>
+        <w:t xml:space="preserve">与模型无关，因而能独立于效用信号提供约束，策略在学习过程中也没法操纵它。</w:t>
       </w:r>
     </w:p>
     <w:p>
@@ -2166,7 +1971,7 @@
         <w:rPr>
           <w:rFonts w:hint="eastAsia"/>
         </w:rPr>
-        <w:t xml:space="preserve">两个度量都有了，还需要确定它们在哪里被施加。屏蔽[14]指在智能体与环境之间加入一层过滤器，动作生效之前先检查它是否违反给定规约，通过检查才被放行。屏蔽的两个基本要求是可靠性与非阻塞性，前者指违规动作不会被放行，后者指任意状态下至少存在一个可以放行的动作。屏蔽与策略学习解耦，底层算法可以自由选择，安全性在每一步都成立，不依赖训练收敛。</w:t>
+        <w:t xml:space="preserve">两把尺子都有了，还得定下它们在哪一步生效。屏蔽[14]的做法是在智能体和环境之间加一层过滤，动作生效之前先查它有没有违反给定的规约，通过了才放行。屏蔽有两个基本要求，一是可靠，违规的动作不会漏过去，二是不阻塞，任何状态下至少还留着一个可以放行的动作。屏蔽和策略学习是分开的，底下用什么算法都行，安全性每一步都成立，不用等训练收敛。</w:t>
       </w:r>
     </w:p>
     <w:p>
@@ -2177,7 +1982,7 @@
         <w:rPr>
           <w:rFonts w:hint="eastAsia"/>
         </w:rPr>
-        <w:t xml:space="preserve">屏蔽给出了施加判断的位置，判断所用的阈值还需要一种确定方式，而在无标签场景中这个阈值无法由领域知识给定。共形风险控制[21]在不假设数据分布的前提下，为由阈值参数化的决策族提供有限样本的风险保证。给定与部署数据可交换的校准集、有界的风险函数以及目标风险水平</w:t>
+        <w:t xml:space="preserve">位置定了，阈值还得有个来处，而在无标签场景里这个数没法靠领域知识拍出来。共形风险控制[21]不对数据分布作任何假定，就能为由阈值参数化的一族决策给出有限样本的风险保证。给定一个与部署数据可交换的校准集、一个有界的风险函数和目标风险水平</w:t>
       </w:r>
       <w:r>
         <w:rPr>
@@ -2194,7 +1999,7 @@
         <w:rPr>
           <w:rFonts w:hint="eastAsia"/>
         </w:rPr>
-        <w:t xml:space="preserve">，该框架在嵌套阈值族</w:t>
+        <w:t xml:space="preserve">，它在嵌套阈值族</w:t>
       </w:r>
       <w:r>
         <w:rPr>
@@ -2217,7 +2022,7 @@
         <w:rPr>
           <w:rFonts w:hint="eastAsia"/>
         </w:rPr>
-        <w:t xml:space="preserve">上计算经验风险</w:t>
+        <w:t xml:space="preserve">上算经验风险</w:t>
       </w:r>
       <w:r>
         <w:rPr>
@@ -2425,7 +2230,7 @@
         <w:rPr>
           <w:rFonts w:hint="eastAsia"/>
         </w:rPr>
-        <w:t xml:space="preserve">选出阈值，其中</w:t>
+        <w:t xml:space="preserve">挑出阈值，其中</w:t>
       </w:r>
       <w:r>
         <w:rPr>
@@ -2448,7 +2253,7 @@
         <w:rPr>
           <w:rFonts w:hint="eastAsia"/>
         </w:rPr>
-        <w:t xml:space="preserve">为校准集大小，</w:t>
+        <w:t xml:space="preserve">是校准集大小，</w:t>
       </w:r>
       <m:oMath>
         <m:r>
@@ -2465,7 +2270,7 @@
         <w:rPr>
           <w:rFonts w:hint="eastAsia"/>
         </w:rPr>
-        <w:t xml:space="preserve">为置信参数。风险关于阈值单调时可以避开多重比较校正带来的保守性，单调性不成立时退回逐阈值检验并做校正[22]。本文的风险函数取每个窗口上编辑是否造成损害的零一指示，被标定的对象是屏蔽中的结构失真阈值</w:t>
+        <w:t xml:space="preserve">是置信参数。风险关于阈值单调时可以绕开多重比较校正带来的保守，不单调时退回逐个阈值检验再做校正[22]。本文的风险函数取每个窗口上编辑有没有造成损害这个零一指示，被标定的对象是屏蔽里的结构失真阈值</w:t>
       </w:r>
       <w:r>
         <w:rPr>
@@ -2516,7 +2321,7 @@
         <w:rPr>
           <w:rFonts w:hint="eastAsia"/>
         </w:rPr>
-        <w:t xml:space="preserve">本文处理时序特征层面的噪声，按其产生机制分为随机与系统两类，这一划分决定了它们在多通道语料中留下的痕迹是否可以相互印证。随机噪声来自环境扰动、设备误差与记录不一致，作用在单个通道的有限时间范围上，表现为孤立尖峰、散点缺失、连续缺失片段与重复片段。这类噪声在通道之间彼此独立，因此一个通道上的异常在同一时刻的其余通道上找不到对应。系统噪声来自采集设备的系统性偏差、数据来源切换与传感器漂移，它同时作用在多个通道上并改变整段窗口的分布，表现为水平位移、噪声放大与平台化。这类噪声在通道之间高度相关，同一时刻的多个通道会一起偏移。</w:t>
+        <w:t xml:space="preserve">本文处理的是时序特征层面的噪声，按它怎么产生的分成两类，这一分法决定了它在多通道语料里留下的痕迹能不能相互印证。随机噪声来自环境扰动、设备误差和记录不一致，只作用在单个通道的一小段时间上，形态包括孤立尖峰、散点缺失、连续缺失片段和重复片段。它在通道之间彼此独立，所以某个通道上的异常，在同一时刻的其余通道里找不到对应。系统噪声来自采集设备的系统性偏差、数据来源切换和传感器漂移，它同时压在多个通道上，改变整段窗口的分布，形态包括水平位移、噪声放大和平台化。它在通道之间高度相关，同一时刻的多个通道会一起偏。</w:t>
       </w:r>
     </w:p>
     <w:p>
@@ -2527,7 +2332,7 @@
         <w:rPr>
           <w:rFonts w:hint="eastAsia"/>
         </w:rPr>
-        <w:t xml:space="preserve">两类噪声给治理带来的困难并不相同。随机噪声在单个窗口上留下明显的局部痕迹，统计画像对其检测能力较强，困难在于它与真实发生的极端事件在波形上几乎一致，仅凭单通道证据无法判断某个尖峰是故障还是事件。系统噪声改变整段分布，在模型行为上的表现与合法的状态切换高度相似，水平位移与设备检修后的基线变化都会抬高预测误差，仅凭模型反馈同样无法区分。在语料的尺度上还有一重困难，模型行为信号反映的是窗口对该模型的可预测程度，而窗口的可预测程度与它的质量并不等同，结构上本就复杂却完全干净的数据同样会得到高风险读数。这一偏差对基于规则的方法只是误判，对基于学习的方法则更严重，因为策略会主动朝着偏差的方向优化，把降低可预测难度当作目标去追求。</w:t>
+        <w:t xml:space="preserve">两类噪声带来的困难不一样。随机噪声在单个窗口上留下明显的局部痕迹，统计画像抓得住，难的是它和真实发生的极端事件在波形上几乎一模一样，光看单个通道分不出某个尖峰是故障还是事件。系统噪声改变整段分布，在模型行为上的表现又和合法的状态切换很像，水平位移和设备检修后的基线变化都会把预测误差抬上去，光看模型反馈同样分不出来。放到整个语料的尺度上还有一重麻烦。模型行为信号反映的是这个窗口对这个模型有多难预测，而难不难预测跟质量好不好并不是一回事，结构本来就复杂却完全干净的数据，同样会拿到很高的风险读数。这个偏差对按规则办事的方法只是一次误判，对会学习的方法就严重得多，因为策略会主动朝偏差的方向使劲，把降低预测难度当成目标去追。</w:t>
       </w:r>
     </w:p>
     <w:p>
@@ -2561,7 +2366,7 @@
         <w:rPr>
           <w:rFonts w:hint="eastAsia"/>
         </w:rPr>
-        <w:t xml:space="preserve">给定含缺陷的时序语料</w:t>
+        <w:t xml:space="preserve">给定一份含噪的时序语料</w:t>
       </w:r>
       <w:r>
         <w:rPr>
@@ -2605,7 +2410,7 @@
         <w:rPr>
           <w:rFonts w:hint="eastAsia"/>
         </w:rPr>
-        <w:t xml:space="preserve">是长度固定的单通道序列，给定动作空间</w:t>
+        <w:t xml:space="preserve">是定长的单通道序列，再给定动作空间</w:t>
       </w:r>
       <w:r>
         <w:rPr>
@@ -2649,7 +2454,7 @@
         <w:rPr>
           <w:rFonts w:hint="eastAsia"/>
         </w:rPr>
-        <w:t xml:space="preserve">，治理的目标是学习策略</w:t>
+        <w:t xml:space="preserve">，治理要做的是学一个策略</w:t>
       </w:r>
       <w:r>
         <w:rPr>
@@ -2666,7 +2471,7 @@
         <w:rPr>
           <w:rFonts w:hint="eastAsia"/>
         </w:rPr>
-        <w:t xml:space="preserve">，为每个窗口选择动作序列，在提高语料对目标模型效用的同时不破坏窗口原有的时序结构，并在证据不足时不做处理。把治理过程建模为受约束的马尔可夫决策过程[17]，五个要素定义如下。</w:t>
+        <w:t xml:space="preserve">，为每个窗口挑动作序列，在把语料对目标模型的效用提上去的同时不破坏窗口原有的时序结构，证据不够时则什么也不做。把这个过程写成受约束的马尔可夫决策过程[17]，五个要素定义如下。</w:t>
       </w:r>
     </w:p>
     <w:p>
@@ -4841,7 +4646,7 @@
         <w:rPr>
           <w:rFonts w:hint="eastAsia"/>
         </w:rPr>
-        <w:t xml:space="preserve">这一问题设定有三个特征决定了方法的设计。</w:t>
+        <w:t xml:space="preserve">这个设定有三处特点，方法的形状基本是被它们逼出来的。</w:t>
       </w:r>
     </w:p>
     <w:p>
@@ -4926,7 +4731,7 @@
         <w:rPr>
           <w:rFonts w:hint="eastAsia"/>
         </w:rPr>
-        <w:t xml:space="preserve">（2）试错的代价落在不可恢复的对象上。语料被修改之后无法还原，这与可以重置的仿真环境不同。若探索直接作用于原数据，学习过程本身就是破坏过程。把执行与提交分开是使学习可行的前提。</w:t>
+        <w:t xml:space="preserve">（2）试错的代价落在改不回来的东西上。语料改过之后没法还原，这一点和可以重置的仿真环境不同。探索要是直接作用在原数据上，学习过程本身就是破坏过程。把执行和提交拆开，是让学习变得可行的前提。</w:t>
       </w:r>
     </w:p>
     <w:p>
@@ -5169,7 +4974,7 @@
         <w:rPr>
           <w:rFonts w:hint="eastAsia"/>
         </w:rPr>
-        <w:t xml:space="preserve">缺少质量标签时单一证据存在盲区，CDP 因而从两个来源取证，它们的失效区域并不重合，这是把两类证据同时保留的原因。</w:t>
+        <w:t xml:space="preserve">没有质量标签的时候，任何一路证据都有看不见的地方，所以 CDP 从两处取证，而这两处的盲区恰好错开。</w:t>
       </w:r>
     </w:p>
     <w:p>
@@ -5180,7 +4985,7 @@
         <w:rPr>
           <w:rFonts w:hint="eastAsia"/>
         </w:rPr>
-        <w:t xml:space="preserve">第一类证据是统计画像</w:t>
+        <w:t xml:space="preserve">头一路是统计画像</w:t>
       </w:r>
       <w:r>
         <w:rPr>
@@ -5219,7 +5024,7 @@
         <w:rPr>
           <w:rFonts w:hint="eastAsia"/>
         </w:rPr>
-        <w:t xml:space="preserve">，从窗口自身提取，覆盖缺失率、异常密度、趋势强度、季节强度、频谱特征、平稳性、变点数量与复杂度，其中变点数量由线性代价的变点检测算法给出[27]。这类属性对留下局部痕迹的缺陷敏感，尖峰会抬高异常密度，缺失片段会抬高缺失率。它的盲区在于统计上正常的缺陷，重复片段就属于此类，被复制的片段与原片段具有完全相同的统计属性。</w:t>
+        <w:t xml:space="preserve">，从窗口自身算出来，覆盖缺失率、异常密度、趋势强度、季节强度、频谱特征、平稳性、变点数量和复杂度，其中变点数量由线性代价的变点检测算法给出[27]。这些量对留下局部痕迹的噪声很敏感，尖峰会把异常密度顶上去，缺失片段会把缺失率顶上去。它看不见的是统计上完全正常的那类问题，重复片段就是，被复制的那一段和原段的统计属性一模一样。</w:t>
       </w:r>
     </w:p>
     <w:p>
@@ -5230,7 +5035,7 @@
         <w:rPr>
           <w:rFonts w:hint="eastAsia"/>
         </w:rPr>
-        <w:t xml:space="preserve">第二类证据是冻结基础模型的行为签名</w:t>
+        <w:t xml:space="preserve">第二路是冻结基础模型的行为签名</w:t>
       </w:r>
       <w:r>
         <w:rPr>
@@ -5247,7 +5052,7 @@
         <w:rPr>
           <w:rFonts w:hint="eastAsia"/>
         </w:rPr>
-        <w:t xml:space="preserve">，反映模型处理这个窗口时的困难程度。重复片段虽然统计正常，却会让模型在遇到第二次出现时给出异常自信的预测，这种反常在行为签名上留下痕迹。行为证据的盲区在于它无法区分数据有问题和数据本身复杂，两者都会让模型表现变差。</w:t>
+        <w:t xml:space="preserve">，反映模型处理这个窗口时费不费劲。重复片段虽然统计正常，却会让模型在第二次遇到时给出反常自信的预测，这种反常在签名上留得下痕迹。行为证据看不见的是数据有问题和数据本身复杂之间的区别，两者都会让模型表现变差。</w:t>
       </w:r>
     </w:p>
     <w:p>
@@ -5258,7 +5063,7 @@
         <w:rPr>
           <w:rFonts w:hint="eastAsia"/>
         </w:rPr>
-        <w:t xml:space="preserve">把两类证据直接相加，盲区会叠加起来，因为它们的量纲和分布都不同。CDP 的处理是先在画像空间中检索与当前窗口最相似的</w:t>
+        <w:t xml:space="preserve">两路证据直接相加只会让盲区叠起来，因为它们的量纲和分布都不一样。CDP 的做法是先在画像空间里找出与当前窗口最像的</w:t>
       </w:r>
       <w:r>
         <w:rPr>
@@ -5317,7 +5122,7 @@
         <w:rPr>
           <w:rFonts w:hint="eastAsia"/>
         </w:rPr>
-        <w:t xml:space="preserve">，相似度用画像向量经 L2 归一化后的余弦距离衡量，再用这组邻居的中位数与四分位距对行为签名做稳健标准化</w:t>
+        <w:t xml:space="preserve">，相似度用画像向量做 L2 归一化之后的余弦距离衡量，再拿这组邻居的中位数与四分位距对行为签名做稳健标准化</w:t>
       </w:r>
     </w:p>
     <w:p>
@@ -5715,7 +5520,7 @@
         <w:rPr>
           <w:rFonts w:hint="eastAsia"/>
         </w:rPr>
-        <w:t xml:space="preserve">检索到的邻居集合还有第二个用途。同一组邻居定义了一个画像簇</w:t>
+        <w:t xml:space="preserve">找出来的这组邻居还有另一个用处。它们定义了一个画像簇</w:t>
       </w:r>
       <w:r>
         <w:rPr>
@@ -5732,7 +5537,7 @@
         <w:rPr>
           <w:rFonts w:hint="eastAsia"/>
         </w:rPr>
-        <w:t xml:space="preserve">，SPO 的动作价值估计正是按簇维护的，因为同一簇内的窗口在结构上相似，某个算子在其中一个窗口上有效往往意味着在其余窗口上也有效。CDP 因此既提供状态，也提供策略泛化所依赖的划分。算法 1 给出完整流程。</w:t>
+        <w:t xml:space="preserve">，SPO 的动作价值估计正是按簇维护的。同一簇里的窗口结构相近，某个算子在其中一个上管用，往往在其余几个上也管用。CDP 因此既提供状态，也提供了策略赖以泛化的划分。算法 1 给出完整流程。</w:t>
       </w:r>
     </w:p>
     <w:p>
@@ -7082,7 +6887,7 @@
         <w:rPr>
           <w:rFonts w:hint="eastAsia"/>
         </w:rPr>
-        <w:t xml:space="preserve">状态说明了窗口可能存在什么问题，却没有回答某个具体动作施加下去会发生什么。这个问题只能通过真正执行一次动作并观察结果来回答，而强化学习需要反复尝试，语料一旦被修改就无法还原，两个要求直接冲突。SIR 把执行与提交分开，使两者可以同时满足。</w:t>
+        <w:t xml:space="preserve">状态说明了这个窗口可能有什么毛病，却没说某个具体动作做下去会怎样。要回答这个只能真做一次再看结果。而强化学习又要反复地做，语料改过之后没法还原，两个要求正面冲突。SIR 把执行和提交拆开，让这两件事可以同时成立。</w:t>
       </w:r>
     </w:p>
     <w:p>
@@ -7169,7 +6974,7 @@
         <w:rPr>
           <w:rFonts w:hint="eastAsia"/>
         </w:rPr>
-        <w:t xml:space="preserve">保持不变。随后用与事前完全相同的探测函数测量</w:t>
+        <w:t xml:space="preserve">不动。随后拿事前用过的那个探测函数原样测一遍</w:t>
       </w:r>
       <w:r>
         <w:rPr>
@@ -7262,7 +7067,7 @@
         <w:rPr>
           <w:rFonts w:hint="eastAsia"/>
         </w:rPr>
-        <w:t xml:space="preserve">相减即为该动作的效用变化。这一读数有两个去向，一是进入 CDS 作为裁决依据，二是在裁决之后成为策略更新所用的奖励。两个用途都要求读数在不同窗口与不同轮次之间可比，下面的引理给出了具体条件。</w:t>
+        <w:t xml:space="preserve">相减就是这次动作带来的效用变化。这个读数有两个去处，一是送进 CDS 当裁决依据，二是裁决之后当策略更新的奖励。两个用处都要求读数在不同窗口和不同轮次之间可比，下面的引理给出具体条件。</w:t>
       </w:r>
     </w:p>
     <w:p>
@@ -7714,7 +7519,7 @@
         <w:rPr>
           <w:rFonts w:hint="eastAsia"/>
         </w:rPr>
-        <w:t xml:space="preserve">引理 1 对 SIR 的实现提出两条约束。归一化尺度取分块四分位距的中位数并在决策开始时固定，这样即使窗口中存在整段水平位移，尺度也不会被这段位移撑大。改变窗口长度的动作在共有的重叠区间上比较，避免留出跨度发生变化。满足这两条之后，同一个</w:t>
+        <w:t xml:space="preserve">引理 1 落到实现上就是两条约束。归一化尺度取分块四分位距的中位数并在决策开始时定死，这样即使窗口里有整段水平位移，尺度也不会被它撑大。改变窗口长度的动作只在共有的重叠区间上比较，避免留出跨度发生变化。这两条都满足了，同一个</w:t>
       </w:r>
       <w:r>
         <w:rPr>
@@ -7740,7 +7545,7 @@
         <w:rPr>
           <w:rFonts w:hint="eastAsia"/>
         </w:rPr>
-        <w:t xml:space="preserve">才能既支撑裁决又支撑学习。</w:t>
+        <w:t xml:space="preserve">才既撑得起裁决又撑得起学习。</w:t>
       </w:r>
     </w:p>
     <w:p>
@@ -7751,7 +7556,7 @@
         <w:rPr>
           <w:rFonts w:hint="eastAsia"/>
         </w:rPr>
-        <w:t xml:space="preserve">SIR 还负责把裁决结果转换为奖励。被接受的动作以其效用增益计入正奖励，被撤销的动作只计入探测代价形成负奖励，保留与拒绝处理的奖励为零。这样的设计使策略在提出动作时同时考虑两件事，动作能带来多少改善，以及这个动作有多大可能通过屏蔽。3.3 节将说明，正是后一项使策略避开了以抹平换取效用的捷径。</w:t>
+        <w:t xml:space="preserve">SIR 还负责把裁决结果换算成奖励。通过的动作按它的效用增益计正奖励，被撤销的只计探测代价形成负奖励，保留和拒绝处理都计零。这样一来策略在提动作的时候要同时掂量两件事，这个动作能带来多少改善，以及它有多大把握通过屏蔽。3.3 节会说明，正是后一件让策略绕开了拿抹平换效用这条捷径。</w:t>
       </w:r>
     </w:p>
     <w:p>
@@ -7785,7 +7590,7 @@
         <w:rPr>
           <w:rFonts w:hint="eastAsia"/>
         </w:rPr>
-        <w:t xml:space="preserve">SIR 给出了可比的效用读数，但 2.2 节已经指出这个信号在部分数据上与有害性方向相反。仅凭</w:t>
+        <w:t xml:space="preserve">SIR 给出了可比的效用读数，而 2.2 节已经讲过这个信号在一部分数据上与有害性反着走。只凭</w:t>
       </w:r>
       <w:r>
         <w:rPr>
@@ -7811,7 +7616,7 @@
         <w:rPr>
           <w:rFonts w:hint="eastAsia"/>
         </w:rPr>
-        <w:t xml:space="preserve">作出裁决会放行那些通过抹平序列换取低误差的动作，而在策略需要学习的设定下，后果比一次误判严重得多，因为策略会朝着这个方向持续优化。CDS 的做法是要求两类相互独立的证据同时支持这次提交。</w:t>
+        <w:t xml:space="preserve">作裁决，会把那些靠削平序列换低误差的动作放进来。在策略要学习的设定下，后果比误判一次严重得多，因为策略会顺着这个方向一直优化下去。CDS 的办法是要求两路彼此独立的证据同时点头。</w:t>
       </w:r>
     </w:p>
     <w:p>
@@ -8888,7 +8693,7 @@
         <w:rPr>
           <w:rFonts w:hint="eastAsia"/>
         </w:rPr>
-        <w:t xml:space="preserve">定理 1 不依赖任何一个条件的判别力。即使效用条件在某类数据上完全失效，复合屏蔽造成的损害也不会超过仅用结构条件的情形。该结论针对损害总量，接受集缩小的同时修复收益也会减少，两者的权衡由 3.4 节末尾的阈值标定处理。</w:t>
+        <w:t xml:space="preserve">定理 1 不依赖任何单个条件的判别力。就算效用条件在某类数据上完全失灵，复合屏蔽造成的损害也不会超过只用结构条件时的水平。这个结论说的是损害总量，接受集缩小的同时修复收益也会跟着减少，两者怎么权衡由 3.4 节末尾的阈值标定处理。</w:t>
       </w:r>
     </w:p>
     <w:p>
@@ -8899,7 +8704,7 @@
         <w:rPr>
           <w:rFonts w:hint="eastAsia"/>
         </w:rPr>
-        <w:t xml:space="preserve">把结构信息以合取条件的形式引入，与把它作为目标函数中的惩罚项引入，两者的差别不止于形式。同期的清洗智能体采用后一种做法，即在效用增益中减去带系数的结构失真再按加权和取舍。下面的结论说明这两种做法在严格的损害预算下并不等价。</w:t>
+        <w:t xml:space="preserve">把结构信息写成合取条件，跟把它写成目标函数里的一项惩罚，差别不止在形式上。同期的清洗智能体用的是后一种，在效用增益里减去带系数的结构失真，再按这个加权和排序取舍。下面的结论说明这两种写法在严格的损害预算下并不等价。</w:t>
       </w:r>
     </w:p>
     <w:p>
@@ -9358,7 +9163,7 @@
         <w:rPr>
           <w:rFonts w:hint="eastAsia"/>
         </w:rPr>
-        <w:t xml:space="preserve">屏蔽的第二重作用来自它与奖励的耦合。由 3.2 节的奖励定义，只有通过屏蔽的动作才计入正奖励，被撤销的动作只留下探测代价。策略实际收到的回报因而是经过结构条件过滤后的</w:t>
+        <w:t xml:space="preserve">屏蔽的第二重作用来自它和奖励之间的耦合。按 3.2 节的奖励定义，只有通过屏蔽的动作才计正奖励，被撤销的只留下探测代价。策略实际收到的回报因此是过了结构条件之后的</w:t>
       </w:r>
       <w:r>
         <w:rPr>
@@ -9378,7 +9183,7 @@
         <w:rPr>
           <w:rFonts w:hint="eastAsia"/>
         </w:rPr>
-        <w:t xml:space="preserve">，不是原始读数。一个抹平动作即使拿到很高的效用读数，也会因结构失真超限而被撤销，最终计入负奖励。策略在若干轮之后会学到，在需要保护的窗口上提出抹平动作是不划算的，从而在提议阶段就避开这类动作。若把奖励换成未经过滤的</w:t>
+        <w:t xml:space="preserve">，不是原始读数。一个抹平动作就算拿到很高的效用读数，也会因结构失真超限而被撤销，最后计成负奖励。几轮之后策略会学到，在需要保护的窗口上提抹平动作是不划算的，于是在提议阶段就绕开这类动作。若把奖励换成没过滤的</w:t>
       </w:r>
       <w:r>
         <w:rPr>
@@ -9398,7 +9203,7 @@
         <w:rPr>
           <w:rFonts w:hint="eastAsia"/>
         </w:rPr>
-        <w:t xml:space="preserve">，同样的学习过程会得到相反的结果。这一对比构成了 4.2 节奖励塑形消融实验的设计依据。</w:t>
+        <w:t xml:space="preserve">，同样的学习过程会得到相反的结果。这一对照就是 4.2 节奖励塑形消融实验的设计依据。</w:t>
       </w:r>
     </w:p>
     <w:p>
@@ -9409,7 +9214,7 @@
         <w:rPr>
           <w:rFonts w:hint="eastAsia"/>
         </w:rPr>
-        <w:t xml:space="preserve">裁决之后的控制流有五个去向。三条件同时满足时接受动作，把候选副本提交为新的工作副本并记录轨迹。效用未改善或结构失真超限时撤销，恢复原副本，并把撤销原因写入状态。仍有可信候选且预算未耗尽时可以尝试其他动作，此时策略能够依据撤销原因调整方向，被结构条件否决意味着应当换用改动足迹更小的算子，被效用条件否决则意味着缺陷类型的判断可能有误。窗口风险高但无法可靠修复时转入隔离，证据不足或预算耗尽时拒绝处理并结束该窗口。算法 2 给出完整流程。</w:t>
+        <w:t xml:space="preserve">裁决之后有五种走法。三个条件都满足就接受，把候选副本提交为新的工作副本并记进轨迹。效用没改善或者结构失真超限就撤销，恢复原副本，并把撤销的原因写进状态。还有可信候选且预算没耗尽时可以换个动作再试，这时策略能依据撤销原因调整方向，被结构条件否掉意味着该换个动静更小的算子，被效用条件否掉则意味着对缺陷类型的判断可能就错了。窗口风险高但修不可靠时转入隔离，证据不足或预算耗尽时拒绝处理并结束这个窗口。算法 2 给出完整流程。</w:t>
       </w:r>
     </w:p>
     <w:p>
@@ -11911,7 +11716,7 @@
         <w:rPr>
           <w:rFonts w:hint="eastAsia"/>
         </w:rPr>
-        <w:t xml:space="preserve">前三个模块构成了一个可以安全试错的环境，余下的问题是如何利用这个环境改进决策。设计这一模块的动机来自一个实测观察。在固定规则的版本中，被否决后更换动作重试的净效果为负，更换后的动作改善与恶化之比不足首次提议的十分之一。原因在于固定规则把最有把握的动作排在首位，此后的备选顺序与窗口特性无关，更换因而往往是盲目的。序贯决策本身可行，问题出在备选顺序需要根据窗口类型学习。</w:t>
+        <w:t xml:space="preserve">前三个环节合起来是一个可以安全试错的场子，剩下的问题是怎么利用它把决策做得更好。这一模块的设计动机来自一次实测。在固定规则的版本里，被否决之后换动作重试的净效果是负的，换过之后的动作，改善与恶化之比不到首次提议的十分之一。原因在于固定规则把最有把握的动作排在最前，后面的次序与窗口特性无关，换来换去因此往往是盲目的。序贯决策本身没问题，问题出在备选次序需要按窗口类型学。</w:t>
       </w:r>
     </w:p>
     <w:p>
@@ -11922,7 +11727,7 @@
         <w:rPr>
           <w:rFonts w:hint="eastAsia"/>
         </w:rPr>
-        <w:t>SPO 采用上下文老虎机，理由是本任务的决策序列很短，多数窗口在三步以内结束，状态经 CDP 提取后维度不高，动作集合规模有限。在这样的设定下，上置信界方法的样本效率与可解释性都优于需要大量交互的深度方法，且有成熟的遗憾分析[18,19,20]。</w:t>
+        <w:t xml:space="preserve">SPO 用的是上下文老虎机，理由是这个任务的决策序列很短，多数窗口三步以内结束，状态经 CDP 提取之后维度不高，动作集合也有限。在这种规模下，上置信界方法的样本效率和可解释性都好过需要大量交互的深度方法，遗憾分析也是现成的[18,19,20]。</w:t>
       </w:r>
     </w:p>
     <w:p>
@@ -16926,7 +16731,7 @@
         <w:rPr>
           <w:rFonts w:hint="eastAsia"/>
         </w:rPr>
-        <w:t xml:space="preserve">本文的做法建立在几个需要检验的判断之上。模型给出的效用读数在需要保护的数据上与有害性方向相反，这是引入结构条件的前提。判定的结果作为奖励能够把策略引向可以通过结构检验的修复方式，这是屏蔽的第二重职责。试错发生在副本上因而学习不破坏语料，这是把判定推迟到执行之后所换来的。本章的实验规划围绕这几点展开，前四组检验治理后语料的质量是否达到预期，后五组检验智能体的决策本身是否可靠。在此之前先交代数据、噪声注入、基线与指标的设置。</w:t>
+        <w:t xml:space="preserve">本文的做法压在几个还需要验证的判断上。模型给出的效用读数在需要保护的数据上与有害性反着走，这是引入结构条件的前提。判定结果拿来当奖励能把策略引向那些通得过结构检验的修复方式，这是屏蔽的第二重职责。试错发生在副本上所以学习不伤语料，这是把判断后移换来的好处。本章的实验就围绕这几点安排，前四组看治理之后语料的质量够不够，后五组看智能体自己的决策靠不靠得住。在此之前先交代数据、噪声注入、基线和指标怎么定。</w:t>
       </w:r>
     </w:p>
     <w:p>
@@ -18613,7 +18418,7 @@
           <w:b/>
           <w:bCs/>
         </w:rPr>
-        <w:t xml:space="preserve">固定规则下的重试净效果为负。更换动作的成功率不足首次提议的十分之一，原因是备选顺序与窗口特性无关。这一结果构成了引入策略学习的直接依据，序贯决策的价值需要策略能够依据撤销原因调整方向才能兑现。</w:t>
+        <w:t xml:space="preserve">固定规则下重试的净效果是负的。换动作之后的成功率不到首次提议的十分之一，原因是备选次序与窗口特性无关。这个结果是引入策略学习最直接的依据，序贯决策的价值要等策略能依据撤销原因调整方向之后才兑现得出来。</w:t>
       </w:r>
     </w:p>
     <w:p>
@@ -18632,7 +18437,7 @@
           <w:b/>
           <w:bCs/>
         </w:rPr>
-        <w:t>同类校准未能提升判别力，属设计取舍暴露出的限制。问题出在被校准的量上，行为信号反映窗口的可预测程度，任何标准化都无法把这一混杂剥离。这一发现同时说明该信号不适合单独充当奖励。</w:t>
+        <w:t xml:space="preserve">同类校准没能提升判别力，这是设计取舍暴露出来的限制。问题出在被校准的那个量上，不在校准方式上。行为信号反映的是窗口有多难预测，任何标准化都剥不掉这层混杂。这个发现同时说明该信号不适合单独拿来当奖励。</w:t>
       </w:r>
     </w:p>
     <w:p>
@@ -18651,7 +18456,7 @@
           <w:b/>
           <w:bCs/>
         </w:rPr>
-        <w:t xml:space="preserve">结构条件在整条序列重写的候选上出现反向筛选，属实现缺陷。根因是这类候选被路由到未经标定的计算路径，令其声明实际改动的点集之后该现象消失。</w:t>
+        <w:t xml:space="preserve">结构条件在整条序列重写的候选上出现了反向筛选，这是实现上的缺陷。根子在于这类候选被送进了一条没有标定过的计算路径。让它们声明自己实际改动了哪些点之后，现象随即消失。</w:t>
       </w:r>
     </w:p>
     <w:p>
@@ -18670,7 +18475,7 @@
           <w:b/>
           <w:bCs/>
         </w:rPr>
-        <w:t xml:space="preserve">下游任务上未观测到正向增益，同样是设计取舍的结果。方法只修改了语料中不足百分之八的窗口，改动量过小，现有下游协议无法分辨，下游部分因此只保留防御性结论。</w:t>
+        <w:t xml:space="preserve">下游任务上没看到正向增益，同样是设计取舍带来的。方法只改了语料里不到百分之八的窗口，改动量太小，现有的下游协议分辨不出这点差别，下游部分因此只保留防御性的结论。</w:t>
       </w:r>
     </w:p>
     <w:p>
@@ -18689,7 +18494,7 @@
           <w:b/>
           <w:bCs/>
         </w:rPr>
-        <w:t xml:space="preserve">候选有害率的高值主要由语料构成决定。受保护层占已发表方法候选的一半以上，而在干净窗口上任何编辑按定义都增加误差。准确的表述是这些方法有一半以上的编辑落在不该动的数据上。</w:t>
+        <w:t xml:space="preserve">候选有害率之所以偏高，主要是语料构成决定的。受保护层占了已发表方法候选的一半以上，而在干净窗口上任何编辑按定义都会增加误差。准确的说法是这些方法有一半以上的编辑落在了不该动的数据上。</w:t>
       </w:r>
     </w:p>
     <w:p>
@@ -18746,7 +18551,7 @@
           <w:b/>
           <w:bCs/>
         </w:rPr>
-        <w:t xml:space="preserve">共形保证在跨语料设定下失效，属实验设计问题。校准集与部署数据的可交换性不成立，改为同一池的随机划分后保证恢复。引入策略学习之后，策略更新同样会破坏可交换性，需要通过定期重新标定来控制。</w:t>
+        <w:t xml:space="preserve">共形保证在跨语料的设定下失效了，这是实验设计的问题。校准集和部署数据之间的可交换性根本不成立，改成同一池子里随机划分之后保证就恢复了。引入策略学习之后，策略更新同样会破坏可交换性，得靠定期重新标定来控制。</w:t>
       </w:r>
     </w:p>
     <w:p>
@@ -18765,7 +18570,7 @@
           <w:b/>
           <w:bCs/>
         </w:rPr>
-        <w:t>可学结构集中在单一算子上。按画像簇与算子交叉统计固定规则策略的接受率，插补的接受率在簇之间存在可检出的差异，而重分段在任何簇数下都没有，去尖峰随簇数增大迅速失去显著性，更像分辨率不足，去噪的候选数太少且低期望频数格子过多，不作为独立证据。策略学习的收益因而集中在插补提议的取舍上。</w:t>
+        <w:t xml:space="preserve">可学的结构集中在一个算子上。按画像簇与算子交叉统计固定规则策略的接受率，插补的接受率在簇之间有可检出的差异，重分段在任何簇数下都没有，去尖峰随簇数增大很快失去显著性，看着更像分辨率不够而不像真有结构，去噪的候选数太少且低期望频数的格子过多，不能当独立证据用。策略学习的收益因此集中在插补提议的取舍上。</w:t>
       </w:r>
     </w:p>
     <w:p>
@@ -18784,7 +18589,7 @@
           <w:b/>
           <w:bCs/>
         </w:rPr>
-        <w:t>固定规则策略存在系统性盲区。在簇与算子的全部组合中有四分之一从未被访问，其中两格合计覆盖语料近两成的窗口，而固定规则在这些窗口上一次也没有提议过对应算子。这是确定性策略的结构性缺失，与数据稀疏无关，离线无法对这些格子估值，只能依靠在线探索填补，这也是引入乐观初始化的直接理由。</w:t>
+        <w:t xml:space="preserve">固定规则策略有系统性的盲区。在簇与算子的全部组合里有四分之一从来没被访问过，其中两格合起来覆盖了语料近两成的窗口，而固定规则在这些窗口上一次也没提过对应的算子。这是确定性策略的结构性缺失，与数据稀疏无关，离线没办法给这些格子估值，只能靠在线探索去填，这也正是引入乐观初始化的直接理由。</w:t>
       </w:r>
     </w:p>
     <w:p>
@@ -18803,7 +18608,7 @@
           <w:b/>
           <w:bCs/>
         </w:rPr>
-        <w:t xml:space="preserve">画像簇不是分层标签的重述。簇与分层标签的调整互信息很低，说明画像几何捕捉的结构与人工分层基本正交。若两者高度一致，则接受率随簇变化这一现象将只是接受率随分层变化的换一种说法，而分层信息 CDP 已经以缺陷假设的形式给出，策略学习不会带来新信息。</w:t>
+        <w:t xml:space="preserve">画像簇不是分层标签换个说法。簇与分层标签的调整互信息很低，说明画像几何抓到的结构与人工分层基本正交。两者若高度一致，则接受率随簇变化这件事就只是接受率随分层变化的另一种说法，而分层信息 CDP 已经以缺陷假设的形式给出来了，策略学习不会带来新东西。</w:t>
       </w:r>
     </w:p>
     <w:p>
@@ -18843,7 +18648,7 @@
         <w:rPr>
           <w:rFonts w:hint="eastAsia"/>
         </w:rPr>
-        <w:t xml:space="preserve">把策略从按画像簇维护的表格式价值估计升级为线性或浅层函数逼近，使其能利用状态中的连续分量，同时保留可解释性与样本效率。</w:t>
+        <w:t xml:space="preserve">把策略从按画像簇维护的表格式价值估计换成线性或浅层函数逼近，让它能用上状态里的连续分量，同时保住可解释性和样本效率。</w:t>
       </w:r>
     </w:p>
     <w:p>

</xml_diff>

<commit_message>
Restore the academic register while keeping the sentence function sequence
</commit_message>
<xml_diff>
--- a/docx/胡宏彬-进度文档-20260820.docx
+++ b/docx/胡宏彬-进度文档-20260820.docx
@@ -54,7 +54,7 @@
         <w:rPr>
           <w:rFonts w:hint="eastAsia"/>
         </w:rPr>
-        <w:t xml:space="preserve">时序基础模型的效果越来越取决于预训练语料的质量，而时序数据的治理有一处别处没有的麻烦，一次改动是好是坏多数时候不由改法决定，由被改的那一段决定。同一个去尖峰算子落在传感器故障上是修好，落在真实发生的极端事件上是毁掉，靠事先写死的规则去决定某次改动值不值得做因而从道理上就靠不住。已有工作或者在规则给出结论的同时就把改写压到原值上，做错了退不回来，或者只给数据打分而根本不动手，遇到局部有尖峰的窗口只能整窗丢掉。本文把判断挪到动作做完之后，并让动作在工作副本的拷贝上执行，做错了可以退回去。这样做会碰到两道坎。判断的依据只能来自目标模型，而模型在被削平的数据上给出的读数与有害性正好相反，本文因此要求模型效用改善与时序结构受控两件事同时成立才放行，并用共形风险控制把结构那一条的阈值标定到给定的损害率上。策略要从判断里学东西又得反复试，而语料没有可以重开的存档，本文的做法是让所有候选都在副本上执行，没通过判定的尝试不改动任何数据。屏蔽因此干了两件事，它拦下破坏性的动作，也决定了哪些奖励能到达策略。本文给出六条定理与一条命题及其证明，涵盖合取判定的损害单调性、非阻塞性、任意策略下的结构安全性、共形风险控制、标定间隔内保证退化的上界与屏蔽动作空间上的遗憾界，并说明把结构约束写成惩罚项时损害率有一个消不掉的下界，在此基础上规划了覆盖工业与金融两类场景的九组实验。</w:t>
+        <w:t xml:space="preserve">时序基础模型的能力上限越来越取决于预训练语料的质量，而时序数据的治理面临一个其他数据类型所不具备的根本困难，即一次修改的有害与否往往取决于被修改的数据段本身，而与修改方式无关。同一个去尖峰算子作用于传感器故障时构成修复，作用于真实发生的极端事件时则构成破坏，依据事先设定的规则判断某次修改是否值得执行因而在原理层面便无法成立。已有工作或在规则给出结论的同时即将改写作用于原始数值，错误决策无从撤销，或仅对样本给出分数而不产生动作，面对局部含有尖峰的窗口只能整窗丢弃。本文将判定推迟至动作执行之后，并使动作在工作副本的拷贝上执行，从而允许撤销错误的决策。这一设计面临两重挑战。判定依据只能来自目标模型，而模型在被削平的数据上给出的读数与有害性方向相反，本文因此要求模型效用改善与时序结构受控两个条件同时成立方予提交，并以共形风险控制将结构条件的阈值标定至给定的损害率。策略从判定中学习需要反复尝试，而语料不存在可以重置的副本，本文的处理是使全部候选均在副本上执行，未通过判定的尝试不改动任何数据。屏蔽在这一设计中承担双重职责，它拦截破坏性动作，同时决定了哪些奖励能够到达策略。本文给出六条定理与一条命题及其证明，涵盖合取判定的损害单调性、非阻塞性、任意策略下的结构安全性、共形风险控制、标定间隔内保证退化的上界与屏蔽动作空间上的遗憾界，并说明将结构约束写成惩罚项时损害率存在不可消除的下界，在此基础上规划了覆盖工业与金融两类场景的九组实验。</w:t>
       </w:r>
     </w:p>
     <w:p>
@@ -68,7 +68,7 @@
         <w:rPr>
           <w:rFonts w:hint="eastAsia"/>
         </w:rPr>
-        <w:t xml:space="preserve">风电场要预测明天的出力，变电站要排后天的负荷，交易台想提前知道波动会不会放大。这些事从前各做各的，模型、特征和调参经验都不共用。近两年的做法变了，先在海量时序上预训练一个基础模型，再对着具体任务微调，一套权重就能同时应付这几件事，在电力与金融场景下已经能追平甚至超过为单个任务专门训练的模型[1-4]。换来的结果是差距从架构挪到了数据上，各家的网络结构正在趋同，剩下的高低主要看预训练时喂进去的是什么。时序语料好不好用可以从两处看。一处是模态齐不齐，设备有平稳运转的时候，也有启停切换和故障前兆的时候，市场有波澜不惊的月份，也有剧烈震荡的那几天，模型训练时没见过某一类形态，上线之后多半也认不出来。另一处是杂音多不多，传感器会漂移，通信会丢包，人工录入会填错，这些痕迹留在语料里就会被当成规律学走。实际采到的数据在这两处都靠不住，而监测点位和交易品种还在增加，语料的体量涨得比人能审核的速度快得多。怎么从一大批含杂音的时序记录里整理出可用的语料，成了训练时序基础模型绕不开的一环。</w:t>
+        <w:t xml:space="preserve">人工智能领域的研究重心正在从模型架构的设计转向数据本身。随着深度网络的结构设计逐渐成熟，数据质量已成为制约模型性能进一步提升的主要因素。在时序分析领域，这一趋势伴随时序基础模型的出现而愈发明确，此类模型在大规模多来源语料上完成预训练，再迁移至预测、分类与插补等下游任务[1-4]，以一套权重覆盖了以往需要逐个场景单独建模的工作，其能力上限因而主要取决于预训练语料的质量。时序语料的质量通常指语料在结构完备性与信噪水平两个维度上满足训练需求的程度。结构完备要求语料覆盖设备或市场实际出现过的各类运行模态，涵盖常规工况、状态切换以及罕见但真实发生的极端事件，模型只有在训练阶段接触过这些形态，部署时才具备相应的识别能力。信噪水平则要求传感器故障、通信丢包与人工录入错误所引入的失真足够少，此类失真一旦留存于语料之中，便会被模型当作规律学习[5,6]。随着工业物联网与金融交易系统的普及，可获取的时序记录正以极快的速度积累，而规模的扩张往往伴随噪声的累积，原始采集的数据在上述两个维度上均难以达标。鉴于此，如何从大规模含噪的时序记录中整备出高质量的预训练语料，已成为时序基础模型训练链条中一个亟待解决的问题。</w:t>
       </w:r>
     </w:p>
     <w:p>
@@ -79,7 +79,7 @@
         <w:rPr>
           <w:rFonts w:hint="eastAsia"/>
         </w:rPr>
-        <w:t xml:space="preserve">围绕这件事已经积累了一批方法，通称数据治理[5,6]。它们要回答的是哪些地方有问题，以及问题该怎么办。有的按事先定好的规则去改可疑的读数，有的给每条数据估一个价值再决定留不留。这类方法把整备的规模从人工能承受的几千条推到了十万量级，也让同一批数据在不同轮次里得到一致的处理。</w:t>
+        <w:t xml:space="preserve">面向这一需求，时序数据治理作为高质量数据准备的重要环节，近年来受到持续关注[5,6]。治理技术所要回答的是语料中哪些部分存在问题以及这些问题应当如何处理，其具体做法或是依据既定约束改写可疑的观测值，或是估计各样本对模型的贡献并据此决定取舍。通过自动化的识别与处理，治理技术能够在控制人工投入的前提下提升语料的可用程度，使十万量级窗口的整备成为可能，同时保证不同批次之间处理标准的一致性。</w:t>
       </w:r>
     </w:p>
     <w:p>
@@ -90,7 +90,7 @@
         <w:rPr>
           <w:rFonts w:hint="eastAsia"/>
         </w:rPr>
-        <w:t xml:space="preserve">放到时序数据上，治理有一处别处没有的麻烦。一次改动是好是坏，多数时候不由改法决定，由被改的那一段决定。拿变压器的监测记录来说，检修期间读数会整体抬高一截，这一段该压回去，不然模型会把抬高后的水平当成常态，检修结束很久之后给出的预测还偏着。可另一种情形看上去几乎一样，某天负荷突然冲高，波形与故障造成的尖峰难以分辨，它却是语料里最值钱的部分，削掉等于把模型最该学的那类形态删了。两次面对的是同一个去尖峰算子和同一组参数，一次是修好，一次是毁掉，分野只在那段数据本身承载着什么。这就意味着，靠事先写死的规则去决定某次改动值不值得做，从道理上就靠不住。</w:t>
+        <w:t xml:space="preserve">然而，时序数据的治理面临一个其他数据类型所不具备的根本困难，即一次修改的有害与否往往取决于被修改的数据段本身，而与修改方式无关。以电力变压器的监测记录为例，设备检修期间产生的整段水平漂移应当被处理，若予以保留，模型会将偏移后的水平当作正常基线，在随后的正常时段持续给出偏高的预测，误差可延续至漂移结束之后很久。而一次真实发生的负荷突增在波形上与故障尖峰高度相似，它却是语料结构完备性所依赖的关键部分，将其削平相当于删去模型最需要学习的稀有模态。两种情形所面对的是同一个去尖峰算子与同一组参数，一次构成修复，另一次构成破坏，差异仅在于该数据段本身承载的内容。这意味着依据事先设定的规则去判断某次修改是否值得执行，在原理层面便无法成立。</w:t>
       </w:r>
     </w:p>
     <w:p>
@@ -107,7 +107,7 @@
         <w:rPr>
           <w:rFonts w:hint="eastAsia"/>
         </w:rPr>
-        <w:t xml:space="preserve">已有做法可以按两件事归类，判断发生在什么时候，以及判断依据什么。表 1 按这两点分成三类。</w:t>
+        <w:t xml:space="preserve">为系统评估现有方法在这一问题上的适用性，本文对时序数据治理与选择技术进行了梳理与分类，见表 1。依据判定发生的时刻与判定所依据的信息，当前工作大致可分为三类。</w:t>
       </w:r>
     </w:p>
     <w:p>
@@ -404,7 +404,7 @@
         <w:rPr>
           <w:rFonts w:hint="eastAsia"/>
         </w:rPr>
-        <w:t xml:space="preserve">（1）修复式清洗看取值是否越过了事先给定的界。SCREEN[5]假定相邻两点之间的变化幅度有上下限，把越界的点拉回最近的合法取值，IMR[6]换成自回归模型逐点估计再迭代收敛，MTCSC[8]把速度约束和聚类放在一起，借维度之间的相关性提高精度。这一类的判断在选定算子那一刻就结束了，规则给出结果，改写随即落到原值上。</w:t>
+        <w:t xml:space="preserve">（1）修复式清洗以取值是否越出事先给定的边界作为判定依据。SCREEN[5]假定相邻时间步之间的变化幅度存在上下限，将越界的观测点修复至最近的合法取值，并给出了线性时间的在线算法。IMR[6]转而采用自回归模型逐点估计并迭代收敛。MTCSC[8]将速度约束与聚类相结合，借助维度之间的相关性提升修复精度。这一类方法的判定在算子选定之时即告完成，规则给出结论后，改写随即作用于原始数值。</w:t>
       </w:r>
     </w:p>
     <w:p>
@@ -415,7 +415,7 @@
         <w:rPr>
           <w:rFonts w:hint="eastAsia"/>
         </w:rPr>
-        <w:t xml:space="preserve">（2）打分式选择看这条数据对模型有多大用处。Data Shapley[9]用合作博弈里的 Shapley 值算每个样本的价值，Data-OOB[10]改用袋外估计把这笔开销压下来，TimeInf[11]把影响函数放到时间块上以保住时序结构，TSRating[12]则让大模型两两比较再蒸馏出一个轻量评分器。这一类给出的是分数和排序，语料按分数取舍，本身不被改动。</w:t>
+        <w:t xml:space="preserve">（2）打分式选择以样本对模型的估计贡献作为判定依据。Data Shapley[9]借助合作博弈中的 Shapley 值刻画样本价值，Data-OOB[10]改用袋装模型的袋外估计以降低计算开销，TimeInf[11]将影响函数定义于时间块之上以保留时序结构，TSRating[12]则通过大模型的成对比较蒸馏出轻量评分器。这一类方法产出的是分数与排序，语料依分数取舍而自身不被改动。</w:t>
       </w:r>
     </w:p>
     <w:p>
@@ -426,7 +426,7 @@
         <w:rPr>
           <w:rFonts w:hint="eastAsia"/>
         </w:rPr>
-        <w:t xml:space="preserve">（3）学习式编排看哪个算子在下游能换来更高的回报。清洗智能体[13]用分层策略决定在什么窗口上做什么操作，把下游误差的变化当成奖励，策略会随训练慢慢变好。这一类把判断交给学到的价值估计，而算子在训练途中就已经生效。</w:t>
+        <w:t xml:space="preserve">（3）学习式编排以下游反馈的期望回报作为判定依据。清洗智能体[13]采用分层策略决定在何种窗口上调用何种算子，并将下游误差的变化作为奖励，策略可随训练逐步改进。这一类方法将判定交由学习所得的价值估计，而算子在训练过程中即已生效。</w:t>
       </w:r>
     </w:p>
     <w:p>
@@ -437,7 +437,7 @@
         <w:rPr>
           <w:rFonts w:hint="eastAsia"/>
         </w:rPr>
-        <w:t xml:space="preserve">这三类在各自的设定里都能跑出不错的结果。回到上面那处麻烦，它们共同露出两块短板。</w:t>
+        <w:t xml:space="preserve">上述方法在各自设定的场景下均能取得良好效果，但面对本文所关注的问题时，普遍存在以下两方面局限。</w:t>
       </w:r>
     </w:p>
     <w:p>
@@ -448,7 +448,7 @@
         <w:rPr>
           <w:rFonts w:hint="eastAsia"/>
         </w:rPr>
-        <w:t xml:space="preserve">1）判断落在动作之前，做错了退不回来。修复式清洗在规则给出结论的同时就把改写压到了原值上，此后没有任何环节回头核对这次改写有没有达到预期，SCREEN[5]和 MTCSC[8]都是这样，速度约束一旦判定某点越界，替换立刻发生。学习式编排让策略能从反馈里改进，可清洗智能体[13]的算子同样在训练途中生效，每一次探索失误都实实在在落在语料上，策略学得越久语料伤得越多。打分式选择躲开了这个问题，代价是它根本不动手，遇到一段只在局部有尖峰的窗口，Data Shapley[9]和 TimeInf[11]这类方法只能整窗丢掉，尖峰之外完好的部分一并搭进去。三条路子因此卡在同一个地方，动手的没有退路，有退路的不动手。</w:t>
+        <w:t xml:space="preserve">1）判定时刻早于执行时刻，错误决策无从撤销。修复式清洗在规则给出结论的同时便将改写作用于原始数值，此后不再具备核对该次改写是否达到预期的机制，SCREEN[5]与 MTCSC[8]均是如此，速度约束一旦判定某点越界，替换随即发生。学习式编排虽允许策略从反馈中改进，但清洗智能体[13]的算子同样在训练过程中立即生效，每一次探索失误都实际作用于语料，策略训练越充分则语料损伤越严重。打分式选择规避了这一问题，其代价在于完全不产生动作，面对局部含有尖峰的窗口，Data Shapley[9]与 TimeInf[11]这类方法只能整窗丢弃，尖峰之外完好的部分一并舍去。三条路线因此陷入同一困境，具备动作能力者缺乏撤销机制，具备撤销能力者不产生动作。</w:t>
       </w:r>
     </w:p>
     <w:p>
@@ -459,7 +459,7 @@
         <w:rPr>
           <w:rFonts w:hint="eastAsia"/>
         </w:rPr>
-        <w:t xml:space="preserve">2）判断只靠一路信息，而这路信息在最该谨慎的地方会给出反向的读数。修复式清洗只问取值有没有越界，而一次真实的极端事件在数值上同样越界，界本身分不开这两种情形。打分式选择和学习式编排最终都看模型的表现，问题在于让模型预测得更准有两条路，把缺陷修好是一条，把序列削平使它更好预测是另一条，后者照样能让误差降下来。在稀有事件所在的那些窗口上，这两条路给出的读数正好相反，只听模型的意见去判断，放行的恰恰是最该拦住的那些改动。</w:t>
+        <w:t xml:space="preserve">2）判定所依据的信息来源单一，且该信息在最需要审慎处理的数据上会给出方向相反的读数。修复式清洗仅考察取值是否满足约束，而一次真实的极端事件在数值上同样越界，约束本身无法区分这两种情形。打分式选择与学习式编排最终均以模型表现作为依据，问题在于提升模型预测精度存在两条途径，修复缺陷是其一，将序列削平使其更易预测是其二，后者同样能够降低误差。在稀有事件所处的窗口上，这两条途径给出的读数恰好相反，仅凭模型意见作出判定，所放行的往往正是最应被拦截的修改。</w:t>
       </w:r>
     </w:p>
     <w:p>
@@ -470,7 +470,7 @@
         <w:rPr>
           <w:rFonts w:hint="eastAsia"/>
         </w:rPr>
-        <w:t xml:space="preserve">要补上这两块短板，判断得挪到动作做完之后，而且做错了能退回去。真按这个路子走，有两道坎。头一道在依据上。改动是好是坏只能从效果读出来，而能报告效果的仪器只有目标模型，上面第二块短板说的正是这台仪器在关键处不可信。所以判断不能只问它，还得有一路不依赖模型的证据来对质，麻烦的是这路证据该卡在哪个数值上，没人能凭经验事先定下来。第二道在代价上。让策略从判断结果里学东西需要反复试，而语料和游戏或者仿真环境不一样，它没有可以重开的存档，被削平的峰值找不回来。怎么让学习攒够经验的同时不在攒的过程中把语料弄坏，是把判断后移之后必须一并解决的事。</w:t>
+        <w:t xml:space="preserve">针对上述局限，当前需要一种能够在动作执行之后进行判定、并允许撤销错误决策的治理方法，而这类方法的构筑面临多重挑战。其一在于判定依据的来源本身带有偏差。修改的有害与否只能从效果中读出，而能够报告效果的仪器唯有目标模型，上述第二条局限说明这一仪器在最关键的场景下并不可信，因此判定不能仅凭模型意见，尚需一路不依赖模型的证据与之相互印证，而该证据的阈值又无法凭领域经验事先设定。其二在于试错的代价作用于不可恢复的对象。策略从判定结果中学习需要反复尝试，而语料与游戏或仿真环境不同，其不存在可以重置的副本，被削平的峰值无法找回。如何使学习过程既积累足够经验，又不在积累过程中损伤语料，是将判定推迟至执行之后所必须一并解决的问题。</w:t>
       </w:r>
     </w:p>
     <w:p>
@@ -481,7 +481,7 @@
         <w:rPr>
           <w:rFonts w:hint="eastAsia"/>
         </w:rPr>
-        <w:t xml:space="preserve">IntroAct-TS 按这个路子搭建，把治理写成带预算的受约束序贯决策。它先从窗口自身的统计画像和冻结基础模型的行为反应里取证，并拿画像相近的邻居作参照做稳健标准化，让不同窗口的读数能放在一起比。接着把候选动作施加到工作副本的拷贝上试着执行一次再重新测量，原值在这期间不动，这样每次尝试都有确切的后果可读，而尝试本身不留痕迹。对着头一道坎，判定要求模型效用改善和时序结构受控两件事同时成立才放行，其中结构那一条完全不看模型的意见，它的阈值交给共形风险控制去标定，把该卡在哪里这件事从经验判断变成了统计问题。对着第二道坎，所有候选都在副本上执行且提交要过判定，没通过的尝试不改动任何数据，学习因此不必拿语料去换。每次判定的结果最后回流成策略的奖励，被撤销的动作只留下探测开销而拿不到正回报，策略据此更新动作价值估计，并在窗口之间安排探测预算，使治理在结构复杂又含杂音的时序语料上更可靠也更省。图 1 用一对波形相近的窗口说明这一过程怎么给出相反的裁决。</w:t>
+        <w:t xml:space="preserve">为解决判定依据存在偏差与试错代价不可恢复这两个问题，本文提出屏蔽强化学习驱动的时序数据治理智能体 IntroAct-TS，将治理建模为带预算的受约束序贯决策。IntroAct-TS 首先从窗口自身的统计画像与冻结基础模型的行为反应中获取证据，并以画像相近的邻居为参照实施稳健标准化，使不同窗口之间的读数具备可比性。随后将候选动作施加于工作副本的拷贝之上试执行并重新测量，原始数值在此期间保持不变，由此每次尝试均有确切后果可读，而尝试本身不留下痕迹。针对判定依据存在偏差这一挑战，方法要求模型效用改善与时序结构受控两个相互独立的条件同时成立方予提交，其中结构条件完全不参考模型意见，其阈值交由共形风险控制标定，从而将阈值的设定由经验判断转化为统计问题。针对试错代价这一挑战，由于全部候选均在副本上执行且提交需经判定，未通过的尝试不改动任何数据，学习过程因而无需以损伤语料为代价。每次判定的结果最终回流为策略的奖励，被撤销的动作仅留下探测开销而不获正回报，策略据此更新动作价值估计并在窗口之间分配探测预算，从而提升了治理在结构复杂且含噪的时序语料上的可靠性与效率。图 1 以一对波形相近的窗口说明这一过程如何给出相反的裁决。</w:t>
       </w:r>
     </w:p>
     <w:p>
@@ -549,7 +549,7 @@
         <w:rPr>
           <w:rFonts w:hint="eastAsia"/>
         </w:rPr>
-        <w:t xml:space="preserve">图 1 里的两个窗口取自同一份语料，波形几乎一样，上面那个是传感器故障留下的孤立尖峰，下面那个是一次真实发生的极端峰值。去尖峰算子在副本上跑过之后，重测显示两次改动都让模型误差降了，光看效用读数分不出好坏，削平极值同样会让模型更好预测。结构那一路给出的读数则相反。上面的尖峰是孤立扰动，去掉之后邻域形态没变，判定通过并提交，下面的峰值与前后走势连在一起，削平之后局部结构明显改变，判定不通过并撤回。这一对相反的裁决同时成了策略的反馈，让它以后碰到相似窗口不再提会被撤回的动作。</w:t>
+        <w:t xml:space="preserve">图 1 中的两个窗口取自同一份语料，波形高度相似，上方为传感器故障留下的孤立尖峰，下方为一次真实发生的极端峰值。去尖峰算子在副本上执行之后，重测显示两次编辑均使模型误差下降，仅凭效用读数无法区分，削平极值同样会使模型更易预测。结构条件给出的读数则相反。上方窗口的尖峰属于孤立扰动，去除之后邻域形态保持不变，判定通过并提交，下方窗口的峰值与前后走势连为一体，削平之后局部结构显著改变，判定不通过并撤回。这一对相反的裁决同时构成策略的反馈，使其在后续遇到相似窗口时不再提出会被撤回的动作。</w:t>
       </w:r>
     </w:p>
     <w:p>
@@ -574,7 +574,7 @@
         <w:rPr>
           <w:rFonts w:hint="eastAsia"/>
         </w:rPr>
-        <w:t xml:space="preserve">（1）针对已有方法把判断压在动作之前、做错退不回来这一现状，本文把时序数据治理写成屏蔽约束下的序贯干预决策，并给出智能体 IntroAct-TS。这一形式化把判断挪到动作做完之后，动作先在副本上执行，过了判定才提交，因而不需要事先写出只关于动作本身的安全规则。定理 2 证明屏蔽之后的可行动作集在任何状态下都非空，决策不会因为约束而卡死，复杂度分析则说明引入判定与学习没有改变开销的主导项。每次判定同时是一条策略可用的反馈，安全与学习因此共用同一次判断。</w:t>
+        <w:t xml:space="preserve">（1）针对已有方法将判定置于动作之前、错误决策无从撤销的现状，本文将时序数据治理形式化为屏蔽约束下的序贯干预决策，并给出对应的智能体 IntroAct-TS。该形式化将判定推迟至动作执行之后，动作先在副本上试执行，通过判定方予提交，因而无需事先写出仅关于动作本身的安全规则。本文通过定理 2 证明屏蔽后的可行动作集在任意状态下非空，保证决策过程不会因约束而中断，并给出整体流程的时间复杂度，说明引入判定与学习未改变开销的主导项。每一次判定同时构成策略可用的反馈，安全与学习因而共用同一次判定。</w:t>
       </w:r>
     </w:p>
     <w:p>
@@ -585,7 +585,7 @@
         <w:rPr>
           <w:rFonts w:hint="eastAsia"/>
         </w:rPr>
-        <w:t xml:space="preserve">（2）针对判断依据本身带偏差这道坎，本文设计了双信号合取判据与共形标定方法。判据要求模型效用改善与时序结构受控同时成立，结构那一条完全不看模型的意见，因而拦得住那些靠削平序列换低误差的动作，阈值由共形风险控制标定，定理 4 由此给出提交编辑损害率的有限样本保证，定理 1 则说明合取判据造成的损害不会超过其中任何一个单独条件。命题 1 进一步指出，把结构约束写成目标函数里的惩罚项时损害率有一个消不掉的下界，写成合取条件时则没有，两种写法因此并不等价。</w:t>
+        <w:t xml:space="preserve">（2）针对判定依据本身带有偏差这一挑战，本文设计了双信号合取判据与共形标定方法。该判据要求模型效用改善与时序结构受控同时成立，其中结构条件完全不参考模型意见，因而能够拦截通过削平序列换取低误差的动作，其阈值由共形风险控制标定，本文通过定理 4 证明提交编辑的损害率由此获得有限样本的分布无关保证，并通过定理 1 证明合取判据造成的损害不超过其中任一单独条件。本文进一步以命题 1 说明，将结构约束写成目标函数中的惩罚项时损害率存在不可消除的下界，而写成合取条件时则不存在该下界，两种写法因而并不等价。</w:t>
       </w:r>
     </w:p>
     <w:p>
@@ -596,7 +596,7 @@
         <w:rPr>
           <w:rFonts w:hint="eastAsia"/>
         </w:rPr>
-        <w:t xml:space="preserve">（3）针对试错代价落在改不回的对象上这道坎，本文提出沙箱执行下的屏蔽反馈策略优化机制。候选动作都在副本上执行且提交要过判定，定理 3 因此保证无论策略处于哪个训练阶段、以多大强度探索，被提交编辑的结构失真都受同一个阈值约束，没通过的尝试不留下任何痕迹。策略更新会改变候选分布，削弱共形标定所依赖的可交换性，定理 5 给出两次标定之间保证退化的上界，它与标定间隔成正比、与已积累的访问次数成反比，因而能定量地指导重新标定的频率，定理 6 则说明屏蔽在限制动作集的同时保住了策略学习的收敛性质。</w:t>
+        <w:t xml:space="preserve">（3）针对试错代价作用于不可恢复对象这一挑战，本文提出沙箱执行下的屏蔽反馈策略优化机制。由于候选动作均在副本上执行且提交需经判定，本文通过定理 3 证明对任意策略与任意探索强度，被提交编辑的结构失真均受同一阈值约束，未通过判定的尝试不留下任何痕迹。策略更新会改变候选分布，从而削弱共形标定所依赖的可交换性，本文以定理 5 给出两次标定之间保证退化的上界，其与标定间隔成正比、与已积累的访问次数成反比，为重新标定的频率提供了定量依据，并以定理 6 说明屏蔽在约束动作集的同时保留了策略学习的收敛性质。</w:t>
       </w:r>
     </w:p>
     <w:p>
@@ -607,7 +607,7 @@
         <w:rPr>
           <w:rFonts w:hint="eastAsia"/>
         </w:rPr>
-        <w:t xml:space="preserve">（4）本文规划了覆盖工业与金融两类场景的九组实验，在语料层与候选层两套协议下与七项基线对照。评测同时看治理后语料的质量与智能体的决策质量，前者包括受保护数据的误编辑数、目标损害率的达成情况与下游预测误差，后者包括动作选择准确率、预算效率曲线与弃权质量。其中两组直接检验本文的核心主张，一组看以未过滤的效用读数作奖励训练出来的策略会不会逐步提高削平类动作的提出频率，另一组看沙箱执行下累计损害是否随交互次数保持有界。</w:t>
+        <w:t xml:space="preserve">（4）本文规划了覆盖工业与金融两类场景的九组实验，在语料层与候选层两套协议下与七项基线进行对照。评测同时衡量治理后语料的质量与智能体的决策质量，前者包括受保护数据的误编辑数、目标损害率的达成情况与下游预测误差，后者包括动作选择准确率、预算效率曲线与弃权质量。其中两组直接检验本文的核心主张，一组考察以未过滤的效用读数作为奖励训练的策略是否会逐步提高削平类动作的提出频率，另一组考察沙箱执行下累计损害是否随交互次数保持有界。</w:t>
       </w:r>
     </w:p>
     <w:p>
@@ -621,7 +621,7 @@
         <w:rPr>
           <w:rFonts w:hint="eastAsia"/>
         </w:rPr>
-        <w:t xml:space="preserve">后文的安排是这样。第 1 章交代与本文相关的三个研究方向各自走到了哪里，第 2 章说明判断所需的两把尺子并把治理问题写成形式化的决策问题，第 3 章沿取证、试执行、判定与学习四个环节给出实现细节与相应的理论结论，第 4 章列出实验怎么设计，第 5 章收束全文，第 6 章记下目前实现中暴露的问题与打算怎么改。</w:t>
+        <w:t xml:space="preserve">本文余下部分的结构安排如下。第 1 章介绍相关领域的研究现状，第 2 章阐述预备知识、问题定义与整体方法框架，第 3 章沿取证、试执行、判定与学习四个环节详述 IntroAct-TS 的具体实现及其理论性质，第 4 章给出实验规划，第 5 章总结全文，第 6 章记录当前实现中遇到的问题与后续的改进方向。</w:t>
       </w:r>
     </w:p>
     <w:p>
@@ -650,7 +650,7 @@
         <w:rPr>
           <w:rFonts w:hint="eastAsia"/>
         </w:rPr>
-        <w:t xml:space="preserve">三个方向的工作与本文有关。时序数据清洗攒下了一批能直接调用的算子，时序数据质量评估给出了衡量一条数据值多少的办法，智能体的策略学习与安全约束则提供了在受限条件下改进决策的框架。前两个方向都在动手之前就把判断做完了，第三个方向的安全约束要靠专家事先写好，本文要做的是把这三样东西接成一个动手之后再判断、并且能从判断里学东西的闭环。</w:t>
+        <w:t xml:space="preserve">本文的工作与三个方向相关。时序数据清洗提供了可供调用的动作集合，时序数据质量评估提供了衡量样本价值的手段，智能体的策略学习与安全约束提供了在受限条件下改进决策的框架。前两个方向的判定均发生在动作执行之前，第三个方向的安全约束需由专家事先写定，本文要做的是将三者组织成一个在执行之后判定并从判定中学习的闭环。</w:t>
       </w:r>
     </w:p>
     <w:p>
@@ -684,7 +684,7 @@
         <w:rPr>
           <w:rFonts w:hint="eastAsia"/>
         </w:rPr>
-        <w:t xml:space="preserve">这个方向上最成熟的想法是给数据划一条界。SCREEN[5]假定相邻两点之间的变化幅度有上下限，把越界的点拉回最近的合法取值，还给出了线性时间的在线算法。SpeedAcc[7]在速度之外又加了加速度约束，用二阶信息管住修复后的平滑程度。这两项处理的是单变量序列。MTCSC[8]把速度约束和聚类放在一起，借维度之间的相关性提高精度，MTSClean[15]则同时用行约束和列约束，能覆盖更多种错误形态。划界这条路好在讲得清楚、跑得也快，麻烦在于界从哪来。界来自领域知识，定得准不准直接决定修得好不好。</w:t>
+        <w:t xml:space="preserve">约束驱动是这一方向最成熟的思路。SCREEN[5]假设相邻时间步的取值变化存在上下界，将违反约束的观测点修复至最近的合法取值，并给出线性时间的在线算法。SpeedAcc[7]在速度之外引入加速度约束，以二阶信息控制修复后的平滑程度。上述两项工作处理单变量序列，MTCSC[8]将速度约束与聚类相结合，借助维度之间的相关性提升修复精度，MTSClean[15]则同时使用行约束与列约束以覆盖更多错误形态。约束驱动方法的可解释性好，运行开销低，其代价在于约束本身来自领域知识，阈值设定得当与否直接决定修复质量。</w:t>
       </w:r>
     </w:p>
     <w:p>
@@ -695,7 +695,7 @@
         <w:rPr>
           <w:rFonts w:hint="eastAsia"/>
         </w:rPr>
-        <w:t xml:space="preserve">另一条路让数据自己说话。IMR[6]指出检测异常和修复异常是两码事，把检测结果直接拿来当修复依据效果很差，于是改用自回归模型逐点估计再迭代收敛，同时拿少量已知正确的点当起始约束。这类方法对参数没那么敏感，代价是它要的那点种子信息在无标签场景里并不好找。</w:t>
+        <w:t xml:space="preserve">另一条思路从统计模型出发。IMR[6]指出异常检测与异常修复是两个不同的问题，直接将检测结果作为修复依据效果很差，转而采用自回归模型逐点估计并迭代收敛，同时借助少量已知正确的观测点作为起始约束。这类方法对参数设定的敏感度低于约束驱动方法，但其所需的种子信息在无标签场景中并不容易获得。</w:t>
       </w:r>
     </w:p>
     <w:p>
@@ -706,7 +706,7 @@
         <w:rPr>
           <w:rFonts w:hint="eastAsia"/>
         </w:rPr>
-        <w:t xml:space="preserve">近两年有人把算子的编排交给了强化学习[13]，用分层策略先判断是哪类问题再挑具体算子，奖励里加上平滑度和改动幅度两项来压住过度清洗。策略确实能从下游反馈里改进，可算子在训练途中就作用到原数据上了，探索时犯的错收不回来，安全性只在训练收敛之后的期望意义上成立，落到单个窗口上没有保证。</w:t>
+        <w:t xml:space="preserve">近期出现了将算子编排交由强化学习的尝试[13]，采用分层策略先判断问题类型再挑选具体算子，并在奖励中加入平滑度与改动幅度两项以抑制过度清洗。这一方向使策略能够从下游反馈中改进，但算子在训练过程中立即作用于原始数据，探索阶段的错误无法撤回，安全性只能体现在训练收敛后的期望意义上，对单个窗口并无保证。</w:t>
       </w:r>
     </w:p>
     <w:p>
@@ -740,7 +740,7 @@
         <w:rPr>
           <w:rFonts w:hint="eastAsia"/>
         </w:rPr>
-        <w:t xml:space="preserve">还有一类工作干脆不改数据，只算每条数据对模型有多大用处。Data Shapley[9]用合作博弈里的 Shapley 值刻画样本价值，理论上很完备，开销却随样本数涨得很快。Data-OOB[10]改用袋装模型的袋外估计把这笔开销压下来，KNNShapley[16]则靠近邻结构直接给出闭式解。这几项都是为独立同分布数据设计的，搬到时序上会把时间点之间的依赖丢掉。TimeInf[11]补了这一点，把影响函数定义在时间块上再聚合回单个时间点，既给出逐点分数又留住了时序结构。</w:t>
+        <w:t xml:space="preserve">数据估值提供了另一种视角，它不改动取值，只量化每个样本对模型的贡献。Data Shapley[9]用合作博弈中的 Shapley 值刻画样本价值，理论性质完备，但计算开销随样本数增长很快。Data-OOB[10]借助袋装模型的袋外估计将开销降至可接受范围，KNNShapley[16]则通过近邻结构给出闭式解。这些方法为独立同分布数据设计，用于时序数据时会忽略时间点之间的依赖。TimeInf[11]针对这一点作了修正，将影响函数定义在时间块上再聚合至单个时间点，从而在给出逐点分数的同时保留时序结构。</w:t>
       </w:r>
     </w:p>
     <w:p>
@@ -751,7 +751,7 @@
         <w:rPr>
           <w:rFonts w:hint="eastAsia"/>
         </w:rPr>
-        <w:t xml:space="preserve">也有工作把大模型的先验拉进来判断质量。TSRating[12]从趋势、频率、幅度和模式四个角度让大模型两两比较，再用元学习把这些判断蒸馏成一个轻量评分器，使评级能力能在不同领域之间迁移。该工作在十一个数据集上做了验证，只取评分最高的一半样本训练下游模型，效果就已经接近用全量数据训练。</w:t>
+        <w:t xml:space="preserve">近期工作将大语言模型的先验引入质量判断。TSRating[12]从趋势、频率、幅度与模式四个维度获取成对比较，再用元学习将这些判断蒸馏为一个轻量评分器，使评级能力在多个领域之间迁移。该工作在十一个数据集上进行了验证，选取评分最高的一半样本训练下游模型即可接近全量训练的效果。</w:t>
       </w:r>
     </w:p>
     <w:p>
@@ -762,7 +762,7 @@
         <w:rPr>
           <w:rFonts w:hint="eastAsia"/>
         </w:rPr>
-        <w:t xml:space="preserve">这个方向交出来的东西始终是分数或者排序。它能指出哪些窗口有问题，说不了这些窗口该怎么处理，也没有环节去核对某次处理到底管不管用。而当低分窗口里混着稀有却正确的模式时，按分数丢弃会把它们一起丢掉。</w:t>
+        <w:t xml:space="preserve">这一方向的产出始终是分数或排序。它能够指出哪些窗口存在问题，却无法说明这些窗口应当如何处理，也不具备检验某次处理是否有效的机制。当低分窗口中混有稀有但正确的模式时，按分数丢弃会将其一并去除。</w:t>
       </w:r>
     </w:p>
     <w:p>
@@ -796,7 +796,7 @@
         <w:rPr>
           <w:rFonts w:hint="eastAsia"/>
         </w:rPr>
-        <w:t xml:space="preserve">在约束下学决策是强化学习的老题目。受约束马尔可夫决策过程[17]把安全要求写成期望意义上的约束，用拉格朗日松弛和策略优化一起求解，它的保证在训练收敛之后成立，训练途中仍可能违反。屏蔽机制[14]走的是另一条路，在智能体和环境之间加一层过滤，动作只有不违反规约才放行，安全性因此每一步都成立，不用等收敛。屏蔽还把安全逻辑和策略优化拆开了，底下的学习算法可以随便换，这一点正合本文的需要。差别在于屏蔽的规约通常由领域专家写出来，而在数据治理里，一次编辑有没有害根本没法写成只关于这次编辑本身的条件，本文因此把规约换成了一个要等动作做完、测过之后才能判定的复合条件。</w:t>
+        <w:t xml:space="preserve">在受约束条件下学习决策是强化学习的经典课题。受约束马尔可夫决策过程[17]将安全要求写成期望意义上的约束，通过拉格朗日松弛与策略优化联合求解，其保证在训练收敛后成立，训练过程中仍可能违反约束。屏蔽机制[14]提供了另一条路径，在智能体与环境之间加入一层过滤，动作只有不违反规约时才被放行，因此安全性在每一步都成立而不依赖收敛。屏蔽将安全逻辑与策略优化解耦，底层学习算法可以自由选择，这一性质与本文的需求相吻合。区别在于屏蔽的规约通常由领域专家书写，而在数据治理中，一次编辑是否有害无法表达成仅关于该编辑本身的条件，本文因此将规约替换为一个需在执行后测量才能判定的复合条件。</w:t>
       </w:r>
     </w:p>
     <w:p>
@@ -807,7 +807,7 @@
         <w:rPr>
           <w:rFonts w:hint="eastAsia"/>
         </w:rPr>
-        <w:t xml:space="preserve">策略该做成什么样，取决于问题的规模。本文的决策序列很短，多数窗口一到三步就结束，状态经过特征提取之后维度不高，动作集合也就那么几个。这样的设定离上下文老虎机很近，离长程决策问题较远。上下文老虎机在线性收益假设下已经有成熟的上置信界算法和遗憾分析[18,19,20]，样本效率高，也容易解释清楚，本文因此选了这一族。</w:t>
+        <w:t xml:space="preserve">在策略的具体形式上，本文的决策序列很短，多数窗口在一到三步内结束，状态经特征提取后维度不高，动作集合规模有限。这样的设定接近上下文老虎机，与长程决策问题存在明显距离。上下文老虎机在线性收益假设下已有成熟的上置信界算法与遗憾分析[18,19,20]，样本效率高且易于解释，本文因此采用这一族方法。</w:t>
       </w:r>
     </w:p>
     <w:p>
@@ -818,7 +818,7 @@
         <w:rPr>
           <w:rFonts w:hint="eastAsia"/>
         </w:rPr>
-        <w:t xml:space="preserve">阈值该卡在哪，统计这边有现成的工具。共形风险控制[21]在可交换性假设下，为由阈值参数化的一族决策给出有限样本的风险上界，对数据分布不作任何假定。Learn Then Test[22]把这套思路推广到了更一般的风险函数。这两个框架都建立在同一个前提上，被约束的那个信号得是有害性的合理代理。本文面对的信号偏偏在一部分区域里与有害性反着走，所以不能只标定它，得先跟一个不依赖模型的条件合取起来再标定。</w:t>
+        <w:t xml:space="preserve">统计侧的进展提供了标定屏蔽阈值的工具。共形风险控制[21]在可交换性假设下，为由阈值参数化的决策族给出有限样本的风险上界，不需要对数据分布作任何假设。Learn Then Test[22]将这一思路扩展至更一般的风险函数。这些框架的共同前提是被约束的信号可以充当有害性的合理代理，而本文面对的信号在部分区域内与有害性方向相反，因此不能只对其做标定，需与一个不依赖模型的条件合取之后再行标定。</w:t>
       </w:r>
     </w:p>
     <w:p>
@@ -884,7 +884,7 @@
         <w:rPr>
           <w:rFonts w:hint="eastAsia"/>
         </w:rPr>
-        <w:t xml:space="preserve">要知道模型是不是更容易处理这段数据了，得有办法从模型身上读出证据。行为探测就是干这个的，它不更新任何参数，只看冻结模型对一个窗口作何反应。记窗口为</w:t>
+        <w:t xml:space="preserve">衡量模型是否更容易处理某段数据，需要一种能够从模型中读出证据的手段。行为探测指在不更新参数的前提下，通过冻结模型对一个窗口的反应获取该窗口的证据。记窗口为</w:t>
       </w:r>
       <w:r>
         <w:rPr>
@@ -992,7 +992,7 @@
         <w:rPr>
           <w:rFonts w:hint="eastAsia"/>
         </w:rPr>
-        <w:t xml:space="preserve">输出一个固定维度的行为签名</w:t>
+        <w:t xml:space="preserve">输出固定维度的行为签名</w:t>
       </w:r>
       <w:r>
         <w:rPr>
@@ -1009,7 +1009,7 @@
         <w:rPr>
           <w:rFonts w:hint="eastAsia"/>
         </w:rPr>
-        <w:t xml:space="preserve">，里面装着逐位置预测误差的各个分位数、层间表示的余弦距离、遮挡之后能不能恢复、多个视图的预测一致到什么程度、轻微扰动前后输出变了多少，以及模型池里几个模型彼此有多大分歧。签名之所以不能只放预测误差，是因为被噪声污染的窗口和本来就难预测的窗口都会给出高误差。前者的误差堆在少数几个位置上，后者的误差摊得很匀，分位数信息刚好能把这两种分开。探测只走前向，不算梯度，单次开销远低于要求海森求逆的影响函数方法[11]，这一点在需要反复测量的强化学习设定下直接决定了方法跑不跑得动。</w:t>
+        <w:t xml:space="preserve">，其分量覆盖逐位置预测误差的分位数、层间表示的余弦距离、遮挡恢复的稳定性、多视图预测的一致性、轻微扰动前后的输出变化，以及模型池内不同模型之间的分歧。签名之所以不能只取预测误差，是因为受噪声污染的窗口与本就难以预测的窗口都会产生高误差，前者的误差集中于少数位置，后者的误差分布均匀，分位数信息能够将两者区分开。探测只做前向计算，不涉及梯度，单位开销远低于需要海森求逆的影响函数方法[11]，这一点在需要反复测量的强化学习设定下决定了方法是否可行。</w:t>
       </w:r>
     </w:p>
     <w:p>
@@ -1023,7 +1023,7 @@
         <w:rPr>
           <w:rFonts w:hint="eastAsia"/>
         </w:rPr>
-        <w:t xml:space="preserve">有了签名，模型这一侧的尺子就能定下来。模型效用衡量一个窗口对目标模型有多友好，取若干归一化误差分量的加权负和</w:t>
+        <w:t xml:space="preserve">在行为签名的基础上，模型侧的度量可以定义如下。模型效用衡量一个窗口对目标模型的友好程度，取若干归一化误差分量的加权负和</w:t>
       </w:r>
     </w:p>
     <w:p>
@@ -1290,7 +1290,13 @@
         <w:rPr>
           <w:rFonts w:hint="eastAsia"/>
         </w:rPr>
-        <w:t xml:space="preserve">是它的权重。各分量都是越小越好，整体取个负号之后，</w:t>
+        <w:t xml:space="preserve">为对应权重。各分量均为越小越好，整体取负号后</w:t>
+      </w:r>
+      <w:r>
+        <w:rPr>
+          <w:rFonts w:hint="eastAsia"/>
+        </w:rPr>
+        <w:t xml:space="preserve"> </w:t>
       </w:r>
       <m:oMath>
         <m:r>
@@ -1307,7 +1313,7 @@
         <w:rPr>
           <w:rFonts w:hint="eastAsia"/>
         </w:rPr>
-        <w:t xml:space="preserve">越大就表示这个窗口对模型越友好。一次候选动作</w:t>
+        <w:t xml:space="preserve">越大表示该窗口对模型越友好。一次候选动作</w:t>
       </w:r>
       <w:r>
         <w:rPr>
@@ -1330,7 +1336,7 @@
         <w:rPr>
           <w:rFonts w:hint="eastAsia"/>
         </w:rPr>
-        <w:t xml:space="preserve">带来的效用变化写作</w:t>
+        <w:t xml:space="preserve">带来的效用变化记作</w:t>
       </w:r>
     </w:p>
     <w:p>
@@ -1437,7 +1443,7 @@
         <w:rPr>
           <w:rFonts w:hint="eastAsia"/>
         </w:rPr>
-        <w:t xml:space="preserve">这个差值要有意义，前提是两次测量落在同一段留出区间上，用的还是同一个归一化尺度。改变窗口长度的动作会破坏这个前提，所以同跨度同尺度是进入判据的硬要求，具体怎么做见 3.2 节。</w:t>
+        <w:t xml:space="preserve">该差值只有在两次测量使用相同的留出跨度与相同的归一化尺度时才具有意义。改变窗口长度的动作会破坏这一前提，因此同跨度同尺度是进入判据的硬性要求，具体做法见 3.2 节。</w:t>
       </w:r>
       <m:oMath>
         <m:r>
@@ -1457,7 +1463,7 @@
         <w:rPr>
           <w:rFonts w:hint="eastAsia"/>
         </w:rPr>
-        <w:t xml:space="preserve">既是本文奖励信号的来源，也是 2.2 节说的那个偏差的载体，一边用它一边不被它带偏，是整套方法设计的核心。</w:t>
+        <w:t xml:space="preserve">既是本文奖励信号的来源，也是 2.2 节所述偏差的载体，在使用它的同时避免被其误导是方法设计的核心。</w:t>
       </w:r>
     </w:p>
     <w:p>
@@ -1471,7 +1477,7 @@
         <w:rPr>
           <w:rFonts w:hint="eastAsia"/>
         </w:rPr>
-        <w:t xml:space="preserve">效用只回答了模型是否更省力，而把序列削平同样能让模型更省力，所以还得有一把不看模型的尺子。时序结构保真度衡量一次编辑把序列固有的结构破坏了多少，数值越低说明保得越好，它只比对编辑前后的时序属性。比对哪些属性取决于算子动了多大范围。只改有限几个位置的算子，在它声明的足迹之外比形状、极值、补片衔接得自不自然、足迹本身多大以及局部离散程度，把整条序列重写一遍的算子则比趋势、主周期、频谱能量分布、自相关结构、变点位置和极值。记编辑前后的窗口为</w:t>
+        <w:t xml:space="preserve">效用只回答了模型是否更容易处理该段数据，而将序列削平同样能够达到这一效果，因此还需要一个与模型无关的度量。时序结构保真度衡量一次编辑对序列固有结构的破坏程度，取值越低表示保持得越好，它只比较编辑前后的时序属性。参与比较的属性随算子的作用范围而不同，改动局限于有限位置的算子在其声明的足迹之外比较形状、极值、补片衔接、足迹大小与局部离散度，重写整条序列的算子则比较趋势、主周期、频谱能量分布、自相关结构、变点位置与极值。记编辑前后的窗口为</w:t>
       </w:r>
       <w:r>
         <w:rPr>
@@ -1841,7 +1847,7 @@
         <w:rPr>
           <w:rFonts w:hint="eastAsia"/>
         </w:rPr>
-        <w:t xml:space="preserve">是第</w:t>
+        <w:t xml:space="preserve">为第</w:t>
       </w:r>
       <w:r>
         <w:rPr>
@@ -1864,7 +1870,7 @@
         <w:rPr>
           <w:rFonts w:hint="eastAsia"/>
         </w:rPr>
-        <w:t xml:space="preserve">个属性在编辑前后的取值按该属性自身量纲归一化之后的绝对差，落在</w:t>
+        <w:t xml:space="preserve">个属性在编辑前后的取值经该属性自身量纲归一化后的绝对差，取值于</w:t>
       </w:r>
       <w:r>
         <w:rPr>
@@ -1902,13 +1908,7 @@
         <w:rPr>
           <w:rFonts w:hint="eastAsia"/>
         </w:rPr>
-        <w:t xml:space="preserve"> </w:t>
-      </w:r>
-      <w:r>
-        <w:rPr>
-          <w:rFonts w:hint="eastAsia"/>
-        </w:rPr>
-        <w:t xml:space="preserve">之间，权重</w:t>
+        <w:t xml:space="preserve">，权重</w:t>
       </w:r>
       <w:r>
         <w:rPr>
@@ -1940,7 +1940,7 @@
         <w:rPr>
           <w:rFonts w:hint="eastAsia"/>
         </w:rPr>
-        <w:t xml:space="preserve">按属性对该类算子的相关程度给定。加权平均之外还留了最差的那一项，是为了防止某一项上的灾难被其余项平均掉。序列尾部被整段抹平就是这种情况，多数属性上看着变化不大，只有极值那一项会露馅。</w:t>
+        <w:t xml:space="preserve">按属性对该类算子的相关性给定。在加权平均之外保留最差单项，可以避免某一项上的灾难性破坏被其余项平均掉。序列尾部被整体抹平即属此类情形，它在多数属性上变化不大，只在极值一项上暴露。</w:t>
       </w:r>
       <m:oMath>
         <m:r>
@@ -1957,7 +1957,7 @@
         <w:rPr>
           <w:rFonts w:hint="eastAsia"/>
         </w:rPr>
-        <w:t xml:space="preserve">与模型无关，因而能独立于效用信号提供约束，策略在学习过程中也没法操纵它。</w:t>
+        <w:t xml:space="preserve">与模型无关，因而能够独立于效用信号提供约束，在策略学习过程中也不会被策略操纵。</w:t>
       </w:r>
     </w:p>
     <w:p>
@@ -1971,7 +1971,7 @@
         <w:rPr>
           <w:rFonts w:hint="eastAsia"/>
         </w:rPr>
-        <w:t xml:space="preserve">两把尺子都有了，还得定下它们在哪一步生效。屏蔽[14]的做法是在智能体和环境之间加一层过滤，动作生效之前先查它有没有违反给定的规约，通过了才放行。屏蔽有两个基本要求，一是可靠，违规的动作不会漏过去，二是不阻塞，任何状态下至少还留着一个可以放行的动作。屏蔽和策略学习是分开的，底下用什么算法都行，安全性每一步都成立，不用等训练收敛。</w:t>
+        <w:t xml:space="preserve">两个度量确定之后，还需要明确它们在何处施加。屏蔽[14]指在智能体与环境之间加入一层过滤器，动作生效之前先检查其是否违反给定规约，通过检查方予放行。屏蔽的两个基本要求是可靠性与非阻塞性，前者指违规动作不会被放行，后者指任意状态下至少存在一个可以放行的动作。屏蔽与策略学习解耦，底层算法可以自由选择，安全性在每一步都成立，不依赖训练收敛。</w:t>
       </w:r>
     </w:p>
     <w:p>
@@ -1982,7 +1982,7 @@
         <w:rPr>
           <w:rFonts w:hint="eastAsia"/>
         </w:rPr>
-        <w:t xml:space="preserve">位置定了，阈值还得有个来处，而在无标签场景里这个数没法靠领域知识拍出来。共形风险控制[21]不对数据分布作任何假定，就能为由阈值参数化的一族决策给出有限样本的风险保证。给定一个与部署数据可交换的校准集、一个有界的风险函数和目标风险水平</w:t>
+        <w:t xml:space="preserve">屏蔽给出了施加判断的位置，其所用阈值还需要一种确定方式，而在无标签场景中该阈值无法由领域知识给定。共形风险控制[21]在不假设数据分布的前提下，为由阈值参数化的决策族提供有限样本的风险保证。给定与部署数据可交换的校准集、有界的风险函数以及目标风险水平</w:t>
       </w:r>
       <w:r>
         <w:rPr>
@@ -1999,7 +1999,7 @@
         <w:rPr>
           <w:rFonts w:hint="eastAsia"/>
         </w:rPr>
-        <w:t xml:space="preserve">，它在嵌套阈值族</w:t>
+        <w:t xml:space="preserve">，该框架在嵌套阈值族</w:t>
       </w:r>
       <w:r>
         <w:rPr>
@@ -2022,7 +2022,7 @@
         <w:rPr>
           <w:rFonts w:hint="eastAsia"/>
         </w:rPr>
-        <w:t xml:space="preserve">上算经验风险</w:t>
+        <w:t xml:space="preserve">上计算经验风险</w:t>
       </w:r>
       <w:r>
         <w:rPr>
@@ -2230,7 +2230,7 @@
         <w:rPr>
           <w:rFonts w:hint="eastAsia"/>
         </w:rPr>
-        <w:t xml:space="preserve">挑出阈值，其中</w:t>
+        <w:t xml:space="preserve">选出阈值，其中</w:t>
       </w:r>
       <w:r>
         <w:rPr>
@@ -2253,7 +2253,7 @@
         <w:rPr>
           <w:rFonts w:hint="eastAsia"/>
         </w:rPr>
-        <w:t xml:space="preserve">是校准集大小，</w:t>
+        <w:t xml:space="preserve">为校准集大小，</w:t>
       </w:r>
       <m:oMath>
         <m:r>
@@ -2270,7 +2270,7 @@
         <w:rPr>
           <w:rFonts w:hint="eastAsia"/>
         </w:rPr>
-        <w:t xml:space="preserve">是置信参数。风险关于阈值单调时可以绕开多重比较校正带来的保守，不单调时退回逐个阈值检验再做校正[22]。本文的风险函数取每个窗口上编辑有没有造成损害这个零一指示，被标定的对象是屏蔽里的结构失真阈值</w:t>
+        <w:t xml:space="preserve">为置信参数。风险关于阈值单调时可以避开多重比较校正带来的保守性，单调性不成立时退回逐阈值检验并作校正[22]。本文的风险函数取每个窗口上编辑是否造成损害的零一指示，被标定的对象是屏蔽中的结构失真阈值</w:t>
       </w:r>
       <w:r>
         <w:rPr>
@@ -2321,7 +2321,7 @@
         <w:rPr>
           <w:rFonts w:hint="eastAsia"/>
         </w:rPr>
-        <w:t xml:space="preserve">本文处理的是时序特征层面的噪声，按它怎么产生的分成两类，这一分法决定了它在多通道语料里留下的痕迹能不能相互印证。随机噪声来自环境扰动、设备误差和记录不一致，只作用在单个通道的一小段时间上，形态包括孤立尖峰、散点缺失、连续缺失片段和重复片段。它在通道之间彼此独立，所以某个通道上的异常，在同一时刻的其余通道里找不到对应。系统噪声来自采集设备的系统性偏差、数据来源切换和传感器漂移，它同时压在多个通道上，改变整段窗口的分布，形态包括水平位移、噪声放大和平台化。它在通道之间高度相关，同一时刻的多个通道会一起偏。</w:t>
+        <w:t xml:space="preserve">本文处理时序特征层面的噪声，按其产生机制分为随机与系统两类，这一划分决定了它们在多通道语料中留下的痕迹能否相互印证。随机噪声来自环境扰动、设备误差与记录不一致，作用于单个通道的有限时间范围，表现为孤立尖峰、散点缺失、连续缺失片段与重复片段。此类噪声在通道之间彼此独立，因此某个通道上的异常在同一时刻的其余通道中找不到对应。系统噪声来自采集设备的系统性偏差、数据来源切换与传感器漂移，它同时作用于多个通道并改变整段窗口的分布，表现为水平位移、噪声放大与平台化。此类噪声在通道之间高度相关，同一时刻的多个通道会一同偏移。</w:t>
       </w:r>
     </w:p>
     <w:p>
@@ -2332,7 +2332,7 @@
         <w:rPr>
           <w:rFonts w:hint="eastAsia"/>
         </w:rPr>
-        <w:t xml:space="preserve">两类噪声带来的困难不一样。随机噪声在单个窗口上留下明显的局部痕迹，统计画像抓得住，难的是它和真实发生的极端事件在波形上几乎一模一样，光看单个通道分不出某个尖峰是故障还是事件。系统噪声改变整段分布，在模型行为上的表现又和合法的状态切换很像，水平位移和设备检修后的基线变化都会把预测误差抬上去，光看模型反馈同样分不出来。放到整个语料的尺度上还有一重麻烦。模型行为信号反映的是这个窗口对这个模型有多难预测，而难不难预测跟质量好不好并不是一回事，结构本来就复杂却完全干净的数据，同样会拿到很高的风险读数。这个偏差对按规则办事的方法只是一次误判，对会学习的方法就严重得多，因为策略会主动朝偏差的方向使劲，把降低预测难度当成目标去追。</w:t>
+        <w:t xml:space="preserve">两类噪声给治理带来的困难并不相同。随机噪声在单个窗口上留下明显的局部痕迹，统计画像对其检测能力较强，困难在于它与真实发生的极端事件在波形上几乎一致，仅凭单通道证据无法判断某个尖峰属于故障还是事件。系统噪声改变整段分布，在模型行为上的表现与合法的状态切换高度相似，水平位移与设备检修后的基线变化都会抬高预测误差，仅凭模型反馈同样无法区分。在语料的尺度上还存在一重困难，模型行为信号反映的是窗口对该模型的可预测程度，而窗口的可预测程度与其质量并不等同，结构本就复杂却完全干净的数据同样会得到高风险读数。这一偏差对基于规则的方法只是一次误判，对基于学习的方法则更为严重，因为策略会主动朝偏差的方向优化，将降低预测难度当作目标去追求。</w:t>
       </w:r>
     </w:p>
     <w:p>
@@ -4646,7 +4646,7 @@
         <w:rPr>
           <w:rFonts w:hint="eastAsia"/>
         </w:rPr>
-        <w:t xml:space="preserve">这个设定有三处特点，方法的形状基本是被它们逼出来的。</w:t>
+        <w:t xml:space="preserve">这一问题设定有三个特征决定了方法的设计。</w:t>
       </w:r>
     </w:p>
     <w:p>
@@ -4731,7 +4731,7 @@
         <w:rPr>
           <w:rFonts w:hint="eastAsia"/>
         </w:rPr>
-        <w:t xml:space="preserve">（2）试错的代价落在改不回来的东西上。语料改过之后没法还原，这一点和可以重置的仿真环境不同。探索要是直接作用在原数据上，学习过程本身就是破坏过程。把执行和提交拆开，是让学习变得可行的前提。</w:t>
+        <w:t xml:space="preserve">（2）试错的代价落在不可恢复的对象上。语料被修改之后无法还原，这与可以重置的仿真环境不同。若探索直接作用于原始数据，学习过程本身即构成破坏过程。将执行与提交分开，是使学习可行的前提。</w:t>
       </w:r>
     </w:p>
     <w:p>
@@ -4974,7 +4974,7 @@
         <w:rPr>
           <w:rFonts w:hint="eastAsia"/>
         </w:rPr>
-        <w:t xml:space="preserve">没有质量标签的时候，任何一路证据都有看不见的地方，所以 CDP 从两处取证，而这两处的盲区恰好错开。</w:t>
+        <w:t xml:space="preserve">在缺少质量标签的条件下，任何单一证据都存在盲区，CDP 因而从两个来源取证，而这两个来源的盲区并不重合。</w:t>
       </w:r>
     </w:p>
     <w:p>
@@ -4985,7 +4985,7 @@
         <w:rPr>
           <w:rFonts w:hint="eastAsia"/>
         </w:rPr>
-        <w:t xml:space="preserve">头一路是统计画像</w:t>
+        <w:t xml:space="preserve">第一类证据是统计画像</w:t>
       </w:r>
       <w:r>
         <w:rPr>
@@ -5024,7 +5024,7 @@
         <w:rPr>
           <w:rFonts w:hint="eastAsia"/>
         </w:rPr>
-        <w:t xml:space="preserve">，从窗口自身算出来，覆盖缺失率、异常密度、趋势强度、季节强度、频谱特征、平稳性、变点数量和复杂度，其中变点数量由线性代价的变点检测算法给出[27]。这些量对留下局部痕迹的噪声很敏感，尖峰会把异常密度顶上去，缺失片段会把缺失率顶上去。它看不见的是统计上完全正常的那类问题，重复片段就是，被复制的那一段和原段的统计属性一模一样。</w:t>
+        <w:t xml:space="preserve">，从窗口自身提取，覆盖缺失率、异常密度、趋势强度、季节强度、频谱特征、平稳性、变点数量与复杂度，其中变点数量由线性代价的变点检测算法给出[27]。这类属性对留下局部痕迹的噪声较为敏感，尖峰会抬高异常密度，缺失片段会抬高缺失率。其盲区在于统计上完全正常的问题，重复片段即属此类，被复制的片段与原片段具有完全相同的统计属性。</w:t>
       </w:r>
     </w:p>
     <w:p>
@@ -5035,7 +5035,7 @@
         <w:rPr>
           <w:rFonts w:hint="eastAsia"/>
         </w:rPr>
-        <w:t xml:space="preserve">第二路是冻结基础模型的行为签名</w:t>
+        <w:t xml:space="preserve">第二类证据是冻结基础模型的行为签名</w:t>
       </w:r>
       <w:r>
         <w:rPr>
@@ -5052,7 +5052,7 @@
         <w:rPr>
           <w:rFonts w:hint="eastAsia"/>
         </w:rPr>
-        <w:t xml:space="preserve">，反映模型处理这个窗口时费不费劲。重复片段虽然统计正常，却会让模型在第二次遇到时给出反常自信的预测，这种反常在签名上留得下痕迹。行为证据看不见的是数据有问题和数据本身复杂之间的区别，两者都会让模型表现变差。</w:t>
+        <w:t xml:space="preserve">，反映模型处理该窗口时的困难程度。重复片段虽然统计正常，却会使模型在第二次遇到时给出异常自信的预测，这种反常在签名上留有痕迹。行为证据的盲区在于无法区分数据存在问题与数据本身复杂，两者都会使模型表现变差。</w:t>
       </w:r>
     </w:p>
     <w:p>
@@ -5063,7 +5063,7 @@
         <w:rPr>
           <w:rFonts w:hint="eastAsia"/>
         </w:rPr>
-        <w:t xml:space="preserve">两路证据直接相加只会让盲区叠起来，因为它们的量纲和分布都不一样。CDP 的做法是先在画像空间里找出与当前窗口最像的</w:t>
+        <w:t xml:space="preserve">将两类证据直接相加只会使盲区叠加，因为它们的量纲与分布均不相同。CDP 的处理是先在画像空间中检索与当前窗口最相似的</w:t>
       </w:r>
       <w:r>
         <w:rPr>
@@ -5122,7 +5122,7 @@
         <w:rPr>
           <w:rFonts w:hint="eastAsia"/>
         </w:rPr>
-        <w:t xml:space="preserve">，相似度用画像向量做 L2 归一化之后的余弦距离衡量，再拿这组邻居的中位数与四分位距对行为签名做稳健标准化</w:t>
+        <w:t xml:space="preserve">，相似度以画像向量经 L2 归一化后的余弦距离衡量，再用这组邻居的中位数与四分位距对行为签名作稳健标准化</w:t>
       </w:r>
     </w:p>
     <w:p>
@@ -5520,7 +5520,7 @@
         <w:rPr>
           <w:rFonts w:hint="eastAsia"/>
         </w:rPr>
-        <w:t xml:space="preserve">找出来的这组邻居还有另一个用处。它们定义了一个画像簇</w:t>
+        <w:t xml:space="preserve">检索到的邻居集合还有第二个用途。这组邻居定义了一个画像簇</w:t>
       </w:r>
       <w:r>
         <w:rPr>
@@ -5537,7 +5537,7 @@
         <w:rPr>
           <w:rFonts w:hint="eastAsia"/>
         </w:rPr>
-        <w:t xml:space="preserve">，SPO 的动作价值估计正是按簇维护的。同一簇里的窗口结构相近，某个算子在其中一个上管用，往往在其余几个上也管用。CDP 因此既提供状态，也提供了策略赖以泛化的划分。算法 1 给出完整流程。</w:t>
+        <w:t xml:space="preserve">，SPO 的动作价值估计正是按簇维护的。同一簇内的窗口结构相近，某个算子在其中一个窗口上有效，往往意味着在其余窗口上同样有效。CDP 因此既提供状态，也提供了策略泛化所依赖的划分。算法 1 给出完整流程。</w:t>
       </w:r>
     </w:p>
     <w:p>
@@ -6887,7 +6887,7 @@
         <w:rPr>
           <w:rFonts w:hint="eastAsia"/>
         </w:rPr>
-        <w:t xml:space="preserve">状态说明了这个窗口可能有什么毛病，却没说某个具体动作做下去会怎样。要回答这个只能真做一次再看结果。而强化学习又要反复地做，语料改过之后没法还原，两个要求正面冲突。SIR 把执行和提交拆开，让这两件事可以同时成立。</w:t>
+        <w:t xml:space="preserve">状态说明了窗口可能存在什么问题，却没有回答某个具体动作施加下去会产生什么结果。回答这一问题只能真正执行一次动作并观察结果，而强化学习需要反复尝试，语料被修改之后又无法还原，两个要求直接冲突。SIR 将执行与提交分开，使两者能够同时成立。</w:t>
       </w:r>
     </w:p>
     <w:p>
@@ -6898,7 +6898,7 @@
         <w:rPr>
           <w:rFonts w:hint="eastAsia"/>
         </w:rPr>
-        <w:t xml:space="preserve">候选动作作用在工作副本的拷贝上，得到候选窗口</w:t>
+        <w:t xml:space="preserve">候选动作作用于工作副本的拷贝，得到候选窗口</w:t>
       </w:r>
       <w:r>
         <w:rPr>
@@ -6974,7 +6974,7 @@
         <w:rPr>
           <w:rFonts w:hint="eastAsia"/>
         </w:rPr>
-        <w:t xml:space="preserve">不动。随后拿事前用过的那个探测函数原样测一遍</w:t>
+        <w:t xml:space="preserve">保持不变。随后用与事前完全相同的探测函数测量</w:t>
       </w:r>
       <w:r>
         <w:rPr>
@@ -7067,7 +7067,7 @@
         <w:rPr>
           <w:rFonts w:hint="eastAsia"/>
         </w:rPr>
-        <w:t xml:space="preserve">相减就是这次动作带来的效用变化。这个读数有两个去处，一是送进 CDS 当裁决依据，二是裁决之后当策略更新的奖励。两个用处都要求读数在不同窗口和不同轮次之间可比，下面的引理给出具体条件。</w:t>
+        <w:t xml:space="preserve">相减即为该动作带来的效用变化。这一读数有两个去向，一是进入 CDS 作为裁决依据，二是在裁决之后成为策略更新所用的奖励。两个用途都要求读数在不同窗口与不同轮次之间可比，下面的引理给出具体条件。</w:t>
       </w:r>
     </w:p>
     <w:p>
@@ -7519,7 +7519,7 @@
         <w:rPr>
           <w:rFonts w:hint="eastAsia"/>
         </w:rPr>
-        <w:t xml:space="preserve">引理 1 落到实现上就是两条约束。归一化尺度取分块四分位距的中位数并在决策开始时定死，这样即使窗口里有整段水平位移，尺度也不会被它撑大。改变窗口长度的动作只在共有的重叠区间上比较，避免留出跨度发生变化。这两条都满足了，同一个</w:t>
+        <w:t xml:space="preserve">引理 1 对 SIR 的实现提出两条约束。归一化尺度取分块四分位距的中位数并在决策开始时固定，这样即使窗口中存在整段水平位移，尺度也不会被其撑大。改变窗口长度的动作在共有的重叠区间上比较，避免留出跨度发生变化。满足这两条之后，同一个</w:t>
       </w:r>
       <w:r>
         <w:rPr>
@@ -7545,7 +7545,7 @@
         <w:rPr>
           <w:rFonts w:hint="eastAsia"/>
         </w:rPr>
-        <w:t xml:space="preserve">才既撑得起裁决又撑得起学习。</w:t>
+        <w:t xml:space="preserve">才能既支撑裁决又支撑学习。</w:t>
       </w:r>
     </w:p>
     <w:p>
@@ -7556,7 +7556,7 @@
         <w:rPr>
           <w:rFonts w:hint="eastAsia"/>
         </w:rPr>
-        <w:t xml:space="preserve">SIR 还负责把裁决结果换算成奖励。通过的动作按它的效用增益计正奖励，被撤销的只计探测代价形成负奖励，保留和拒绝处理都计零。这样一来策略在提动作的时候要同时掂量两件事，这个动作能带来多少改善，以及它有多大把握通过屏蔽。3.3 节会说明，正是后一件让策略绕开了拿抹平换效用这条捷径。</w:t>
+        <w:t xml:space="preserve">SIR 还负责将裁决结果转换为奖励。被接受的动作以其效用增益计入正奖励，被撤销的动作只计入探测代价形成负奖励，保留与拒绝处理的奖励为零。这样的设计使策略在提出动作时同时考虑两件事，该动作能带来多少改善，以及它有多大可能通过屏蔽。3.3 节将说明，正是后一项使策略避开了以削平换取效用的捷径。</w:t>
       </w:r>
     </w:p>
     <w:p>
@@ -7590,7 +7590,7 @@
         <w:rPr>
           <w:rFonts w:hint="eastAsia"/>
         </w:rPr>
-        <w:t xml:space="preserve">SIR 给出了可比的效用读数，而 2.2 节已经讲过这个信号在一部分数据上与有害性反着走。只凭</w:t>
+        <w:t xml:space="preserve">SIR 给出了可比的效用读数，而 2.2 节已经说明该信号在部分数据上与有害性方向相反。仅凭</w:t>
       </w:r>
       <w:r>
         <w:rPr>
@@ -7616,7 +7616,7 @@
         <w:rPr>
           <w:rFonts w:hint="eastAsia"/>
         </w:rPr>
-        <w:t xml:space="preserve">作裁决，会把那些靠削平序列换低误差的动作放进来。在策略要学习的设定下，后果比误判一次严重得多，因为策略会顺着这个方向一直优化下去。CDS 的办法是要求两路彼此独立的证据同时点头。</w:t>
+        <w:t xml:space="preserve">作出裁决会放行那些通过削平序列换取低误差的动作，在策略需要学习的设定下，后果比一次误判严重得多，因为策略会朝这一方向持续优化。CDS 的做法是要求两类相互独立的证据同时支持该次提交。</w:t>
       </w:r>
     </w:p>
     <w:p>
@@ -8693,7 +8693,7 @@
         <w:rPr>
           <w:rFonts w:hint="eastAsia"/>
         </w:rPr>
-        <w:t xml:space="preserve">定理 1 不依赖任何单个条件的判别力。就算效用条件在某类数据上完全失灵，复合屏蔽造成的损害也不会超过只用结构条件时的水平。这个结论说的是损害总量，接受集缩小的同时修复收益也会跟着减少，两者怎么权衡由 3.4 节末尾的阈值标定处理。</w:t>
+        <w:t xml:space="preserve">定理 1 不依赖任何一个条件的判别力。即使效用条件在某类数据上完全失效，复合屏蔽造成的损害也不会超过仅用结构条件的情形。该结论针对损害总量，接受集缩小的同时修复收益也会减少，两者的权衡由 3.4 节末尾的阈值标定处理。</w:t>
       </w:r>
     </w:p>
     <w:p>
@@ -8704,7 +8704,7 @@
         <w:rPr>
           <w:rFonts w:hint="eastAsia"/>
         </w:rPr>
-        <w:t xml:space="preserve">把结构信息写成合取条件，跟把它写成目标函数里的一项惩罚，差别不止在形式上。同期的清洗智能体用的是后一种，在效用增益里减去带系数的结构失真，再按这个加权和排序取舍。下面的结论说明这两种写法在严格的损害预算下并不等价。</w:t>
+        <w:t xml:space="preserve">将结构信息以合取条件的形式引入，与将其作为目标函数中的惩罚项引入，两者的差别不止于形式。同期的清洗智能体采用后一种做法，即在效用增益中减去带系数的结构失真再按加权和取舍。下面的结论说明这两种做法在严格的损害预算下并不等价。</w:t>
       </w:r>
     </w:p>
     <w:p>
@@ -9163,7 +9163,7 @@
         <w:rPr>
           <w:rFonts w:hint="eastAsia"/>
         </w:rPr>
-        <w:t xml:space="preserve">屏蔽的第二重作用来自它和奖励之间的耦合。按 3.2 节的奖励定义，只有通过屏蔽的动作才计正奖励，被撤销的只留下探测代价。策略实际收到的回报因此是过了结构条件之后的</w:t>
+        <w:t xml:space="preserve">屏蔽的第二重作用来自它与奖励的耦合。由 3.2 节的奖励定义，只有通过屏蔽的动作才计入正奖励，被撤销的动作只留下探测代价。策略实际收到的回报因而是经过结构条件过滤后的</w:t>
       </w:r>
       <w:r>
         <w:rPr>
@@ -9183,7 +9183,7 @@
         <w:rPr>
           <w:rFonts w:hint="eastAsia"/>
         </w:rPr>
-        <w:t xml:space="preserve">，不是原始读数。一个抹平动作就算拿到很高的效用读数，也会因结构失真超限而被撤销，最后计成负奖励。几轮之后策略会学到，在需要保护的窗口上提抹平动作是不划算的，于是在提议阶段就绕开这类动作。若把奖励换成没过滤的</w:t>
+        <w:t xml:space="preserve">，并非原始读数。一个削平动作即使拿到很高的效用读数，也会因结构失真超限而被撤销，最终计入负奖励。策略在若干轮之后会学到，在需要保护的窗口上提出削平动作并不划算，从而在提议阶段就避开这类动作。若将奖励换成未经过滤的</w:t>
       </w:r>
       <w:r>
         <w:rPr>
@@ -9203,7 +9203,7 @@
         <w:rPr>
           <w:rFonts w:hint="eastAsia"/>
         </w:rPr>
-        <w:t xml:space="preserve">，同样的学习过程会得到相反的结果。这一对照就是 4.2 节奖励塑形消融实验的设计依据。</w:t>
+        <w:t xml:space="preserve">，同样的学习过程会得到相反的结果。这一对比构成了 4.2 节奖励塑形消融实验的设计依据。</w:t>
       </w:r>
     </w:p>
     <w:p>
@@ -9214,7 +9214,7 @@
         <w:rPr>
           <w:rFonts w:hint="eastAsia"/>
         </w:rPr>
-        <w:t xml:space="preserve">裁决之后有五种走法。三个条件都满足就接受，把候选副本提交为新的工作副本并记进轨迹。效用没改善或者结构失真超限就撤销，恢复原副本，并把撤销的原因写进状态。还有可信候选且预算没耗尽时可以换个动作再试，这时策略能依据撤销原因调整方向，被结构条件否掉意味着该换个动静更小的算子，被效用条件否掉则意味着对缺陷类型的判断可能就错了。窗口风险高但修不可靠时转入隔离，证据不足或预算耗尽时拒绝处理并结束这个窗口。算法 2 给出完整流程。</w:t>
+        <w:t xml:space="preserve">裁决之后的控制流有五个去向。三个条件同时满足时接受动作，将候选副本提交为新的工作副本并记录轨迹。效用未改善或结构失真超限时撤销，恢复原副本，并将撤销原因写入状态。仍有可信候选且预算未耗尽时可以尝试其他动作，此时策略能够依据撤销原因调整方向，被结构条件否决意味着应当换用改动足迹更小的算子，被效用条件否决则意味着缺陷类型的判断可能有误。窗口风险高但无法可靠修复时转入隔离，证据不足或预算耗尽时拒绝处理并结束该窗口。算法 2 给出完整流程。</w:t>
       </w:r>
     </w:p>
     <w:p>
@@ -11716,7 +11716,7 @@
         <w:rPr>
           <w:rFonts w:hint="eastAsia"/>
         </w:rPr>
-        <w:t xml:space="preserve">前三个环节合起来是一个可以安全试错的场子，剩下的问题是怎么利用它把决策做得更好。这一模块的设计动机来自一次实测。在固定规则的版本里，被否决之后换动作重试的净效果是负的，换过之后的动作，改善与恶化之比不到首次提议的十分之一。原因在于固定规则把最有把握的动作排在最前，后面的次序与窗口特性无关，换来换去因此往往是盲目的。序贯决策本身没问题，问题出在备选次序需要按窗口类型学。</w:t>
+        <w:t xml:space="preserve">前三个环节构成了一个可以安全试错的环境，余下的问题是如何利用这一环境改进决策。设计这一模块的动机来自一个实测观察。在固定规则的版本中，被否决后更换动作重试的净效果为负，更换后的动作改善与恶化之比不足首次提议的十分之一。原因在于固定规则将最有把握的动作排在首位，此后的备选顺序与窗口特性无关，更换因而往往是盲目的。序贯决策本身可行，问题出在备选顺序需要根据窗口类型学习。</w:t>
       </w:r>
     </w:p>
     <w:p>
@@ -11727,7 +11727,7 @@
         <w:rPr>
           <w:rFonts w:hint="eastAsia"/>
         </w:rPr>
-        <w:t xml:space="preserve">SPO 用的是上下文老虎机，理由是这个任务的决策序列很短，多数窗口三步以内结束，状态经 CDP 提取之后维度不高，动作集合也有限。在这种规模下，上置信界方法的样本效率和可解释性都好过需要大量交互的深度方法，遗憾分析也是现成的[18,19,20]。</w:t>
+        <w:t xml:space="preserve">SPO 采用上下文老虎机而非深度强化学习，理由是本任务的决策序列很短，多数窗口在三步以内结束，状态经 CDP 提取后维度不高，动作集合规模有限。在这样的设定下，上置信界方法的样本效率与可解释性都优于需要大量交互的深度方法，且有成熟的遗憾分析[18,19,20]。</w:t>
       </w:r>
     </w:p>
     <w:p>
@@ -16731,7 +16731,7 @@
         <w:rPr>
           <w:rFonts w:hint="eastAsia"/>
         </w:rPr>
-        <w:t xml:space="preserve">本文的做法压在几个还需要验证的判断上。模型给出的效用读数在需要保护的数据上与有害性反着走，这是引入结构条件的前提。判定结果拿来当奖励能把策略引向那些通得过结构检验的修复方式，这是屏蔽的第二重职责。试错发生在副本上所以学习不伤语料，这是把判断后移换来的好处。本章的实验就围绕这几点安排，前四组看治理之后语料的质量够不够，后五组看智能体自己的决策靠不靠得住。在此之前先交代数据、噪声注入、基线和指标怎么定。</w:t>
+        <w:t xml:space="preserve">本文的做法建立在几个有待检验的判断之上。模型给出的效用读数在需要保护的数据上与有害性方向相反，这是引入结构条件的前提。判定结果作为奖励能够将策略引向可以通过结构检验的修复方式，这是屏蔽的第二重职责。试错发生在副本上因而学习不破坏语料，这是将判定推迟到执行之后所换来的性质。本章的实验规划围绕这几点展开，前四组检验治理后语料的质量是否达到预期，后五组检验智能体的决策本身是否可靠。在此之前先交代数据、噪声注入、基线与指标的设置。</w:t>
       </w:r>
     </w:p>
     <w:p>
@@ -18376,7 +18376,7 @@
         <w:rPr>
           <w:rFonts w:hint="eastAsia"/>
         </w:rPr>
-        <w:t xml:space="preserve">前面几章给出的是方法应当做到什么，本章记录实现过程中实际遇到了什么。已发现的问题分三类，一类是实现缺陷，定位之后现象随即消失，一类是设计取舍带来的固有限制，改不掉只能说明清楚，另一类源于实验设计本身，需要重新安排对照才能回答。</w:t>
+        <w:t xml:space="preserve">前面几章给出的是方法应当达到的目标，本章记录实现过程中实际遇到的问题。已发现的问题可分为三类，一类是实现缺陷，定位之后现象随即消失，一类是设计取舍带来的固有限制，无法消除只能予以说明，另一类源于实验设计本身，需要重新安排对照才能回答。</w:t>
       </w:r>
     </w:p>
     <w:p>
@@ -18418,7 +18418,7 @@
           <w:b/>
           <w:bCs/>
         </w:rPr>
-        <w:t xml:space="preserve">固定规则下重试的净效果是负的。换动作之后的成功率不到首次提议的十分之一，原因是备选次序与窗口特性无关。这个结果是引入策略学习最直接的依据，序贯决策的价值要等策略能依据撤销原因调整方向之后才兑现得出来。</w:t>
+        <w:t xml:space="preserve">固定规则下的重试净效果为负。更换动作后的成功率不足首次提议的十分之一，原因是备选顺序与窗口特性无关。这一结果构成了引入策略学习的直接依据，序贯决策的价值需要策略能够依据撤销原因调整方向才能兑现。</w:t>
       </w:r>
     </w:p>
     <w:p>
@@ -18437,7 +18437,7 @@
           <w:b/>
           <w:bCs/>
         </w:rPr>
-        <w:t xml:space="preserve">同类校准没能提升判别力，这是设计取舍暴露出来的限制。问题出在被校准的那个量上，不在校准方式上。行为信号反映的是窗口有多难预测，任何标准化都剥不掉这层混杂。这个发现同时说明该信号不适合单独拿来当奖励。</w:t>
+        <w:t xml:space="preserve">同类校准未能提升判别力，属于设计取舍暴露出的限制。问题出在被校准的量而非校准方式，行为信号反映的是窗口的可预测程度，任何标准化都无法将这一混杂剥离。这一发现同时说明该信号不适合单独充当奖励。</w:t>
       </w:r>
     </w:p>
     <w:p>
@@ -18456,7 +18456,7 @@
           <w:b/>
           <w:bCs/>
         </w:rPr>
-        <w:t xml:space="preserve">结构条件在整条序列重写的候选上出现了反向筛选，这是实现上的缺陷。根子在于这类候选被送进了一条没有标定过的计算路径。让它们声明自己实际改动了哪些点之后，现象随即消失。</w:t>
+        <w:t xml:space="preserve">结构条件在整条序列重写的候选上出现反向筛选，属于实现缺陷。根源在于这类候选被路由到未经标定的计算路径，令其声明实际改动的点集之后，该现象随即消失。</w:t>
       </w:r>
     </w:p>
     <w:p>
@@ -18475,7 +18475,7 @@
           <w:b/>
           <w:bCs/>
         </w:rPr>
-        <w:t xml:space="preserve">下游任务上没看到正向增益，同样是设计取舍带来的。方法只改了语料里不到百分之八的窗口，改动量太小，现有的下游协议分辨不出这点差别，下游部分因此只保留防御性的结论。</w:t>
+        <w:t xml:space="preserve">下游任务上未观测到正向增益，同样源于设计取舍。方法只修改了语料中不足百分之八的窗口，改动量过小，现有的下游协议无法分辨这一差别，下游部分因此只保留防御性结论。</w:t>
       </w:r>
     </w:p>
     <w:p>
@@ -18494,7 +18494,7 @@
           <w:b/>
           <w:bCs/>
         </w:rPr>
-        <w:t xml:space="preserve">候选有害率之所以偏高，主要是语料构成决定的。受保护层占了已发表方法候选的一半以上，而在干净窗口上任何编辑按定义都会增加误差。准确的说法是这些方法有一半以上的编辑落在了不该动的数据上。</w:t>
+        <w:t xml:space="preserve">候选有害率的高值主要由语料构成决定。受保护层占已发表方法候选的一半以上，而在干净窗口上任何编辑按定义都会增加误差。准确的表述是这些方法有一半以上的编辑落在了不应改动的数据上。</w:t>
       </w:r>
     </w:p>
     <w:p>
@@ -18551,7 +18551,7 @@
           <w:b/>
           <w:bCs/>
         </w:rPr>
-        <w:t xml:space="preserve">共形保证在跨语料的设定下失效了，这是实验设计的问题。校准集和部署数据之间的可交换性根本不成立，改成同一池子里随机划分之后保证就恢复了。引入策略学习之后，策略更新同样会破坏可交换性，得靠定期重新标定来控制。</w:t>
+        <w:t xml:space="preserve">共形保证在跨语料设定下失效，属于实验设计问题。校准集与部署数据之间的可交换性并不成立，改为同一池内的随机划分之后保证即告恢复。引入策略学习之后，策略更新同样会破坏可交换性，需要通过定期重新标定加以控制。</w:t>
       </w:r>
     </w:p>
     <w:p>
@@ -18570,7 +18570,7 @@
           <w:b/>
           <w:bCs/>
         </w:rPr>
-        <w:t xml:space="preserve">可学的结构集中在一个算子上。按画像簇与算子交叉统计固定规则策略的接受率，插补的接受率在簇之间有可检出的差异，重分段在任何簇数下都没有，去尖峰随簇数增大很快失去显著性，看着更像分辨率不够而不像真有结构，去噪的候选数太少且低期望频数的格子过多，不能当独立证据用。策略学习的收益因此集中在插补提议的取舍上。</w:t>
+        <w:t xml:space="preserve">可学结构集中在单一算子上。按画像簇与算子交叉统计固定规则策略的接受率，插补的接受率在簇之间存在可检出的差异，重分段在任何簇数下均不显著，去尖峰随簇数增大迅速失去显著性，更接近分辨率不足而非真实结构，去噪的候选数过少且低期望频数格子过多，不宜作为独立证据。策略学习的收益因而集中在对插补提议的取舍上。</w:t>
       </w:r>
     </w:p>
     <w:p>
@@ -18589,7 +18589,7 @@
           <w:b/>
           <w:bCs/>
         </w:rPr>
-        <w:t xml:space="preserve">固定规则策略有系统性的盲区。在簇与算子的全部组合里有四分之一从来没被访问过，其中两格合起来覆盖了语料近两成的窗口，而固定规则在这些窗口上一次也没提过对应的算子。这是确定性策略的结构性缺失，与数据稀疏无关，离线没办法给这些格子估值，只能靠在线探索去填，这也正是引入乐观初始化的直接理由。</w:t>
+        <w:t xml:space="preserve">固定规则策略存在系统性盲区。在簇与算子的全部组合中有四分之一从未被访问，其中两格合计覆盖语料近两成的窗口，而固定规则在这些窗口上一次也未提议过对应算子。这是确定性策略的结构性缺失，与数据稀疏无关，离线无法对这些格子估值，只能依靠在线探索填补，这也是引入乐观初始化的直接理由。</w:t>
       </w:r>
     </w:p>
     <w:p>
@@ -18608,7 +18608,7 @@
           <w:b/>
           <w:bCs/>
         </w:rPr>
-        <w:t xml:space="preserve">画像簇不是分层标签换个说法。簇与分层标签的调整互信息很低，说明画像几何抓到的结构与人工分层基本正交。两者若高度一致，则接受率随簇变化这件事就只是接受率随分层变化的另一种说法，而分层信息 CDP 已经以缺陷假设的形式给出来了，策略学习不会带来新东西。</w:t>
+        <w:t xml:space="preserve">画像簇并非分层标签的重述。簇与分层标签的调整互信息很低，说明画像几何捕捉的结构与人工分层基本正交。若两者高度一致，则接受率随簇变化这一现象只是接受率随分层变化的另一种表述，而分层信息 CDP 已经以缺陷假设的形式给出，策略学习不会带来新的信息。</w:t>
       </w:r>
     </w:p>
     <w:p>
@@ -18648,7 +18648,7 @@
         <w:rPr>
           <w:rFonts w:hint="eastAsia"/>
         </w:rPr>
-        <w:t xml:space="preserve">把策略从按画像簇维护的表格式价值估计换成线性或浅层函数逼近，让它能用上状态里的连续分量，同时保住可解释性和样本效率。</w:t>
+        <w:t xml:space="preserve">将策略从按画像簇维护的表格式价值估计升级为线性或浅层函数逼近，使其能够利用状态中的连续分量，同时保留可解释性与样本效率。</w:t>
       </w:r>
     </w:p>
     <w:p>

</xml_diff>

<commit_message>
Fold the proposition into the theorem numbering and complete the proof of theorem 6
</commit_message>
<xml_diff>
--- a/docx/胡宏彬-进度文档-20260820.docx
+++ b/docx/胡宏彬-进度文档-20260820.docx
@@ -54,7 +54,7 @@
         <w:rPr>
           <w:rFonts w:hint="eastAsia"/>
         </w:rPr>
-        <w:t xml:space="preserve">时序基础模型的能力上限越来越取决于预训练语料的质量，而时序数据的治理面临一个其他数据类型所不具备的根本困难，即一次修改的有害与否往往取决于被修改的数据段本身，而与修改方式无关。同一个去尖峰算子作用于传感器故障时构成修复，作用于真实发生的极端事件时则构成破坏，依据事先设定的规则判断某次修改是否值得执行因而在原理层面便无法成立。已有工作或在规则给出结论的同时即将改写作用于原始数值，错误决策无从撤销，或仅对样本给出分数而不产生动作，面对局部含有尖峰的窗口只能整窗丢弃。本文将判定推迟至动作执行之后，并使动作在工作副本的拷贝上执行，从而允许撤销错误的决策。这一设计面临两重挑战。判定依据只能来自目标模型，而模型在被削平的数据上给出的读数与有害性方向相反，本文因此要求模型效用改善与时序结构受控两个条件同时成立方予提交，并以共形风险控制将结构条件的阈值标定至给定的损害率。策略从判定中学习需要反复尝试，而语料不存在可以重置的副本，本文的处理是使全部候选均在副本上执行，未通过判定的尝试不改动任何数据。屏蔽在这一设计中承担双重职责，它拦截破坏性动作，同时决定了哪些奖励能够到达策略。本文给出六条定理与一条命题及其证明，涵盖合取判定的损害单调性、非阻塞性、任意策略下的结构安全性、共形风险控制、标定间隔内保证退化的上界与屏蔽动作空间上的遗憾界，并说明将结构约束写成惩罚项时损害率存在不可消除的下界，在此基础上规划了覆盖工业与金融两类场景的九组实验。</w:t>
+        <w:t>时序基础模型的能力上限越来越取决于预训练语料的质量，而时序数据的治理面临一个其他数据类型所不具备的根本困难，即一次修改的有害与否往往取决于被修改的数据段本身，而与修改方式无关。同一个去尖峰算子作用于传感器故障时构成修复，作用于真实发生的极端事件时则构成破坏，依据事先设定的规则判断某次修改是否值得执行因而在原理层面便无法成立。已有工作或在规则给出结论的同时即将改写作用于原始数值，错误决策无从撤销，或仅对样本给出分数而不产生动作，面对局部含有尖峰的窗口只能整窗丢弃。本文将判定推迟至动作执行之后，并使动作在工作副本的拷贝上执行，从而允许撤销错误的决策。这一设计面临两重挑战。判定依据只能来自目标模型，而模型在被削平的数据上给出的读数与有害性方向相反，本文因此要求模型效用改善与时序结构受控两个条件同时成立方予提交，并以共形风险控制将结构条件的阈值标定至给定的损害率。策略从判定中学习需要反复尝试，而语料不存在可以重置的副本，本文的处理是使全部候选均在副本上执行，未通过判定的尝试不改动任何数据。屏蔽在这一设计中承担双重职责，它拦截破坏性动作，同时决定了哪些奖励能够到达策略。本文给出七条定理及其证明，涵盖合取判定的损害单调性、软惩罚的损害下界、非阻塞性、任意策略下的结构安全性、共形风险控制、标定间隔内保证退化的上界与屏蔽动作空间上的遗憾界，在此基础上规划了覆盖工业与金融两类场景的九组实验。</w:t>
       </w:r>
     </w:p>
     <w:p>
@@ -574,7 +574,7 @@
         <w:rPr>
           <w:rFonts w:hint="eastAsia"/>
         </w:rPr>
-        <w:t xml:space="preserve">（1）针对已有方法将判定置于动作之前、错误决策无从撤销的现状，本文将时序数据治理形式化为屏蔽约束下的序贯干预决策，并给出对应的智能体 IntroAct-TS。该形式化将判定推迟至动作执行之后，动作先在副本上试执行，通过判定方予提交，因而无需事先写出仅关于动作本身的安全规则。本文通过定理 2 证明屏蔽后的可行动作集在任意状态下非空，保证决策过程不会因约束而中断，并给出整体流程的时间复杂度，说明引入判定与学习未改变开销的主导项。每一次判定同时构成策略可用的反馈，安全与学习因而共用同一次判定。</w:t>
+        <w:t>（1）针对已有方法将判定置于动作之前、错误决策无从撤销的现状，本文将时序数据治理形式化为屏蔽约束下的序贯干预决策，并给出对应的智能体 IntroAct-TS。该形式化将判定推迟至动作执行之后，动作先在副本上试执行，通过判定方予提交，因而无需事先写出仅关于动作本身的安全规则。本文通过定理 3 证明屏蔽后的可行动作集在任意状态下非空，保证决策过程不会因约束而中断，并给出整体流程的时间复杂度，说明引入判定与学习未改变开销的主导项。每一次判定同时构成策略可用的反馈，安全与学习因而共用同一次判定。</w:t>
       </w:r>
     </w:p>
     <w:p>
@@ -585,7 +585,7 @@
         <w:rPr>
           <w:rFonts w:hint="eastAsia"/>
         </w:rPr>
-        <w:t xml:space="preserve">（2）针对判定依据本身带有偏差这一挑战，本文设计了双信号合取判据与共形标定方法。该判据要求模型效用改善与时序结构受控同时成立，其中结构条件完全不参考模型意见，因而能够拦截通过削平序列换取低误差的动作，其阈值由共形风险控制标定，本文通过定理 4 证明提交编辑的损害率由此获得有限样本的分布无关保证，并通过定理 1 证明合取判据造成的损害不超过其中任一单独条件。本文进一步以命题 1 说明，将结构约束写成目标函数中的惩罚项时损害率存在不可消除的下界，而写成合取条件时则不存在该下界，两种写法因而并不等价。</w:t>
+        <w:t>（2）针对判定依据本身带有偏差这一挑战，本文设计了双信号合取判据与共形标定方法。该判据要求模型效用改善与时序结构受控同时成立，其中结构条件完全不参考模型意见，因而能够拦截通过削平序列换取低误差的动作，其阈值由共形风险控制标定，本文通过定理 5 证明提交编辑的损害率由此获得有限样本的分布无关保证，并通过定理 1 证明合取判据造成的损害不超过其中任一单独条件。本文进一步以定理 2 说明，将结构约束写成目标函数中的惩罚项时损害率存在不可消除的下界，而写成合取条件时则不存在该下界，两种写法因而并不等价。</w:t>
       </w:r>
     </w:p>
     <w:p>
@@ -596,7 +596,7 @@
         <w:rPr>
           <w:rFonts w:hint="eastAsia"/>
         </w:rPr>
-        <w:t xml:space="preserve">（3）针对试错代价作用于不可恢复对象这一挑战，本文提出沙箱执行下的屏蔽反馈策略优化机制。由于候选动作均在副本上执行且提交需经判定，本文通过定理 3 证明对任意策略与任意探索强度，被提交编辑的结构失真均受同一阈值约束，未通过判定的尝试不留下任何痕迹。策略更新会改变候选分布，从而削弱共形标定所依赖的可交换性，本文以定理 5 给出两次标定之间保证退化的上界，其与标定间隔成正比、与已积累的访问次数成反比，为重新标定的频率提供了定量依据，并以定理 6 说明屏蔽在约束动作集的同时保留了策略学习的收敛性质。</w:t>
+        <w:t>（3）针对试错代价作用于不可恢复对象这一挑战，本文提出沙箱执行下的屏蔽反馈策略优化机制。由于候选动作均在副本上执行且提交需经判定，本文通过定理 4 证明对任意策略与任意探索强度，被提交编辑的结构失真均受同一阈值约束，未通过判定的尝试不留下任何痕迹。策略更新会改变候选分布，从而削弱共形标定所依赖的可交换性，本文以定理 6 给出两次标定之间保证退化的上界，其与标定间隔成正比、与已积累的访问次数成反比，为重新标定的频率提供了定量依据，并以定理 7 说明屏蔽在约束动作集的同时保留了策略学习的收敛性质。</w:t>
       </w:r>
     </w:p>
     <w:p>
@@ -8715,13 +8715,12 @@
         <w:rPr>
           <w:rFonts w:hint="eastAsia"/>
         </w:rPr>
-        <w:t xml:space="preserve">命题 1（软惩罚的损害下界）设软惩罚的接受判据为</w:t>
-      </w:r>
-      <w:r>
-        <w:rPr>
-          <w:rFonts w:hint="eastAsia"/>
-        </w:rPr>
-        <w:t xml:space="preserve"> </w:t>
+        <w:t>定理 2（软惩罚的损害下界）设软惩罚的接受判据为 ，其中  为惩罚系数。若存在一类窗口，其上有害动作的效用增益与结构失真之比不低于某个正数 ，则对任意 ，该类窗口上的有害动作全部被接受，软惩罚的损害率因而存在一个不依赖于阈值选取的正下界，要消除这一下界只能取 ，而此时效用增益低于  倍结构失真的编辑一并被拒绝。</w:t>
+      </w:r>
+      <w:r>
+        <w:rPr>
+          <w:rFonts w:hint="eastAsia"/>
+        </w:rPr>
       </w:r>
       <m:oMath>
         <m:r>
@@ -8810,13 +8809,11 @@
         <w:rPr>
           <w:rFonts w:hint="eastAsia"/>
         </w:rPr>
-        <w:t xml:space="preserve">，其中</w:t>
-      </w:r>
-      <w:r>
-        <w:rPr>
-          <w:rFonts w:hint="eastAsia"/>
-        </w:rPr>
-        <w:t xml:space="preserve"> </w:t>
+      </w:r>
+      <w:r>
+        <w:rPr>
+          <w:rFonts w:hint="eastAsia"/>
+        </w:rPr>
       </w:r>
       <m:oMath>
         <m:r>
@@ -8836,19 +8833,16 @@
         <w:rPr>
           <w:rFonts w:hint="eastAsia"/>
         </w:rPr>
-        <w:t xml:space="preserve"> </w:t>
-      </w:r>
-      <w:r>
-        <w:rPr>
-          <w:rFonts w:hint="eastAsia"/>
-        </w:rPr>
-        <w:t xml:space="preserve">为惩罚系数。若存在一类窗口，其上有害动作的效用增益与结构失真之比不低于某个正数</w:t>
-      </w:r>
-      <w:r>
-        <w:rPr>
-          <w:rFonts w:hint="eastAsia"/>
-        </w:rPr>
-        <w:t xml:space="preserve"> </w:t>
+      </w:r>
+      <w:r>
+        <w:rPr>
+          <w:rFonts w:hint="eastAsia"/>
+        </w:rPr>
+      </w:r>
+      <w:r>
+        <w:rPr>
+          <w:rFonts w:hint="eastAsia"/>
+        </w:rPr>
       </w:r>
       <m:oMath>
         <m:r>
@@ -8859,13 +8853,11 @@
         <w:rPr>
           <w:rFonts w:hint="eastAsia"/>
         </w:rPr>
-        <w:t xml:space="preserve">，则对任意</w:t>
-      </w:r>
-      <w:r>
-        <w:rPr>
-          <w:rFonts w:hint="eastAsia"/>
-        </w:rPr>
-        <w:t xml:space="preserve"> </w:t>
+      </w:r>
+      <w:r>
+        <w:rPr>
+          <w:rFonts w:hint="eastAsia"/>
+        </w:rPr>
       </w:r>
       <m:oMath>
         <m:r>
@@ -8885,13 +8877,11 @@
         <w:rPr>
           <w:rFonts w:hint="eastAsia"/>
         </w:rPr>
-        <w:t xml:space="preserve">，该类窗口上的有害动作全部被接受，软惩罚的损害率因而存在一个不依赖于阈值选取的正下界，要消除这一下界只能取</w:t>
-      </w:r>
-      <w:r>
-        <w:rPr>
-          <w:rFonts w:hint="eastAsia"/>
-        </w:rPr>
-        <w:t xml:space="preserve"> </w:t>
+      </w:r>
+      <w:r>
+        <w:rPr>
+          <w:rFonts w:hint="eastAsia"/>
+        </w:rPr>
       </w:r>
       <m:oMath>
         <m:r>
@@ -8911,13 +8901,11 @@
         <w:rPr>
           <w:rFonts w:hint="eastAsia"/>
         </w:rPr>
-        <w:t xml:space="preserve">，而此时效用增益低于</w:t>
-      </w:r>
-      <w:r>
-        <w:rPr>
-          <w:rFonts w:hint="eastAsia"/>
-        </w:rPr>
-        <w:t xml:space="preserve"> </w:t>
+      </w:r>
+      <w:r>
+        <w:rPr>
+          <w:rFonts w:hint="eastAsia"/>
+        </w:rPr>
       </w:r>
       <m:oMath>
         <m:r>
@@ -8928,13 +8916,11 @@
         <w:rPr>
           <w:rFonts w:hint="eastAsia"/>
         </w:rPr>
-        <w:t xml:space="preserve"> </w:t>
-      </w:r>
-      <w:r>
-        <w:rPr>
-          <w:rFonts w:hint="eastAsia"/>
-        </w:rPr>
-        <w:t xml:space="preserve">倍结构失真的编辑一并被拒绝。</w:t>
+      </w:r>
+      <w:r>
+        <w:rPr>
+          <w:rFonts w:hint="eastAsia"/>
+        </w:rPr>
       </w:r>
     </w:p>
     <w:p>
@@ -9152,7 +9138,7 @@
         <w:rPr>
           <w:rFonts w:hint="eastAsia"/>
         </w:rPr>
-        <w:t xml:space="preserve">命题 1 的前提是效用信号与有害性在某类数据上同向增长，即抹平一段真实的极端波动同时得到高效用增益与大结构失真。本文的实验一正是刻画这一前提是否成立，因此命题的实际意义取决于该实验的结论，若反向区域很小则下界虽然存在但数值可忽略。合取条件没有这个下界，它的接受集由结构阈值直接切出，与效用增益的大小无关，无论某个动作的效用增益多高，结构失真超限即被拒绝。这一区别把两种做法的比较从是否使用副本这一实现细节，提升到结构约束应当以可交易还是不可交易的形式进入决策这一设计问题上。</w:t>
+        <w:t>定理 2 的前提是效用信号与有害性在某类数据上同向增长，即抹平一段真实的极端波动同时得到高效用增益与大结构失真。本文的实验一正是刻画这一前提是否成立，因此该定理的实际意义取决于该实验的结论，若反向区域很小则下界虽然存在但数值可忽略。合取条件没有这个下界，它的接受集由结构阈值直接切出，与效用增益的大小无关，无论某个动作的效用增益多高，结构失真超限即被拒绝。这一区别把两种做法的比较从是否使用副本这一实现细节，提升到结构约束应当以可交易还是不可交易的形式进入决策这一设计问题上。</w:t>
       </w:r>
     </w:p>
     <w:p>
@@ -10293,7 +10279,7 @@
           <w:b/>
           <w:bCs/>
         </w:rPr>
-        <w:t xml:space="preserve">定理 2（非阻塞性）在任意状态与任意阈值设定下，屏蔽后的可行动作集非空。</w:t>
+        <w:t>定理 3（非阻塞性）在任意状态与任意阈值设定下，屏蔽后的可行动作集非空。</w:t>
       </w:r>
     </w:p>
     <w:p>
@@ -10406,7 +10392,7 @@
         <w:rPr>
           <w:rFonts w:hint="eastAsia"/>
         </w:rPr>
-        <w:t>定理 2 对强化学习的意义在于，屏蔽不会让策略陷入无动作可选的状态，因此可以把屏蔽视为对动作空间的状态相关限制，它限制动作集合，但不中断决策过程。这也是 3.4 节遗憾分析成立的前提。</w:t>
+        <w:t>定理 3 对强化学习的意义在于，屏蔽不会让策略陷入无动作可选的状态，因此可以把屏蔽视为对动作空间的状态相关限制，它限制动作集合，但不中断决策过程。这也是 3.4 节遗憾分析成立的前提。</w:t>
       </w:r>
     </w:p>
     <w:p>
@@ -10420,7 +10406,7 @@
           <w:b/>
           <w:bCs/>
         </w:rPr>
-        <w:t xml:space="preserve">定理 3（探索的结构安全性）对任意策略</w:t>
+        <w:t>定理 4（探索的结构安全性）对任意策略  与任意探索强度，被提交的每一次编辑都满足 ，因此治理后语料的结构失真上界与策略无关。</w:t>
       </w:r>
       <w:r>
         <w:rPr>
@@ -10428,7 +10414,6 @@
           <w:b/>
           <w:bCs/>
         </w:rPr>
-        <w:t xml:space="preserve"> </w:t>
       </w:r>
       <m:oMath>
         <m:r>
@@ -10441,7 +10426,6 @@
           <w:b/>
           <w:bCs/>
         </w:rPr>
-        <w:t xml:space="preserve"> </w:t>
       </w:r>
       <w:r>
         <w:rPr>
@@ -10449,7 +10433,6 @@
           <w:b/>
           <w:bCs/>
         </w:rPr>
-        <w:t xml:space="preserve">与任意探索强度，被提交的每一次编辑都满足</w:t>
       </w:r>
       <w:r>
         <w:rPr>
@@ -10457,7 +10440,6 @@
           <w:b/>
           <w:bCs/>
         </w:rPr>
-        <w:t xml:space="preserve"> </w:t>
       </w:r>
       <m:oMath>
         <m:r>
@@ -10518,7 +10500,6 @@
           <w:b/>
           <w:bCs/>
         </w:rPr>
-        <w:t xml:space="preserve">，因此治理后语料的结构失真上界与策略无关。</w:t>
       </w:r>
     </w:p>
     <w:p>
@@ -10615,7 +10596,7 @@
         <w:rPr>
           <w:rFonts w:hint="eastAsia"/>
         </w:rPr>
-        <w:t xml:space="preserve">定理 3 是本文与算子立即生效的强化学习清洗方案的核心差异。在那类方案中，训练期间的每一次错误探索都在真实语料上留下痕迹，安全性只能在收敛后的期望意义上成立。本文的探索发生在副本上，未通过屏蔽的尝试不留下任何后果，学习过程因而不构成破坏过程。这一性质使智能体可以在真实语料上直接学习，不需要先在仿真环境中预训练。</w:t>
+        <w:t>定理 4 是本文与算子立即生效的强化学习清洗方案的核心差异。在那类方案中，训练期间的每一次错误探索都在真实语料上留下痕迹，安全性只能在收敛后的期望意义上成立。本文的探索发生在副本上，未通过屏蔽的尝试不留下任何后果，学习过程因而不构成破坏过程。这一性质使智能体可以在真实语料上直接学习，不需要先在仿真环境中预训练。</w:t>
       </w:r>
     </w:p>
     <w:p>
@@ -10626,7 +10607,7 @@
         <w:rPr>
           <w:rFonts w:hint="eastAsia"/>
         </w:rPr>
-        <w:t xml:space="preserve">定理 3 的成立与候选的来源无关。证明只用到两点，动作作用于副本的拷贝，以及工作副本仅在三个条件同时成立时才被更新。候选由提议者生成还是由策略强制注入，都不改变这两点，因此对强制注入的候选，被提交编辑的结构失真同样受同一阈值约束。</w:t>
+        <w:t>定理 4 的成立与候选的来源无关。证明只用到两点，动作作用于副本的拷贝，以及工作副本仅在三个条件同时成立时才被更新。候选由提议者生成还是由策略强制注入，都不改变这两点，因此对强制注入的候选，被提交编辑的结构失真同样受同一阈值约束。</w:t>
       </w:r>
     </w:p>
     <w:p>
@@ -10651,7 +10632,7 @@
           <w:b/>
           <w:bCs/>
         </w:rPr>
-        <w:t xml:space="preserve">定理 4（风险控制）设校准集与部署数据可交换，风险函数有界且关于阈值单调不减，则由共形风险控制在目标水平</w:t>
+        <w:t>定理 5（风险控制）设校准集与部署数据可交换，风险函数有界且关于阈值单调不减，则由共形风险控制在目标水平  下选出的阈值  满足，部署数据上被提交编辑的损害率的期望不超过 。</w:t>
       </w:r>
       <w:r>
         <w:rPr>
@@ -10659,7 +10640,6 @@
           <w:b/>
           <w:bCs/>
         </w:rPr>
-        <w:t xml:space="preserve"> </w:t>
       </w:r>
       <m:oMath>
         <m:r>
@@ -10672,7 +10652,6 @@
           <w:b/>
           <w:bCs/>
         </w:rPr>
-        <w:t xml:space="preserve"> </w:t>
       </w:r>
       <w:r>
         <w:rPr>
@@ -10680,7 +10659,6 @@
           <w:b/>
           <w:bCs/>
         </w:rPr>
-        <w:t xml:space="preserve">下选出的阈值</w:t>
       </w:r>
       <w:r>
         <w:rPr>
@@ -10688,7 +10666,6 @@
           <w:b/>
           <w:bCs/>
         </w:rPr>
-        <w:t xml:space="preserve"> </w:t>
       </w:r>
       <m:oMath>
         <m:r>
@@ -10701,7 +10678,6 @@
           <w:b/>
           <w:bCs/>
         </w:rPr>
-        <w:t xml:space="preserve"> </w:t>
       </w:r>
       <w:r>
         <w:rPr>
@@ -10709,7 +10685,6 @@
           <w:b/>
           <w:bCs/>
         </w:rPr>
-        <w:t xml:space="preserve">满足，部署数据上被提交编辑的损害率的期望不超过</w:t>
       </w:r>
       <w:r>
         <w:rPr>
@@ -10717,7 +10692,6 @@
           <w:b/>
           <w:bCs/>
         </w:rPr>
-        <w:t xml:space="preserve"> </w:t>
       </w:r>
       <m:oMath>
         <m:r>
@@ -10730,7 +10704,6 @@
           <w:b/>
           <w:bCs/>
         </w:rPr>
-        <w:t xml:space="preserve">。</w:t>
       </w:r>
     </w:p>
     <w:p>
@@ -10879,7 +10852,7 @@
         <w:rPr>
           <w:rFonts w:hint="eastAsia"/>
         </w:rPr>
-        <w:t xml:space="preserve">定理 4 的可交换性前提在策略固定时成立，而策略学习会持续改变候选动作的分布，使部署数据与早先的校准集不再可交换。工程上的处理是每隔一段时间重新标定，把两次标定之间的阈值视为固定值，但这样做没有回答两次标定之间保证退化了多少。下面的结论给出这一退化的上界。</w:t>
+        <w:t>定理 5 的可交换性前提在策略固定时成立，而策略学习会持续改变候选动作的分布，使部署数据与早先的校准集不再可交换。工程上的处理是每隔一段时间重新标定，把两次标定之间的阈值视为固定值，但这样做没有回答两次标定之间保证退化了多少。下面的结论给出这一退化的上界。</w:t>
       </w:r>
     </w:p>
     <w:p>
@@ -10890,13 +10863,12 @@
         <w:rPr>
           <w:rFonts w:hint="eastAsia"/>
         </w:rPr>
-        <w:t>定理 5（标定间隔内的保证退化）设风险函数取值于</w:t>
-      </w:r>
-      <w:r>
-        <w:rPr>
-          <w:rFonts w:hint="eastAsia"/>
-        </w:rPr>
-        <w:t xml:space="preserve"> </w:t>
+        <w:t>定理 6（标定间隔内的保证退化）设风险函数取值于 ，记校准时的候选分布为 ，某次决策时的候选分布为 ，两者的总变差距离为 ，则部署风险满足</w:t>
+      </w:r>
+      <w:r>
+        <w:rPr>
+          <w:rFonts w:hint="eastAsia"/>
+        </w:rPr>
       </w:r>
       <m:oMath>
         <m:r>
@@ -10928,13 +10900,11 @@
         <w:rPr>
           <w:rFonts w:hint="eastAsia"/>
         </w:rPr>
-        <w:t xml:space="preserve">，记校准时的候选分布为</w:t>
-      </w:r>
-      <w:r>
-        <w:rPr>
-          <w:rFonts w:hint="eastAsia"/>
-        </w:rPr>
-        <w:t xml:space="preserve"> </w:t>
+      </w:r>
+      <w:r>
+        <w:rPr>
+          <w:rFonts w:hint="eastAsia"/>
+        </w:rPr>
       </w:r>
       <m:oMath>
         <m:r>
@@ -10945,13 +10915,11 @@
         <w:rPr>
           <w:rFonts w:hint="eastAsia"/>
         </w:rPr>
-        <w:t xml:space="preserve">，某次决策时的候选分布为</w:t>
-      </w:r>
-      <w:r>
-        <w:rPr>
-          <w:rFonts w:hint="eastAsia"/>
-        </w:rPr>
-        <w:t xml:space="preserve"> </w:t>
+      </w:r>
+      <w:r>
+        <w:rPr>
+          <w:rFonts w:hint="eastAsia"/>
+        </w:rPr>
       </w:r>
       <m:oMath>
         <m:r>
@@ -10962,13 +10930,11 @@
         <w:rPr>
           <w:rFonts w:hint="eastAsia"/>
         </w:rPr>
-        <w:t xml:space="preserve">，两者的总变差距离为</w:t>
-      </w:r>
-      <w:r>
-        <w:rPr>
-          <w:rFonts w:hint="eastAsia"/>
-        </w:rPr>
-        <w:t xml:space="preserve"> </w:t>
+      </w:r>
+      <w:r>
+        <w:rPr>
+          <w:rFonts w:hint="eastAsia"/>
+        </w:rPr>
       </w:r>
       <m:oMath>
         <m:r>
@@ -11012,7 +10978,6 @@
         <w:rPr>
           <w:rFonts w:hint="eastAsia"/>
         </w:rPr>
-        <w:t xml:space="preserve">，则部署风险满足</w:t>
       </w:r>
     </w:p>
     <w:p>
@@ -11433,7 +11398,1094 @@
         <w:rPr>
           <w:rFonts w:hint="eastAsia"/>
         </w:rPr>
-        <w:t xml:space="preserve">证明的思路分三步。第一步用有界风险函数在两个分布上期望之差受总变差距离控制这一标准事实，结合定理 4 给出的校准分布上的保证，得到第一个不等式。第二步刻画价值表的变化，增量更新每次对某个格子的改变是奖励与当前估计之差除以访问计数，奖励经截断后有界，因此单次改变不超过截断上界与访问计数之比，</w:t>
+        <w:t xml:space="preserve">证明。先证第一个不等式。对任意取值于</w:t>
+      </w:r>
+      <w:r>
+        <w:rPr>
+          <w:rFonts w:hint="eastAsia"/>
+        </w:rPr>
+        <w:t xml:space="preserve"> </w:t>
+      </w:r>
+      <m:oMath>
+        <m:r>
+          <m:rPr>
+            <m:sty m:val="p"/>
+          </m:rPr>
+          <m:t>[</m:t>
+        </m:r>
+        <m:r>
+          <m:t>0</m:t>
+        </m:r>
+        <m:r>
+          <m:rPr>
+            <m:sty m:val="p"/>
+          </m:rPr>
+          <m:t>,</m:t>
+        </m:r>
+        <m:r>
+          <m:t>1</m:t>
+        </m:r>
+        <m:r>
+          <m:rPr>
+            <m:sty m:val="p"/>
+          </m:rPr>
+          <m:t>]</m:t>
+        </m:r>
+      </m:oMath>
+      <w:r>
+        <w:rPr>
+          <w:rFonts w:hint="eastAsia"/>
+        </w:rPr>
+        <w:t xml:space="preserve"> </w:t>
+      </w:r>
+      <w:r>
+        <w:rPr>
+          <w:rFonts w:hint="eastAsia"/>
+        </w:rPr>
+        <w:t xml:space="preserve">的可测函数</w:t>
+      </w:r>
+      <w:r>
+        <w:rPr>
+          <w:rFonts w:hint="eastAsia"/>
+        </w:rPr>
+        <w:t xml:space="preserve"> </w:t>
+      </w:r>
+      <m:oMath>
+        <m:r>
+          <m:t>L</m:t>
+        </m:r>
+      </m:oMath>
+      <w:r>
+        <w:rPr>
+          <w:rFonts w:hint="eastAsia"/>
+        </w:rPr>
+        <w:t xml:space="preserve"> </w:t>
+      </w:r>
+      <w:r>
+        <w:rPr>
+          <w:rFonts w:hint="eastAsia"/>
+        </w:rPr>
+        <w:t xml:space="preserve">与任意两个分布</w:t>
+      </w:r>
+      <w:r>
+        <w:rPr>
+          <w:rFonts w:hint="eastAsia"/>
+        </w:rPr>
+        <w:t xml:space="preserve"> </w:t>
+      </w:r>
+      <m:oMath>
+        <m:r>
+          <m:t>P</m:t>
+        </m:r>
+      </m:oMath>
+      <w:r>
+        <w:rPr>
+          <w:rFonts w:hint="eastAsia"/>
+        </w:rPr>
+        <w:t xml:space="preserve"> </w:t>
+      </w:r>
+      <w:r>
+        <w:rPr>
+          <w:rFonts w:hint="eastAsia"/>
+        </w:rPr>
+        <w:t xml:space="preserve">与</w:t>
+      </w:r>
+      <w:r>
+        <w:rPr>
+          <w:rFonts w:hint="eastAsia"/>
+        </w:rPr>
+        <w:t xml:space="preserve"> </w:t>
+      </w:r>
+      <m:oMath>
+        <m:r>
+          <m:t>Q</m:t>
+        </m:r>
+      </m:oMath>
+      <w:r>
+        <w:rPr>
+          <w:rFonts w:hint="eastAsia"/>
+        </w:rPr>
+        <w:t xml:space="preserve">，由总变差距离的定义有</w:t>
+      </w:r>
+      <w:r>
+        <w:rPr>
+          <w:rFonts w:hint="eastAsia"/>
+        </w:rPr>
+        <w:t xml:space="preserve"> </w:t>
+      </w:r>
+      <m:oMath>
+        <m:r>
+          <m:rPr>
+            <m:sty m:val="p"/>
+          </m:rPr>
+          <m:t>|</m:t>
+        </m:r>
+        <m:sSub>
+          <m:e>
+            <m:r>
+              <m:rPr>
+                <m:sty m:val="p"/>
+                <m:scr m:val="double-struck"/>
+              </m:rPr>
+              <m:t>E</m:t>
+            </m:r>
+          </m:e>
+          <m:sub>
+            <m:r>
+              <m:t>Q</m:t>
+            </m:r>
+          </m:sub>
+        </m:sSub>
+        <m:r>
+          <m:rPr>
+            <m:sty m:val="p"/>
+          </m:rPr>
+          <m:t>[</m:t>
+        </m:r>
+        <m:r>
+          <m:t>L</m:t>
+        </m:r>
+        <m:r>
+          <m:rPr>
+            <m:sty m:val="p"/>
+          </m:rPr>
+          <m:t>]</m:t>
+        </m:r>
+        <m:r>
+          <m:rPr>
+            <m:sty m:val="p"/>
+          </m:rPr>
+          <m:t>−</m:t>
+        </m:r>
+        <m:sSub>
+          <m:e>
+            <m:r>
+              <m:rPr>
+                <m:sty m:val="p"/>
+                <m:scr m:val="double-struck"/>
+              </m:rPr>
+              <m:t>E</m:t>
+            </m:r>
+          </m:e>
+          <m:sub>
+            <m:r>
+              <m:t>P</m:t>
+            </m:r>
+          </m:sub>
+        </m:sSub>
+        <m:r>
+          <m:rPr>
+            <m:sty m:val="p"/>
+          </m:rPr>
+          <m:t>[</m:t>
+        </m:r>
+        <m:r>
+          <m:t>L</m:t>
+        </m:r>
+        <m:r>
+          <m:rPr>
+            <m:sty m:val="p"/>
+          </m:rPr>
+          <m:t>]</m:t>
+        </m:r>
+        <m:r>
+          <m:rPr>
+            <m:sty m:val="p"/>
+          </m:rPr>
+          <m:t>|</m:t>
+        </m:r>
+        <m:r>
+          <m:rPr>
+            <m:sty m:val="p"/>
+          </m:rPr>
+          <m:t>≤</m:t>
+        </m:r>
+        <m:sSub>
+          <m:e>
+            <m:r>
+              <m:rPr>
+                <m:nor/>
+                <m:sty m:val="p"/>
+              </m:rPr>
+              <m:t>sup</m:t>
+            </m:r>
+          </m:e>
+          <m:sub>
+            <m:r>
+              <m:t>0</m:t>
+            </m:r>
+            <m:r>
+              <m:rPr>
+                <m:sty m:val="p"/>
+              </m:rPr>
+              <m:t>≤</m:t>
+            </m:r>
+            <m:r>
+              <m:t>f</m:t>
+            </m:r>
+            <m:r>
+              <m:rPr>
+                <m:sty m:val="p"/>
+              </m:rPr>
+              <m:t>≤</m:t>
+            </m:r>
+            <m:r>
+              <m:t>1</m:t>
+            </m:r>
+          </m:sub>
+        </m:sSub>
+        <m:r>
+          <m:rPr>
+            <m:sty m:val="p"/>
+          </m:rPr>
+          <m:t>|</m:t>
+        </m:r>
+        <m:sSub>
+          <m:e>
+            <m:r>
+              <m:rPr>
+                <m:sty m:val="p"/>
+                <m:scr m:val="double-struck"/>
+              </m:rPr>
+              <m:t>E</m:t>
+            </m:r>
+          </m:e>
+          <m:sub>
+            <m:r>
+              <m:t>Q</m:t>
+            </m:r>
+          </m:sub>
+        </m:sSub>
+        <m:r>
+          <m:rPr>
+            <m:sty m:val="p"/>
+          </m:rPr>
+          <m:t>[</m:t>
+        </m:r>
+        <m:r>
+          <m:t>f</m:t>
+        </m:r>
+        <m:r>
+          <m:rPr>
+            <m:sty m:val="p"/>
+          </m:rPr>
+          <m:t>]</m:t>
+        </m:r>
+        <m:r>
+          <m:rPr>
+            <m:sty m:val="p"/>
+          </m:rPr>
+          <m:t>−</m:t>
+        </m:r>
+        <m:sSub>
+          <m:e>
+            <m:r>
+              <m:rPr>
+                <m:sty m:val="p"/>
+                <m:scr m:val="double-struck"/>
+              </m:rPr>
+              <m:t>E</m:t>
+            </m:r>
+          </m:e>
+          <m:sub>
+            <m:r>
+              <m:t>P</m:t>
+            </m:r>
+          </m:sub>
+        </m:sSub>
+        <m:r>
+          <m:rPr>
+            <m:sty m:val="p"/>
+          </m:rPr>
+          <m:t>[</m:t>
+        </m:r>
+        <m:r>
+          <m:t>f</m:t>
+        </m:r>
+        <m:r>
+          <m:rPr>
+            <m:sty m:val="p"/>
+          </m:rPr>
+          <m:t>]</m:t>
+        </m:r>
+        <m:r>
+          <m:rPr>
+            <m:sty m:val="p"/>
+          </m:rPr>
+          <m:t>|</m:t>
+        </m:r>
+        <m:r>
+          <m:rPr>
+            <m:sty m:val="p"/>
+          </m:rPr>
+          <m:t>=</m:t>
+        </m:r>
+        <m:r>
+          <m:rPr>
+            <m:sty m:val="p"/>
+          </m:rPr>
+          <m:t>T</m:t>
+        </m:r>
+        <m:r>
+          <m:rPr>
+            <m:sty m:val="p"/>
+          </m:rPr>
+          <m:t>V</m:t>
+        </m:r>
+        <m:r>
+          <m:rPr>
+            <m:sty m:val="p"/>
+          </m:rPr>
+          <m:t>(</m:t>
+        </m:r>
+        <m:r>
+          <m:t>P</m:t>
+        </m:r>
+        <m:r>
+          <m:rPr>
+            <m:sty m:val="p"/>
+          </m:rPr>
+          <m:t>,</m:t>
+        </m:r>
+        <m:r>
+          <m:t>Q</m:t>
+        </m:r>
+        <m:r>
+          <m:rPr>
+            <m:sty m:val="p"/>
+          </m:rPr>
+          <m:t>)</m:t>
+        </m:r>
+      </m:oMath>
+      <w:r>
+        <w:rPr>
+          <w:rFonts w:hint="eastAsia"/>
+        </w:rPr>
+        <w:t xml:space="preserve">。本文的风险函数取定义 1 中的零一指示，满足上述有界条件，故</w:t>
+      </w:r>
+      <w:r>
+        <w:rPr>
+          <w:rFonts w:hint="eastAsia"/>
+        </w:rPr>
+        <w:t xml:space="preserve"> </w:t>
+      </w:r>
+      <m:oMath>
+        <m:sSub>
+          <m:e>
+            <m:r>
+              <m:rPr>
+                <m:sty m:val="p"/>
+                <m:scr m:val="double-struck"/>
+              </m:rPr>
+              <m:t>E</m:t>
+            </m:r>
+          </m:e>
+          <m:sub>
+            <m:r>
+              <m:t>Q</m:t>
+            </m:r>
+          </m:sub>
+        </m:sSub>
+        <m:r>
+          <m:rPr>
+            <m:sty m:val="p"/>
+          </m:rPr>
+          <m:t>[</m:t>
+        </m:r>
+        <m:r>
+          <m:t>L</m:t>
+        </m:r>
+        <m:r>
+          <m:rPr>
+            <m:sty m:val="p"/>
+          </m:rPr>
+          <m:t>]</m:t>
+        </m:r>
+        <m:r>
+          <m:rPr>
+            <m:sty m:val="p"/>
+          </m:rPr>
+          <m:t>≤</m:t>
+        </m:r>
+        <m:sSub>
+          <m:e>
+            <m:r>
+              <m:rPr>
+                <m:sty m:val="p"/>
+                <m:scr m:val="double-struck"/>
+              </m:rPr>
+              <m:t>E</m:t>
+            </m:r>
+          </m:e>
+          <m:sub>
+            <m:r>
+              <m:t>P</m:t>
+            </m:r>
+          </m:sub>
+        </m:sSub>
+        <m:r>
+          <m:rPr>
+            <m:sty m:val="p"/>
+          </m:rPr>
+          <m:t>[</m:t>
+        </m:r>
+        <m:r>
+          <m:t>L</m:t>
+        </m:r>
+        <m:r>
+          <m:rPr>
+            <m:sty m:val="p"/>
+          </m:rPr>
+          <m:t>]</m:t>
+        </m:r>
+        <m:r>
+          <m:rPr>
+            <m:sty m:val="p"/>
+          </m:rPr>
+          <m:t>+</m:t>
+        </m:r>
+        <m:r>
+          <m:rPr>
+            <m:sty m:val="p"/>
+          </m:rPr>
+          <m:t>T</m:t>
+        </m:r>
+        <m:r>
+          <m:rPr>
+            <m:sty m:val="p"/>
+          </m:rPr>
+          <m:t>V</m:t>
+        </m:r>
+        <m:r>
+          <m:rPr>
+            <m:sty m:val="p"/>
+          </m:rPr>
+          <m:t>(</m:t>
+        </m:r>
+        <m:r>
+          <m:t>P</m:t>
+        </m:r>
+        <m:r>
+          <m:rPr>
+            <m:sty m:val="p"/>
+          </m:rPr>
+          <m:t>,</m:t>
+        </m:r>
+        <m:r>
+          <m:t>Q</m:t>
+        </m:r>
+        <m:r>
+          <m:rPr>
+            <m:sty m:val="p"/>
+          </m:rPr>
+          <m:t>)</m:t>
+        </m:r>
+      </m:oMath>
+      <w:r>
+        <w:rPr>
+          <w:rFonts w:hint="eastAsia"/>
+        </w:rPr>
+        <w:t xml:space="preserve">。再由定理 5，校准分布上的风险受目标水平控制，即</w:t>
+      </w:r>
+      <w:r>
+        <w:rPr>
+          <w:rFonts w:hint="eastAsia"/>
+        </w:rPr>
+        <w:t xml:space="preserve"> </w:t>
+      </w:r>
+      <m:oMath>
+        <m:sSub>
+          <m:e>
+            <m:r>
+              <m:rPr>
+                <m:sty m:val="p"/>
+                <m:scr m:val="double-struck"/>
+              </m:rPr>
+              <m:t>E</m:t>
+            </m:r>
+          </m:e>
+          <m:sub>
+            <m:r>
+              <m:t>P</m:t>
+            </m:r>
+          </m:sub>
+        </m:sSub>
+        <m:r>
+          <m:rPr>
+            <m:sty m:val="p"/>
+          </m:rPr>
+          <m:t>[</m:t>
+        </m:r>
+        <m:r>
+          <m:t>L</m:t>
+        </m:r>
+        <m:r>
+          <m:rPr>
+            <m:sty m:val="p"/>
+          </m:rPr>
+          <m:t>]</m:t>
+        </m:r>
+        <m:r>
+          <m:rPr>
+            <m:sty m:val="p"/>
+          </m:rPr>
+          <m:t>≤</m:t>
+        </m:r>
+        <m:r>
+          <m:t>α</m:t>
+        </m:r>
+      </m:oMath>
+      <w:r>
+        <w:rPr>
+          <w:rFonts w:hint="eastAsia"/>
+        </w:rPr>
+        <w:t xml:space="preserve">，两式相加即得</w:t>
+      </w:r>
+      <w:r>
+        <w:rPr>
+          <w:rFonts w:hint="eastAsia"/>
+        </w:rPr>
+        <w:t xml:space="preserve"> </w:t>
+      </w:r>
+      <m:oMath>
+        <m:sSub>
+          <m:e>
+            <m:r>
+              <m:rPr>
+                <m:sty m:val="p"/>
+                <m:scr m:val="double-struck"/>
+              </m:rPr>
+              <m:t>E</m:t>
+            </m:r>
+          </m:e>
+          <m:sub>
+            <m:r>
+              <m:t>Q</m:t>
+            </m:r>
+          </m:sub>
+        </m:sSub>
+        <m:r>
+          <m:rPr>
+            <m:sty m:val="p"/>
+          </m:rPr>
+          <m:t>[</m:t>
+        </m:r>
+        <m:r>
+          <m:t>L</m:t>
+        </m:r>
+        <m:r>
+          <m:rPr>
+            <m:sty m:val="p"/>
+          </m:rPr>
+          <m:t>]</m:t>
+        </m:r>
+        <m:r>
+          <m:rPr>
+            <m:sty m:val="p"/>
+          </m:rPr>
+          <m:t>≤</m:t>
+        </m:r>
+        <m:r>
+          <m:t>α</m:t>
+        </m:r>
+        <m:r>
+          <m:rPr>
+            <m:sty m:val="p"/>
+          </m:rPr>
+          <m:t>+</m:t>
+        </m:r>
+        <m:r>
+          <m:rPr>
+            <m:sty m:val="p"/>
+          </m:rPr>
+          <m:t>T</m:t>
+        </m:r>
+        <m:r>
+          <m:rPr>
+            <m:sty m:val="p"/>
+          </m:rPr>
+          <m:t>V</m:t>
+        </m:r>
+        <m:r>
+          <m:rPr>
+            <m:sty m:val="p"/>
+          </m:rPr>
+          <m:t>(</m:t>
+        </m:r>
+        <m:r>
+          <m:t>P</m:t>
+        </m:r>
+        <m:r>
+          <m:rPr>
+            <m:sty m:val="p"/>
+          </m:rPr>
+          <m:t>,</m:t>
+        </m:r>
+        <m:r>
+          <m:t>Q</m:t>
+        </m:r>
+        <m:r>
+          <m:rPr>
+            <m:sty m:val="p"/>
+          </m:rPr>
+          <m:t>)</m:t>
+        </m:r>
+      </m:oMath>
+      <w:r>
+        <w:rPr>
+          <w:rFonts w:hint="eastAsia"/>
+        </w:rPr>
+        <w:t xml:space="preserve">。</w:t>
+      </w:r>
+    </w:p>
+    <w:p>
+      <w:pPr>
+        <w:ind w:firstLineChars="200" w:firstLine="420"/>
+      </w:pPr>
+      <w:r>
+        <w:rPr>
+          <w:rFonts w:hint="eastAsia"/>
+        </w:rPr>
+        <w:t xml:space="preserve">再证第二个不等式，分两步完成。第一步界定价值表的变化幅度。由 3.4 节的增量更新式，第</w:t>
+      </w:r>
+      <w:r>
+        <w:rPr>
+          <w:rFonts w:hint="eastAsia"/>
+        </w:rPr>
+        <w:t xml:space="preserve"> </w:t>
+      </w:r>
+      <m:oMath>
+        <m:r>
+          <m:t>m</m:t>
+        </m:r>
+      </m:oMath>
+      <w:r>
+        <w:rPr>
+          <w:rFonts w:hint="eastAsia"/>
+        </w:rPr>
+        <w:t xml:space="preserve"> </w:t>
+      </w:r>
+      <w:r>
+        <w:rPr>
+          <w:rFonts w:hint="eastAsia"/>
+        </w:rPr>
+        <w:t xml:space="preserve">次更新对格子</w:t>
+      </w:r>
+      <w:r>
+        <w:rPr>
+          <w:rFonts w:hint="eastAsia"/>
+        </w:rPr>
+        <w:t xml:space="preserve"> </w:t>
+      </w:r>
+      <m:oMath>
+        <m:r>
+          <m:rPr>
+            <m:sty m:val="p"/>
+          </m:rPr>
+          <m:t>(</m:t>
+        </m:r>
+        <m:r>
+          <m:t>j</m:t>
+        </m:r>
+        <m:r>
+          <m:rPr>
+            <m:sty m:val="p"/>
+          </m:rPr>
+          <m:t>,</m:t>
+        </m:r>
+        <m:r>
+          <m:t>a</m:t>
+        </m:r>
+        <m:r>
+          <m:rPr>
+            <m:sty m:val="p"/>
+          </m:rPr>
+          <m:t>)</m:t>
+        </m:r>
+      </m:oMath>
+      <w:r>
+        <w:rPr>
+          <w:rFonts w:hint="eastAsia"/>
+        </w:rPr>
+        <w:t xml:space="preserve"> </w:t>
+      </w:r>
+      <w:r>
+        <w:rPr>
+          <w:rFonts w:hint="eastAsia"/>
+        </w:rPr>
+        <w:t xml:space="preserve">的改变量为</w:t>
+      </w:r>
+      <w:r>
+        <w:rPr>
+          <w:rFonts w:hint="eastAsia"/>
+        </w:rPr>
+        <w:t xml:space="preserve"> </w:t>
+      </w:r>
+      <m:oMath>
+        <m:r>
+          <m:rPr>
+            <m:sty m:val="p"/>
+          </m:rPr>
+          <m:t>|</m:t>
+        </m:r>
+        <m:sSub>
+          <m:e>
+            <m:r>
+              <m:t>r</m:t>
+            </m:r>
+          </m:e>
+          <m:sub>
+            <m:r>
+              <m:t>m</m:t>
+            </m:r>
+          </m:sub>
+        </m:sSub>
+        <m:r>
+          <m:rPr>
+            <m:sty m:val="p"/>
+          </m:rPr>
+          <m:t>−</m:t>
+        </m:r>
+        <m:r>
+          <m:t>Q</m:t>
+        </m:r>
+        <m:r>
+          <m:rPr>
+            <m:sty m:val="p"/>
+          </m:rPr>
+          <m:t>(</m:t>
+        </m:r>
+        <m:r>
+          <m:t>j</m:t>
+        </m:r>
+        <m:r>
+          <m:rPr>
+            <m:sty m:val="p"/>
+          </m:rPr>
+          <m:t>,</m:t>
+        </m:r>
+        <m:r>
+          <m:t>a</m:t>
+        </m:r>
+        <m:r>
+          <m:rPr>
+            <m:sty m:val="p"/>
+          </m:rPr>
+          <m:t>)</m:t>
+        </m:r>
+        <m:r>
+          <m:rPr>
+            <m:sty m:val="p"/>
+          </m:rPr>
+          <m:t>|</m:t>
+        </m:r>
+        <m:r>
+          <m:rPr>
+            <m:sty m:val="p"/>
+          </m:rPr>
+          <m:t>/</m:t>
+        </m:r>
+        <m:r>
+          <m:t>n</m:t>
+        </m:r>
+        <m:r>
+          <m:rPr>
+            <m:sty m:val="p"/>
+          </m:rPr>
+          <m:t>(</m:t>
+        </m:r>
+        <m:r>
+          <m:t>j</m:t>
+        </m:r>
+        <m:r>
+          <m:rPr>
+            <m:sty m:val="p"/>
+          </m:rPr>
+          <m:t>,</m:t>
+        </m:r>
+        <m:r>
+          <m:t>a</m:t>
+        </m:r>
+        <m:r>
+          <m:rPr>
+            <m:sty m:val="p"/>
+          </m:rPr>
+          <m:t>)</m:t>
+        </m:r>
+      </m:oMath>
+      <w:r>
+        <w:rPr>
+          <w:rFonts w:hint="eastAsia"/>
+        </w:rPr>
+        <w:t xml:space="preserve">。奖励经截断后落在</w:t>
+      </w:r>
+      <w:r>
+        <w:rPr>
+          <w:rFonts w:hint="eastAsia"/>
+        </w:rPr>
+        <w:t xml:space="preserve"> </w:t>
+      </w:r>
+      <m:oMath>
+        <m:r>
+          <m:rPr>
+            <m:sty m:val="p"/>
+          </m:rPr>
+          <m:t>[</m:t>
+        </m:r>
+        <m:r>
+          <m:rPr>
+            <m:sty m:val="p"/>
+          </m:rPr>
+          <m:t>−</m:t>
+        </m:r>
+        <m:sSub>
+          <m:e>
+            <m:r>
+              <m:t>c</m:t>
+            </m:r>
+          </m:e>
+          <m:sub>
+            <m:r>
+              <m:t>0</m:t>
+            </m:r>
+          </m:sub>
+        </m:sSub>
+        <m:r>
+          <m:rPr>
+            <m:sty m:val="p"/>
+          </m:rPr>
+          <m:t>,</m:t>
+        </m:r>
+        <m:r>
+          <m:t>q</m:t>
+        </m:r>
+        <m:r>
+          <m:rPr>
+            <m:sty m:val="p"/>
+          </m:rPr>
+          <m:t>]</m:t>
+        </m:r>
+      </m:oMath>
+      <w:r>
+        <w:rPr>
+          <w:rFonts w:hint="eastAsia"/>
+        </w:rPr>
+        <w:t xml:space="preserve"> </w:t>
+      </w:r>
+      <w:r>
+        <w:rPr>
+          <w:rFonts w:hint="eastAsia"/>
+        </w:rPr>
+        <w:t xml:space="preserve">内，而</w:t>
+      </w:r>
+      <w:r>
+        <w:rPr>
+          <w:rFonts w:hint="eastAsia"/>
+        </w:rPr>
+        <w:t xml:space="preserve"> </w:t>
+      </w:r>
+      <m:oMath>
+        <m:r>
+          <m:t>Q</m:t>
+        </m:r>
+      </m:oMath>
+      <w:r>
+        <w:rPr>
+          <w:rFonts w:hint="eastAsia"/>
+        </w:rPr>
+        <w:t xml:space="preserve"> </w:t>
+      </w:r>
+      <w:r>
+        <w:rPr>
+          <w:rFonts w:hint="eastAsia"/>
+        </w:rPr>
+        <w:t xml:space="preserve">作为历史奖励的均值同样落在该区间内，故分子不超过</w:t>
+      </w:r>
+      <w:r>
+        <w:rPr>
+          <w:rFonts w:hint="eastAsia"/>
+        </w:rPr>
+        <w:t xml:space="preserve"> </w:t>
+      </w:r>
+      <m:oMath>
+        <m:r>
+          <m:t>q</m:t>
+        </m:r>
+        <m:r>
+          <m:rPr>
+            <m:sty m:val="p"/>
+          </m:rPr>
+          <m:t>+</m:t>
+        </m:r>
+        <m:sSub>
+          <m:e>
+            <m:r>
+              <m:t>c</m:t>
+            </m:r>
+          </m:e>
+          <m:sub>
+            <m:r>
+              <m:t>0</m:t>
+            </m:r>
+          </m:sub>
+        </m:sSub>
+      </m:oMath>
+      <w:r>
+        <w:rPr>
+          <w:rFonts w:hint="eastAsia"/>
+        </w:rPr>
+        <w:t xml:space="preserve">，在</w:t>
+      </w:r>
+      <w:r>
+        <w:rPr>
+          <w:rFonts w:hint="eastAsia"/>
+        </w:rPr>
+        <w:t xml:space="preserve"> </w:t>
+      </w:r>
+      <m:oMath>
+        <m:sSub>
+          <m:e>
+            <m:r>
+              <m:t>c</m:t>
+            </m:r>
+          </m:e>
+          <m:sub>
+            <m:r>
+              <m:t>0</m:t>
+            </m:r>
+          </m:sub>
+        </m:sSub>
+        <m:r>
+          <m:rPr>
+            <m:sty m:val="p"/>
+          </m:rPr>
+          <m:t>≪</m:t>
+        </m:r>
+        <m:r>
+          <m:t>q</m:t>
+        </m:r>
+      </m:oMath>
+      <w:r>
+        <w:rPr>
+          <w:rFonts w:hint="eastAsia"/>
+        </w:rPr>
+        <w:t xml:space="preserve"> </w:t>
+      </w:r>
+      <w:r>
+        <w:rPr>
+          <w:rFonts w:hint="eastAsia"/>
+        </w:rPr>
+        <w:t xml:space="preserve">时以</w:t>
+      </w:r>
+      <w:r>
+        <w:rPr>
+          <w:rFonts w:hint="eastAsia"/>
+        </w:rPr>
+        <w:t xml:space="preserve"> </w:t>
+      </w:r>
+      <m:oMath>
+        <m:r>
+          <m:t>2</m:t>
+        </m:r>
+        <m:r>
+          <m:t>q</m:t>
+        </m:r>
+      </m:oMath>
+      <w:r>
+        <w:rPr>
+          <w:rFonts w:hint="eastAsia"/>
+        </w:rPr>
+        <w:t xml:space="preserve"> </w:t>
+      </w:r>
+      <w:r>
+        <w:rPr>
+          <w:rFonts w:hint="eastAsia"/>
+        </w:rPr>
+        <w:t xml:space="preserve">为界。分母不小于该期间的最小访问计数</w:t>
+      </w:r>
+      <w:r>
+        <w:rPr>
+          <w:rFonts w:hint="eastAsia"/>
+        </w:rPr>
+        <w:t xml:space="preserve"> </w:t>
+      </w:r>
+      <m:oMath>
+        <m:sSub>
+          <m:e>
+            <m:r>
+              <m:t>n</m:t>
+            </m:r>
+          </m:e>
+          <m:sub>
+            <m:r>
+              <m:rPr>
+                <m:nor/>
+                <m:sty m:val="p"/>
+              </m:rPr>
+              <m:t>min</m:t>
+            </m:r>
+          </m:sub>
+        </m:sSub>
+      </m:oMath>
+      <w:r>
+        <w:rPr>
+          <w:rFonts w:hint="eastAsia"/>
+        </w:rPr>
+        <w:t xml:space="preserve"> </w:t>
+      </w:r>
+      <w:r>
+        <w:rPr>
+          <w:rFonts w:hint="eastAsia"/>
+        </w:rPr>
+        <w:t xml:space="preserve">且随更新单调不减，因此单次更新的改变量不超过</w:t>
+      </w:r>
+      <w:r>
+        <w:rPr>
+          <w:rFonts w:hint="eastAsia"/>
+        </w:rPr>
+        <w:t xml:space="preserve"> </w:t>
+      </w:r>
+      <m:oMath>
+        <m:r>
+          <m:t>2</m:t>
+        </m:r>
+        <m:r>
+          <m:t>q</m:t>
+        </m:r>
+        <m:r>
+          <m:rPr>
+            <m:sty m:val="p"/>
+          </m:rPr>
+          <m:t>/</m:t>
+        </m:r>
+        <m:sSub>
+          <m:e>
+            <m:r>
+              <m:t>n</m:t>
+            </m:r>
+          </m:e>
+          <m:sub>
+            <m:r>
+              <m:rPr>
+                <m:nor/>
+                <m:sty m:val="p"/>
+              </m:rPr>
+              <m:t>min</m:t>
+            </m:r>
+          </m:sub>
+        </m:sSub>
+      </m:oMath>
+      <w:r>
+        <w:rPr>
+          <w:rFonts w:hint="eastAsia"/>
+        </w:rPr>
+        <w:t xml:space="preserve">。两次标定之间共发生</w:t>
+      </w:r>
+      <w:r>
+        <w:rPr>
+          <w:rFonts w:hint="eastAsia"/>
+        </w:rPr>
+        <w:t xml:space="preserve"> </w:t>
       </w:r>
       <m:oMath>
         <m:sSub>
@@ -11474,15 +12526,117 @@
         <w:rPr>
           <w:rFonts w:hint="eastAsia"/>
         </w:rPr>
-        <w:t xml:space="preserve">次更新的累积改变不超过其</w:t>
-      </w:r>
-      <w:r>
-        <w:rPr>
-          <w:rFonts w:hint="eastAsia"/>
-        </w:rPr>
-        <w:t xml:space="preserve"> </w:t>
-      </w:r>
-      <m:oMath>
+        <w:t xml:space="preserve">次更新，由三角不等式，任一格子的累积改变量满足</w:t>
+      </w:r>
+      <w:r>
+        <w:rPr>
+          <w:rFonts w:hint="eastAsia"/>
+        </w:rPr>
+        <w:t xml:space="preserve"> </w:t>
+      </w:r>
+      <m:oMath>
+        <m:r>
+          <m:rPr>
+            <m:sty m:val="p"/>
+          </m:rPr>
+          <m:t>|</m:t>
+        </m:r>
+        <m:sSub>
+          <m:e>
+            <m:r>
+              <m:t>Q</m:t>
+            </m:r>
+          </m:e>
+          <m:sub>
+            <m:r>
+              <m:t>t</m:t>
+            </m:r>
+          </m:sub>
+        </m:sSub>
+        <m:r>
+          <m:rPr>
+            <m:sty m:val="p"/>
+          </m:rPr>
+          <m:t>(</m:t>
+        </m:r>
+        <m:r>
+          <m:t>j</m:t>
+        </m:r>
+        <m:r>
+          <m:rPr>
+            <m:sty m:val="p"/>
+          </m:rPr>
+          <m:t>,</m:t>
+        </m:r>
+        <m:r>
+          <m:t>a</m:t>
+        </m:r>
+        <m:r>
+          <m:rPr>
+            <m:sty m:val="p"/>
+          </m:rPr>
+          <m:t>)</m:t>
+        </m:r>
+        <m:r>
+          <m:rPr>
+            <m:sty m:val="p"/>
+          </m:rPr>
+          <m:t>−</m:t>
+        </m:r>
+        <m:sSub>
+          <m:e>
+            <m:r>
+              <m:t>Q</m:t>
+            </m:r>
+          </m:e>
+          <m:sub>
+            <m:r>
+              <m:t>0</m:t>
+            </m:r>
+          </m:sub>
+        </m:sSub>
+        <m:r>
+          <m:rPr>
+            <m:sty m:val="p"/>
+          </m:rPr>
+          <m:t>(</m:t>
+        </m:r>
+        <m:r>
+          <m:t>j</m:t>
+        </m:r>
+        <m:r>
+          <m:rPr>
+            <m:sty m:val="p"/>
+          </m:rPr>
+          <m:t>,</m:t>
+        </m:r>
+        <m:r>
+          <m:t>a</m:t>
+        </m:r>
+        <m:r>
+          <m:rPr>
+            <m:sty m:val="p"/>
+          </m:rPr>
+          <m:t>)</m:t>
+        </m:r>
+        <m:r>
+          <m:rPr>
+            <m:sty m:val="p"/>
+          </m:rPr>
+          <m:t>|</m:t>
+        </m:r>
+        <m:r>
+          <m:rPr>
+            <m:sty m:val="p"/>
+          </m:rPr>
+          <m:t>≤</m:t>
+        </m:r>
+        <m:r>
+          <m:t>2</m:t>
+        </m:r>
+        <m:r>
+          <m:t>q</m:t>
+        </m:r>
         <m:sSub>
           <m:e>
             <m:r>
@@ -11510,18 +12664,205 @@
             </m:r>
           </m:sub>
         </m:sSub>
-      </m:oMath>
-      <w:r>
-        <w:rPr>
-          <w:rFonts w:hint="eastAsia"/>
-        </w:rPr>
-        <w:t xml:space="preserve"> </w:t>
-      </w:r>
-      <w:r>
-        <w:rPr>
-          <w:rFonts w:hint="eastAsia"/>
-        </w:rPr>
-        <w:t xml:space="preserve">倍。第三步把价值变化换算为分布变化，上置信界是确定性策略，动作分布只在两个动作的置信上界发生交叉时才改变，而间隔条件保证价值改变量小于</w:t>
+        <m:r>
+          <m:rPr>
+            <m:sty m:val="p"/>
+          </m:rPr>
+          <m:t>/</m:t>
+        </m:r>
+        <m:sSub>
+          <m:e>
+            <m:r>
+              <m:t>n</m:t>
+            </m:r>
+          </m:e>
+          <m:sub>
+            <m:r>
+              <m:rPr>
+                <m:nor/>
+                <m:sty m:val="p"/>
+              </m:rPr>
+              <m:t>min</m:t>
+            </m:r>
+          </m:sub>
+        </m:sSub>
+        <m:r>
+          <m:rPr>
+            <m:sty m:val="p"/>
+          </m:rPr>
+          <m:t>≜</m:t>
+        </m:r>
+        <m:sSub>
+          <m:e>
+            <m:r>
+              <m:t>Δ</m:t>
+            </m:r>
+          </m:e>
+          <m:sub>
+            <m:r>
+              <m:t>Q</m:t>
+            </m:r>
+          </m:sub>
+        </m:sSub>
+      </m:oMath>
+      <w:r>
+        <w:rPr>
+          <w:rFonts w:hint="eastAsia"/>
+        </w:rPr>
+        <w:t xml:space="preserve">。</w:t>
+      </w:r>
+    </w:p>
+    <w:p>
+      <w:pPr>
+        <w:ind w:firstLineChars="200" w:firstLine="420"/>
+      </w:pPr>
+      <w:r>
+        <w:rPr>
+          <w:rFonts w:hint="eastAsia"/>
+        </w:rPr>
+        <w:t xml:space="preserve">第二步把价值变化换算为动作分布的变化。上置信界策略是确定性的，给定状态</w:t>
+      </w:r>
+      <w:r>
+        <w:rPr>
+          <w:rFonts w:hint="eastAsia"/>
+        </w:rPr>
+        <w:t xml:space="preserve"> </w:t>
+      </w:r>
+      <m:oMath>
+        <m:r>
+          <m:t>s</m:t>
+        </m:r>
+      </m:oMath>
+      <w:r>
+        <w:rPr>
+          <w:rFonts w:hint="eastAsia"/>
+        </w:rPr>
+        <w:t xml:space="preserve"> </w:t>
+      </w:r>
+      <w:r>
+        <w:rPr>
+          <w:rFonts w:hint="eastAsia"/>
+        </w:rPr>
+        <w:t xml:space="preserve">其选出的动作为使</w:t>
+      </w:r>
+      <w:r>
+        <w:rPr>
+          <w:rFonts w:hint="eastAsia"/>
+        </w:rPr>
+        <w:t xml:space="preserve"> </w:t>
+      </w:r>
+      <m:oMath>
+        <m:r>
+          <m:t>Q</m:t>
+        </m:r>
+        <m:r>
+          <m:rPr>
+            <m:sty m:val="p"/>
+          </m:rPr>
+          <m:t>(</m:t>
+        </m:r>
+        <m:r>
+          <m:t>j</m:t>
+        </m:r>
+        <m:r>
+          <m:rPr>
+            <m:sty m:val="p"/>
+          </m:rPr>
+          <m:t>,</m:t>
+        </m:r>
+        <m:r>
+          <m:t>a</m:t>
+        </m:r>
+        <m:r>
+          <m:rPr>
+            <m:sty m:val="p"/>
+          </m:rPr>
+          <m:t>)</m:t>
+        </m:r>
+        <m:r>
+          <m:rPr>
+            <m:sty m:val="p"/>
+          </m:rPr>
+          <m:t>+</m:t>
+        </m:r>
+        <m:sSub>
+          <m:e>
+            <m:r>
+              <m:t>c</m:t>
+            </m:r>
+          </m:e>
+          <m:sub>
+            <m:r>
+              <m:t>u</m:t>
+            </m:r>
+          </m:sub>
+        </m:sSub>
+        <m:rad>
+          <m:radPr>
+            <m:degHide m:val="1"/>
+          </m:radPr>
+          <m:deg/>
+          <m:e>
+            <m:r>
+              <m:t>2</m:t>
+            </m:r>
+            <m:r>
+              <m:rPr>
+                <m:nor/>
+                <m:sty m:val="p"/>
+              </m:rPr>
+              <m:t>ln</m:t>
+            </m:r>
+            <m:r>
+              <m:t>t</m:t>
+            </m:r>
+            <m:r>
+              <m:rPr>
+                <m:sty m:val="p"/>
+              </m:rPr>
+              <m:t>/</m:t>
+            </m:r>
+            <m:r>
+              <m:t>n</m:t>
+            </m:r>
+            <m:r>
+              <m:rPr>
+                <m:sty m:val="p"/>
+              </m:rPr>
+              <m:t>(</m:t>
+            </m:r>
+            <m:r>
+              <m:t>j</m:t>
+            </m:r>
+            <m:r>
+              <m:rPr>
+                <m:sty m:val="p"/>
+              </m:rPr>
+              <m:t>,</m:t>
+            </m:r>
+            <m:r>
+              <m:t>a</m:t>
+            </m:r>
+            <m:r>
+              <m:rPr>
+                <m:sty m:val="p"/>
+              </m:rPr>
+              <m:t>)</m:t>
+            </m:r>
+          </m:e>
+        </m:rad>
+      </m:oMath>
+      <w:r>
+        <w:rPr>
+          <w:rFonts w:hint="eastAsia"/>
+        </w:rPr>
+        <w:t xml:space="preserve"> </w:t>
+      </w:r>
+      <w:r>
+        <w:rPr>
+          <w:rFonts w:hint="eastAsia"/>
+        </w:rPr>
+        <w:t xml:space="preserve">取最大的那一个。记该状态下最优动作与次优动作的上置信界之差为</w:t>
       </w:r>
       <w:r>
         <w:rPr>
@@ -11533,37 +12874,345 @@
         <m:r>
           <m:t>γ</m:t>
         </m:r>
-      </m:oMath>
-      <w:r>
-        <w:rPr>
-          <w:rFonts w:hint="eastAsia"/>
-        </w:rPr>
-        <w:t xml:space="preserve"> </w:t>
-      </w:r>
-      <w:r>
-        <w:rPr>
-          <w:rFonts w:hint="eastAsia"/>
-        </w:rPr>
-        <w:t xml:space="preserve">时排序不会翻转，由此得到第二个不等式。</w:t>
-      </w:r>
-    </w:p>
-    <w:p>
-      <w:pPr>
-        <w:ind w:firstLineChars="200" w:firstLine="420"/>
-      </w:pPr>
-      <w:r>
-        <w:rPr>
-          <w:rFonts w:hint="eastAsia"/>
-        </w:rPr>
-        <w:t>定理 5 说明保证的退化与标定间隔成正比、与已积累的访问次数成反比。学习早期访问次数少，同样的间隔带来的退化更大，因此早期应当标定得更密，随着访问次数积累，同样的间隔所对应的退化自动收窄。这为</w:t>
-      </w:r>
-      <w:r>
-        <w:rPr>
-          <w:rFonts w:hint="eastAsia"/>
-        </w:rPr>
-        <w:t xml:space="preserve"> </w:t>
-      </w:r>
-      <m:oMath>
+        <m:r>
+          <m:rPr>
+            <m:sty m:val="p"/>
+          </m:rPr>
+          <m:t>(</m:t>
+        </m:r>
+        <m:r>
+          <m:t>s</m:t>
+        </m:r>
+        <m:r>
+          <m:rPr>
+            <m:sty m:val="p"/>
+          </m:rPr>
+          <m:t>)</m:t>
+        </m:r>
+      </m:oMath>
+      <w:r>
+        <w:rPr>
+          <w:rFonts w:hint="eastAsia"/>
+        </w:rPr>
+        <w:t xml:space="preserve">，并设</w:t>
+      </w:r>
+      <w:r>
+        <w:rPr>
+          <w:rFonts w:hint="eastAsia"/>
+        </w:rPr>
+        <w:t xml:space="preserve"> </w:t>
+      </w:r>
+      <m:oMath>
+        <m:r>
+          <m:t>γ</m:t>
+        </m:r>
+        <m:r>
+          <m:rPr>
+            <m:sty m:val="p"/>
+          </m:rPr>
+          <m:t>=</m:t>
+        </m:r>
+        <m:sSub>
+          <m:e>
+            <m:r>
+              <m:rPr>
+                <m:nor/>
+                <m:sty m:val="p"/>
+              </m:rPr>
+              <m:t>inf</m:t>
+            </m:r>
+          </m:e>
+          <m:sub>
+            <m:r>
+              <m:t>s</m:t>
+            </m:r>
+          </m:sub>
+        </m:sSub>
+        <m:r>
+          <m:t>γ</m:t>
+        </m:r>
+        <m:r>
+          <m:rPr>
+            <m:sty m:val="p"/>
+          </m:rPr>
+          <m:t>(</m:t>
+        </m:r>
+        <m:r>
+          <m:t>s</m:t>
+        </m:r>
+        <m:r>
+          <m:rPr>
+            <m:sty m:val="p"/>
+          </m:rPr>
+          <m:t>)</m:t>
+        </m:r>
+        <m:r>
+          <m:rPr>
+            <m:sty m:val="p"/>
+          </m:rPr>
+          <m:t>&gt;</m:t>
+        </m:r>
+        <m:r>
+          <m:t>0</m:t>
+        </m:r>
+      </m:oMath>
+      <w:r>
+        <w:rPr>
+          <w:rFonts w:hint="eastAsia"/>
+        </w:rPr>
+        <w:t xml:space="preserve">。若某状态上所有格子的价值改变量都严格小于</w:t>
+      </w:r>
+      <w:r>
+        <w:rPr>
+          <w:rFonts w:hint="eastAsia"/>
+        </w:rPr>
+        <w:t xml:space="preserve"> </w:t>
+      </w:r>
+      <m:oMath>
+        <m:r>
+          <m:t>γ</m:t>
+        </m:r>
+        <m:r>
+          <m:rPr>
+            <m:sty m:val="p"/>
+          </m:rPr>
+          <m:t>/</m:t>
+        </m:r>
+        <m:r>
+          <m:t>2</m:t>
+        </m:r>
+      </m:oMath>
+      <w:r>
+        <w:rPr>
+          <w:rFonts w:hint="eastAsia"/>
+        </w:rPr>
+        <w:t xml:space="preserve">，则最优动作的上置信界至多下降</w:t>
+      </w:r>
+      <w:r>
+        <w:rPr>
+          <w:rFonts w:hint="eastAsia"/>
+        </w:rPr>
+        <w:t xml:space="preserve"> </w:t>
+      </w:r>
+      <m:oMath>
+        <m:r>
+          <m:t>γ</m:t>
+        </m:r>
+        <m:r>
+          <m:rPr>
+            <m:sty m:val="p"/>
+          </m:rPr>
+          <m:t>/</m:t>
+        </m:r>
+        <m:r>
+          <m:t>2</m:t>
+        </m:r>
+      </m:oMath>
+      <w:r>
+        <w:rPr>
+          <w:rFonts w:hint="eastAsia"/>
+        </w:rPr>
+        <w:t xml:space="preserve">，次优动作至多上升</w:t>
+      </w:r>
+      <w:r>
+        <w:rPr>
+          <w:rFonts w:hint="eastAsia"/>
+        </w:rPr>
+        <w:t xml:space="preserve"> </w:t>
+      </w:r>
+      <m:oMath>
+        <m:r>
+          <m:t>γ</m:t>
+        </m:r>
+        <m:r>
+          <m:rPr>
+            <m:sty m:val="p"/>
+          </m:rPr>
+          <m:t>/</m:t>
+        </m:r>
+        <m:r>
+          <m:t>2</m:t>
+        </m:r>
+      </m:oMath>
+      <w:r>
+        <w:rPr>
+          <w:rFonts w:hint="eastAsia"/>
+        </w:rPr>
+        <w:t xml:space="preserve">，两者之差仍为正，排序不发生翻转，该状态上的动作选择保持不变。因此动作分布发生改变的状态只能落在</w:t>
+      </w:r>
+      <w:r>
+        <w:rPr>
+          <w:rFonts w:hint="eastAsia"/>
+        </w:rPr>
+        <w:t xml:space="preserve"> </w:t>
+      </w:r>
+      <m:oMath>
+        <m:sSub>
+          <m:e>
+            <m:r>
+              <m:t>Δ</m:t>
+            </m:r>
+          </m:e>
+          <m:sub>
+            <m:r>
+              <m:t>Q</m:t>
+            </m:r>
+          </m:sub>
+        </m:sSub>
+        <m:r>
+          <m:rPr>
+            <m:sty m:val="p"/>
+          </m:rPr>
+          <m:t>≥</m:t>
+        </m:r>
+        <m:r>
+          <m:t>γ</m:t>
+        </m:r>
+        <m:r>
+          <m:rPr>
+            <m:sty m:val="p"/>
+          </m:rPr>
+          <m:t>/</m:t>
+        </m:r>
+        <m:r>
+          <m:t>2</m:t>
+        </m:r>
+      </m:oMath>
+      <w:r>
+        <w:rPr>
+          <w:rFonts w:hint="eastAsia"/>
+        </w:rPr>
+        <w:t xml:space="preserve"> </w:t>
+      </w:r>
+      <w:r>
+        <w:rPr>
+          <w:rFonts w:hint="eastAsia"/>
+        </w:rPr>
+        <w:t xml:space="preserve">的情形中，由此这类状态所占的概率质量不超过</w:t>
+      </w:r>
+      <w:r>
+        <w:rPr>
+          <w:rFonts w:hint="eastAsia"/>
+        </w:rPr>
+        <w:t xml:space="preserve"> </w:t>
+      </w:r>
+      <m:oMath>
+        <m:r>
+          <m:t>2</m:t>
+        </m:r>
+        <m:sSub>
+          <m:e>
+            <m:r>
+              <m:t>Δ</m:t>
+            </m:r>
+          </m:e>
+          <m:sub>
+            <m:r>
+              <m:t>Q</m:t>
+            </m:r>
+          </m:sub>
+        </m:sSub>
+        <m:r>
+          <m:rPr>
+            <m:sty m:val="p"/>
+          </m:rPr>
+          <m:t>/</m:t>
+        </m:r>
+        <m:r>
+          <m:t>γ</m:t>
+        </m:r>
+      </m:oMath>
+      <w:r>
+        <w:rPr>
+          <w:rFonts w:hint="eastAsia"/>
+        </w:rPr>
+        <w:t xml:space="preserve">。确定性策略下两个分布的总变差距离等于动作选择发生改变的状态的概率质量，故</w:t>
+      </w:r>
+      <w:r>
+        <w:rPr>
+          <w:rFonts w:hint="eastAsia"/>
+        </w:rPr>
+        <w:t xml:space="preserve"> </w:t>
+      </w:r>
+      <m:oMath>
+        <m:r>
+          <m:rPr>
+            <m:sty m:val="p"/>
+          </m:rPr>
+          <m:t>T</m:t>
+        </m:r>
+        <m:r>
+          <m:rPr>
+            <m:sty m:val="p"/>
+          </m:rPr>
+          <m:t>V</m:t>
+        </m:r>
+        <m:r>
+          <m:rPr>
+            <m:sty m:val="p"/>
+          </m:rPr>
+          <m:t>(</m:t>
+        </m:r>
+        <m:r>
+          <m:t>P</m:t>
+        </m:r>
+        <m:r>
+          <m:rPr>
+            <m:sty m:val="p"/>
+          </m:rPr>
+          <m:t>,</m:t>
+        </m:r>
+        <m:r>
+          <m:t>Q</m:t>
+        </m:r>
+        <m:r>
+          <m:rPr>
+            <m:sty m:val="p"/>
+          </m:rPr>
+          <m:t>)</m:t>
+        </m:r>
+        <m:r>
+          <m:rPr>
+            <m:sty m:val="p"/>
+          </m:rPr>
+          <m:t>≤</m:t>
+        </m:r>
+        <m:r>
+          <m:t>2</m:t>
+        </m:r>
+        <m:sSub>
+          <m:e>
+            <m:r>
+              <m:t>Δ</m:t>
+            </m:r>
+          </m:e>
+          <m:sub>
+            <m:r>
+              <m:t>Q</m:t>
+            </m:r>
+          </m:sub>
+        </m:sSub>
+        <m:r>
+          <m:rPr>
+            <m:sty m:val="p"/>
+          </m:rPr>
+          <m:t>/</m:t>
+        </m:r>
+        <m:r>
+          <m:t>γ</m:t>
+        </m:r>
+        <m:r>
+          <m:rPr>
+            <m:sty m:val="p"/>
+          </m:rPr>
+          <m:t>=</m:t>
+        </m:r>
+        <m:r>
+          <m:t>4</m:t>
+        </m:r>
+        <m:r>
+          <m:t>q</m:t>
+        </m:r>
         <m:sSub>
           <m:e>
             <m:r>
@@ -11591,47 +13240,132 @@
             </m:r>
           </m:sub>
         </m:sSub>
-      </m:oMath>
-      <w:r>
-        <w:rPr>
-          <w:rFonts w:hint="eastAsia"/>
-        </w:rPr>
-        <w:t xml:space="preserve"> </w:t>
-      </w:r>
-      <w:r>
-        <w:rPr>
-          <w:rFonts w:hint="eastAsia"/>
-        </w:rPr>
-        <w:t xml:space="preserve">的选取提供了依据，此前只有策略变化快时应当缩短这一定性说法。需要指明该结论依赖间隔条件</w:t>
-      </w:r>
-      <w:r>
-        <w:rPr>
-          <w:rFonts w:hint="eastAsia"/>
-        </w:rPr>
-        <w:t xml:space="preserve"> </w:t>
-      </w:r>
-      <m:oMath>
+        <m:r>
+          <m:rPr>
+            <m:sty m:val="p"/>
+          </m:rPr>
+          <m:t>/</m:t>
+        </m:r>
+        <m:r>
+          <m:rPr>
+            <m:sty m:val="p"/>
+          </m:rPr>
+          <m:t>(</m:t>
+        </m:r>
         <m:r>
           <m:t>γ</m:t>
         </m:r>
-      </m:oMath>
-      <w:r>
-        <w:rPr>
-          <w:rFonts w:hint="eastAsia"/>
-        </w:rPr>
-        <w:t xml:space="preserve"> </w:t>
-      </w:r>
-      <w:r>
-        <w:rPr>
-          <w:rFonts w:hint="eastAsia"/>
-        </w:rPr>
-        <w:t xml:space="preserve">为正。上置信界是确定性策略，排序一旦翻转动作分布就跳变，若某个状态下两个动作的置信上界任意接近，则</w:t>
-      </w:r>
-      <w:r>
-        <w:rPr>
-          <w:rFonts w:hint="eastAsia"/>
-        </w:rPr>
-        <w:t xml:space="preserve"> </w:t>
+        <m:sSub>
+          <m:e>
+            <m:r>
+              <m:t>n</m:t>
+            </m:r>
+          </m:e>
+          <m:sub>
+            <m:r>
+              <m:rPr>
+                <m:nor/>
+                <m:sty m:val="p"/>
+              </m:rPr>
+              <m:t>min</m:t>
+            </m:r>
+          </m:sub>
+        </m:sSub>
+        <m:r>
+          <m:rPr>
+            <m:sty m:val="p"/>
+          </m:rPr>
+          <m:t>)</m:t>
+        </m:r>
+      </m:oMath>
+      <w:r>
+        <w:rPr>
+          <w:rFonts w:hint="eastAsia"/>
+        </w:rPr>
+        <w:t xml:space="preserve">。将常数因子并入</w:t>
+      </w:r>
+      <w:r>
+        <w:rPr>
+          <w:rFonts w:hint="eastAsia"/>
+        </w:rPr>
+        <w:t xml:space="preserve"> </w:t>
+      </w:r>
+      <m:oMath>
+        <m:r>
+          <m:t>q</m:t>
+        </m:r>
+      </m:oMath>
+      <w:r>
+        <w:rPr>
+          <w:rFonts w:hint="eastAsia"/>
+        </w:rPr>
+        <w:t xml:space="preserve"> </w:t>
+      </w:r>
+      <w:r>
+        <w:rPr>
+          <w:rFonts w:hint="eastAsia"/>
+        </w:rPr>
+        <w:t xml:space="preserve">的定义即得所述形式。证毕。</w:t>
+      </w:r>
+    </w:p>
+    <w:p>
+      <w:pPr>
+        <w:ind w:firstLineChars="200" w:firstLine="420"/>
+      </w:pPr>
+      <w:r>
+        <w:rPr>
+          <w:rFonts w:hint="eastAsia"/>
+        </w:rPr>
+        <w:t>定理 6 说明保证的退化与标定间隔成正比、与已积累的访问次数成反比。学习早期访问次数少，同样的间隔带来的退化更大，因此早期应当标定得更密，随着访问次数积累，同样的间隔所对应的退化自动收窄。这为  的选取提供了依据，此前只有策略变化快时应当缩短这一定性说法。需要指明该结论依赖间隔条件  为正。上置信界是确定性策略，排序一旦翻转动作分布就跳变，若某个状态下两个动作的置信上界任意接近，则  趋于零而上界失效。该条件在实测中是否成立需要检验，检验方式是统计各状态下  的经验分布，若其下尾接近零则结论应改用期望形式而不是最坏情况形式。这一检验尚未进行。</w:t>
+      </w:r>
+      <w:r>
+        <w:rPr>
+          <w:rFonts w:hint="eastAsia"/>
+        </w:rPr>
+      </w:r>
+      <m:oMath>
+        <m:sSub>
+          <m:e>
+            <m:r>
+              <m:t>T</m:t>
+            </m:r>
+          </m:e>
+          <m:sub>
+            <m:r>
+              <m:rPr>
+                <m:sty m:val="p"/>
+              </m:rPr>
+              <m:t>c</m:t>
+            </m:r>
+            <m:r>
+              <m:rPr>
+                <m:sty m:val="p"/>
+              </m:rPr>
+              <m:t>a</m:t>
+            </m:r>
+            <m:r>
+              <m:rPr>
+                <m:sty m:val="p"/>
+              </m:rPr>
+              <m:t>l</m:t>
+            </m:r>
+          </m:sub>
+        </m:sSub>
+      </m:oMath>
+      <w:r>
+        <w:rPr>
+          <w:rFonts w:hint="eastAsia"/>
+        </w:rPr>
+      </w:r>
+      <w:r>
+        <w:rPr>
+          <w:rFonts w:hint="eastAsia"/>
+        </w:rPr>
+      </w:r>
+      <w:r>
+        <w:rPr>
+          <w:rFonts w:hint="eastAsia"/>
+        </w:rPr>
       </w:r>
       <m:oMath>
         <m:r>
@@ -11642,19 +13376,16 @@
         <w:rPr>
           <w:rFonts w:hint="eastAsia"/>
         </w:rPr>
-        <w:t xml:space="preserve"> </w:t>
-      </w:r>
-      <w:r>
-        <w:rPr>
-          <w:rFonts w:hint="eastAsia"/>
-        </w:rPr>
-        <w:t xml:space="preserve">趋于零而上界失效。该条件在实测中是否成立需要检验，检验方式是统计各状态下</w:t>
-      </w:r>
-      <w:r>
-        <w:rPr>
-          <w:rFonts w:hint="eastAsia"/>
-        </w:rPr>
-        <w:t xml:space="preserve"> </w:t>
+      </w:r>
+      <w:r>
+        <w:rPr>
+          <w:rFonts w:hint="eastAsia"/>
+        </w:rPr>
+      </w:r>
+      <w:r>
+        <w:rPr>
+          <w:rFonts w:hint="eastAsia"/>
+        </w:rPr>
       </w:r>
       <m:oMath>
         <m:r>
@@ -11665,13 +13396,31 @@
         <w:rPr>
           <w:rFonts w:hint="eastAsia"/>
         </w:rPr>
-        <w:t xml:space="preserve"> </w:t>
-      </w:r>
-      <w:r>
-        <w:rPr>
-          <w:rFonts w:hint="eastAsia"/>
-        </w:rPr>
-        <w:t xml:space="preserve">的经验分布，若其下尾接近零则结论应改用期望形式而不是最坏情况形式。这一检验尚未进行。</w:t>
+      </w:r>
+      <w:r>
+        <w:rPr>
+          <w:rFonts w:hint="eastAsia"/>
+        </w:rPr>
+      </w:r>
+      <w:r>
+        <w:rPr>
+          <w:rFonts w:hint="eastAsia"/>
+        </w:rPr>
+      </w:r>
+      <m:oMath>
+        <m:r>
+          <m:t>γ</m:t>
+        </m:r>
+      </m:oMath>
+      <w:r>
+        <w:rPr>
+          <w:rFonts w:hint="eastAsia"/>
+        </w:rPr>
+      </w:r>
+      <w:r>
+        <w:rPr>
+          <w:rFonts w:hint="eastAsia"/>
+        </w:rPr>
       </w:r>
     </w:p>
     <w:p>
@@ -11682,7 +13431,7 @@
         <w:rPr>
           <w:rFonts w:hint="eastAsia"/>
         </w:rPr>
-        <w:t xml:space="preserve">另有一点边界与可交换性无关。阈值网格中最保守的取值仍然对应一个正的经验风险，低于这个下界的目标水平在当前动作空间下无解，此时标定过程返回最保守的阈值，这一行为符合定义。定理 3 给出的结构上界在两次标定之间始终成立，因此标定间隔只影响损害率保证的紧致程度，不影响结构安全性。</w:t>
+        <w:t>另有一点边界与可交换性无关。阈值网格中最保守的取值仍然对应一个正的经验风险，低于这个下界的目标水平在当前动作空间下无解，此时标定过程返回最保守的阈值，这一行为符合定义。定理 4 给出的结构上界在两次标定之间始终成立，因此标定间隔只影响损害率保证的紧致程度，不影响结构安全性。</w:t>
       </w:r>
     </w:p>
     <w:p>
@@ -12111,13 +13860,12 @@
         <w:rPr>
           <w:rFonts w:hint="eastAsia"/>
         </w:rPr>
-        <w:t xml:space="preserve">其中</w:t>
-      </w:r>
-      <w:r>
-        <w:rPr>
-          <w:rFonts w:hint="eastAsia"/>
-        </w:rPr>
-        <w:t xml:space="preserve"> </w:t>
+        <w:t>其中  是屏蔽后的可行动作集，由定理 3 保证非空， 为全局决策计数， 控制探索强度。收到 CDS 的奖励  后按增量式更新</w:t>
+      </w:r>
+      <w:r>
+        <w:rPr>
+          <w:rFonts w:hint="eastAsia"/>
+        </w:rPr>
       </w:r>
       <m:oMath>
         <m:sSub>
@@ -12189,13 +13937,11 @@
         <w:rPr>
           <w:rFonts w:hint="eastAsia"/>
         </w:rPr>
-        <w:t xml:space="preserve"> </w:t>
-      </w:r>
-      <w:r>
-        <w:rPr>
-          <w:rFonts w:hint="eastAsia"/>
-        </w:rPr>
-        <w:t xml:space="preserve">是屏蔽后的可行动作集，由定理 2 保证非空，</w:t>
+      </w:r>
+      <w:r>
+        <w:rPr>
+          <w:rFonts w:hint="eastAsia"/>
+        </w:rPr>
       </w:r>
       <m:oMath>
         <m:r>
@@ -12206,13 +13952,11 @@
         <w:rPr>
           <w:rFonts w:hint="eastAsia"/>
         </w:rPr>
-        <w:t xml:space="preserve"> </w:t>
-      </w:r>
-      <w:r>
-        <w:rPr>
-          <w:rFonts w:hint="eastAsia"/>
-        </w:rPr>
-        <w:t xml:space="preserve">为全局决策计数，</w:t>
+      </w:r>
+      <w:r>
+        <w:rPr>
+          <w:rFonts w:hint="eastAsia"/>
+        </w:rPr>
       </w:r>
       <m:oMath>
         <m:sSub>
@@ -12232,19 +13976,16 @@
         <w:rPr>
           <w:rFonts w:hint="eastAsia"/>
         </w:rPr>
-        <w:t xml:space="preserve"> </w:t>
-      </w:r>
-      <w:r>
-        <w:rPr>
-          <w:rFonts w:hint="eastAsia"/>
-        </w:rPr>
-        <w:t xml:space="preserve">控制探索强度。收到 CDS 的奖励</w:t>
-      </w:r>
-      <w:r>
-        <w:rPr>
-          <w:rFonts w:hint="eastAsia"/>
-        </w:rPr>
-        <w:t xml:space="preserve"> </w:t>
+      </w:r>
+      <w:r>
+        <w:rPr>
+          <w:rFonts w:hint="eastAsia"/>
+        </w:rPr>
+      </w:r>
+      <w:r>
+        <w:rPr>
+          <w:rFonts w:hint="eastAsia"/>
+        </w:rPr>
       </w:r>
       <m:oMath>
         <m:r>
@@ -12255,13 +13996,11 @@
         <w:rPr>
           <w:rFonts w:hint="eastAsia"/>
         </w:rPr>
-        <w:t xml:space="preserve"> </w:t>
-      </w:r>
-      <w:r>
-        <w:rPr>
-          <w:rFonts w:hint="eastAsia"/>
-        </w:rPr>
-        <w:t xml:space="preserve">后按增量式更新</w:t>
+      </w:r>
+      <w:r>
+        <w:rPr>
+          <w:rFonts w:hint="eastAsia"/>
+        </w:rPr>
       </w:r>
     </w:p>
     <w:p>
@@ -12715,13 +14454,12 @@
         <w:rPr>
           <w:rFonts w:hint="eastAsia"/>
         </w:rPr>
-        <w:t>接受奖励需要设上界。定理 6 的遗憾界要求奖励有界或次高斯，而实测的效用变化两者皆非，其分布呈长尾，少数窗口的读数比中位数高出两个数量级，远超上置信界在同等规模下的探索宽度。若不设上界，持有极端值的格子将被永久选中而探索停止，这破坏的是定理的前提。因此接受奖励按训练划分上的分位数</w:t>
-      </w:r>
-      <w:r>
-        <w:rPr>
-          <w:rFonts w:hint="eastAsia"/>
-        </w:rPr>
-        <w:t xml:space="preserve"> </w:t>
+        <w:t>接受奖励需要设上界。定理 7 的遗憾界要求奖励有界或次高斯，而实测的效用变化两者皆非，其分布呈长尾，少数窗口的读数比中位数高出两个数量级，远超上置信界在同等规模下的探索宽度。若不设上界，持有极端值的格子将被永久选中而探索停止，这破坏的是定理的前提。因此接受奖励按训练划分上的分位数  做单侧截断，即 ，评测划分不参与该数值的确定。撤销奖励本身已由代价系数限定，不需要截断。分位数取值经过敏感性检验，取值不宜低于 95 分位，更低的取值会压到奖励分布的主体，改变相当一部分窗口的动作选择。</w:t>
+      </w:r>
+      <w:r>
+        <w:rPr>
+          <w:rFonts w:hint="eastAsia"/>
+        </w:rPr>
       </w:r>
       <m:oMath>
         <m:r>
@@ -12732,19 +14470,16 @@
         <w:rPr>
           <w:rFonts w:hint="eastAsia"/>
         </w:rPr>
-        <w:t xml:space="preserve"> </w:t>
-      </w:r>
-      <w:r>
-        <w:rPr>
-          <w:rFonts w:hint="eastAsia"/>
-        </w:rPr>
-        <w:t xml:space="preserve">做单侧截断，即</w:t>
-      </w:r>
-      <w:r>
-        <w:rPr>
-          <w:rFonts w:hint="eastAsia"/>
-        </w:rPr>
-        <w:t xml:space="preserve"> </w:t>
+      </w:r>
+      <w:r>
+        <w:rPr>
+          <w:rFonts w:hint="eastAsia"/>
+        </w:rPr>
+      </w:r>
+      <w:r>
+        <w:rPr>
+          <w:rFonts w:hint="eastAsia"/>
+        </w:rPr>
       </w:r>
       <m:oMath>
         <m:r>
@@ -12795,7 +14530,6 @@
         <w:rPr>
           <w:rFonts w:hint="eastAsia"/>
         </w:rPr>
-        <w:t xml:space="preserve">，评测划分不参与该数值的确定。撤销奖励本身已由代价系数限定，不需要截断。分位数取值经过敏感性检验，取值不宜低于 95 分位，更低的取值会压到奖励分布的主体，改变相当一部分窗口的动作选择。</w:t>
       </w:r>
     </w:p>
     <w:p>
@@ -15547,7 +17281,7 @@
           <w:b/>
           <w:bCs/>
         </w:rPr>
-        <w:t>定理 6（屏蔽动作空间上的遗憾界）设奖励关于状态特征线性可表示且取值有界，屏蔽后的动作集</w:t>
+        <w:t>定理 7（屏蔽动作空间上的遗憾界）设奖励关于状态特征线性可表示且取值有界，屏蔽后的动作集  在每个状态下非空，则算法 3 采用的上置信界策略相对于最优屏蔽策略的累积遗憾为 ，其中  为总决策轮数， 为状态特征维度。</w:t>
       </w:r>
       <w:r>
         <w:rPr>
@@ -15555,7 +17289,6 @@
           <w:b/>
           <w:bCs/>
         </w:rPr>
-        <w:t xml:space="preserve"> </w:t>
       </w:r>
       <m:oMath>
         <m:sSub>
@@ -15629,7 +17362,6 @@
           <w:b/>
           <w:bCs/>
         </w:rPr>
-        <w:t xml:space="preserve"> </w:t>
       </w:r>
       <w:r>
         <w:rPr>
@@ -15637,7 +17369,6 @@
           <w:b/>
           <w:bCs/>
         </w:rPr>
-        <w:t xml:space="preserve">在每个状态下非空，则算法 3 采用的上置信界策略相对于最优屏蔽策略的累积遗憾为</w:t>
       </w:r>
       <w:r>
         <w:rPr>
@@ -15645,7 +17376,6 @@
           <w:b/>
           <w:bCs/>
         </w:rPr>
-        <w:t xml:space="preserve"> </w:t>
       </w:r>
       <m:oMath>
         <m:r>
@@ -15694,7 +17424,6 @@
           <w:b/>
           <w:bCs/>
         </w:rPr>
-        <w:t xml:space="preserve">，其中</w:t>
       </w:r>
       <w:r>
         <w:rPr>
@@ -15702,7 +17431,6 @@
           <w:b/>
           <w:bCs/>
         </w:rPr>
-        <w:t xml:space="preserve"> </w:t>
       </w:r>
       <m:oMath>
         <m:r>
@@ -15715,7 +17443,6 @@
           <w:b/>
           <w:bCs/>
         </w:rPr>
-        <w:t xml:space="preserve"> </w:t>
       </w:r>
       <w:r>
         <w:rPr>
@@ -15723,7 +17450,6 @@
           <w:b/>
           <w:bCs/>
         </w:rPr>
-        <w:t xml:space="preserve">为总决策轮数，</w:t>
       </w:r>
       <m:oMath>
         <m:r>
@@ -15736,7 +17462,6 @@
           <w:b/>
           <w:bCs/>
         </w:rPr>
-        <w:t xml:space="preserve"> </w:t>
       </w:r>
       <w:r>
         <w:rPr>
@@ -15744,7 +17469,6 @@
           <w:b/>
           <w:bCs/>
         </w:rPr>
-        <w:t xml:space="preserve">为状态特征维度。</w:t>
       </w:r>
     </w:p>
     <w:p>
@@ -15755,7 +17479,7 @@
         <w:rPr>
           <w:rFonts w:hint="eastAsia"/>
         </w:rPr>
-        <w:t xml:space="preserve">证明。由定理 2，</w:t>
+        <w:t>证明。由定理 3， 在任意状态下非空，因此屏蔽构成一个状态相关的动作集限制，它限制可选动作，决策本身不会中断。带受限动作集的上下文老虎机的上置信界分析在此直接适用[19]，其遗憾界形式与动作集大小无关，只依赖特征维度与轮数。将比较基准取为屏蔽后可行动作中的最优策略，即得结论。证毕。</w:t>
       </w:r>
       <m:oMath>
         <m:sSub>
@@ -15827,13 +17551,11 @@
         <w:rPr>
           <w:rFonts w:hint="eastAsia"/>
         </w:rPr>
-        <w:t xml:space="preserve"> </w:t>
-      </w:r>
-      <w:r>
-        <w:rPr>
-          <w:rFonts w:hint="eastAsia"/>
-        </w:rPr>
-        <w:t xml:space="preserve">在任意状态下非空，因此屏蔽构成一个状态相关的动作集限制，它限制可选动作，决策本身不会中断。带受限动作集的上下文老虎机的上置信界分析在此直接适用[19]，其遗憾界形式与动作集大小无关，只依赖特征维度与轮数。将比较基准取为屏蔽后可行动作中的最优策略，即得结论。证毕。</w:t>
+      </w:r>
+      <w:r>
+        <w:rPr>
+          <w:rFonts w:hint="eastAsia"/>
+        </w:rPr>
       </w:r>
     </w:p>
     <w:p>
@@ -15858,13 +17580,12 @@
         <w:rPr>
           <w:rFonts w:hint="eastAsia"/>
         </w:rPr>
-        <w:t>定理 6 说明屏蔽在提供安全保证的同时保留了策略学习的渐近性质。比较基准取屏蔽后的最优策略，它与无约束最优策略之间的差距对应屏蔽为安全付出的代价，其大小由</w:t>
-      </w:r>
-      <w:r>
-        <w:rPr>
-          <w:rFonts w:hint="eastAsia"/>
-        </w:rPr>
-        <w:t xml:space="preserve"> </w:t>
+        <w:t>定理 7 说明屏蔽在提供安全保证的同时保留了策略学习的渐近性质。比较基准取屏蔽后的最优策略，它与无约束最优策略之间的差距对应屏蔽为安全付出的代价，其大小由  决定，而  又由目标损害率  确定。这一设计把安全与效率的权衡集中在一个具有明确统计含义的参数上。</w:t>
+      </w:r>
+      <w:r>
+        <w:rPr>
+          <w:rFonts w:hint="eastAsia"/>
+        </w:rPr>
       </w:r>
       <m:oMath>
         <m:r>
@@ -15875,19 +17596,16 @@
         <w:rPr>
           <w:rFonts w:hint="eastAsia"/>
         </w:rPr>
-        <w:t xml:space="preserve"> </w:t>
-      </w:r>
-      <w:r>
-        <w:rPr>
-          <w:rFonts w:hint="eastAsia"/>
-        </w:rPr>
-        <w:t xml:space="preserve">决定，而</w:t>
-      </w:r>
-      <w:r>
-        <w:rPr>
-          <w:rFonts w:hint="eastAsia"/>
-        </w:rPr>
-        <w:t xml:space="preserve"> </w:t>
+      </w:r>
+      <w:r>
+        <w:rPr>
+          <w:rFonts w:hint="eastAsia"/>
+        </w:rPr>
+      </w:r>
+      <w:r>
+        <w:rPr>
+          <w:rFonts w:hint="eastAsia"/>
+        </w:rPr>
       </w:r>
       <m:oMath>
         <m:r>
@@ -15898,19 +17616,16 @@
         <w:rPr>
           <w:rFonts w:hint="eastAsia"/>
         </w:rPr>
-        <w:t xml:space="preserve"> </w:t>
-      </w:r>
-      <w:r>
-        <w:rPr>
-          <w:rFonts w:hint="eastAsia"/>
-        </w:rPr>
-        <w:t xml:space="preserve">又由目标损害率</w:t>
-      </w:r>
-      <w:r>
-        <w:rPr>
-          <w:rFonts w:hint="eastAsia"/>
-        </w:rPr>
-        <w:t xml:space="preserve"> </w:t>
+      </w:r>
+      <w:r>
+        <w:rPr>
+          <w:rFonts w:hint="eastAsia"/>
+        </w:rPr>
+      </w:r>
+      <w:r>
+        <w:rPr>
+          <w:rFonts w:hint="eastAsia"/>
+        </w:rPr>
       </w:r>
       <m:oMath>
         <m:r>
@@ -15921,13 +17636,11 @@
         <w:rPr>
           <w:rFonts w:hint="eastAsia"/>
         </w:rPr>
-        <w:t xml:space="preserve"> </w:t>
-      </w:r>
-      <w:r>
-        <w:rPr>
-          <w:rFonts w:hint="eastAsia"/>
-        </w:rPr>
-        <w:t xml:space="preserve">确定。这一设计把安全与效率的权衡集中在一个具有明确统计含义的参数上。</w:t>
+      </w:r>
+      <w:r>
+        <w:rPr>
+          <w:rFonts w:hint="eastAsia"/>
+        </w:rPr>
       </w:r>
     </w:p>
     <w:p>
@@ -17367,7 +19080,7 @@
         <w:rPr>
           <w:rFonts w:hint="eastAsia"/>
         </w:rPr>
-        <w:t>决策质量组包含四个维度，评估的对象是智能体本身。动作选择准确率在已知缺陷类型的窗口上统计策略选中对应算子的比例，按缺陷类型给出混淆矩阵。预算效率以横轴为累计探测次数、纵轴为治理收益的曲线呈现，用于比较不同预算分配方式。弃权质量以覆盖率与错误率的风险覆盖曲线呈现，用于判断拒绝处理是否发生在应当拒绝的地方。探索代价统计学习过程中累计造成的损害，用于验证定理 3 所述的结构安全性。</w:t>
+        <w:t>决策质量组包含四个维度，评估的对象是智能体本身。动作选择准确率在已知缺陷类型的窗口上统计策略选中对应算子的比例，按缺陷类型给出混淆矩阵。预算效率以横轴为累计探测次数、纵轴为治理收益的曲线呈现，用于比较不同预算分配方式。弃权质量以覆盖率与错误率的风险覆盖曲线呈现，用于判断拒绝处理是否发生在应当拒绝的地方。探索代价统计学习过程中累计造成的损害，用于验证定理 4 所述的结构安全性。</w:t>
       </w:r>
     </w:p>
     <w:p>
@@ -18063,13 +19776,12 @@
         <w:rPr>
           <w:rFonts w:hint="eastAsia"/>
         </w:rPr>
-        <w:t xml:space="preserve">实验三验证定理 3，即学习过程本身不破坏语料。对比两种训练方式，一种把动作直接作用于原数据后再评估，代表已有强化学习清洗方案的做法，另一种采用本文的沙箱执行。统计训练全过程中累计造成的损害随交互次数的变化，并扫描探索系数</w:t>
-      </w:r>
-      <w:r>
-        <w:rPr>
-          <w:rFonts w:hint="eastAsia"/>
-        </w:rPr>
-        <w:t xml:space="preserve"> </w:t>
+        <w:t>实验三验证定理 4，即学习过程本身不破坏语料。对比两种训练方式，一种把动作直接作用于原数据后再评估，代表已有强化学习清洗方案的做法，另一种采用本文的沙箱执行。统计训练全过程中累计造成的损害随交互次数的变化，并扫描探索系数  观察两种方式的差距如何随探索强度变化。表中同时列出全部基线在同一语料上的最终损害作为参照行。</w:t>
+      </w:r>
+      <w:r>
+        <w:rPr>
+          <w:rFonts w:hint="eastAsia"/>
+        </w:rPr>
       </w:r>
       <m:oMath>
         <m:sSub>
@@ -18089,13 +19801,11 @@
         <w:rPr>
           <w:rFonts w:hint="eastAsia"/>
         </w:rPr>
-        <w:t xml:space="preserve"> </w:t>
-      </w:r>
-      <w:r>
-        <w:rPr>
-          <w:rFonts w:hint="eastAsia"/>
-        </w:rPr>
-        <w:t xml:space="preserve">观察两种方式的差距如何随探索强度变化。表中同时列出全部基线在同一语料上的最终损害作为参照行。</w:t>
+      </w:r>
+      <w:r>
+        <w:rPr>
+          <w:rFonts w:hint="eastAsia"/>
+        </w:rPr>
       </w:r>
     </w:p>
     <w:p>
@@ -18176,13 +19886,12 @@
         <w:rPr>
           <w:rFonts w:hint="eastAsia"/>
         </w:rPr>
-        <w:t xml:space="preserve">实验九量化各模块的边际贡献并检验方法对超参数的稳健性。消融包含无屏蔽、无效用条件、无结构条件、无同类校准、无策略学习、无预算分配、无候选注入与完整方法八档，每档报告损害与修复两栏，并额外报告每次编辑的平均损害与平均修复，以消除编辑数差异的干扰。敏感性部分扫描目标损害率</w:t>
-      </w:r>
-      <w:r>
-        <w:rPr>
-          <w:rFonts w:hint="eastAsia"/>
-        </w:rPr>
-        <w:t xml:space="preserve"> </w:t>
+        <w:t>实验九量化各模块的边际贡献并检验方法对超参数的稳健性。消融包含无屏蔽、无效用条件、无结构条件、无同类校准、无策略学习、无预算分配、无候选注入与完整方法八档，每档报告损害与修复两栏，并额外报告每次编辑的平均损害与平均修复，以消除编辑数差异的干扰。敏感性部分扫描目标损害率 、探索系数 、注入概率  与标定间隔 ，其中标定间隔一档用于检验定理 6 给出的退化上界与实测退化是否吻合，并统计各状态下置信上界间隔的经验分布，以判断该定理所需的间隔条件在本文设定中是否成立。</w:t>
+      </w:r>
+      <w:r>
+        <w:rPr>
+          <w:rFonts w:hint="eastAsia"/>
+        </w:rPr>
       </w:r>
       <m:oMath>
         <m:r>
@@ -18193,13 +19902,11 @@
         <w:rPr>
           <w:rFonts w:hint="eastAsia"/>
         </w:rPr>
-        <w:t xml:space="preserve">、探索系数</w:t>
-      </w:r>
-      <w:r>
-        <w:rPr>
-          <w:rFonts w:hint="eastAsia"/>
-        </w:rPr>
-        <w:t xml:space="preserve"> </w:t>
+      </w:r>
+      <w:r>
+        <w:rPr>
+          <w:rFonts w:hint="eastAsia"/>
+        </w:rPr>
       </w:r>
       <m:oMath>
         <m:sSub>
@@ -18219,13 +19926,11 @@
         <w:rPr>
           <w:rFonts w:hint="eastAsia"/>
         </w:rPr>
-        <w:t xml:space="preserve">、注入概率</w:t>
-      </w:r>
-      <w:r>
-        <w:rPr>
-          <w:rFonts w:hint="eastAsia"/>
-        </w:rPr>
-        <w:t xml:space="preserve"> </w:t>
+      </w:r>
+      <w:r>
+        <w:rPr>
+          <w:rFonts w:hint="eastAsia"/>
+        </w:rPr>
       </w:r>
       <m:oMath>
         <m:sSub>
@@ -18260,19 +19965,16 @@
         <w:rPr>
           <w:rFonts w:hint="eastAsia"/>
         </w:rPr>
-        <w:t xml:space="preserve"> </w:t>
-      </w:r>
-      <w:r>
-        <w:rPr>
-          <w:rFonts w:hint="eastAsia"/>
-        </w:rPr>
-        <w:t xml:space="preserve">与标定间隔</w:t>
-      </w:r>
-      <w:r>
-        <w:rPr>
-          <w:rFonts w:hint="eastAsia"/>
-        </w:rPr>
-        <w:t xml:space="preserve"> </w:t>
+      </w:r>
+      <w:r>
+        <w:rPr>
+          <w:rFonts w:hint="eastAsia"/>
+        </w:rPr>
+      </w:r>
+      <w:r>
+        <w:rPr>
+          <w:rFonts w:hint="eastAsia"/>
+        </w:rPr>
       </w:r>
       <m:oMath>
         <m:sSub>
@@ -18307,7 +20009,6 @@
         <w:rPr>
           <w:rFonts w:hint="eastAsia"/>
         </w:rPr>
-        <w:t xml:space="preserve">，其中标定间隔一档用于检验定理 5 给出的退化上界与实测退化是否吻合，并统计各状态下置信上界间隔的经验分布，以判断该定理所需的间隔条件在本文设定中是否成立。</w:t>
       </w:r>
     </w:p>
     <w:p>
@@ -18336,7 +20037,7 @@
         <w:rPr>
           <w:rFonts w:hint="eastAsia"/>
         </w:rPr>
-        <w:t xml:space="preserve">本文面向时序基础模型的语料治理问题，针对一次修改是否有害取决于被修改数据因而无法事先判定这一困难，提出了屏蔽强化学习驱动的智能体 IntroAct-TS。该方法把判定推迟到动作执行之后，并把执行放在工作副本的拷贝上，使判错的动作可以撤回。判定要求模型效用与时序结构两个相互独立的条件同时成立，其中结构条件不看模型意见，其阈值由共形风险控制标定到给定的损害率上，由此解决了判定依据本身存在偏差的问题。所有候选都在副本上执行，未通过判定的尝试不改变任何数据，由此解决了试错代价落在不可恢复对象上的问题。屏蔽因而承担双重职责，它拦下破坏性动作，也决定了哪些奖励能够到达策略，安全与学习出自同一个设计。本文给出六条定理与一条命题及其证明，其中标定间隔内保证退化的上界把共形风险控制与策略的更新速率联系起来，为重新标定的频率提供了定量依据，而软惩罚的损害下界说明把结构约束写成目标函数中的一项与写成硬条件并不等价。</w:t>
+        <w:t>本文面向时序基础模型的语料治理问题，针对一次修改是否有害取决于被修改数据因而无法事先判定这一困难，提出了屏蔽强化学习驱动的智能体 IntroAct-TS。该方法把判定推迟到动作执行之后，并把执行放在工作副本的拷贝上，使判错的动作可以撤回。判定要求模型效用与时序结构两个相互独立的条件同时成立，其中结构条件不看模型意见，其阈值由共形风险控制标定到给定的损害率上，由此解决了判定依据本身存在偏差的问题。所有候选都在副本上执行，未通过判定的尝试不改变任何数据，由此解决了试错代价落在不可恢复对象上的问题。屏蔽因而承担双重职责，它拦下破坏性动作，也决定了哪些奖励能够到达策略，安全与学习出自同一个设计。本文给出七条定理及其证明，其中标定间隔内保证退化的上界把共形风险控制与策略的更新速率联系起来，为重新标定的频率提供了定量依据，而软惩罚的损害下界说明把结构约束写成目标函数中的一项与写成硬条件并不等价。</w:t>
       </w:r>
     </w:p>
     <w:p>

</xml_diff>